<commit_message>
Refines resume details and updates HTML structure for clarity and consistency
</commit_message>
<xml_diff>
--- a/assets/resume/Vidit_Dhull_Data_Engineer.docx
+++ b/assets/resume/Vidit_Dhull_Data_Engineer.docx
@@ -99,7 +99,7 @@
           <w:sz w:val="20"/>
           <w:szCs w:val="20"/>
         </w:rPr>
-        <w:t>+91 9355512200</w:t>
+        <w:t xml:space="preserve">Mobile No.: </w:t>
       </w:r>
       <w:r>
         <w:rPr>
@@ -107,7 +107,7 @@
           <w:sz w:val="20"/>
           <w:szCs w:val="20"/>
         </w:rPr>
-        <w:tab/>
+        <w:t>+91 9355512200</w:t>
       </w:r>
       <w:r>
         <w:rPr>
@@ -131,7 +131,7 @@
           <w:sz w:val="20"/>
           <w:szCs w:val="20"/>
         </w:rPr>
-        <w:tab/>
+        <w:t xml:space="preserve">Email: </w:t>
       </w:r>
       <w:hyperlink r:id="rId8" w:history="1">
         <w:r>
@@ -166,7 +166,7 @@
           <w:sz w:val="20"/>
           <w:szCs w:val="20"/>
         </w:rPr>
-        <w:tab/>
+        <w:t xml:space="preserve">Location: </w:t>
       </w:r>
       <w:r>
         <w:rPr>
@@ -626,6 +626,19 @@
       </w:r>
       <w:r>
         <w:rPr>
+          <w:rFonts w:asciiTheme="minorHAnsi" w:eastAsiaTheme="minorHAnsi" w:hAnsiTheme="minorHAnsi" w:cstheme="minorHAnsi"/>
+          <w:b/>
+          <w:bCs/>
+          <w:kern w:val="2"/>
+          <w:sz w:val="22"/>
+          <w:szCs w:val="22"/>
+          <w:lang w:val="en-IN" w:eastAsia="en-US" w:bidi="ar-SA"/>
+          <w14:ligatures w14:val="standardContextual"/>
+        </w:rPr>
+        <w:t xml:space="preserve"> </w:t>
+      </w:r>
+      <w:r>
+        <w:rPr>
           <w:rFonts w:ascii="Cambria Math" w:eastAsiaTheme="minorHAnsi" w:hAnsi="Cambria Math" w:cs="Cambria Math"/>
           <w:b/>
           <w:bCs/>
@@ -635,7 +648,7 @@
           <w:lang w:val="en-IN" w:eastAsia="en-US" w:bidi="ar-SA"/>
           <w14:ligatures w14:val="standardContextual"/>
         </w:rPr>
-        <w:t>‑</w:t>
+        <w:t xml:space="preserve">– </w:t>
       </w:r>
       <w:r>
         <w:rPr>
@@ -648,7 +661,33 @@
           <w:lang w:val="en-IN" w:eastAsia="en-US" w:bidi="ar-SA"/>
           <w14:ligatures w14:val="standardContextual"/>
         </w:rPr>
-        <w:t>star; 600+ LeetCode problems</w:t>
+        <w:t xml:space="preserve">star; </w:t>
+      </w:r>
+      <w:r>
+        <w:rPr>
+          <w:rFonts w:asciiTheme="minorHAnsi" w:eastAsiaTheme="minorHAnsi" w:hAnsiTheme="minorHAnsi" w:cstheme="minorHAnsi"/>
+          <w:b/>
+          <w:bCs/>
+          <w:kern w:val="2"/>
+          <w:sz w:val="22"/>
+          <w:szCs w:val="22"/>
+          <w:lang w:val="en-IN" w:eastAsia="en-US" w:bidi="ar-SA"/>
+          <w14:ligatures w14:val="standardContextual"/>
+        </w:rPr>
+        <w:t>7</w:t>
+      </w:r>
+      <w:r>
+        <w:rPr>
+          <w:rFonts w:asciiTheme="minorHAnsi" w:eastAsiaTheme="minorHAnsi" w:hAnsiTheme="minorHAnsi" w:cstheme="minorHAnsi"/>
+          <w:b/>
+          <w:bCs/>
+          <w:kern w:val="2"/>
+          <w:sz w:val="22"/>
+          <w:szCs w:val="22"/>
+          <w:lang w:val="en-IN" w:eastAsia="en-US" w:bidi="ar-SA"/>
+          <w14:ligatures w14:val="standardContextual"/>
+        </w:rPr>
+        <w:t>00+ LeetCode problems</w:t>
       </w:r>
       <w:r>
         <w:rPr>
@@ -1413,21 +1452,8 @@
           <w:lang w:val="en-IN" w:eastAsia="en-US" w:bidi="ar-SA"/>
           <w14:ligatures w14:val="standardContextual"/>
         </w:rPr>
-        <w:t xml:space="preserve"> created </w:t>
-      </w:r>
-      <w:proofErr w:type="gramStart"/>
-      <w:r>
-        <w:rPr>
-          <w:rFonts w:asciiTheme="minorHAnsi" w:eastAsiaTheme="minorHAnsi" w:hAnsiTheme="minorHAnsi" w:cstheme="minorHAnsi"/>
-          <w:kern w:val="2"/>
-          <w:sz w:val="22"/>
-          <w:szCs w:val="22"/>
-          <w:lang w:val="en-IN" w:eastAsia="en-US" w:bidi="ar-SA"/>
-          <w14:ligatures w14:val="standardContextual"/>
-        </w:rPr>
-        <w:t>Silver</w:t>
-      </w:r>
-      <w:proofErr w:type="gramEnd"/>
+        <w:t xml:space="preserve"> created Silver</w:t>
+      </w:r>
       <w:r>
         <w:rPr>
           <w:rFonts w:asciiTheme="minorHAnsi" w:eastAsiaTheme="minorHAnsi" w:hAnsiTheme="minorHAnsi" w:cstheme="minorHAnsi"/>
@@ -1949,7 +1975,19 @@
           <w:lang w:val="en-IN" w:eastAsia="en-US" w:bidi="ar-SA"/>
           <w14:ligatures w14:val="standardContextual"/>
         </w:rPr>
-        <w:t>DP-700: Fabric Data Engineer Associate (Microsoft),</w:t>
+        <w:t xml:space="preserve">DP-700: </w:t>
+      </w:r>
+      <w:r>
+        <w:rPr>
+          <w:rFonts w:asciiTheme="minorHAnsi" w:eastAsiaTheme="minorHAnsi" w:hAnsiTheme="minorHAnsi" w:cstheme="minorHAnsi"/>
+          <w:bCs/>
+          <w:kern w:val="2"/>
+          <w:sz w:val="22"/>
+          <w:szCs w:val="22"/>
+          <w:lang w:val="en-IN" w:eastAsia="en-US" w:bidi="ar-SA"/>
+          <w14:ligatures w14:val="standardContextual"/>
+        </w:rPr>
+        <w:t>Fabric Data Engineer Associate (Microsoft),</w:t>
       </w:r>
       <w:r>
         <w:rPr>
@@ -1992,7 +2030,19 @@
           <w:lang w:val="en-IN" w:eastAsia="en-US" w:bidi="ar-SA"/>
           <w14:ligatures w14:val="standardContextual"/>
         </w:rPr>
-        <w:t>DP-203: Azure Data Engineer Associate (Microsoft),</w:t>
+        <w:t xml:space="preserve">DP-203: </w:t>
+      </w:r>
+      <w:r>
+        <w:rPr>
+          <w:rFonts w:asciiTheme="minorHAnsi" w:eastAsiaTheme="minorHAnsi" w:hAnsiTheme="minorHAnsi" w:cstheme="minorHAnsi"/>
+          <w:bCs/>
+          <w:kern w:val="2"/>
+          <w:sz w:val="22"/>
+          <w:szCs w:val="22"/>
+          <w:lang w:val="en-IN" w:eastAsia="en-US" w:bidi="ar-SA"/>
+          <w14:ligatures w14:val="standardContextual"/>
+        </w:rPr>
+        <w:t>Azure Data Engineer Associate (Microsoft),</w:t>
       </w:r>
       <w:r>
         <w:rPr>
@@ -2035,7 +2085,19 @@
           <w:lang w:val="en-IN" w:eastAsia="en-US" w:bidi="ar-SA"/>
           <w14:ligatures w14:val="standardContextual"/>
         </w:rPr>
-        <w:t>DP-900: Azure Data Fundamentals (Microsoft),</w:t>
+        <w:t xml:space="preserve">DP-900: </w:t>
+      </w:r>
+      <w:r>
+        <w:rPr>
+          <w:rFonts w:asciiTheme="minorHAnsi" w:eastAsiaTheme="minorHAnsi" w:hAnsiTheme="minorHAnsi" w:cstheme="minorHAnsi"/>
+          <w:bCs/>
+          <w:kern w:val="2"/>
+          <w:sz w:val="22"/>
+          <w:szCs w:val="22"/>
+          <w:lang w:val="en-IN" w:eastAsia="en-US" w:bidi="ar-SA"/>
+          <w14:ligatures w14:val="standardContextual"/>
+        </w:rPr>
+        <w:t>Azure Data Fundamentals (Microsoft),</w:t>
       </w:r>
       <w:r>
         <w:rPr>
@@ -2077,7 +2139,43 @@
           <w:lang w:val="en-IN" w:eastAsia="en-US" w:bidi="ar-SA"/>
           <w14:ligatures w14:val="standardContextual"/>
         </w:rPr>
-        <w:t>IBM Data Engineering Specialization (Coursera),</w:t>
+        <w:t>IBM</w:t>
+      </w:r>
+      <w:r>
+        <w:rPr>
+          <w:rFonts w:asciiTheme="minorHAnsi" w:eastAsiaTheme="minorHAnsi" w:hAnsiTheme="minorHAnsi" w:cstheme="minorHAnsi"/>
+          <w:b/>
+          <w:kern w:val="2"/>
+          <w:sz w:val="22"/>
+          <w:szCs w:val="22"/>
+          <w:lang w:val="en-IN" w:eastAsia="en-US" w:bidi="ar-SA"/>
+          <w14:ligatures w14:val="standardContextual"/>
+        </w:rPr>
+        <w:t>:</w:t>
+      </w:r>
+      <w:r>
+        <w:rPr>
+          <w:rFonts w:asciiTheme="minorHAnsi" w:eastAsiaTheme="minorHAnsi" w:hAnsiTheme="minorHAnsi" w:cstheme="minorHAnsi"/>
+          <w:b/>
+          <w:kern w:val="2"/>
+          <w:sz w:val="22"/>
+          <w:szCs w:val="22"/>
+          <w:lang w:val="en-IN" w:eastAsia="en-US" w:bidi="ar-SA"/>
+          <w14:ligatures w14:val="standardContextual"/>
+        </w:rPr>
+        <w:t xml:space="preserve"> </w:t>
+      </w:r>
+      <w:r>
+        <w:rPr>
+          <w:rFonts w:asciiTheme="minorHAnsi" w:eastAsiaTheme="minorHAnsi" w:hAnsiTheme="minorHAnsi" w:cstheme="minorHAnsi"/>
+          <w:bCs/>
+          <w:kern w:val="2"/>
+          <w:sz w:val="22"/>
+          <w:szCs w:val="22"/>
+          <w:lang w:val="en-IN" w:eastAsia="en-US" w:bidi="ar-SA"/>
+          <w14:ligatures w14:val="standardContextual"/>
+        </w:rPr>
+        <w:t>Data Engineering Specialization,</w:t>
       </w:r>
       <w:r>
         <w:rPr>
@@ -2162,7 +2260,33 @@
           <w:lang w:val="en-IN" w:eastAsia="en-US" w:bidi="ar-SA"/>
           <w14:ligatures w14:val="standardContextual"/>
         </w:rPr>
-        <w:t>Programming &amp; Scripting:</w:t>
+        <w:t xml:space="preserve">Programming </w:t>
+      </w:r>
+      <w:r>
+        <w:rPr>
+          <w:rFonts w:asciiTheme="minorHAnsi" w:eastAsiaTheme="minorHAnsi" w:hAnsiTheme="minorHAnsi" w:cstheme="minorHAnsi"/>
+          <w:b/>
+          <w:bCs/>
+          <w:kern w:val="2"/>
+          <w:sz w:val="22"/>
+          <w:szCs w:val="22"/>
+          <w:lang w:val="en-IN" w:eastAsia="en-US" w:bidi="ar-SA"/>
+          <w14:ligatures w14:val="standardContextual"/>
+        </w:rPr>
+        <w:t>Languages</w:t>
+      </w:r>
+      <w:r>
+        <w:rPr>
+          <w:rFonts w:asciiTheme="minorHAnsi" w:eastAsiaTheme="minorHAnsi" w:hAnsiTheme="minorHAnsi" w:cstheme="minorHAnsi"/>
+          <w:b/>
+          <w:bCs/>
+          <w:kern w:val="2"/>
+          <w:sz w:val="22"/>
+          <w:szCs w:val="22"/>
+          <w:lang w:val="en-IN" w:eastAsia="en-US" w:bidi="ar-SA"/>
+          <w14:ligatures w14:val="standardContextual"/>
+        </w:rPr>
+        <w:t>:</w:t>
       </w:r>
       <w:r>
         <w:rPr>
@@ -2215,7 +2339,20 @@
           <w:lang w:val="en-IN" w:eastAsia="en-US" w:bidi="ar-SA"/>
           <w14:ligatures w14:val="standardContextual"/>
         </w:rPr>
-        <w:t xml:space="preserve">Data Engineering Tools: </w:t>
+        <w:t>Tech Stack</w:t>
+      </w:r>
+      <w:r>
+        <w:rPr>
+          <w:rFonts w:asciiTheme="minorHAnsi" w:eastAsiaTheme="minorHAnsi" w:hAnsiTheme="minorHAnsi" w:cstheme="minorHAnsi"/>
+          <w:b/>
+          <w:bCs/>
+          <w:kern w:val="2"/>
+          <w:sz w:val="22"/>
+          <w:szCs w:val="22"/>
+          <w:lang w:val="en-IN" w:eastAsia="en-US" w:bidi="ar-SA"/>
+          <w14:ligatures w14:val="standardContextual"/>
+        </w:rPr>
+        <w:t xml:space="preserve">: </w:t>
       </w:r>
       <w:r>
         <w:rPr>
@@ -2691,7 +2828,7 @@
           <w:lang w:val="en-IN" w:eastAsia="en-US" w:bidi="ar-SA"/>
           <w14:ligatures w14:val="standardContextual"/>
         </w:rPr>
-        <w:t>Bengaluru | 82% (2022–2023)</w:t>
+        <w:t>Bengaluru | (2022–2023)</w:t>
       </w:r>
     </w:p>
     <w:p>
@@ -2769,9 +2906,47 @@
         <w:t>(2018–2022)</w:t>
       </w:r>
     </w:p>
+    <w:p>
+      <w:pPr>
+        <w:pStyle w:val="LO-normal"/>
+        <w:jc w:val="both"/>
+        <w:rPr>
+          <w:rFonts w:asciiTheme="minorHAnsi" w:eastAsiaTheme="minorHAnsi" w:hAnsiTheme="minorHAnsi" w:cstheme="minorHAnsi"/>
+          <w:sz w:val="22"/>
+          <w:szCs w:val="22"/>
+          <w:lang w:val="en-IN" w:eastAsia="en-US" w:bidi="ar-SA"/>
+        </w:rPr>
+      </w:pPr>
+    </w:p>
+    <w:p>
+      <w:pPr>
+        <w:pStyle w:val="LO-normal"/>
+        <w:jc w:val="both"/>
+        <w:rPr>
+          <w:rFonts w:asciiTheme="minorHAnsi" w:eastAsiaTheme="minorHAnsi" w:hAnsiTheme="minorHAnsi" w:cstheme="minorHAnsi"/>
+          <w:sz w:val="22"/>
+          <w:szCs w:val="22"/>
+          <w:lang w:val="en-IN" w:eastAsia="en-US" w:bidi="ar-SA"/>
+        </w:rPr>
+      </w:pPr>
+    </w:p>
+    <w:p>
+      <w:pPr>
+        <w:pStyle w:val="LO-normal"/>
+        <w:jc w:val="both"/>
+        <w:rPr>
+          <w:rFonts w:asciiTheme="minorHAnsi" w:eastAsiaTheme="minorHAnsi" w:hAnsiTheme="minorHAnsi" w:cstheme="minorHAnsi"/>
+          <w:kern w:val="2"/>
+          <w:sz w:val="22"/>
+          <w:szCs w:val="22"/>
+          <w:lang w:val="en-IN" w:eastAsia="en-US" w:bidi="ar-SA"/>
+          <w14:ligatures w14:val="standardContextual"/>
+        </w:rPr>
+      </w:pPr>
+    </w:p>
     <w:sectPr>
       <w:pgSz w:w="11906" w:h="16838"/>
-      <w:pgMar w:top="720" w:right="720" w:bottom="720" w:left="720" w:header="227" w:footer="227" w:gutter="0"/>
+      <w:pgMar w:top="340" w:right="720" w:bottom="340" w:left="720" w:header="227" w:footer="227" w:gutter="0"/>
       <w:cols w:space="708"/>
       <w:docGrid w:linePitch="360"/>
     </w:sectPr>

</xml_diff>

<commit_message>
Refines resume content and updates skill descriptions for clarity and relevance
</commit_message>
<xml_diff>
--- a/assets/resume/Vidit_Dhull_Data_Engineer.docx
+++ b/assets/resume/Vidit_Dhull_Data_Engineer.docx
@@ -9,16 +9,16 @@
         <w:rPr>
           <w:rFonts w:asciiTheme="minorHAnsi" w:eastAsia="Verdana" w:hAnsiTheme="minorHAnsi" w:cstheme="minorHAnsi"/>
           <w:b/>
-          <w:sz w:val="36"/>
-          <w:szCs w:val="36"/>
+          <w:sz w:val="32"/>
+          <w:szCs w:val="32"/>
         </w:rPr>
       </w:pPr>
       <w:r>
         <w:rPr>
           <w:rFonts w:asciiTheme="minorHAnsi" w:eastAsia="Verdana" w:hAnsiTheme="minorHAnsi" w:cstheme="minorHAnsi"/>
           <w:b/>
-          <w:sz w:val="36"/>
-          <w:szCs w:val="36"/>
+          <w:sz w:val="32"/>
+          <w:szCs w:val="32"/>
         </w:rPr>
         <w:t>Vidit Dhull</w:t>
       </w:r>
@@ -26,8 +26,8 @@
         <w:rPr>
           <w:rFonts w:asciiTheme="minorHAnsi" w:eastAsia="Verdana" w:hAnsiTheme="minorHAnsi" w:cstheme="minorHAnsi"/>
           <w:b/>
-          <w:sz w:val="36"/>
-          <w:szCs w:val="36"/>
+          <w:sz w:val="32"/>
+          <w:szCs w:val="32"/>
         </w:rPr>
         <w:t>, Data Engineer</w:t>
       </w:r>
@@ -38,8 +38,8 @@
         <w:jc w:val="center"/>
         <w:rPr>
           <w:rFonts w:cstheme="minorHAnsi"/>
-          <w:sz w:val="20"/>
-          <w:szCs w:val="20"/>
+          <w:sz w:val="18"/>
+          <w:szCs w:val="18"/>
         </w:rPr>
       </w:pPr>
       <w:hyperlink r:id="rId8" w:history="1">
@@ -47,8 +47,8 @@
           <w:rPr>
             <w:rStyle w:val="Hyperlink"/>
             <w:rFonts w:cstheme="minorHAnsi"/>
-            <w:sz w:val="20"/>
-            <w:szCs w:val="20"/>
+            <w:sz w:val="18"/>
+            <w:szCs w:val="18"/>
           </w:rPr>
           <w:t>vidit.dh@gmail.com</w:t>
         </w:r>
@@ -56,16 +56,16 @@
       <w:r>
         <w:rPr>
           <w:rFonts w:cstheme="minorHAnsi"/>
-          <w:sz w:val="20"/>
-          <w:szCs w:val="20"/>
+          <w:sz w:val="18"/>
+          <w:szCs w:val="18"/>
         </w:rPr>
         <w:t xml:space="preserve"> | </w:t>
       </w:r>
       <w:r>
         <w:rPr>
           <w:rFonts w:cstheme="minorHAnsi"/>
-          <w:sz w:val="20"/>
-          <w:szCs w:val="20"/>
+          <w:sz w:val="18"/>
+          <w:szCs w:val="18"/>
         </w:rPr>
         <w:t xml:space="preserve">Portfolio: </w:t>
       </w:r>
@@ -74,8 +74,8 @@
           <w:rPr>
             <w:rStyle w:val="Hyperlink"/>
             <w:rFonts w:cstheme="minorHAnsi"/>
-            <w:sz w:val="20"/>
-            <w:szCs w:val="20"/>
+            <w:sz w:val="18"/>
+            <w:szCs w:val="18"/>
           </w:rPr>
           <w:t>viditdhull.github.io</w:t>
         </w:r>
@@ -83,16 +83,16 @@
       <w:r>
         <w:rPr>
           <w:rFonts w:cstheme="minorHAnsi"/>
-          <w:sz w:val="20"/>
-          <w:szCs w:val="20"/>
+          <w:sz w:val="18"/>
+          <w:szCs w:val="18"/>
         </w:rPr>
         <w:t xml:space="preserve"> | +91 9355512200  | </w:t>
       </w:r>
       <w:r>
         <w:rPr>
           <w:rFonts w:cstheme="minorHAnsi"/>
-          <w:sz w:val="20"/>
-          <w:szCs w:val="20"/>
+          <w:sz w:val="18"/>
+          <w:szCs w:val="18"/>
         </w:rPr>
         <w:t xml:space="preserve">LinkedIn: </w:t>
       </w:r>
@@ -101,17 +101,13 @@
           <w:rPr>
             <w:rStyle w:val="Hyperlink"/>
             <w:rFonts w:cstheme="minorHAnsi"/>
-            <w:sz w:val="20"/>
-            <w:szCs w:val="20"/>
+            <w:sz w:val="18"/>
+            <w:szCs w:val="18"/>
           </w:rPr>
           <w:t>linkedin/viditdhull/</w:t>
         </w:r>
       </w:hyperlink>
       <w:r>
-        <w:rPr>
-          <w:sz w:val="24"/>
-          <w:szCs w:val="24"/>
-        </w:rPr>
         <w:t xml:space="preserve"> | Bengaluru, India</w:t>
       </w:r>
     </w:p>
@@ -121,8 +117,6 @@
         <w:ind w:right="-397"/>
         <w:rPr>
           <w:rFonts w:cstheme="minorHAnsi"/>
-          <w:sz w:val="24"/>
-          <w:szCs w:val="24"/>
         </w:rPr>
       </w:pPr>
     </w:p>
@@ -136,16 +130,16 @@
         <w:rPr>
           <w:rFonts w:cstheme="minorHAnsi"/>
           <w:b/>
-          <w:sz w:val="32"/>
-          <w:szCs w:val="32"/>
+          <w:sz w:val="28"/>
+          <w:szCs w:val="28"/>
         </w:rPr>
       </w:pPr>
       <w:r>
         <w:rPr>
           <w:rFonts w:cstheme="minorHAnsi"/>
           <w:b/>
-          <w:sz w:val="32"/>
-          <w:szCs w:val="32"/>
+          <w:sz w:val="28"/>
+          <w:szCs w:val="28"/>
         </w:rPr>
         <w:t xml:space="preserve">PROFESSIONAL </w:t>
       </w:r>
@@ -153,8 +147,8 @@
         <w:rPr>
           <w:rFonts w:cstheme="minorHAnsi"/>
           <w:b/>
-          <w:sz w:val="32"/>
-          <w:szCs w:val="32"/>
+          <w:sz w:val="28"/>
+          <w:szCs w:val="28"/>
         </w:rPr>
         <w:t>SUMMARY</w:t>
       </w:r>
@@ -170,6 +164,8 @@
         <w:rPr>
           <w:rFonts w:asciiTheme="minorHAnsi" w:eastAsiaTheme="minorHAnsi" w:hAnsiTheme="minorHAnsi" w:cstheme="minorHAnsi"/>
           <w:kern w:val="2"/>
+          <w:sz w:val="22"/>
+          <w:szCs w:val="22"/>
           <w:lang w:val="en-IN" w:eastAsia="en-US" w:bidi="ar-SA"/>
           <w14:ligatures w14:val="standardContextual"/>
         </w:rPr>
@@ -180,10 +176,23 @@
           <w:b/>
           <w:bCs/>
           <w:kern w:val="2"/>
-          <w:lang w:val="en-IN" w:eastAsia="en-US" w:bidi="ar-SA"/>
-          <w14:ligatures w14:val="standardContextual"/>
-        </w:rPr>
-        <w:t>Data</w:t>
+          <w:sz w:val="22"/>
+          <w:szCs w:val="22"/>
+          <w:lang w:val="en-IN" w:eastAsia="en-US" w:bidi="ar-SA"/>
+          <w14:ligatures w14:val="standardContextual"/>
+        </w:rPr>
+        <w:t>Data Engineer</w:t>
+      </w:r>
+      <w:r>
+        <w:rPr>
+          <w:rFonts w:asciiTheme="minorHAnsi" w:eastAsiaTheme="minorHAnsi" w:hAnsiTheme="minorHAnsi" w:cstheme="minorHAnsi"/>
+          <w:kern w:val="2"/>
+          <w:sz w:val="22"/>
+          <w:szCs w:val="22"/>
+          <w:lang w:val="en-IN" w:eastAsia="en-US" w:bidi="ar-SA"/>
+          <w14:ligatures w14:val="standardContextual"/>
+        </w:rPr>
+        <w:t xml:space="preserve"> with </w:t>
       </w:r>
       <w:r>
         <w:rPr>
@@ -191,10 +200,34 @@
           <w:b/>
           <w:bCs/>
           <w:kern w:val="2"/>
-          <w:lang w:val="en-IN" w:eastAsia="en-US" w:bidi="ar-SA"/>
-          <w14:ligatures w14:val="standardContextual"/>
-        </w:rPr>
-        <w:t xml:space="preserve"> </w:t>
+          <w:sz w:val="22"/>
+          <w:szCs w:val="22"/>
+          <w:lang w:val="en-IN" w:eastAsia="en-US" w:bidi="ar-SA"/>
+          <w14:ligatures w14:val="standardContextual"/>
+        </w:rPr>
+        <w:t>5+ years</w:t>
+      </w:r>
+      <w:r>
+        <w:rPr>
+          <w:rFonts w:asciiTheme="minorHAnsi" w:eastAsiaTheme="minorHAnsi" w:hAnsiTheme="minorHAnsi" w:cstheme="minorHAnsi"/>
+          <w:kern w:val="2"/>
+          <w:sz w:val="22"/>
+          <w:szCs w:val="22"/>
+          <w:lang w:val="en-IN" w:eastAsia="en-US" w:bidi="ar-SA"/>
+          <w14:ligatures w14:val="standardContextual"/>
+        </w:rPr>
+        <w:t xml:space="preserve"> of experience</w:t>
+      </w:r>
+      <w:r>
+        <w:rPr>
+          <w:rFonts w:asciiTheme="minorHAnsi" w:eastAsiaTheme="minorHAnsi" w:hAnsiTheme="minorHAnsi" w:cstheme="minorHAnsi"/>
+          <w:kern w:val="2"/>
+          <w:sz w:val="22"/>
+          <w:szCs w:val="22"/>
+          <w:lang w:val="en-IN" w:eastAsia="en-US" w:bidi="ar-SA"/>
+          <w14:ligatures w14:val="standardContextual"/>
+        </w:rPr>
+        <w:t xml:space="preserve"> building </w:t>
       </w:r>
       <w:r>
         <w:rPr>
@@ -202,28 +235,23 @@
           <w:b/>
           <w:bCs/>
           <w:kern w:val="2"/>
-          <w:lang w:val="en-IN" w:eastAsia="en-US" w:bidi="ar-SA"/>
-          <w14:ligatures w14:val="standardContextual"/>
-        </w:rPr>
-        <w:t>Engineer</w:t>
-      </w:r>
-      <w:r>
-        <w:rPr>
-          <w:rFonts w:asciiTheme="minorHAnsi" w:eastAsiaTheme="minorHAnsi" w:hAnsiTheme="minorHAnsi" w:cstheme="minorHAnsi"/>
-          <w:kern w:val="2"/>
-          <w:lang w:val="en-IN" w:eastAsia="en-US" w:bidi="ar-SA"/>
-          <w14:ligatures w14:val="standardContextual"/>
-        </w:rPr>
-        <w:t xml:space="preserve"> </w:t>
-      </w:r>
-      <w:r>
-        <w:rPr>
-          <w:rFonts w:asciiTheme="minorHAnsi" w:eastAsiaTheme="minorHAnsi" w:hAnsiTheme="minorHAnsi" w:cstheme="minorHAnsi"/>
-          <w:kern w:val="2"/>
-          <w:lang w:val="en-IN" w:eastAsia="en-US" w:bidi="ar-SA"/>
-          <w14:ligatures w14:val="standardContextual"/>
-        </w:rPr>
-        <w:t xml:space="preserve">with </w:t>
+          <w:sz w:val="22"/>
+          <w:szCs w:val="22"/>
+          <w:lang w:val="en-IN" w:eastAsia="en-US" w:bidi="ar-SA"/>
+          <w14:ligatures w14:val="standardContextual"/>
+        </w:rPr>
+        <w:t>scalable data platforms</w:t>
+      </w:r>
+      <w:r>
+        <w:rPr>
+          <w:rFonts w:asciiTheme="minorHAnsi" w:eastAsiaTheme="minorHAnsi" w:hAnsiTheme="minorHAnsi" w:cstheme="minorHAnsi"/>
+          <w:kern w:val="2"/>
+          <w:sz w:val="22"/>
+          <w:szCs w:val="22"/>
+          <w:lang w:val="en-IN" w:eastAsia="en-US" w:bidi="ar-SA"/>
+          <w14:ligatures w14:val="standardContextual"/>
+        </w:rPr>
+        <w:t xml:space="preserve"> and </w:t>
       </w:r>
       <w:r>
         <w:rPr>
@@ -231,10 +259,23 @@
           <w:b/>
           <w:bCs/>
           <w:kern w:val="2"/>
-          <w:lang w:val="en-IN" w:eastAsia="en-US" w:bidi="ar-SA"/>
-          <w14:ligatures w14:val="standardContextual"/>
-        </w:rPr>
-        <w:t>3</w:t>
+          <w:sz w:val="22"/>
+          <w:szCs w:val="22"/>
+          <w:lang w:val="en-IN" w:eastAsia="en-US" w:bidi="ar-SA"/>
+          <w14:ligatures w14:val="standardContextual"/>
+        </w:rPr>
+        <w:t>real-time streaming pipelines</w:t>
+      </w:r>
+      <w:r>
+        <w:rPr>
+          <w:rFonts w:asciiTheme="minorHAnsi" w:eastAsiaTheme="minorHAnsi" w:hAnsiTheme="minorHAnsi" w:cstheme="minorHAnsi"/>
+          <w:kern w:val="2"/>
+          <w:sz w:val="22"/>
+          <w:szCs w:val="22"/>
+          <w:lang w:val="en-IN" w:eastAsia="en-US" w:bidi="ar-SA"/>
+          <w14:ligatures w14:val="standardContextual"/>
+        </w:rPr>
+        <w:t xml:space="preserve"> using Spark, Kafka, and both </w:t>
       </w:r>
       <w:r>
         <w:rPr>
@@ -242,10 +283,23 @@
           <w:b/>
           <w:bCs/>
           <w:kern w:val="2"/>
-          <w:lang w:val="en-IN" w:eastAsia="en-US" w:bidi="ar-SA"/>
-          <w14:ligatures w14:val="standardContextual"/>
-        </w:rPr>
-        <w:t>+ years</w:t>
+          <w:sz w:val="22"/>
+          <w:szCs w:val="22"/>
+          <w:lang w:val="en-IN" w:eastAsia="en-US" w:bidi="ar-SA"/>
+          <w14:ligatures w14:val="standardContextual"/>
+        </w:rPr>
+        <w:t>open-source</w:t>
+      </w:r>
+      <w:r>
+        <w:rPr>
+          <w:rFonts w:asciiTheme="minorHAnsi" w:eastAsiaTheme="minorHAnsi" w:hAnsiTheme="minorHAnsi" w:cstheme="minorHAnsi"/>
+          <w:kern w:val="2"/>
+          <w:sz w:val="22"/>
+          <w:szCs w:val="22"/>
+          <w:lang w:val="en-IN" w:eastAsia="en-US" w:bidi="ar-SA"/>
+          <w14:ligatures w14:val="standardContextual"/>
+        </w:rPr>
+        <w:t xml:space="preserve"> and </w:t>
       </w:r>
       <w:r>
         <w:rPr>
@@ -253,35 +307,19 @@
           <w:b/>
           <w:bCs/>
           <w:kern w:val="2"/>
-          <w:lang w:val="en-IN" w:eastAsia="en-US" w:bidi="ar-SA"/>
-          <w14:ligatures w14:val="standardContextual"/>
-        </w:rPr>
-        <w:t xml:space="preserve"> experience in</w:t>
-      </w:r>
-      <w:r>
-        <w:rPr>
-          <w:rFonts w:asciiTheme="minorHAnsi" w:eastAsiaTheme="minorHAnsi" w:hAnsiTheme="minorHAnsi" w:cstheme="minorHAnsi"/>
-          <w:b/>
-          <w:bCs/>
-          <w:kern w:val="2"/>
-          <w:lang w:val="en-IN" w:eastAsia="en-US" w:bidi="ar-SA"/>
-          <w14:ligatures w14:val="standardContextual"/>
-        </w:rPr>
-        <w:t xml:space="preserve"> designing scalable lakehouse and event-driven data platforms</w:t>
-      </w:r>
-      <w:r>
-        <w:rPr>
-          <w:rFonts w:asciiTheme="minorHAnsi" w:eastAsiaTheme="minorHAnsi" w:hAnsiTheme="minorHAnsi" w:cstheme="minorHAnsi"/>
-          <w:kern w:val="2"/>
-          <w:lang w:val="en-IN" w:eastAsia="en-US" w:bidi="ar-SA"/>
-          <w14:ligatures w14:val="standardContextual"/>
-        </w:rPr>
-        <w:t xml:space="preserve"> for real-time telemetry analytics and enterprise reporting</w:t>
-      </w:r>
-      <w:r>
-        <w:rPr>
-          <w:rFonts w:asciiTheme="minorHAnsi" w:eastAsiaTheme="minorHAnsi" w:hAnsiTheme="minorHAnsi" w:cstheme="minorHAnsi"/>
-          <w:kern w:val="2"/>
+          <w:sz w:val="22"/>
+          <w:szCs w:val="22"/>
+          <w:lang w:val="en-IN" w:eastAsia="en-US" w:bidi="ar-SA"/>
+          <w14:ligatures w14:val="standardContextual"/>
+        </w:rPr>
+        <w:t>Azure-based data ecosystems</w:t>
+      </w:r>
+      <w:r>
+        <w:rPr>
+          <w:rFonts w:asciiTheme="minorHAnsi" w:eastAsiaTheme="minorHAnsi" w:hAnsiTheme="minorHAnsi" w:cstheme="minorHAnsi"/>
+          <w:kern w:val="2"/>
+          <w:sz w:val="22"/>
+          <w:szCs w:val="22"/>
           <w:lang w:val="en-IN" w:eastAsia="en-US" w:bidi="ar-SA"/>
           <w14:ligatures w14:val="standardContextual"/>
         </w:rPr>
@@ -299,29 +337,46 @@
         <w:rPr>
           <w:rFonts w:asciiTheme="minorHAnsi" w:eastAsiaTheme="minorHAnsi" w:hAnsiTheme="minorHAnsi" w:cstheme="minorHAnsi"/>
           <w:kern w:val="2"/>
-          <w:lang w:val="en-IN" w:eastAsia="en-US" w:bidi="ar-SA"/>
-          <w14:ligatures w14:val="standardContextual"/>
-        </w:rPr>
-      </w:pPr>
+          <w:sz w:val="22"/>
+          <w:szCs w:val="22"/>
+          <w:lang w:val="en-IN" w:eastAsia="en-US" w:bidi="ar-SA"/>
+          <w14:ligatures w14:val="standardContextual"/>
+        </w:rPr>
+      </w:pPr>
+      <w:r>
+        <w:rPr>
+          <w:rFonts w:asciiTheme="minorHAnsi" w:eastAsiaTheme="minorHAnsi" w:hAnsiTheme="minorHAnsi" w:cstheme="minorHAnsi"/>
+          <w:kern w:val="2"/>
+          <w:sz w:val="22"/>
+          <w:szCs w:val="22"/>
+          <w:lang w:val="en-IN" w:eastAsia="en-US" w:bidi="ar-SA"/>
+          <w14:ligatures w14:val="standardContextual"/>
+        </w:rPr>
+        <w:t xml:space="preserve">Experienced in designing Medallion Delta Lakehouse architectures, optimizing large-scale ETL pipelines, and delivering </w:t>
+      </w:r>
       <w:r>
         <w:rPr>
           <w:rFonts w:asciiTheme="minorHAnsi" w:eastAsiaTheme="minorHAnsi" w:hAnsiTheme="minorHAnsi" w:cstheme="minorHAnsi"/>
           <w:b/>
           <w:bCs/>
           <w:kern w:val="2"/>
-          <w:lang w:val="en-IN" w:eastAsia="en-US" w:bidi="ar-SA"/>
-          <w14:ligatures w14:val="standardContextual"/>
-        </w:rPr>
-        <w:t>Strong ownership mindset</w:t>
-      </w:r>
-      <w:r>
-        <w:rPr>
-          <w:rFonts w:asciiTheme="minorHAnsi" w:eastAsiaTheme="minorHAnsi" w:hAnsiTheme="minorHAnsi" w:cstheme="minorHAnsi"/>
-          <w:kern w:val="2"/>
-          <w:lang w:val="en-IN" w:eastAsia="en-US" w:bidi="ar-SA"/>
-          <w14:ligatures w14:val="standardContextual"/>
-        </w:rPr>
-        <w:t xml:space="preserve"> with hands-on </w:t>
+          <w:sz w:val="22"/>
+          <w:szCs w:val="22"/>
+          <w:lang w:val="en-IN" w:eastAsia="en-US" w:bidi="ar-SA"/>
+          <w14:ligatures w14:val="standardContextual"/>
+        </w:rPr>
+        <w:t>high-throughput event-driven</w:t>
+      </w:r>
+      <w:r>
+        <w:rPr>
+          <w:rFonts w:asciiTheme="minorHAnsi" w:eastAsiaTheme="minorHAnsi" w:hAnsiTheme="minorHAnsi" w:cstheme="minorHAnsi"/>
+          <w:kern w:val="2"/>
+          <w:sz w:val="22"/>
+          <w:szCs w:val="22"/>
+          <w:lang w:val="en-IN" w:eastAsia="en-US" w:bidi="ar-SA"/>
+          <w14:ligatures w14:val="standardContextual"/>
+        </w:rPr>
+        <w:t xml:space="preserve"> </w:t>
       </w:r>
       <w:r>
         <w:rPr>
@@ -329,42 +384,30 @@
           <w:b/>
           <w:bCs/>
           <w:kern w:val="2"/>
-          <w:lang w:val="en-IN" w:eastAsia="en-US" w:bidi="ar-SA"/>
-          <w14:ligatures w14:val="standardContextual"/>
-        </w:rPr>
-        <w:t>leadership in platform architecture</w:t>
-      </w:r>
-      <w:r>
-        <w:rPr>
-          <w:rFonts w:asciiTheme="minorHAnsi" w:eastAsiaTheme="minorHAnsi" w:hAnsiTheme="minorHAnsi" w:cstheme="minorHAnsi"/>
-          <w:kern w:val="2"/>
-          <w:lang w:val="en-IN" w:eastAsia="en-US" w:bidi="ar-SA"/>
-          <w14:ligatures w14:val="standardContextual"/>
-        </w:rPr>
-        <w:t>, performance optimization</w:t>
-      </w:r>
-      <w:r>
-        <w:rPr>
-          <w:rFonts w:asciiTheme="minorHAnsi" w:eastAsiaTheme="minorHAnsi" w:hAnsiTheme="minorHAnsi" w:cstheme="minorHAnsi"/>
-          <w:kern w:val="2"/>
-          <w:lang w:val="en-IN" w:eastAsia="en-US" w:bidi="ar-SA"/>
-          <w14:ligatures w14:val="standardContextual"/>
-        </w:rPr>
-        <w:t>, code reviews</w:t>
-      </w:r>
-      <w:r>
-        <w:rPr>
-          <w:rFonts w:asciiTheme="minorHAnsi" w:eastAsiaTheme="minorHAnsi" w:hAnsiTheme="minorHAnsi" w:cstheme="minorHAnsi"/>
-          <w:kern w:val="2"/>
-          <w:lang w:val="en-IN" w:eastAsia="en-US" w:bidi="ar-SA"/>
-          <w14:ligatures w14:val="standardContextual"/>
-        </w:rPr>
-        <w:t>, and reusable engineering standards</w:t>
-      </w:r>
-      <w:r>
-        <w:rPr>
-          <w:rFonts w:asciiTheme="minorHAnsi" w:eastAsiaTheme="minorHAnsi" w:hAnsiTheme="minorHAnsi" w:cstheme="minorHAnsi"/>
-          <w:kern w:val="2"/>
+          <w:sz w:val="22"/>
+          <w:szCs w:val="22"/>
+          <w:lang w:val="en-IN" w:eastAsia="en-US" w:bidi="ar-SA"/>
+          <w14:ligatures w14:val="standardContextual"/>
+        </w:rPr>
+        <w:t>systems</w:t>
+      </w:r>
+      <w:r>
+        <w:rPr>
+          <w:rFonts w:asciiTheme="minorHAnsi" w:eastAsiaTheme="minorHAnsi" w:hAnsiTheme="minorHAnsi" w:cstheme="minorHAnsi"/>
+          <w:kern w:val="2"/>
+          <w:sz w:val="22"/>
+          <w:szCs w:val="22"/>
+          <w:lang w:val="en-IN" w:eastAsia="en-US" w:bidi="ar-SA"/>
+          <w14:ligatures w14:val="standardContextual"/>
+        </w:rPr>
+        <w:t xml:space="preserve"> processing TB-scale telemetry data</w:t>
+      </w:r>
+      <w:r>
+        <w:rPr>
+          <w:rFonts w:asciiTheme="minorHAnsi" w:eastAsiaTheme="minorHAnsi" w:hAnsiTheme="minorHAnsi" w:cstheme="minorHAnsi"/>
+          <w:kern w:val="2"/>
+          <w:sz w:val="22"/>
+          <w:szCs w:val="22"/>
           <w:lang w:val="en-IN" w:eastAsia="en-US" w:bidi="ar-SA"/>
           <w14:ligatures w14:val="standardContextual"/>
         </w:rPr>
@@ -382,6 +425,8 @@
         <w:rPr>
           <w:rFonts w:asciiTheme="minorHAnsi" w:eastAsiaTheme="minorHAnsi" w:hAnsiTheme="minorHAnsi" w:cstheme="minorHAnsi"/>
           <w:kern w:val="2"/>
+          <w:sz w:val="22"/>
+          <w:szCs w:val="22"/>
           <w:lang w:val="en-IN" w:eastAsia="en-US" w:bidi="ar-SA"/>
           <w14:ligatures w14:val="standardContextual"/>
         </w:rPr>
@@ -392,10 +437,23 @@
           <w:b/>
           <w:bCs/>
           <w:kern w:val="2"/>
-          <w:lang w:val="en-IN" w:eastAsia="en-US" w:bidi="ar-SA"/>
-          <w14:ligatures w14:val="standardContextual"/>
-        </w:rPr>
-        <w:t>Ranked 1</w:t>
+          <w:sz w:val="22"/>
+          <w:szCs w:val="22"/>
+          <w:lang w:val="en-IN" w:eastAsia="en-US" w:bidi="ar-SA"/>
+          <w14:ligatures w14:val="standardContextual"/>
+        </w:rPr>
+        <w:t>Strong ownership mindset</w:t>
+      </w:r>
+      <w:r>
+        <w:rPr>
+          <w:rFonts w:asciiTheme="minorHAnsi" w:eastAsiaTheme="minorHAnsi" w:hAnsiTheme="minorHAnsi" w:cstheme="minorHAnsi"/>
+          <w:kern w:val="2"/>
+          <w:sz w:val="22"/>
+          <w:szCs w:val="22"/>
+          <w:lang w:val="en-IN" w:eastAsia="en-US" w:bidi="ar-SA"/>
+          <w14:ligatures w14:val="standardContextual"/>
+        </w:rPr>
+        <w:t xml:space="preserve"> with hands-on </w:t>
       </w:r>
       <w:r>
         <w:rPr>
@@ -403,10 +461,12 @@
           <w:b/>
           <w:bCs/>
           <w:kern w:val="2"/>
-          <w:lang w:val="en-IN" w:eastAsia="en-US" w:bidi="ar-SA"/>
-          <w14:ligatures w14:val="standardContextual"/>
-        </w:rPr>
-        <w:t>st</w:t>
+          <w:sz w:val="22"/>
+          <w:szCs w:val="22"/>
+          <w:lang w:val="en-IN" w:eastAsia="en-US" w:bidi="ar-SA"/>
+          <w14:ligatures w14:val="standardContextual"/>
+        </w:rPr>
+        <w:t>leadership in</w:t>
       </w:r>
       <w:r>
         <w:rPr>
@@ -414,37 +474,12 @@
           <w:b/>
           <w:bCs/>
           <w:kern w:val="2"/>
-          <w:lang w:val="en-IN" w:eastAsia="en-US" w:bidi="ar-SA"/>
-          <w14:ligatures w14:val="standardContextual"/>
-        </w:rPr>
-        <w:t xml:space="preserve">  among 120+ students</w:t>
-      </w:r>
-      <w:r>
-        <w:rPr>
-          <w:rFonts w:asciiTheme="minorHAnsi" w:eastAsiaTheme="minorHAnsi" w:hAnsiTheme="minorHAnsi" w:cstheme="minorHAnsi"/>
-          <w:kern w:val="2"/>
-          <w:lang w:val="en-IN" w:eastAsia="en-US" w:bidi="ar-SA"/>
-          <w14:ligatures w14:val="standardContextual"/>
-        </w:rPr>
-        <w:t xml:space="preserve"> in PG</w:t>
-      </w:r>
-      <w:r>
-        <w:rPr>
-          <w:rFonts w:asciiTheme="minorHAnsi" w:eastAsiaTheme="minorHAnsi" w:hAnsiTheme="minorHAnsi" w:cstheme="minorHAnsi"/>
-          <w:kern w:val="2"/>
-          <w:lang w:val="en-IN" w:eastAsia="en-US" w:bidi="ar-SA"/>
-          <w14:ligatures w14:val="standardContextual"/>
-        </w:rPr>
-        <w:t xml:space="preserve"> - </w:t>
-      </w:r>
-      <w:r>
-        <w:rPr>
-          <w:rFonts w:asciiTheme="minorHAnsi" w:eastAsiaTheme="minorHAnsi" w:hAnsiTheme="minorHAnsi" w:cstheme="minorHAnsi"/>
-          <w:kern w:val="2"/>
-          <w:lang w:val="en-IN" w:eastAsia="en-US" w:bidi="ar-SA"/>
-          <w14:ligatures w14:val="standardContextual"/>
-        </w:rPr>
-        <w:t xml:space="preserve">Diploma (Big Data Analytics) at </w:t>
+          <w:sz w:val="22"/>
+          <w:szCs w:val="22"/>
+          <w:lang w:val="en-IN" w:eastAsia="en-US" w:bidi="ar-SA"/>
+          <w14:ligatures w14:val="standardContextual"/>
+        </w:rPr>
+        <w:t xml:space="preserve"> data</w:t>
       </w:r>
       <w:r>
         <w:rPr>
@@ -452,10 +487,45 @@
           <w:b/>
           <w:bCs/>
           <w:kern w:val="2"/>
-          <w:lang w:val="en-IN" w:eastAsia="en-US" w:bidi="ar-SA"/>
-          <w14:ligatures w14:val="standardContextual"/>
-        </w:rPr>
-        <w:t>CDAC Bengaluru</w:t>
+          <w:sz w:val="22"/>
+          <w:szCs w:val="22"/>
+          <w:lang w:val="en-IN" w:eastAsia="en-US" w:bidi="ar-SA"/>
+          <w14:ligatures w14:val="standardContextual"/>
+        </w:rPr>
+        <w:t xml:space="preserve"> platform architecture</w:t>
+      </w:r>
+      <w:r>
+        <w:rPr>
+          <w:rFonts w:asciiTheme="minorHAnsi" w:eastAsiaTheme="minorHAnsi" w:hAnsiTheme="minorHAnsi" w:cstheme="minorHAnsi"/>
+          <w:kern w:val="2"/>
+          <w:sz w:val="22"/>
+          <w:szCs w:val="22"/>
+          <w:lang w:val="en-IN" w:eastAsia="en-US" w:bidi="ar-SA"/>
+          <w14:ligatures w14:val="standardContextual"/>
+        </w:rPr>
+        <w:t>, performance optimization, and reusable engineering standards</w:t>
+      </w:r>
+      <w:r>
+        <w:rPr>
+          <w:rFonts w:asciiTheme="minorHAnsi" w:eastAsiaTheme="minorHAnsi" w:hAnsiTheme="minorHAnsi" w:cstheme="minorHAnsi"/>
+          <w:kern w:val="2"/>
+          <w:sz w:val="22"/>
+          <w:szCs w:val="22"/>
+          <w:lang w:val="en-IN" w:eastAsia="en-US" w:bidi="ar-SA"/>
+          <w14:ligatures w14:val="standardContextual"/>
+        </w:rPr>
+        <w:t>.</w:t>
+      </w:r>
+      <w:r>
+        <w:rPr>
+          <w:rFonts w:asciiTheme="minorHAnsi" w:eastAsiaTheme="minorHAnsi" w:hAnsiTheme="minorHAnsi" w:cstheme="minorHAnsi"/>
+          <w:kern w:val="2"/>
+          <w:sz w:val="22"/>
+          <w:szCs w:val="22"/>
+          <w:lang w:val="en-IN" w:eastAsia="en-US" w:bidi="ar-SA"/>
+          <w14:ligatures w14:val="standardContextual"/>
+        </w:rPr>
+        <w:t xml:space="preserve"> Developed </w:t>
       </w:r>
       <w:r>
         <w:rPr>
@@ -463,10 +533,90 @@
           <w:b/>
           <w:bCs/>
           <w:kern w:val="2"/>
-          <w:lang w:val="en-IN" w:eastAsia="en-US" w:bidi="ar-SA"/>
-          <w14:ligatures w14:val="standardContextual"/>
-        </w:rPr>
-        <w:t>.</w:t>
+          <w:sz w:val="22"/>
+          <w:szCs w:val="22"/>
+          <w:lang w:val="en-IN" w:eastAsia="en-US" w:bidi="ar-SA"/>
+          <w14:ligatures w14:val="standardContextual"/>
+        </w:rPr>
+        <w:t>AI-assisted SDLC automation</w:t>
+      </w:r>
+      <w:r>
+        <w:rPr>
+          <w:rFonts w:asciiTheme="minorHAnsi" w:eastAsiaTheme="minorHAnsi" w:hAnsiTheme="minorHAnsi" w:cstheme="minorHAnsi"/>
+          <w:kern w:val="2"/>
+          <w:sz w:val="22"/>
+          <w:szCs w:val="22"/>
+          <w:lang w:val="en-IN" w:eastAsia="en-US" w:bidi="ar-SA"/>
+          <w14:ligatures w14:val="standardContextual"/>
+        </w:rPr>
+        <w:t xml:space="preserve"> using Azure OpenAI, agentic workflows, and developer productivity tooling.</w:t>
+      </w:r>
+    </w:p>
+    <w:p>
+      <w:pPr>
+        <w:pStyle w:val="LO-normal"/>
+        <w:spacing w:line="120" w:lineRule="auto"/>
+        <w:ind w:right="-397"/>
+        <w:jc w:val="both"/>
+        <w:rPr>
+          <w:rFonts w:asciiTheme="minorHAnsi" w:eastAsiaTheme="minorHAnsi" w:hAnsiTheme="minorHAnsi" w:cstheme="minorHAnsi"/>
+          <w:kern w:val="2"/>
+          <w:sz w:val="22"/>
+          <w:szCs w:val="22"/>
+          <w:lang w:val="en-IN" w:eastAsia="en-US" w:bidi="ar-SA"/>
+          <w14:ligatures w14:val="standardContextual"/>
+        </w:rPr>
+      </w:pPr>
+    </w:p>
+    <w:p>
+      <w:pPr>
+        <w:pBdr>
+          <w:bottom w:val="single" w:sz="6" w:space="1" w:color="auto"/>
+        </w:pBdr>
+        <w:spacing w:after="0" w:line="240" w:lineRule="auto"/>
+        <w:ind w:left="-397" w:right="-397"/>
+        <w:rPr>
+          <w:rFonts w:cstheme="minorHAnsi"/>
+          <w:b/>
+          <w:sz w:val="28"/>
+          <w:szCs w:val="28"/>
+        </w:rPr>
+      </w:pPr>
+      <w:r>
+        <w:rPr>
+          <w:rFonts w:cstheme="minorHAnsi"/>
+          <w:b/>
+          <w:sz w:val="28"/>
+          <w:szCs w:val="28"/>
+        </w:rPr>
+        <w:t>W</w:t>
+      </w:r>
+      <w:r>
+        <w:rPr>
+          <w:rFonts w:cstheme="minorHAnsi"/>
+          <w:b/>
+          <w:sz w:val="28"/>
+          <w:szCs w:val="28"/>
+        </w:rPr>
+        <w:t>ORK</w:t>
+      </w:r>
+      <w:r>
+        <w:rPr>
+          <w:rFonts w:cstheme="minorHAnsi"/>
+          <w:b/>
+          <w:sz w:val="28"/>
+          <w:szCs w:val="28"/>
+        </w:rPr>
+        <w:t xml:space="preserve"> A</w:t>
+      </w:r>
+      <w:r>
+        <w:rPr>
+          <w:rFonts w:cstheme="minorHAnsi"/>
+          <w:b/>
+          <w:sz w:val="28"/>
+          <w:szCs w:val="28"/>
+        </w:rPr>
+        <w:t>UTHORIZATION</w:t>
       </w:r>
     </w:p>
     <w:p>
@@ -477,59 +627,91 @@
           <w:numId w:val="26"/>
         </w:numPr>
         <w:ind w:left="0" w:right="-397"/>
-        <w:rPr>
-          <w:rFonts w:asciiTheme="minorHAnsi" w:eastAsiaTheme="minorHAnsi" w:hAnsiTheme="minorHAnsi" w:cstheme="minorHAnsi"/>
-          <w:kern w:val="2"/>
-          <w:lang w:val="en-IN" w:eastAsia="en-US" w:bidi="ar-SA"/>
-          <w14:ligatures w14:val="standardContextual"/>
-        </w:rPr>
-      </w:pPr>
-      <w:r>
-        <w:rPr>
-          <w:rFonts w:asciiTheme="minorHAnsi" w:eastAsiaTheme="minorHAnsi" w:hAnsiTheme="minorHAnsi" w:cstheme="minorHAnsi"/>
-          <w:kern w:val="2"/>
-          <w:lang w:val="en-IN" w:eastAsia="en-US" w:bidi="ar-SA"/>
-          <w14:ligatures w14:val="standardContextual"/>
-        </w:rPr>
-        <w:t xml:space="preserve">HackerRank 5 star in </w:t>
-      </w:r>
+        <w:jc w:val="both"/>
+        <w:rPr>
+          <w:rFonts w:asciiTheme="minorHAnsi" w:eastAsiaTheme="minorHAnsi" w:hAnsiTheme="minorHAnsi" w:cstheme="minorHAnsi"/>
+          <w:kern w:val="2"/>
+          <w:sz w:val="22"/>
+          <w:szCs w:val="22"/>
+          <w:lang w:val="en-IN" w:eastAsia="en-US" w:bidi="ar-SA"/>
+          <w14:ligatures w14:val="standardContextual"/>
+        </w:rPr>
+      </w:pPr>
+      <w:r>
+        <w:rPr>
+          <w:rFonts w:asciiTheme="minorHAnsi" w:eastAsiaTheme="minorHAnsi" w:hAnsiTheme="minorHAnsi" w:cstheme="minorHAnsi"/>
+          <w:kern w:val="2"/>
+          <w:sz w:val="22"/>
+          <w:szCs w:val="22"/>
+          <w:lang w:val="en-IN" w:eastAsia="en-US" w:bidi="ar-SA"/>
+          <w14:ligatures w14:val="standardContextual"/>
+        </w:rPr>
+        <w:t>Non</w:t>
+      </w:r>
+      <w:r>
+        <w:rPr>
+          <w:rFonts w:asciiTheme="minorHAnsi" w:eastAsiaTheme="minorHAnsi" w:hAnsiTheme="minorHAnsi" w:cstheme="minorHAnsi"/>
+          <w:kern w:val="2"/>
+          <w:sz w:val="22"/>
+          <w:szCs w:val="22"/>
+          <w:lang w:val="en-IN" w:eastAsia="en-US" w:bidi="ar-SA"/>
+          <w14:ligatures w14:val="standardContextual"/>
+        </w:rPr>
+        <w:t>-</w:t>
+      </w:r>
+      <w:r>
+        <w:rPr>
+          <w:rFonts w:asciiTheme="minorHAnsi" w:eastAsiaTheme="minorHAnsi" w:hAnsiTheme="minorHAnsi" w:cstheme="minorHAnsi"/>
+          <w:kern w:val="2"/>
+          <w:sz w:val="22"/>
+          <w:szCs w:val="22"/>
+          <w:lang w:val="en-IN" w:eastAsia="en-US" w:bidi="ar-SA"/>
+          <w14:ligatures w14:val="standardContextual"/>
+        </w:rPr>
+        <w:t xml:space="preserve">EU. </w:t>
+      </w:r>
+      <w:r>
+        <w:rPr>
+          <w:rFonts w:asciiTheme="minorHAnsi" w:eastAsiaTheme="minorHAnsi" w:hAnsiTheme="minorHAnsi" w:cstheme="minorHAnsi"/>
+          <w:kern w:val="2"/>
+          <w:sz w:val="22"/>
+          <w:szCs w:val="22"/>
+          <w:lang w:val="en-IN" w:eastAsia="en-US" w:bidi="ar-SA"/>
+          <w14:ligatures w14:val="standardContextual"/>
+        </w:rPr>
+        <w:t>Requires employer sponsorship (Highly Skilled Migrant / EU Blue Card). Ready to relocate to Netherlands.</w:t>
+      </w:r>
+    </w:p>
+    <w:p>
+      <w:pPr>
+        <w:pStyle w:val="LO-normal"/>
+        <w:numPr>
+          <w:ilvl w:val="0"/>
+          <w:numId w:val="26"/>
+        </w:numPr>
+        <w:ind w:left="0" w:right="-397"/>
+        <w:jc w:val="both"/>
+        <w:rPr>
+          <w:rFonts w:asciiTheme="minorHAnsi" w:eastAsiaTheme="minorHAnsi" w:hAnsiTheme="minorHAnsi" w:cstheme="minorHAnsi"/>
+          <w:kern w:val="2"/>
+          <w:sz w:val="22"/>
+          <w:szCs w:val="22"/>
+          <w:lang w:val="en-IN" w:eastAsia="en-US" w:bidi="ar-SA"/>
+          <w14:ligatures w14:val="standardContextual"/>
+        </w:rPr>
+      </w:pPr>
       <w:r>
         <w:rPr>
           <w:rFonts w:asciiTheme="minorHAnsi" w:eastAsiaTheme="minorHAnsi" w:hAnsiTheme="minorHAnsi" w:cstheme="minorHAnsi"/>
           <w:b/>
           <w:bCs/>
           <w:kern w:val="2"/>
-          <w:lang w:val="en-IN" w:eastAsia="en-US" w:bidi="ar-SA"/>
-          <w14:ligatures w14:val="standardContextual"/>
-        </w:rPr>
-        <w:t>Python and SQL</w:t>
-      </w:r>
-      <w:r>
-        <w:rPr>
-          <w:rFonts w:asciiTheme="minorHAnsi" w:eastAsiaTheme="minorHAnsi" w:hAnsiTheme="minorHAnsi" w:cstheme="minorHAnsi"/>
-          <w:kern w:val="2"/>
-          <w:lang w:val="en-IN" w:eastAsia="en-US" w:bidi="ar-SA"/>
-          <w14:ligatures w14:val="standardContextual"/>
-        </w:rPr>
-        <w:t>;</w:t>
-      </w:r>
-      <w:r>
-        <w:rPr>
-          <w:rFonts w:asciiTheme="minorHAnsi" w:eastAsiaTheme="minorHAnsi" w:hAnsiTheme="minorHAnsi" w:cstheme="minorHAnsi"/>
-          <w:kern w:val="2"/>
-          <w:lang w:val="en-IN" w:eastAsia="en-US" w:bidi="ar-SA"/>
-          <w14:ligatures w14:val="standardContextual"/>
-        </w:rPr>
-        <w:t xml:space="preserve"> Solved</w:t>
-      </w:r>
-      <w:r>
-        <w:rPr>
-          <w:rFonts w:asciiTheme="minorHAnsi" w:eastAsiaTheme="minorHAnsi" w:hAnsiTheme="minorHAnsi" w:cstheme="minorHAnsi"/>
-          <w:kern w:val="2"/>
-          <w:lang w:val="en-IN" w:eastAsia="en-US" w:bidi="ar-SA"/>
-          <w14:ligatures w14:val="standardContextual"/>
-        </w:rPr>
-        <w:t xml:space="preserve"> </w:t>
+          <w:sz w:val="22"/>
+          <w:szCs w:val="22"/>
+          <w:lang w:val="en-IN" w:eastAsia="en-US" w:bidi="ar-SA"/>
+          <w14:ligatures w14:val="standardContextual"/>
+        </w:rPr>
+        <w:t xml:space="preserve">Languages: </w:t>
       </w:r>
       <w:r>
         <w:rPr>
@@ -537,28 +719,104 @@
           <w:b/>
           <w:bCs/>
           <w:kern w:val="2"/>
-          <w:lang w:val="en-IN" w:eastAsia="en-US" w:bidi="ar-SA"/>
-          <w14:ligatures w14:val="standardContextual"/>
-        </w:rPr>
-        <w:t>700+ LeetCode problems</w:t>
-      </w:r>
-      <w:r>
-        <w:rPr>
-          <w:rFonts w:asciiTheme="minorHAnsi" w:eastAsiaTheme="minorHAnsi" w:hAnsiTheme="minorHAnsi" w:cstheme="minorHAnsi"/>
-          <w:kern w:val="2"/>
-          <w:lang w:val="en-IN" w:eastAsia="en-US" w:bidi="ar-SA"/>
-          <w14:ligatures w14:val="standardContextual"/>
-        </w:rPr>
-        <w:t xml:space="preserve"> with hands-on CI/CD, and agile collaboratio</w:t>
-      </w:r>
-      <w:r>
-        <w:rPr>
-          <w:rFonts w:asciiTheme="minorHAnsi" w:eastAsiaTheme="minorHAnsi" w:hAnsiTheme="minorHAnsi" w:cstheme="minorHAnsi"/>
-          <w:kern w:val="2"/>
-          <w:lang w:val="en-IN" w:eastAsia="en-US" w:bidi="ar-SA"/>
-          <w14:ligatures w14:val="standardContextual"/>
-        </w:rPr>
-        <w:t>ns.</w:t>
+          <w:sz w:val="22"/>
+          <w:szCs w:val="22"/>
+          <w:lang w:val="en-IN" w:eastAsia="en-US" w:bidi="ar-SA"/>
+          <w14:ligatures w14:val="standardContextual"/>
+        </w:rPr>
+        <w:t>English</w:t>
+      </w:r>
+      <w:r>
+        <w:rPr>
+          <w:rFonts w:asciiTheme="minorHAnsi" w:eastAsiaTheme="minorHAnsi" w:hAnsiTheme="minorHAnsi" w:cstheme="minorHAnsi"/>
+          <w:kern w:val="2"/>
+          <w:sz w:val="22"/>
+          <w:szCs w:val="22"/>
+          <w:lang w:val="en-IN" w:eastAsia="en-US" w:bidi="ar-SA"/>
+          <w14:ligatures w14:val="standardContextual"/>
+        </w:rPr>
+        <w:t xml:space="preserve"> - </w:t>
+      </w:r>
+      <w:r>
+        <w:rPr>
+          <w:rFonts w:asciiTheme="minorHAnsi" w:eastAsiaTheme="minorHAnsi" w:hAnsiTheme="minorHAnsi" w:cstheme="minorHAnsi"/>
+          <w:kern w:val="2"/>
+          <w:sz w:val="22"/>
+          <w:szCs w:val="22"/>
+          <w:lang w:val="en-IN" w:eastAsia="en-US" w:bidi="ar-SA"/>
+          <w14:ligatures w14:val="standardContextual"/>
+        </w:rPr>
+        <w:t xml:space="preserve">Fluent/Professional; </w:t>
+      </w:r>
+      <w:r>
+        <w:rPr>
+          <w:rFonts w:asciiTheme="minorHAnsi" w:eastAsiaTheme="minorHAnsi" w:hAnsiTheme="minorHAnsi" w:cstheme="minorHAnsi"/>
+          <w:b/>
+          <w:bCs/>
+          <w:kern w:val="2"/>
+          <w:sz w:val="22"/>
+          <w:szCs w:val="22"/>
+          <w:lang w:val="en-IN" w:eastAsia="en-US" w:bidi="ar-SA"/>
+          <w14:ligatures w14:val="standardContextual"/>
+        </w:rPr>
+        <w:t>Hindi</w:t>
+      </w:r>
+      <w:r>
+        <w:rPr>
+          <w:rFonts w:asciiTheme="minorHAnsi" w:eastAsiaTheme="minorHAnsi" w:hAnsiTheme="minorHAnsi" w:cstheme="minorHAnsi"/>
+          <w:kern w:val="2"/>
+          <w:sz w:val="22"/>
+          <w:szCs w:val="22"/>
+          <w:lang w:val="en-IN" w:eastAsia="en-US" w:bidi="ar-SA"/>
+          <w14:ligatures w14:val="standardContextual"/>
+        </w:rPr>
+        <w:t xml:space="preserve"> - </w:t>
+      </w:r>
+      <w:r>
+        <w:rPr>
+          <w:rFonts w:asciiTheme="minorHAnsi" w:eastAsiaTheme="minorHAnsi" w:hAnsiTheme="minorHAnsi" w:cstheme="minorHAnsi"/>
+          <w:kern w:val="2"/>
+          <w:sz w:val="22"/>
+          <w:szCs w:val="22"/>
+          <w:lang w:val="en-IN" w:eastAsia="en-US" w:bidi="ar-SA"/>
+          <w14:ligatures w14:val="standardContextual"/>
+        </w:rPr>
+        <w:t xml:space="preserve">Native; </w:t>
+      </w:r>
+      <w:r>
+        <w:rPr>
+          <w:rFonts w:asciiTheme="minorHAnsi" w:eastAsiaTheme="minorHAnsi" w:hAnsiTheme="minorHAnsi" w:cstheme="minorHAnsi"/>
+          <w:b/>
+          <w:bCs/>
+          <w:kern w:val="2"/>
+          <w:sz w:val="22"/>
+          <w:szCs w:val="22"/>
+          <w:lang w:val="en-IN" w:eastAsia="en-US" w:bidi="ar-SA"/>
+          <w14:ligatures w14:val="standardContextual"/>
+        </w:rPr>
+        <w:t>Dutch</w:t>
+      </w:r>
+      <w:r>
+        <w:rPr>
+          <w:rFonts w:asciiTheme="minorHAnsi" w:eastAsiaTheme="minorHAnsi" w:hAnsiTheme="minorHAnsi" w:cstheme="minorHAnsi"/>
+          <w:kern w:val="2"/>
+          <w:sz w:val="22"/>
+          <w:szCs w:val="22"/>
+          <w:lang w:val="en-IN" w:eastAsia="en-US" w:bidi="ar-SA"/>
+          <w14:ligatures w14:val="standardContextual"/>
+        </w:rPr>
+        <w:t xml:space="preserve"> - </w:t>
+      </w:r>
+      <w:r>
+        <w:rPr>
+          <w:rFonts w:asciiTheme="minorHAnsi" w:eastAsiaTheme="minorHAnsi" w:hAnsiTheme="minorHAnsi" w:cstheme="minorHAnsi"/>
+          <w:kern w:val="2"/>
+          <w:sz w:val="22"/>
+          <w:szCs w:val="22"/>
+          <w:lang w:val="en-IN" w:eastAsia="en-US" w:bidi="ar-SA"/>
+          <w14:ligatures w14:val="standardContextual"/>
+        </w:rPr>
+        <w:t>A1 (learning)</w:t>
       </w:r>
     </w:p>
     <w:p>
@@ -572,8 +830,8 @@
           <w:b/>
           <w:bCs/>
           <w:kern w:val="2"/>
-          <w:sz w:val="22"/>
-          <w:szCs w:val="22"/>
+          <w:sz w:val="20"/>
+          <w:szCs w:val="20"/>
           <w:lang w:val="en-IN" w:eastAsia="en-US" w:bidi="ar-SA"/>
           <w14:ligatures w14:val="standardContextual"/>
         </w:rPr>
@@ -588,16 +846,14 @@
         <w:ind w:left="-397" w:right="-397"/>
         <w:rPr>
           <w:rFonts w:cstheme="minorHAnsi"/>
-          <w:sz w:val="24"/>
-          <w:szCs w:val="24"/>
         </w:rPr>
       </w:pPr>
       <w:r>
         <w:rPr>
           <w:rFonts w:cstheme="minorHAnsi"/>
           <w:b/>
-          <w:sz w:val="32"/>
-          <w:szCs w:val="32"/>
+          <w:sz w:val="28"/>
+          <w:szCs w:val="28"/>
         </w:rPr>
         <w:t>EXPERIENCE</w:t>
       </w:r>
@@ -611,22 +867,20 @@
           <w:rFonts w:asciiTheme="minorHAnsi" w:eastAsiaTheme="minorHAnsi" w:hAnsiTheme="minorHAnsi" w:cstheme="minorHAnsi"/>
           <w:b/>
           <w:kern w:val="2"/>
-          <w:sz w:val="32"/>
-          <w:szCs w:val="32"/>
-          <w:lang w:val="en-IN" w:eastAsia="en-US" w:bidi="ar-SA"/>
-          <w14:ligatures w14:val="standardContextual"/>
-        </w:rPr>
-      </w:pPr>
-      <w:r>
-        <w:rPr>
-          <w:rFonts w:asciiTheme="minorHAnsi" w:eastAsiaTheme="minorHAnsi" w:hAnsiTheme="minorHAnsi" w:cstheme="minorHAnsi"/>
-          <w:b/>
-          <w:kern w:val="2"/>
           <w:sz w:val="28"/>
           <w:szCs w:val="28"/>
           <w:lang w:val="en-IN" w:eastAsia="en-US" w:bidi="ar-SA"/>
           <w14:ligatures w14:val="standardContextual"/>
         </w:rPr>
+      </w:pPr>
+      <w:r>
+        <w:rPr>
+          <w:rFonts w:asciiTheme="minorHAnsi" w:eastAsiaTheme="minorHAnsi" w:hAnsiTheme="minorHAnsi" w:cstheme="minorHAnsi"/>
+          <w:b/>
+          <w:kern w:val="2"/>
+          <w:lang w:val="en-IN" w:eastAsia="en-US" w:bidi="ar-SA"/>
+          <w14:ligatures w14:val="standardContextual"/>
+        </w:rPr>
         <w:t>Data Engineer, Alstom</w:t>
       </w:r>
       <w:r>
@@ -634,8 +888,6 @@
           <w:rFonts w:asciiTheme="minorHAnsi" w:eastAsiaTheme="minorHAnsi" w:hAnsiTheme="minorHAnsi" w:cstheme="minorHAnsi"/>
           <w:b/>
           <w:kern w:val="2"/>
-          <w:sz w:val="28"/>
-          <w:szCs w:val="28"/>
           <w:lang w:val="en-IN" w:eastAsia="en-US" w:bidi="ar-SA"/>
           <w14:ligatures w14:val="standardContextual"/>
         </w:rPr>
@@ -646,8 +898,6 @@
           <w:rFonts w:asciiTheme="minorHAnsi" w:eastAsiaTheme="minorHAnsi" w:hAnsiTheme="minorHAnsi" w:cstheme="minorHAnsi"/>
           <w:b/>
           <w:kern w:val="2"/>
-          <w:sz w:val="28"/>
-          <w:szCs w:val="28"/>
           <w:lang w:val="en-IN" w:eastAsia="en-US" w:bidi="ar-SA"/>
           <w14:ligatures w14:val="standardContextual"/>
         </w:rPr>
@@ -658,8 +908,6 @@
           <w:rFonts w:asciiTheme="minorHAnsi" w:eastAsiaTheme="minorHAnsi" w:hAnsiTheme="minorHAnsi" w:cstheme="minorHAnsi"/>
           <w:b/>
           <w:kern w:val="2"/>
-          <w:sz w:val="28"/>
-          <w:szCs w:val="28"/>
           <w:lang w:val="en-IN" w:eastAsia="en-US" w:bidi="ar-SA"/>
           <w14:ligatures w14:val="standardContextual"/>
         </w:rPr>
@@ -670,8 +918,6 @@
           <w:rFonts w:asciiTheme="minorHAnsi" w:eastAsiaTheme="minorHAnsi" w:hAnsiTheme="minorHAnsi" w:cstheme="minorHAnsi"/>
           <w:b/>
           <w:kern w:val="2"/>
-          <w:sz w:val="28"/>
-          <w:szCs w:val="28"/>
           <w:lang w:val="en-IN" w:eastAsia="en-US" w:bidi="ar-SA"/>
           <w14:ligatures w14:val="standardContextual"/>
         </w:rPr>
@@ -682,8 +928,6 @@
           <w:rFonts w:asciiTheme="minorHAnsi" w:eastAsiaTheme="minorHAnsi" w:hAnsiTheme="minorHAnsi" w:cstheme="minorHAnsi"/>
           <w:b/>
           <w:kern w:val="2"/>
-          <w:sz w:val="28"/>
-          <w:szCs w:val="28"/>
           <w:lang w:val="en-IN" w:eastAsia="en-US" w:bidi="ar-SA"/>
           <w14:ligatures w14:val="standardContextual"/>
         </w:rPr>
@@ -694,8 +938,6 @@
           <w:rFonts w:asciiTheme="minorHAnsi" w:eastAsiaTheme="minorHAnsi" w:hAnsiTheme="minorHAnsi" w:cstheme="minorHAnsi"/>
           <w:b/>
           <w:kern w:val="2"/>
-          <w:sz w:val="28"/>
-          <w:szCs w:val="28"/>
           <w:lang w:val="en-IN" w:eastAsia="en-US" w:bidi="ar-SA"/>
           <w14:ligatures w14:val="standardContextual"/>
         </w:rPr>
@@ -706,8 +948,6 @@
           <w:rFonts w:asciiTheme="minorHAnsi" w:eastAsiaTheme="minorHAnsi" w:hAnsiTheme="minorHAnsi" w:cstheme="minorHAnsi"/>
           <w:b/>
           <w:kern w:val="2"/>
-          <w:sz w:val="28"/>
-          <w:szCs w:val="28"/>
           <w:lang w:val="en-IN" w:eastAsia="en-US" w:bidi="ar-SA"/>
           <w14:ligatures w14:val="standardContextual"/>
         </w:rPr>
@@ -718,8 +958,26 @@
           <w:rFonts w:asciiTheme="minorHAnsi" w:eastAsiaTheme="minorHAnsi" w:hAnsiTheme="minorHAnsi" w:cstheme="minorHAnsi"/>
           <w:b/>
           <w:kern w:val="2"/>
-          <w:sz w:val="28"/>
-          <w:szCs w:val="28"/>
+          <w:lang w:val="en-IN" w:eastAsia="en-US" w:bidi="ar-SA"/>
+          <w14:ligatures w14:val="standardContextual"/>
+        </w:rPr>
+        <w:tab/>
+      </w:r>
+      <w:r>
+        <w:rPr>
+          <w:rFonts w:asciiTheme="minorHAnsi" w:eastAsiaTheme="minorHAnsi" w:hAnsiTheme="minorHAnsi" w:cstheme="minorHAnsi"/>
+          <w:b/>
+          <w:kern w:val="2"/>
+          <w:lang w:val="en-IN" w:eastAsia="en-US" w:bidi="ar-SA"/>
+          <w14:ligatures w14:val="standardContextual"/>
+        </w:rPr>
+        <w:tab/>
+      </w:r>
+      <w:r>
+        <w:rPr>
+          <w:rFonts w:asciiTheme="minorHAnsi" w:eastAsiaTheme="minorHAnsi" w:hAnsiTheme="minorHAnsi" w:cstheme="minorHAnsi"/>
+          <w:b/>
+          <w:kern w:val="2"/>
           <w:lang w:val="en-IN" w:eastAsia="en-US" w:bidi="ar-SA"/>
           <w14:ligatures w14:val="standardContextual"/>
         </w:rPr>
@@ -731,8 +989,6 @@
           <w:rFonts w:asciiTheme="minorHAnsi" w:eastAsiaTheme="minorHAnsi" w:hAnsiTheme="minorHAnsi" w:cstheme="minorHAnsi"/>
           <w:b/>
           <w:kern w:val="2"/>
-          <w:sz w:val="28"/>
-          <w:szCs w:val="28"/>
           <w:lang w:val="en-IN" w:eastAsia="en-US" w:bidi="ar-SA"/>
           <w14:ligatures w14:val="standardContextual"/>
         </w:rPr>
@@ -743,8 +999,6 @@
           <w:rFonts w:asciiTheme="minorHAnsi" w:eastAsiaTheme="minorHAnsi" w:hAnsiTheme="minorHAnsi" w:cstheme="minorHAnsi"/>
           <w:b/>
           <w:kern w:val="2"/>
-          <w:sz w:val="28"/>
-          <w:szCs w:val="28"/>
           <w:lang w:val="en-IN" w:eastAsia="en-US" w:bidi="ar-SA"/>
           <w14:ligatures w14:val="standardContextual"/>
         </w:rPr>
@@ -755,8 +1009,6 @@
           <w:rFonts w:asciiTheme="minorHAnsi" w:eastAsiaTheme="minorHAnsi" w:hAnsiTheme="minorHAnsi" w:cstheme="minorHAnsi"/>
           <w:b/>
           <w:kern w:val="2"/>
-          <w:sz w:val="28"/>
-          <w:szCs w:val="28"/>
           <w:lang w:val="en-IN" w:eastAsia="en-US" w:bidi="ar-SA"/>
           <w14:ligatures w14:val="standardContextual"/>
         </w:rPr>
@@ -775,18 +1027,33 @@
         <w:rPr>
           <w:rFonts w:asciiTheme="minorHAnsi" w:eastAsiaTheme="minorHAnsi" w:hAnsiTheme="minorHAnsi" w:cstheme="minorHAnsi"/>
           <w:kern w:val="2"/>
-          <w:lang w:val="en-IN" w:eastAsia="en-US" w:bidi="ar-SA"/>
-          <w14:ligatures w14:val="standardContextual"/>
-        </w:rPr>
-      </w:pPr>
-      <w:r>
-        <w:rPr>
-          <w:rFonts w:asciiTheme="minorHAnsi" w:eastAsiaTheme="minorHAnsi" w:hAnsiTheme="minorHAnsi" w:cstheme="minorHAnsi"/>
-          <w:kern w:val="2"/>
-          <w:lang w:val="en-IN" w:eastAsia="en-US" w:bidi="ar-SA"/>
-          <w14:ligatures w14:val="standardContextual"/>
-        </w:rPr>
-        <w:t>Worked on development of company wide, multi product log analytics platform (</w:t>
+          <w:sz w:val="22"/>
+          <w:szCs w:val="22"/>
+          <w:lang w:val="en-IN" w:eastAsia="en-US" w:bidi="ar-SA"/>
+          <w14:ligatures w14:val="standardContextual"/>
+        </w:rPr>
+      </w:pPr>
+      <w:r>
+        <w:rPr>
+          <w:rFonts w:asciiTheme="minorHAnsi" w:eastAsiaTheme="minorHAnsi" w:hAnsiTheme="minorHAnsi" w:cstheme="minorHAnsi"/>
+          <w:kern w:val="2"/>
+          <w:sz w:val="22"/>
+          <w:szCs w:val="22"/>
+          <w:lang w:val="en-IN" w:eastAsia="en-US" w:bidi="ar-SA"/>
+          <w14:ligatures w14:val="standardContextual"/>
+        </w:rPr>
+        <w:t>Took</w:t>
+      </w:r>
+      <w:r>
+        <w:rPr>
+          <w:rFonts w:asciiTheme="minorHAnsi" w:eastAsiaTheme="minorHAnsi" w:hAnsiTheme="minorHAnsi" w:cstheme="minorHAnsi"/>
+          <w:kern w:val="2"/>
+          <w:sz w:val="22"/>
+          <w:szCs w:val="22"/>
+          <w:lang w:val="en-IN" w:eastAsia="en-US" w:bidi="ar-SA"/>
+          <w14:ligatures w14:val="standardContextual"/>
+        </w:rPr>
+        <w:t xml:space="preserve"> </w:t>
       </w:r>
       <w:r>
         <w:rPr>
@@ -794,6 +1061,8 @@
           <w:b/>
           <w:bCs/>
           <w:kern w:val="2"/>
+          <w:sz w:val="22"/>
+          <w:szCs w:val="22"/>
           <w:lang w:val="en-IN" w:eastAsia="en-US" w:bidi="ar-SA"/>
           <w14:ligatures w14:val="standardContextual"/>
         </w:rPr>
@@ -803,10 +1072,12 @@
         <w:rPr>
           <w:rFonts w:asciiTheme="minorHAnsi" w:eastAsiaTheme="minorHAnsi" w:hAnsiTheme="minorHAnsi" w:cstheme="minorHAnsi"/>
           <w:kern w:val="2"/>
-          <w:lang w:val="en-IN" w:eastAsia="en-US" w:bidi="ar-SA"/>
-          <w14:ligatures w14:val="standardContextual"/>
-        </w:rPr>
-        <w:t xml:space="preserve">) for train telemetry subsystems (CCP2, MooN) built from POC to production on a </w:t>
+          <w:sz w:val="22"/>
+          <w:szCs w:val="22"/>
+          <w:lang w:val="en-IN" w:eastAsia="en-US" w:bidi="ar-SA"/>
+          <w14:ligatures w14:val="standardContextual"/>
+        </w:rPr>
+        <w:t xml:space="preserve">, a company-wide log analytics platform for train telemetry subsystems from POC to production on a </w:t>
       </w:r>
       <w:r>
         <w:rPr>
@@ -814,6 +1085,8 @@
           <w:b/>
           <w:bCs/>
           <w:kern w:val="2"/>
+          <w:sz w:val="22"/>
+          <w:szCs w:val="22"/>
           <w:lang w:val="en-IN" w:eastAsia="en-US" w:bidi="ar-SA"/>
           <w14:ligatures w14:val="standardContextual"/>
         </w:rPr>
@@ -823,10 +1096,12 @@
         <w:rPr>
           <w:rFonts w:asciiTheme="minorHAnsi" w:eastAsiaTheme="minorHAnsi" w:hAnsiTheme="minorHAnsi" w:cstheme="minorHAnsi"/>
           <w:kern w:val="2"/>
-          <w:lang w:val="en-IN" w:eastAsia="en-US" w:bidi="ar-SA"/>
-          <w14:ligatures w14:val="standardContextual"/>
-        </w:rPr>
-        <w:t xml:space="preserve">; unified heterogeneous logs for KPIs, log browsing, and pattern matching. (Processes </w:t>
+          <w:sz w:val="22"/>
+          <w:szCs w:val="22"/>
+          <w:lang w:val="en-IN" w:eastAsia="en-US" w:bidi="ar-SA"/>
+          <w14:ligatures w14:val="standardContextual"/>
+        </w:rPr>
+        <w:t xml:space="preserve">; unified heterogeneous logs and delivered </w:t>
       </w:r>
       <w:r>
         <w:rPr>
@@ -834,19 +1109,34 @@
           <w:b/>
           <w:bCs/>
           <w:kern w:val="2"/>
-          <w:lang w:val="en-IN" w:eastAsia="en-US" w:bidi="ar-SA"/>
-          <w14:ligatures w14:val="standardContextual"/>
-        </w:rPr>
-        <w:t>millions of events</w:t>
-      </w:r>
-      <w:r>
-        <w:rPr>
-          <w:rFonts w:asciiTheme="minorHAnsi" w:eastAsiaTheme="minorHAnsi" w:hAnsiTheme="minorHAnsi" w:cstheme="minorHAnsi"/>
-          <w:kern w:val="2"/>
-          <w:lang w:val="en-IN" w:eastAsia="en-US" w:bidi="ar-SA"/>
-          <w14:ligatures w14:val="standardContextual"/>
-        </w:rPr>
-        <w:t xml:space="preserve"> and </w:t>
+          <w:sz w:val="22"/>
+          <w:szCs w:val="22"/>
+          <w:lang w:val="en-IN" w:eastAsia="en-US" w:bidi="ar-SA"/>
+          <w14:ligatures w14:val="standardContextual"/>
+        </w:rPr>
+        <w:t>Power BI dashboards</w:t>
+      </w:r>
+      <w:r>
+        <w:rPr>
+          <w:rFonts w:asciiTheme="minorHAnsi" w:eastAsiaTheme="minorHAnsi" w:hAnsiTheme="minorHAnsi" w:cstheme="minorHAnsi"/>
+          <w:kern w:val="2"/>
+          <w:sz w:val="22"/>
+          <w:szCs w:val="22"/>
+          <w:lang w:val="en-IN" w:eastAsia="en-US" w:bidi="ar-SA"/>
+          <w14:ligatures w14:val="standardContextual"/>
+        </w:rPr>
+        <w:t xml:space="preserve"> for KPI monitoring, log exploration, and pattern analysis</w:t>
+      </w:r>
+      <w:r>
+        <w:rPr>
+          <w:rFonts w:asciiTheme="minorHAnsi" w:eastAsiaTheme="minorHAnsi" w:hAnsiTheme="minorHAnsi" w:cstheme="minorHAnsi"/>
+          <w:kern w:val="2"/>
+          <w:sz w:val="22"/>
+          <w:szCs w:val="22"/>
+          <w:lang w:val="en-IN" w:eastAsia="en-US" w:bidi="ar-SA"/>
+          <w14:ligatures w14:val="standardContextual"/>
+        </w:rPr>
+        <w:t xml:space="preserve">; </w:t>
       </w:r>
       <w:r>
         <w:rPr>
@@ -854,19 +1144,23 @@
           <w:b/>
           <w:bCs/>
           <w:kern w:val="2"/>
-          <w:lang w:val="en-IN" w:eastAsia="en-US" w:bidi="ar-SA"/>
-          <w14:ligatures w14:val="standardContextual"/>
-        </w:rPr>
-        <w:t xml:space="preserve">TB scale </w:t>
-      </w:r>
-      <w:r>
-        <w:rPr>
-          <w:rFonts w:asciiTheme="minorHAnsi" w:eastAsiaTheme="minorHAnsi" w:hAnsiTheme="minorHAnsi" w:cstheme="minorHAnsi"/>
-          <w:kern w:val="2"/>
-          <w:lang w:val="en-IN" w:eastAsia="en-US" w:bidi="ar-SA"/>
-          <w14:ligatures w14:val="standardContextual"/>
-        </w:rPr>
-        <w:t>data daily)</w:t>
+          <w:sz w:val="22"/>
+          <w:szCs w:val="22"/>
+          <w:lang w:val="en-IN" w:eastAsia="en-US" w:bidi="ar-SA"/>
+          <w14:ligatures w14:val="standardContextual"/>
+        </w:rPr>
+        <w:t>reduced recurring analysis cycles from 2 months to under 1 week</w:t>
+      </w:r>
+      <w:r>
+        <w:rPr>
+          <w:rFonts w:asciiTheme="minorHAnsi" w:eastAsiaTheme="minorHAnsi" w:hAnsiTheme="minorHAnsi" w:cstheme="minorHAnsi"/>
+          <w:kern w:val="2"/>
+          <w:sz w:val="22"/>
+          <w:szCs w:val="22"/>
+          <w:lang w:val="en-IN" w:eastAsia="en-US" w:bidi="ar-SA"/>
+          <w14:ligatures w14:val="standardContextual"/>
+        </w:rPr>
+        <w:t>.</w:t>
       </w:r>
     </w:p>
     <w:p>
@@ -881,6 +1175,8 @@
         <w:rPr>
           <w:rFonts w:asciiTheme="minorHAnsi" w:eastAsiaTheme="minorHAnsi" w:hAnsiTheme="minorHAnsi" w:cstheme="minorHAnsi"/>
           <w:kern w:val="2"/>
+          <w:sz w:val="22"/>
+          <w:szCs w:val="22"/>
           <w:lang w:val="en-IN" w:eastAsia="en-US" w:bidi="ar-SA"/>
           <w14:ligatures w14:val="standardContextual"/>
         </w:rPr>
@@ -891,6 +1187,8 @@
           <w:b/>
           <w:bCs/>
           <w:kern w:val="2"/>
+          <w:sz w:val="22"/>
+          <w:szCs w:val="22"/>
           <w:lang w:val="en-IN" w:eastAsia="en-US" w:bidi="ar-SA"/>
           <w14:ligatures w14:val="standardContextual"/>
         </w:rPr>
@@ -900,6 +1198,8 @@
         <w:rPr>
           <w:rFonts w:asciiTheme="minorHAnsi" w:eastAsiaTheme="minorHAnsi" w:hAnsiTheme="minorHAnsi" w:cstheme="minorHAnsi"/>
           <w:kern w:val="2"/>
+          <w:sz w:val="22"/>
+          <w:szCs w:val="22"/>
           <w:lang w:val="en-IN" w:eastAsia="en-US" w:bidi="ar-SA"/>
           <w14:ligatures w14:val="standardContextual"/>
         </w:rPr>
@@ -911,6 +1211,8 @@
           <w:b/>
           <w:bCs/>
           <w:kern w:val="2"/>
+          <w:sz w:val="22"/>
+          <w:szCs w:val="22"/>
           <w:lang w:val="en-IN" w:eastAsia="en-US" w:bidi="ar-SA"/>
           <w14:ligatures w14:val="standardContextual"/>
         </w:rPr>
@@ -920,6 +1222,8 @@
         <w:rPr>
           <w:rFonts w:asciiTheme="minorHAnsi" w:eastAsiaTheme="minorHAnsi" w:hAnsiTheme="minorHAnsi" w:cstheme="minorHAnsi"/>
           <w:kern w:val="2"/>
+          <w:sz w:val="22"/>
+          <w:szCs w:val="22"/>
           <w:lang w:val="en-IN" w:eastAsia="en-US" w:bidi="ar-SA"/>
           <w14:ligatures w14:val="standardContextual"/>
         </w:rPr>
@@ -929,6 +1233,8 @@
         <w:rPr>
           <w:rFonts w:asciiTheme="minorHAnsi" w:eastAsiaTheme="minorHAnsi" w:hAnsiTheme="minorHAnsi" w:cstheme="minorHAnsi"/>
           <w:kern w:val="2"/>
+          <w:sz w:val="22"/>
+          <w:szCs w:val="22"/>
           <w:lang w:val="en-IN" w:eastAsia="en-US" w:bidi="ar-SA"/>
           <w14:ligatures w14:val="standardContextual"/>
         </w:rPr>
@@ -938,6 +1244,8 @@
         <w:rPr>
           <w:rFonts w:asciiTheme="minorHAnsi" w:eastAsiaTheme="minorHAnsi" w:hAnsiTheme="minorHAnsi" w:cstheme="minorHAnsi"/>
           <w:kern w:val="2"/>
+          <w:sz w:val="22"/>
+          <w:szCs w:val="22"/>
           <w:lang w:val="en-IN" w:eastAsia="en-US" w:bidi="ar-SA"/>
           <w14:ligatures w14:val="standardContextual"/>
         </w:rPr>
@@ -949,6 +1257,8 @@
           <w:b/>
           <w:bCs/>
           <w:kern w:val="2"/>
+          <w:sz w:val="22"/>
+          <w:szCs w:val="22"/>
           <w:lang w:val="en-IN" w:eastAsia="en-US" w:bidi="ar-SA"/>
           <w14:ligatures w14:val="standardContextual"/>
         </w:rPr>
@@ -958,10 +1268,108 @@
         <w:rPr>
           <w:rFonts w:asciiTheme="minorHAnsi" w:eastAsiaTheme="minorHAnsi" w:hAnsiTheme="minorHAnsi" w:cstheme="minorHAnsi"/>
           <w:kern w:val="2"/>
-          <w:lang w:val="en-IN" w:eastAsia="en-US" w:bidi="ar-SA"/>
-          <w14:ligatures w14:val="standardContextual"/>
-        </w:rPr>
-        <w:t xml:space="preserve"> (Blob → Event stream/hub → Lakehouse), supporting 1..N file drops and separating UI vs automated uploads; improved ingestion responsiveness and reduced ops overhead.</w:t>
+          <w:sz w:val="22"/>
+          <w:szCs w:val="22"/>
+          <w:lang w:val="en-IN" w:eastAsia="en-US" w:bidi="ar-SA"/>
+          <w14:ligatures w14:val="standardContextual"/>
+        </w:rPr>
+        <w:t xml:space="preserve"> (Blob → Event stream/hub → Lakehouse</w:t>
+      </w:r>
+      <w:r>
+        <w:rPr>
+          <w:rFonts w:asciiTheme="minorHAnsi" w:eastAsiaTheme="minorHAnsi" w:hAnsiTheme="minorHAnsi" w:cstheme="minorHAnsi"/>
+          <w:kern w:val="2"/>
+          <w:sz w:val="22"/>
+          <w:szCs w:val="22"/>
+          <w:lang w:val="en-IN" w:eastAsia="en-US" w:bidi="ar-SA"/>
+          <w14:ligatures w14:val="standardContextual"/>
+        </w:rPr>
+        <w:t>/Warehouse/Eventhouse</w:t>
+      </w:r>
+      <w:r>
+        <w:rPr>
+          <w:rFonts w:asciiTheme="minorHAnsi" w:eastAsiaTheme="minorHAnsi" w:hAnsiTheme="minorHAnsi" w:cstheme="minorHAnsi"/>
+          <w:kern w:val="2"/>
+          <w:sz w:val="22"/>
+          <w:szCs w:val="22"/>
+          <w:lang w:val="en-IN" w:eastAsia="en-US" w:bidi="ar-SA"/>
+          <w14:ligatures w14:val="standardContextual"/>
+        </w:rPr>
+        <w:t xml:space="preserve">), </w:t>
+      </w:r>
+      <w:r>
+        <w:rPr>
+          <w:rFonts w:asciiTheme="minorHAnsi" w:eastAsiaTheme="minorHAnsi" w:hAnsiTheme="minorHAnsi" w:cstheme="minorHAnsi"/>
+          <w:kern w:val="2"/>
+          <w:sz w:val="22"/>
+          <w:szCs w:val="22"/>
+          <w:lang w:val="en-IN" w:eastAsia="en-US" w:bidi="ar-SA"/>
+          <w14:ligatures w14:val="standardContextual"/>
+        </w:rPr>
+        <w:t xml:space="preserve">supporting </w:t>
+      </w:r>
+      <w:r>
+        <w:rPr>
+          <w:rFonts w:asciiTheme="minorHAnsi" w:eastAsiaTheme="minorHAnsi" w:hAnsiTheme="minorHAnsi" w:cstheme="minorHAnsi"/>
+          <w:b/>
+          <w:bCs/>
+          <w:kern w:val="2"/>
+          <w:sz w:val="22"/>
+          <w:szCs w:val="22"/>
+          <w:lang w:val="en-IN" w:eastAsia="en-US" w:bidi="ar-SA"/>
+          <w14:ligatures w14:val="standardContextual"/>
+        </w:rPr>
+        <w:t>30+ GB</w:t>
+      </w:r>
+      <w:r>
+        <w:rPr>
+          <w:rFonts w:asciiTheme="minorHAnsi" w:eastAsiaTheme="minorHAnsi" w:hAnsiTheme="minorHAnsi" w:cstheme="minorHAnsi"/>
+          <w:b/>
+          <w:bCs/>
+          <w:kern w:val="2"/>
+          <w:sz w:val="22"/>
+          <w:szCs w:val="22"/>
+          <w:lang w:val="en-IN" w:eastAsia="en-US" w:bidi="ar-SA"/>
+          <w14:ligatures w14:val="standardContextual"/>
+        </w:rPr>
+        <w:t xml:space="preserve"> (5</w:t>
+      </w:r>
+      <w:r>
+        <w:rPr>
+          <w:rFonts w:asciiTheme="minorHAnsi" w:eastAsiaTheme="minorHAnsi" w:hAnsiTheme="minorHAnsi" w:cstheme="minorHAnsi"/>
+          <w:b/>
+          <w:bCs/>
+          <w:kern w:val="2"/>
+          <w:sz w:val="22"/>
+          <w:szCs w:val="22"/>
+          <w:lang w:val="en-IN" w:eastAsia="en-US" w:bidi="ar-SA"/>
+          <w14:ligatures w14:val="standardContextual"/>
+        </w:rPr>
+        <w:t>M+</w:t>
+      </w:r>
+      <w:r>
+        <w:rPr>
+          <w:rFonts w:asciiTheme="minorHAnsi" w:eastAsiaTheme="minorHAnsi" w:hAnsiTheme="minorHAnsi" w:cstheme="minorHAnsi"/>
+          <w:b/>
+          <w:bCs/>
+          <w:kern w:val="2"/>
+          <w:sz w:val="22"/>
+          <w:szCs w:val="22"/>
+          <w:lang w:val="en-IN" w:eastAsia="en-US" w:bidi="ar-SA"/>
+          <w14:ligatures w14:val="standardContextual"/>
+        </w:rPr>
+        <w:t xml:space="preserve"> events)</w:t>
+      </w:r>
+      <w:r>
+        <w:rPr>
+          <w:rFonts w:asciiTheme="minorHAnsi" w:eastAsiaTheme="minorHAnsi" w:hAnsiTheme="minorHAnsi" w:cstheme="minorHAnsi"/>
+          <w:kern w:val="2"/>
+          <w:sz w:val="22"/>
+          <w:szCs w:val="22"/>
+          <w:lang w:val="en-IN" w:eastAsia="en-US" w:bidi="ar-SA"/>
+          <w14:ligatures w14:val="standardContextual"/>
+        </w:rPr>
+        <w:t xml:space="preserve"> daily data ingestion.</w:t>
       </w:r>
     </w:p>
     <w:p>
@@ -976,6 +1384,8 @@
         <w:rPr>
           <w:rFonts w:asciiTheme="minorHAnsi" w:eastAsiaTheme="minorHAnsi" w:hAnsiTheme="minorHAnsi" w:cstheme="minorHAnsi"/>
           <w:kern w:val="2"/>
+          <w:sz w:val="22"/>
+          <w:szCs w:val="22"/>
           <w:lang w:val="en-IN" w:eastAsia="en-US" w:bidi="ar-SA"/>
           <w14:ligatures w14:val="standardContextual"/>
         </w:rPr>
@@ -986,6 +1396,8 @@
           <w:b/>
           <w:bCs/>
           <w:kern w:val="2"/>
+          <w:sz w:val="22"/>
+          <w:szCs w:val="22"/>
           <w:lang w:val="en-IN" w:eastAsia="en-US" w:bidi="ar-SA"/>
           <w14:ligatures w14:val="standardContextual"/>
         </w:rPr>
@@ -995,6 +1407,8 @@
         <w:rPr>
           <w:rFonts w:asciiTheme="minorHAnsi" w:eastAsiaTheme="minorHAnsi" w:hAnsiTheme="minorHAnsi" w:cstheme="minorHAnsi"/>
           <w:kern w:val="2"/>
+          <w:sz w:val="22"/>
+          <w:szCs w:val="22"/>
           <w:lang w:val="en-IN" w:eastAsia="en-US" w:bidi="ar-SA"/>
           <w14:ligatures w14:val="standardContextual"/>
         </w:rPr>
@@ -1006,6 +1420,8 @@
           <w:b/>
           <w:bCs/>
           <w:kern w:val="2"/>
+          <w:sz w:val="22"/>
+          <w:szCs w:val="22"/>
           <w:lang w:val="en-IN" w:eastAsia="en-US" w:bidi="ar-SA"/>
           <w14:ligatures w14:val="standardContextual"/>
         </w:rPr>
@@ -1015,6 +1431,8 @@
         <w:rPr>
           <w:rFonts w:asciiTheme="minorHAnsi" w:eastAsiaTheme="minorHAnsi" w:hAnsiTheme="minorHAnsi" w:cstheme="minorHAnsi"/>
           <w:kern w:val="2"/>
+          <w:sz w:val="22"/>
+          <w:szCs w:val="22"/>
           <w:lang w:val="en-IN" w:eastAsia="en-US" w:bidi="ar-SA"/>
           <w14:ligatures w14:val="standardContextual"/>
         </w:rPr>
@@ -1026,6 +1444,8 @@
           <w:b/>
           <w:bCs/>
           <w:kern w:val="2"/>
+          <w:sz w:val="22"/>
+          <w:szCs w:val="22"/>
           <w:lang w:val="en-IN" w:eastAsia="en-US" w:bidi="ar-SA"/>
           <w14:ligatures w14:val="standardContextual"/>
         </w:rPr>
@@ -1035,10 +1455,12 @@
         <w:rPr>
           <w:rFonts w:asciiTheme="minorHAnsi" w:eastAsiaTheme="minorHAnsi" w:hAnsiTheme="minorHAnsi" w:cstheme="minorHAnsi"/>
           <w:kern w:val="2"/>
-          <w:lang w:val="en-IN" w:eastAsia="en-US" w:bidi="ar-SA"/>
-          <w14:ligatures w14:val="standardContextual"/>
-        </w:rPr>
-        <w:t xml:space="preserve">, enabling fast matching of event sequences to known signatures; reduced investigation/triage time by </w:t>
+          <w:sz w:val="22"/>
+          <w:szCs w:val="22"/>
+          <w:lang w:val="en-IN" w:eastAsia="en-US" w:bidi="ar-SA"/>
+          <w14:ligatures w14:val="standardContextual"/>
+        </w:rPr>
+        <w:t xml:space="preserve">, enabling fast matching of event sequences to known signatures; reduced investigation time by </w:t>
       </w:r>
       <w:r>
         <w:rPr>
@@ -1046,6 +1468,8 @@
           <w:b/>
           <w:bCs/>
           <w:kern w:val="2"/>
+          <w:sz w:val="22"/>
+          <w:szCs w:val="22"/>
           <w:lang w:val="en-IN" w:eastAsia="en-US" w:bidi="ar-SA"/>
           <w14:ligatures w14:val="standardContextual"/>
         </w:rPr>
@@ -1055,6 +1479,8 @@
         <w:rPr>
           <w:rFonts w:asciiTheme="minorHAnsi" w:eastAsiaTheme="minorHAnsi" w:hAnsiTheme="minorHAnsi" w:cstheme="minorHAnsi"/>
           <w:kern w:val="2"/>
+          <w:sz w:val="22"/>
+          <w:szCs w:val="22"/>
           <w:lang w:val="en-IN" w:eastAsia="en-US" w:bidi="ar-SA"/>
           <w14:ligatures w14:val="standardContextual"/>
         </w:rPr>
@@ -1073,25 +1499,66 @@
         <w:rPr>
           <w:rFonts w:asciiTheme="minorHAnsi" w:eastAsiaTheme="minorHAnsi" w:hAnsiTheme="minorHAnsi" w:cstheme="minorHAnsi"/>
           <w:kern w:val="2"/>
-          <w:lang w:val="en-IN" w:eastAsia="en-US" w:bidi="ar-SA"/>
-          <w14:ligatures w14:val="standardContextual"/>
-        </w:rPr>
-      </w:pPr>
-      <w:r>
-        <w:rPr>
-          <w:rFonts w:asciiTheme="minorHAnsi" w:eastAsiaTheme="minorHAnsi" w:hAnsiTheme="minorHAnsi" w:cstheme="minorHAnsi"/>
-          <w:kern w:val="2"/>
-          <w:lang w:val="en-IN" w:eastAsia="en-US" w:bidi="ar-SA"/>
-          <w14:ligatures w14:val="standardContextual"/>
-        </w:rPr>
-        <w:t xml:space="preserve">Designed and delivered </w:t>
-      </w:r>
+          <w:sz w:val="22"/>
+          <w:szCs w:val="22"/>
+          <w:lang w:val="en-IN" w:eastAsia="en-US" w:bidi="ar-SA"/>
+          <w14:ligatures w14:val="standardContextual"/>
+        </w:rPr>
+      </w:pPr>
       <w:r>
         <w:rPr>
           <w:rFonts w:asciiTheme="minorHAnsi" w:eastAsiaTheme="minorHAnsi" w:hAnsiTheme="minorHAnsi" w:cstheme="minorHAnsi"/>
           <w:b/>
           <w:bCs/>
           <w:kern w:val="2"/>
+          <w:sz w:val="22"/>
+          <w:szCs w:val="22"/>
+          <w:lang w:val="en-IN" w:eastAsia="en-US" w:bidi="ar-SA"/>
+          <w14:ligatures w14:val="standardContextual"/>
+        </w:rPr>
+        <w:t>Designed</w:t>
+      </w:r>
+      <w:r>
+        <w:rPr>
+          <w:rFonts w:asciiTheme="minorHAnsi" w:eastAsiaTheme="minorHAnsi" w:hAnsiTheme="minorHAnsi" w:cstheme="minorHAnsi"/>
+          <w:kern w:val="2"/>
+          <w:sz w:val="22"/>
+          <w:szCs w:val="22"/>
+          <w:lang w:val="en-IN" w:eastAsia="en-US" w:bidi="ar-SA"/>
+          <w14:ligatures w14:val="standardContextual"/>
+        </w:rPr>
+        <w:t xml:space="preserve"> and </w:t>
+      </w:r>
+      <w:r>
+        <w:rPr>
+          <w:rFonts w:asciiTheme="minorHAnsi" w:eastAsiaTheme="minorHAnsi" w:hAnsiTheme="minorHAnsi" w:cstheme="minorHAnsi"/>
+          <w:b/>
+          <w:bCs/>
+          <w:kern w:val="2"/>
+          <w:sz w:val="22"/>
+          <w:szCs w:val="22"/>
+          <w:lang w:val="en-IN" w:eastAsia="en-US" w:bidi="ar-SA"/>
+          <w14:ligatures w14:val="standardContextual"/>
+        </w:rPr>
+        <w:t>delivered</w:t>
+      </w:r>
+      <w:r>
+        <w:rPr>
+          <w:rFonts w:asciiTheme="minorHAnsi" w:eastAsiaTheme="minorHAnsi" w:hAnsiTheme="minorHAnsi" w:cstheme="minorHAnsi"/>
+          <w:kern w:val="2"/>
+          <w:sz w:val="22"/>
+          <w:szCs w:val="22"/>
+          <w:lang w:val="en-IN" w:eastAsia="en-US" w:bidi="ar-SA"/>
+          <w14:ligatures w14:val="standardContextual"/>
+        </w:rPr>
+        <w:t xml:space="preserve"> </w:t>
+      </w:r>
+      <w:r>
+        <w:rPr>
+          <w:rFonts w:asciiTheme="minorHAnsi" w:eastAsiaTheme="minorHAnsi" w:hAnsiTheme="minorHAnsi" w:cstheme="minorHAnsi"/>
+          <w:kern w:val="2"/>
+          <w:sz w:val="22"/>
+          <w:szCs w:val="22"/>
           <w:lang w:val="en-IN" w:eastAsia="en-US" w:bidi="ar-SA"/>
           <w14:ligatures w14:val="standardContextual"/>
         </w:rPr>
@@ -1101,6 +1568,8 @@
         <w:rPr>
           <w:rFonts w:asciiTheme="minorHAnsi" w:eastAsiaTheme="minorHAnsi" w:hAnsiTheme="minorHAnsi" w:cstheme="minorHAnsi"/>
           <w:kern w:val="2"/>
+          <w:sz w:val="22"/>
+          <w:szCs w:val="22"/>
           <w:lang w:val="en-IN" w:eastAsia="en-US" w:bidi="ar-SA"/>
           <w14:ligatures w14:val="standardContextual"/>
         </w:rPr>
@@ -1112,6 +1581,8 @@
           <w:b/>
           <w:bCs/>
           <w:kern w:val="2"/>
+          <w:sz w:val="22"/>
+          <w:szCs w:val="22"/>
           <w:lang w:val="en-IN" w:eastAsia="en-US" w:bidi="ar-SA"/>
           <w14:ligatures w14:val="standardContextual"/>
         </w:rPr>
@@ -1121,6 +1592,8 @@
         <w:rPr>
           <w:rFonts w:asciiTheme="minorHAnsi" w:eastAsiaTheme="minorHAnsi" w:hAnsiTheme="minorHAnsi" w:cstheme="minorHAnsi"/>
           <w:kern w:val="2"/>
+          <w:sz w:val="22"/>
+          <w:szCs w:val="22"/>
           <w:lang w:val="en-IN" w:eastAsia="en-US" w:bidi="ar-SA"/>
           <w14:ligatures w14:val="standardContextual"/>
         </w:rPr>
@@ -1132,6 +1605,8 @@
           <w:b/>
           <w:bCs/>
           <w:kern w:val="2"/>
+          <w:sz w:val="22"/>
+          <w:szCs w:val="22"/>
           <w:lang w:val="en-IN" w:eastAsia="en-US" w:bidi="ar-SA"/>
           <w14:ligatures w14:val="standardContextual"/>
         </w:rPr>
@@ -1141,6 +1616,8 @@
         <w:rPr>
           <w:rFonts w:asciiTheme="minorHAnsi" w:eastAsiaTheme="minorHAnsi" w:hAnsiTheme="minorHAnsi" w:cstheme="minorHAnsi"/>
           <w:kern w:val="2"/>
+          <w:sz w:val="22"/>
+          <w:szCs w:val="22"/>
           <w:lang w:val="en-IN" w:eastAsia="en-US" w:bidi="ar-SA"/>
           <w14:ligatures w14:val="standardContextual"/>
         </w:rPr>
@@ -1159,6 +1636,8 @@
         <w:rPr>
           <w:rFonts w:asciiTheme="minorHAnsi" w:eastAsiaTheme="minorHAnsi" w:hAnsiTheme="minorHAnsi" w:cstheme="minorHAnsi"/>
           <w:kern w:val="2"/>
+          <w:sz w:val="22"/>
+          <w:szCs w:val="22"/>
           <w:lang w:val="en-IN" w:eastAsia="en-US" w:bidi="ar-SA"/>
           <w14:ligatures w14:val="standardContextual"/>
         </w:rPr>
@@ -1169,19 +1648,23 @@
           <w:b/>
           <w:bCs/>
           <w:kern w:val="2"/>
-          <w:lang w:val="en-IN" w:eastAsia="en-US" w:bidi="ar-SA"/>
-          <w14:ligatures w14:val="standardContextual"/>
-        </w:rPr>
-        <w:t>Built standardized Medallion</w:t>
-      </w:r>
-      <w:r>
-        <w:rPr>
-          <w:rFonts w:asciiTheme="minorHAnsi" w:eastAsiaTheme="minorHAnsi" w:hAnsiTheme="minorHAnsi" w:cstheme="minorHAnsi"/>
-          <w:kern w:val="2"/>
-          <w:lang w:val="en-IN" w:eastAsia="en-US" w:bidi="ar-SA"/>
-          <w14:ligatures w14:val="standardContextual"/>
-        </w:rPr>
-        <w:t xml:space="preserve"> (Bronze/Silver/Gold) </w:t>
+          <w:sz w:val="22"/>
+          <w:szCs w:val="22"/>
+          <w:lang w:val="en-IN" w:eastAsia="en-US" w:bidi="ar-SA"/>
+          <w14:ligatures w14:val="standardContextual"/>
+        </w:rPr>
+        <w:t>Improved performance and cost-efficiency</w:t>
+      </w:r>
+      <w:r>
+        <w:rPr>
+          <w:rFonts w:asciiTheme="minorHAnsi" w:eastAsiaTheme="minorHAnsi" w:hAnsiTheme="minorHAnsi" w:cstheme="minorHAnsi"/>
+          <w:kern w:val="2"/>
+          <w:sz w:val="22"/>
+          <w:szCs w:val="22"/>
+          <w:lang w:val="en-IN" w:eastAsia="en-US" w:bidi="ar-SA"/>
+          <w14:ligatures w14:val="standardContextual"/>
+        </w:rPr>
+        <w:t xml:space="preserve"> by optimizing </w:t>
       </w:r>
       <w:r>
         <w:rPr>
@@ -1189,19 +1672,45 @@
           <w:b/>
           <w:bCs/>
           <w:kern w:val="2"/>
-          <w:lang w:val="en-IN" w:eastAsia="en-US" w:bidi="ar-SA"/>
-          <w14:ligatures w14:val="standardContextual"/>
-        </w:rPr>
-        <w:t>Delta pipelines</w:t>
-      </w:r>
-      <w:r>
-        <w:rPr>
-          <w:rFonts w:asciiTheme="minorHAnsi" w:eastAsiaTheme="minorHAnsi" w:hAnsiTheme="minorHAnsi" w:cstheme="minorHAnsi"/>
-          <w:kern w:val="2"/>
-          <w:lang w:val="en-IN" w:eastAsia="en-US" w:bidi="ar-SA"/>
-          <w14:ligatures w14:val="standardContextual"/>
-        </w:rPr>
-        <w:t xml:space="preserve"> + </w:t>
+          <w:sz w:val="22"/>
+          <w:szCs w:val="22"/>
+          <w:lang w:val="en-IN" w:eastAsia="en-US" w:bidi="ar-SA"/>
+          <w14:ligatures w14:val="standardContextual"/>
+        </w:rPr>
+        <w:t>Spark workloads</w:t>
+      </w:r>
+      <w:r>
+        <w:rPr>
+          <w:rFonts w:asciiTheme="minorHAnsi" w:eastAsiaTheme="minorHAnsi" w:hAnsiTheme="minorHAnsi" w:cstheme="minorHAnsi"/>
+          <w:kern w:val="2"/>
+          <w:sz w:val="22"/>
+          <w:szCs w:val="22"/>
+          <w:lang w:val="en-IN" w:eastAsia="en-US" w:bidi="ar-SA"/>
+          <w14:ligatures w14:val="standardContextual"/>
+        </w:rPr>
+        <w:t xml:space="preserve"> (partitioning, broadcast joins, shuffle reduction</w:t>
+      </w:r>
+      <w:r>
+        <w:rPr>
+          <w:rFonts w:asciiTheme="minorHAnsi" w:eastAsiaTheme="minorHAnsi" w:hAnsiTheme="minorHAnsi" w:cstheme="minorHAnsi"/>
+          <w:kern w:val="2"/>
+          <w:sz w:val="22"/>
+          <w:szCs w:val="22"/>
+          <w:lang w:val="en-IN" w:eastAsia="en-US" w:bidi="ar-SA"/>
+          <w14:ligatures w14:val="standardContextual"/>
+        </w:rPr>
+        <w:t>, handling data skew</w:t>
+      </w:r>
+      <w:r>
+        <w:rPr>
+          <w:rFonts w:asciiTheme="minorHAnsi" w:eastAsiaTheme="minorHAnsi" w:hAnsiTheme="minorHAnsi" w:cstheme="minorHAnsi"/>
+          <w:kern w:val="2"/>
+          <w:sz w:val="22"/>
+          <w:szCs w:val="22"/>
+          <w:lang w:val="en-IN" w:eastAsia="en-US" w:bidi="ar-SA"/>
+          <w14:ligatures w14:val="standardContextual"/>
+        </w:rPr>
+        <w:t xml:space="preserve">); cut backfill time by </w:t>
       </w:r>
       <w:r>
         <w:rPr>
@@ -1209,19 +1718,23 @@
           <w:b/>
           <w:bCs/>
           <w:kern w:val="2"/>
-          <w:lang w:val="en-IN" w:eastAsia="en-US" w:bidi="ar-SA"/>
-          <w14:ligatures w14:val="standardContextual"/>
-        </w:rPr>
-        <w:t>semantic models</w:t>
-      </w:r>
-      <w:r>
-        <w:rPr>
-          <w:rFonts w:asciiTheme="minorHAnsi" w:eastAsiaTheme="minorHAnsi" w:hAnsiTheme="minorHAnsi" w:cstheme="minorHAnsi"/>
-          <w:kern w:val="2"/>
-          <w:lang w:val="en-IN" w:eastAsia="en-US" w:bidi="ar-SA"/>
-          <w14:ligatures w14:val="standardContextual"/>
-        </w:rPr>
-        <w:t xml:space="preserve"> for multi-tenant onboarding; reduced onboarding/troubleshooting cycle from </w:t>
+          <w:sz w:val="22"/>
+          <w:szCs w:val="22"/>
+          <w:lang w:val="en-IN" w:eastAsia="en-US" w:bidi="ar-SA"/>
+          <w14:ligatures w14:val="standardContextual"/>
+        </w:rPr>
+        <w:t>50%</w:t>
+      </w:r>
+      <w:r>
+        <w:rPr>
+          <w:rFonts w:asciiTheme="minorHAnsi" w:eastAsiaTheme="minorHAnsi" w:hAnsiTheme="minorHAnsi" w:cstheme="minorHAnsi"/>
+          <w:kern w:val="2"/>
+          <w:sz w:val="22"/>
+          <w:szCs w:val="22"/>
+          <w:lang w:val="en-IN" w:eastAsia="en-US" w:bidi="ar-SA"/>
+          <w14:ligatures w14:val="standardContextual"/>
+        </w:rPr>
+        <w:t xml:space="preserve"> and improved query latency by </w:t>
       </w:r>
       <w:r>
         <w:rPr>
@@ -1229,15 +1742,19 @@
           <w:b/>
           <w:bCs/>
           <w:kern w:val="2"/>
-          <w:lang w:val="en-IN" w:eastAsia="en-US" w:bidi="ar-SA"/>
-          <w14:ligatures w14:val="standardContextual"/>
-        </w:rPr>
-        <w:t>2 months to &lt;2 weeks</w:t>
-      </w:r>
-      <w:r>
-        <w:rPr>
-          <w:rFonts w:asciiTheme="minorHAnsi" w:eastAsiaTheme="minorHAnsi" w:hAnsiTheme="minorHAnsi" w:cstheme="minorHAnsi"/>
-          <w:kern w:val="2"/>
+          <w:sz w:val="22"/>
+          <w:szCs w:val="22"/>
+          <w:lang w:val="en-IN" w:eastAsia="en-US" w:bidi="ar-SA"/>
+          <w14:ligatures w14:val="standardContextual"/>
+        </w:rPr>
+        <w:t>90%</w:t>
+      </w:r>
+      <w:r>
+        <w:rPr>
+          <w:rFonts w:asciiTheme="minorHAnsi" w:eastAsiaTheme="minorHAnsi" w:hAnsiTheme="minorHAnsi" w:cstheme="minorHAnsi"/>
+          <w:kern w:val="2"/>
+          <w:sz w:val="22"/>
+          <w:szCs w:val="22"/>
           <w:lang w:val="en-IN" w:eastAsia="en-US" w:bidi="ar-SA"/>
           <w14:ligatures w14:val="standardContextual"/>
         </w:rPr>
@@ -1256,18 +1773,22 @@
         <w:rPr>
           <w:rFonts w:asciiTheme="minorHAnsi" w:eastAsiaTheme="minorHAnsi" w:hAnsiTheme="minorHAnsi" w:cstheme="minorHAnsi"/>
           <w:kern w:val="2"/>
-          <w:lang w:val="en-IN" w:eastAsia="en-US" w:bidi="ar-SA"/>
-          <w14:ligatures w14:val="standardContextual"/>
-        </w:rPr>
-      </w:pPr>
-      <w:r>
-        <w:rPr>
-          <w:rFonts w:asciiTheme="minorHAnsi" w:eastAsiaTheme="minorHAnsi" w:hAnsiTheme="minorHAnsi" w:cstheme="minorHAnsi"/>
-          <w:kern w:val="2"/>
-          <w:lang w:val="en-IN" w:eastAsia="en-US" w:bidi="ar-SA"/>
-          <w14:ligatures w14:val="standardContextual"/>
-        </w:rPr>
-        <w:t xml:space="preserve">Improved </w:t>
+          <w:sz w:val="22"/>
+          <w:szCs w:val="22"/>
+          <w:lang w:val="en-IN" w:eastAsia="en-US" w:bidi="ar-SA"/>
+          <w14:ligatures w14:val="standardContextual"/>
+        </w:rPr>
+      </w:pPr>
+      <w:r>
+        <w:rPr>
+          <w:rFonts w:asciiTheme="minorHAnsi" w:eastAsiaTheme="minorHAnsi" w:hAnsiTheme="minorHAnsi" w:cstheme="minorHAnsi"/>
+          <w:kern w:val="2"/>
+          <w:sz w:val="22"/>
+          <w:szCs w:val="22"/>
+          <w:lang w:val="en-IN" w:eastAsia="en-US" w:bidi="ar-SA"/>
+          <w14:ligatures w14:val="standardContextual"/>
+        </w:rPr>
+        <w:t xml:space="preserve">Implemented </w:t>
       </w:r>
       <w:r>
         <w:rPr>
@@ -1275,19 +1796,23 @@
           <w:b/>
           <w:bCs/>
           <w:kern w:val="2"/>
-          <w:lang w:val="en-IN" w:eastAsia="en-US" w:bidi="ar-SA"/>
-          <w14:ligatures w14:val="standardContextual"/>
-        </w:rPr>
-        <w:t>performance and cost-efficiency</w:t>
-      </w:r>
-      <w:r>
-        <w:rPr>
-          <w:rFonts w:asciiTheme="minorHAnsi" w:eastAsiaTheme="minorHAnsi" w:hAnsiTheme="minorHAnsi" w:cstheme="minorHAnsi"/>
-          <w:kern w:val="2"/>
-          <w:lang w:val="en-IN" w:eastAsia="en-US" w:bidi="ar-SA"/>
-          <w14:ligatures w14:val="standardContextual"/>
-        </w:rPr>
-        <w:t xml:space="preserve"> by optimizing </w:t>
+          <w:sz w:val="22"/>
+          <w:szCs w:val="22"/>
+          <w:lang w:val="en-IN" w:eastAsia="en-US" w:bidi="ar-SA"/>
+          <w14:ligatures w14:val="standardContextual"/>
+        </w:rPr>
+        <w:t>agentic automation</w:t>
+      </w:r>
+      <w:r>
+        <w:rPr>
+          <w:rFonts w:asciiTheme="minorHAnsi" w:eastAsiaTheme="minorHAnsi" w:hAnsiTheme="minorHAnsi" w:cstheme="minorHAnsi"/>
+          <w:kern w:val="2"/>
+          <w:sz w:val="22"/>
+          <w:szCs w:val="22"/>
+          <w:lang w:val="en-IN" w:eastAsia="en-US" w:bidi="ar-SA"/>
+          <w14:ligatures w14:val="standardContextual"/>
+        </w:rPr>
+        <w:t xml:space="preserve"> for Microsoft Fabric pipelines using </w:t>
       </w:r>
       <w:r>
         <w:rPr>
@@ -1295,19 +1820,23 @@
           <w:b/>
           <w:bCs/>
           <w:kern w:val="2"/>
-          <w:lang w:val="en-IN" w:eastAsia="en-US" w:bidi="ar-SA"/>
-          <w14:ligatures w14:val="standardContextual"/>
-        </w:rPr>
-        <w:t>Spark workloads</w:t>
-      </w:r>
-      <w:r>
-        <w:rPr>
-          <w:rFonts w:asciiTheme="minorHAnsi" w:eastAsiaTheme="minorHAnsi" w:hAnsiTheme="minorHAnsi" w:cstheme="minorHAnsi"/>
-          <w:kern w:val="2"/>
-          <w:lang w:val="en-IN" w:eastAsia="en-US" w:bidi="ar-SA"/>
-          <w14:ligatures w14:val="standardContextual"/>
-        </w:rPr>
-        <w:t xml:space="preserve"> (partitioning, broadcast joins, shuffle reduction) and table layout (partitioning/indexing); cut runtime by </w:t>
+          <w:sz w:val="22"/>
+          <w:szCs w:val="22"/>
+          <w:lang w:val="en-IN" w:eastAsia="en-US" w:bidi="ar-SA"/>
+          <w14:ligatures w14:val="standardContextual"/>
+        </w:rPr>
+        <w:t>Azure AI Foundry</w:t>
+      </w:r>
+      <w:r>
+        <w:rPr>
+          <w:rFonts w:asciiTheme="minorHAnsi" w:eastAsiaTheme="minorHAnsi" w:hAnsiTheme="minorHAnsi" w:cstheme="minorHAnsi"/>
+          <w:kern w:val="2"/>
+          <w:sz w:val="22"/>
+          <w:szCs w:val="22"/>
+          <w:lang w:val="en-IN" w:eastAsia="en-US" w:bidi="ar-SA"/>
+          <w14:ligatures w14:val="standardContextual"/>
+        </w:rPr>
+        <w:t xml:space="preserve">, </w:t>
       </w:r>
       <w:r>
         <w:rPr>
@@ -1315,35 +1844,41 @@
           <w:b/>
           <w:bCs/>
           <w:kern w:val="2"/>
-          <w:lang w:val="en-IN" w:eastAsia="en-US" w:bidi="ar-SA"/>
-          <w14:ligatures w14:val="standardContextual"/>
-        </w:rPr>
-        <w:t>50%</w:t>
-      </w:r>
-      <w:r>
-        <w:rPr>
-          <w:rFonts w:asciiTheme="minorHAnsi" w:eastAsiaTheme="minorHAnsi" w:hAnsiTheme="minorHAnsi" w:cstheme="minorHAnsi"/>
-          <w:kern w:val="2"/>
-          <w:lang w:val="en-IN" w:eastAsia="en-US" w:bidi="ar-SA"/>
-          <w14:ligatures w14:val="standardContextual"/>
-        </w:rPr>
-        <w:t xml:space="preserve"> and improved query latency by </w:t>
-      </w:r>
-      <w:r>
-        <w:rPr>
-          <w:rFonts w:asciiTheme="minorHAnsi" w:eastAsiaTheme="minorHAnsi" w:hAnsiTheme="minorHAnsi" w:cstheme="minorHAnsi"/>
-          <w:b/>
-          <w:bCs/>
-          <w:kern w:val="2"/>
-          <w:lang w:val="en-IN" w:eastAsia="en-US" w:bidi="ar-SA"/>
-          <w14:ligatures w14:val="standardContextual"/>
-        </w:rPr>
-        <w:t>90%</w:t>
-      </w:r>
-      <w:r>
-        <w:rPr>
-          <w:rFonts w:asciiTheme="minorHAnsi" w:eastAsiaTheme="minorHAnsi" w:hAnsiTheme="minorHAnsi" w:cstheme="minorHAnsi"/>
-          <w:kern w:val="2"/>
+          <w:sz w:val="22"/>
+          <w:szCs w:val="22"/>
+          <w:lang w:val="en-IN" w:eastAsia="en-US" w:bidi="ar-SA"/>
+          <w14:ligatures w14:val="standardContextual"/>
+        </w:rPr>
+        <w:t>MCP-style tool integration</w:t>
+      </w:r>
+      <w:r>
+        <w:rPr>
+          <w:rFonts w:asciiTheme="minorHAnsi" w:eastAsiaTheme="minorHAnsi" w:hAnsiTheme="minorHAnsi" w:cstheme="minorHAnsi"/>
+          <w:kern w:val="2"/>
+          <w:sz w:val="22"/>
+          <w:szCs w:val="22"/>
+          <w:lang w:val="en-IN" w:eastAsia="en-US" w:bidi="ar-SA"/>
+          <w14:ligatures w14:val="standardContextual"/>
+        </w:rPr>
+        <w:t>, to support data quality checks, test generation, validation</w:t>
+      </w:r>
+      <w:r>
+        <w:rPr>
+          <w:rFonts w:asciiTheme="minorHAnsi" w:eastAsiaTheme="minorHAnsi" w:hAnsiTheme="minorHAnsi" w:cstheme="minorHAnsi"/>
+          <w:kern w:val="2"/>
+          <w:sz w:val="22"/>
+          <w:szCs w:val="22"/>
+          <w:lang w:val="en-IN" w:eastAsia="en-US" w:bidi="ar-SA"/>
+          <w14:ligatures w14:val="standardContextual"/>
+        </w:rPr>
+        <w:t>, spec-driven development</w:t>
+      </w:r>
+      <w:r>
+        <w:rPr>
+          <w:rFonts w:asciiTheme="minorHAnsi" w:eastAsiaTheme="minorHAnsi" w:hAnsiTheme="minorHAnsi" w:cstheme="minorHAnsi"/>
+          <w:kern w:val="2"/>
+          <w:sz w:val="22"/>
+          <w:szCs w:val="22"/>
           <w:lang w:val="en-IN" w:eastAsia="en-US" w:bidi="ar-SA"/>
           <w14:ligatures w14:val="standardContextual"/>
         </w:rPr>
@@ -1362,6 +1897,8 @@
         <w:rPr>
           <w:rFonts w:asciiTheme="minorHAnsi" w:eastAsiaTheme="minorHAnsi" w:hAnsiTheme="minorHAnsi" w:cstheme="minorHAnsi"/>
           <w:kern w:val="2"/>
+          <w:sz w:val="22"/>
+          <w:szCs w:val="22"/>
           <w:lang w:val="en-IN" w:eastAsia="en-US" w:bidi="ar-SA"/>
           <w14:ligatures w14:val="standardContextual"/>
         </w:rPr>
@@ -1372,10 +1909,23 @@
           <w:b/>
           <w:bCs/>
           <w:kern w:val="2"/>
-          <w:lang w:val="en-IN" w:eastAsia="en-US" w:bidi="ar-SA"/>
-          <w14:ligatures w14:val="standardContextual"/>
-        </w:rPr>
-        <w:t>T</w:t>
+          <w:sz w:val="22"/>
+          <w:szCs w:val="22"/>
+          <w:lang w:val="en-IN" w:eastAsia="en-US" w:bidi="ar-SA"/>
+          <w14:ligatures w14:val="standardContextual"/>
+        </w:rPr>
+        <w:t>Technical owner</w:t>
+      </w:r>
+      <w:r>
+        <w:rPr>
+          <w:rFonts w:asciiTheme="minorHAnsi" w:eastAsiaTheme="minorHAnsi" w:hAnsiTheme="minorHAnsi" w:cstheme="minorHAnsi"/>
+          <w:kern w:val="2"/>
+          <w:sz w:val="22"/>
+          <w:szCs w:val="22"/>
+          <w:lang w:val="en-IN" w:eastAsia="en-US" w:bidi="ar-SA"/>
+          <w14:ligatures w14:val="standardContextual"/>
+        </w:rPr>
+        <w:t xml:space="preserve"> for the CCP2 subsystem, </w:t>
       </w:r>
       <w:r>
         <w:rPr>
@@ -1383,63 +1933,23 @@
           <w:b/>
           <w:bCs/>
           <w:kern w:val="2"/>
-          <w:lang w:val="en-IN" w:eastAsia="en-US" w:bidi="ar-SA"/>
-          <w14:ligatures w14:val="standardContextual"/>
-        </w:rPr>
-        <w:t>echnical owner</w:t>
-      </w:r>
-      <w:r>
-        <w:rPr>
-          <w:rFonts w:asciiTheme="minorHAnsi" w:eastAsiaTheme="minorHAnsi" w:hAnsiTheme="minorHAnsi" w:cstheme="minorHAnsi"/>
-          <w:kern w:val="2"/>
-          <w:lang w:val="en-IN" w:eastAsia="en-US" w:bidi="ar-SA"/>
-          <w14:ligatures w14:val="standardContextual"/>
-        </w:rPr>
-        <w:t xml:space="preserve"> for CCP2 stream, driving architectural decisions, aligning engineering priorities with product requirements, and mentoring contributors on platform standards.</w:t>
-      </w:r>
-    </w:p>
-    <w:p>
-      <w:pPr>
-        <w:pStyle w:val="LO-normal"/>
-        <w:numPr>
-          <w:ilvl w:val="0"/>
-          <w:numId w:val="33"/>
-        </w:numPr>
-        <w:ind w:left="0" w:right="-397"/>
-        <w:jc w:val="both"/>
-        <w:rPr>
-          <w:rFonts w:asciiTheme="minorHAnsi" w:eastAsiaTheme="minorHAnsi" w:hAnsiTheme="minorHAnsi" w:cstheme="minorHAnsi"/>
-          <w:kern w:val="2"/>
-          <w:lang w:val="en-IN" w:eastAsia="en-US" w:bidi="ar-SA"/>
-          <w14:ligatures w14:val="standardContextual"/>
-        </w:rPr>
-      </w:pPr>
-      <w:r>
-        <w:rPr>
-          <w:rFonts w:asciiTheme="minorHAnsi" w:eastAsiaTheme="minorHAnsi" w:hAnsiTheme="minorHAnsi" w:cstheme="minorHAnsi"/>
-          <w:kern w:val="2"/>
-          <w:lang w:val="en-IN" w:eastAsia="en-US" w:bidi="ar-SA"/>
-          <w14:ligatures w14:val="standardContextual"/>
-        </w:rPr>
-        <w:t>Authored</w:t>
-      </w:r>
-      <w:r>
-        <w:rPr>
-          <w:rFonts w:asciiTheme="minorHAnsi" w:eastAsiaTheme="minorHAnsi" w:hAnsiTheme="minorHAnsi" w:cstheme="minorHAnsi"/>
-          <w:kern w:val="2"/>
-          <w:lang w:val="en-IN" w:eastAsia="en-US" w:bidi="ar-SA"/>
-          <w14:ligatures w14:val="standardContextual"/>
-        </w:rPr>
-        <w:t xml:space="preserve"> automated</w:t>
-      </w:r>
-      <w:r>
-        <w:rPr>
-          <w:rFonts w:asciiTheme="minorHAnsi" w:eastAsiaTheme="minorHAnsi" w:hAnsiTheme="minorHAnsi" w:cstheme="minorHAnsi"/>
-          <w:kern w:val="2"/>
-          <w:lang w:val="en-IN" w:eastAsia="en-US" w:bidi="ar-SA"/>
-          <w14:ligatures w14:val="standardContextual"/>
-        </w:rPr>
-        <w:t xml:space="preserve"> validation checklists; reduced onboarding defects to under </w:t>
+          <w:sz w:val="22"/>
+          <w:szCs w:val="22"/>
+          <w:lang w:val="en-IN" w:eastAsia="en-US" w:bidi="ar-SA"/>
+          <w14:ligatures w14:val="standardContextual"/>
+        </w:rPr>
+        <w:t>leading 3 data engineers</w:t>
+      </w:r>
+      <w:r>
+        <w:rPr>
+          <w:rFonts w:asciiTheme="minorHAnsi" w:eastAsiaTheme="minorHAnsi" w:hAnsiTheme="minorHAnsi" w:cstheme="minorHAnsi"/>
+          <w:kern w:val="2"/>
+          <w:sz w:val="22"/>
+          <w:szCs w:val="22"/>
+          <w:lang w:val="en-IN" w:eastAsia="en-US" w:bidi="ar-SA"/>
+          <w14:ligatures w14:val="standardContextual"/>
+        </w:rPr>
+        <w:t xml:space="preserve">, translating client </w:t>
       </w:r>
       <w:r>
         <w:rPr>
@@ -1447,10 +1957,23 @@
           <w:b/>
           <w:bCs/>
           <w:kern w:val="2"/>
-          <w:lang w:val="en-IN" w:eastAsia="en-US" w:bidi="ar-SA"/>
-          <w14:ligatures w14:val="standardContextual"/>
-        </w:rPr>
-        <w:t>10%</w:t>
+          <w:sz w:val="22"/>
+          <w:szCs w:val="22"/>
+          <w:lang w:val="en-IN" w:eastAsia="en-US" w:bidi="ar-SA"/>
+          <w14:ligatures w14:val="standardContextual"/>
+        </w:rPr>
+        <w:t>requirements into scalable solutions</w:t>
+      </w:r>
+      <w:r>
+        <w:rPr>
+          <w:rFonts w:asciiTheme="minorHAnsi" w:eastAsiaTheme="minorHAnsi" w:hAnsiTheme="minorHAnsi" w:cstheme="minorHAnsi"/>
+          <w:kern w:val="2"/>
+          <w:sz w:val="22"/>
+          <w:szCs w:val="22"/>
+          <w:lang w:val="en-IN" w:eastAsia="en-US" w:bidi="ar-SA"/>
+          <w14:ligatures w14:val="standardContextual"/>
+        </w:rPr>
+        <w:t xml:space="preserve">, assigning implementation tasks, reviewing code, and </w:t>
       </w:r>
       <w:r>
         <w:rPr>
@@ -1458,19 +1981,12 @@
           <w:b/>
           <w:bCs/>
           <w:kern w:val="2"/>
-          <w:lang w:val="en-IN" w:eastAsia="en-US" w:bidi="ar-SA"/>
-          <w14:ligatures w14:val="standardContextual"/>
-        </w:rPr>
-        <w:t xml:space="preserve"> </w:t>
-      </w:r>
-      <w:r>
-        <w:rPr>
-          <w:rFonts w:asciiTheme="minorHAnsi" w:eastAsiaTheme="minorHAnsi" w:hAnsiTheme="minorHAnsi" w:cstheme="minorHAnsi"/>
-          <w:kern w:val="2"/>
-          <w:lang w:val="en-IN" w:eastAsia="en-US" w:bidi="ar-SA"/>
-          <w14:ligatures w14:val="standardContextual"/>
-        </w:rPr>
-        <w:t>and</w:t>
+          <w:sz w:val="22"/>
+          <w:szCs w:val="22"/>
+          <w:lang w:val="en-IN" w:eastAsia="en-US" w:bidi="ar-SA"/>
+          <w14:ligatures w14:val="standardContextual"/>
+        </w:rPr>
+        <w:t>driving</w:t>
       </w:r>
       <w:r>
         <w:rPr>
@@ -1478,19 +1994,12 @@
           <w:b/>
           <w:bCs/>
           <w:kern w:val="2"/>
-          <w:lang w:val="en-IN" w:eastAsia="en-US" w:bidi="ar-SA"/>
-          <w14:ligatures w14:val="standardContextual"/>
-        </w:rPr>
-        <w:t xml:space="preserve"> </w:t>
-      </w:r>
-      <w:r>
-        <w:rPr>
-          <w:rFonts w:asciiTheme="minorHAnsi" w:eastAsiaTheme="minorHAnsi" w:hAnsiTheme="minorHAnsi" w:cstheme="minorHAnsi"/>
-          <w:kern w:val="2"/>
-          <w:lang w:val="en-IN" w:eastAsia="en-US" w:bidi="ar-SA"/>
-          <w14:ligatures w14:val="standardContextual"/>
-        </w:rPr>
-        <w:t>reducing manual rework by</w:t>
+          <w:sz w:val="22"/>
+          <w:szCs w:val="22"/>
+          <w:lang w:val="en-IN" w:eastAsia="en-US" w:bidi="ar-SA"/>
+          <w14:ligatures w14:val="standardContextual"/>
+        </w:rPr>
+        <w:t xml:space="preserve"> end-to-end</w:t>
       </w:r>
       <w:r>
         <w:rPr>
@@ -1498,10 +2007,34 @@
           <w:b/>
           <w:bCs/>
           <w:kern w:val="2"/>
-          <w:lang w:val="en-IN" w:eastAsia="en-US" w:bidi="ar-SA"/>
-          <w14:ligatures w14:val="standardContextual"/>
-        </w:rPr>
-        <w:t xml:space="preserve"> 60%</w:t>
+          <w:sz w:val="22"/>
+          <w:szCs w:val="22"/>
+          <w:lang w:val="en-IN" w:eastAsia="en-US" w:bidi="ar-SA"/>
+          <w14:ligatures w14:val="standardContextual"/>
+        </w:rPr>
+        <w:t xml:space="preserve"> delivery</w:t>
+      </w:r>
+      <w:r>
+        <w:rPr>
+          <w:rFonts w:asciiTheme="minorHAnsi" w:eastAsiaTheme="minorHAnsi" w:hAnsiTheme="minorHAnsi" w:cstheme="minorHAnsi"/>
+          <w:kern w:val="2"/>
+          <w:sz w:val="22"/>
+          <w:szCs w:val="22"/>
+          <w:lang w:val="en-IN" w:eastAsia="en-US" w:bidi="ar-SA"/>
+          <w14:ligatures w14:val="standardContextual"/>
+        </w:rPr>
+        <w:t xml:space="preserve"> of features</w:t>
+      </w:r>
+      <w:r>
+        <w:rPr>
+          <w:rFonts w:asciiTheme="minorHAnsi" w:eastAsiaTheme="minorHAnsi" w:hAnsiTheme="minorHAnsi" w:cstheme="minorHAnsi"/>
+          <w:kern w:val="2"/>
+          <w:sz w:val="22"/>
+          <w:szCs w:val="22"/>
+          <w:lang w:val="en-IN" w:eastAsia="en-US" w:bidi="ar-SA"/>
+          <w14:ligatures w14:val="standardContextual"/>
+        </w:rPr>
+        <w:t>/data</w:t>
       </w:r>
       <w:r>
         <w:rPr>
@@ -1509,6 +2042,8 @@
           <w:b/>
           <w:bCs/>
           <w:kern w:val="2"/>
+          <w:sz w:val="22"/>
+          <w:szCs w:val="22"/>
           <w:lang w:val="en-IN" w:eastAsia="en-US" w:bidi="ar-SA"/>
           <w14:ligatures w14:val="standardContextual"/>
         </w:rPr>
@@ -1524,8 +2059,342 @@
         <w:rPr>
           <w:rFonts w:asciiTheme="minorHAnsi" w:eastAsiaTheme="minorHAnsi" w:hAnsiTheme="minorHAnsi" w:cstheme="minorHAnsi"/>
           <w:kern w:val="2"/>
-          <w:sz w:val="28"/>
-          <w:szCs w:val="28"/>
+          <w:sz w:val="22"/>
+          <w:szCs w:val="22"/>
+          <w:lang w:val="en-IN" w:eastAsia="en-US" w:bidi="ar-SA"/>
+          <w14:ligatures w14:val="standardContextual"/>
+        </w:rPr>
+      </w:pPr>
+    </w:p>
+    <w:p>
+      <w:pPr>
+        <w:pStyle w:val="LO-normal"/>
+        <w:ind w:left="-397" w:right="-397"/>
+        <w:jc w:val="both"/>
+        <w:rPr>
+          <w:rFonts w:asciiTheme="minorHAnsi" w:eastAsiaTheme="minorHAnsi" w:hAnsiTheme="minorHAnsi" w:cstheme="minorHAnsi"/>
+          <w:b/>
+          <w:kern w:val="2"/>
+          <w:lang w:val="en-IN" w:eastAsia="en-US" w:bidi="ar-SA"/>
+          <w14:ligatures w14:val="standardContextual"/>
+        </w:rPr>
+      </w:pPr>
+      <w:r>
+        <w:rPr>
+          <w:rFonts w:asciiTheme="minorHAnsi" w:eastAsiaTheme="minorHAnsi" w:hAnsiTheme="minorHAnsi" w:cstheme="minorHAnsi"/>
+          <w:b/>
+          <w:kern w:val="2"/>
+          <w:lang w:val="en-IN" w:eastAsia="en-US" w:bidi="ar-SA"/>
+          <w14:ligatures w14:val="standardContextual"/>
+        </w:rPr>
+        <w:t>Software Engineer, Nextsavy Technologies</w:t>
+      </w:r>
+      <w:r>
+        <w:rPr>
+          <w:rFonts w:asciiTheme="minorHAnsi" w:eastAsiaTheme="minorHAnsi" w:hAnsiTheme="minorHAnsi" w:cstheme="minorHAnsi"/>
+          <w:b/>
+          <w:kern w:val="2"/>
+          <w:lang w:val="en-IN" w:eastAsia="en-US" w:bidi="ar-SA"/>
+          <w14:ligatures w14:val="standardContextual"/>
+        </w:rPr>
+        <w:tab/>
+      </w:r>
+      <w:r>
+        <w:rPr>
+          <w:rFonts w:asciiTheme="minorHAnsi" w:eastAsiaTheme="minorHAnsi" w:hAnsiTheme="minorHAnsi" w:cstheme="minorHAnsi"/>
+          <w:b/>
+          <w:kern w:val="2"/>
+          <w:lang w:val="en-IN" w:eastAsia="en-US" w:bidi="ar-SA"/>
+          <w14:ligatures w14:val="standardContextual"/>
+        </w:rPr>
+        <w:tab/>
+      </w:r>
+      <w:r>
+        <w:rPr>
+          <w:rFonts w:asciiTheme="minorHAnsi" w:eastAsiaTheme="minorHAnsi" w:hAnsiTheme="minorHAnsi" w:cstheme="minorHAnsi"/>
+          <w:b/>
+          <w:kern w:val="2"/>
+          <w:lang w:val="en-IN" w:eastAsia="en-US" w:bidi="ar-SA"/>
+          <w14:ligatures w14:val="standardContextual"/>
+        </w:rPr>
+        <w:tab/>
+      </w:r>
+      <w:r>
+        <w:rPr>
+          <w:rFonts w:asciiTheme="minorHAnsi" w:eastAsiaTheme="minorHAnsi" w:hAnsiTheme="minorHAnsi" w:cstheme="minorHAnsi"/>
+          <w:b/>
+          <w:kern w:val="2"/>
+          <w:lang w:val="en-IN" w:eastAsia="en-US" w:bidi="ar-SA"/>
+          <w14:ligatures w14:val="standardContextual"/>
+        </w:rPr>
+        <w:tab/>
+      </w:r>
+      <w:r>
+        <w:rPr>
+          <w:rFonts w:asciiTheme="minorHAnsi" w:eastAsiaTheme="minorHAnsi" w:hAnsiTheme="minorHAnsi" w:cstheme="minorHAnsi"/>
+          <w:b/>
+          <w:kern w:val="2"/>
+          <w:lang w:val="en-IN" w:eastAsia="en-US" w:bidi="ar-SA"/>
+          <w14:ligatures w14:val="standardContextual"/>
+        </w:rPr>
+        <w:tab/>
+        <w:t xml:space="preserve">            September</w:t>
+      </w:r>
+      <w:r>
+        <w:rPr>
+          <w:rFonts w:asciiTheme="minorHAnsi" w:eastAsiaTheme="minorHAnsi" w:hAnsiTheme="minorHAnsi" w:cstheme="minorHAnsi"/>
+          <w:b/>
+          <w:kern w:val="2"/>
+          <w:lang w:val="en-IN" w:eastAsia="en-US" w:bidi="ar-SA"/>
+          <w14:ligatures w14:val="standardContextual"/>
+        </w:rPr>
+        <w:t xml:space="preserve"> 2020</w:t>
+      </w:r>
+      <w:r>
+        <w:rPr>
+          <w:rFonts w:asciiTheme="minorHAnsi" w:eastAsiaTheme="minorHAnsi" w:hAnsiTheme="minorHAnsi" w:cstheme="minorHAnsi"/>
+          <w:b/>
+          <w:kern w:val="2"/>
+          <w:lang w:val="en-IN" w:eastAsia="en-US" w:bidi="ar-SA"/>
+          <w14:ligatures w14:val="standardContextual"/>
+        </w:rPr>
+        <w:t xml:space="preserve"> - </w:t>
+      </w:r>
+      <w:r>
+        <w:rPr>
+          <w:rFonts w:asciiTheme="minorHAnsi" w:eastAsiaTheme="minorHAnsi" w:hAnsiTheme="minorHAnsi" w:cstheme="minorHAnsi"/>
+          <w:b/>
+          <w:kern w:val="2"/>
+          <w:lang w:val="en-IN" w:eastAsia="en-US" w:bidi="ar-SA"/>
+          <w14:ligatures w14:val="standardContextual"/>
+        </w:rPr>
+        <w:t>August 2022</w:t>
+      </w:r>
+    </w:p>
+    <w:p>
+      <w:pPr>
+        <w:pStyle w:val="LO-normal"/>
+        <w:numPr>
+          <w:ilvl w:val="0"/>
+          <w:numId w:val="32"/>
+        </w:numPr>
+        <w:ind w:left="0" w:right="-397"/>
+        <w:jc w:val="both"/>
+        <w:rPr>
+          <w:rFonts w:asciiTheme="minorHAnsi" w:eastAsiaTheme="minorHAnsi" w:hAnsiTheme="minorHAnsi" w:cstheme="minorHAnsi"/>
+          <w:kern w:val="2"/>
+          <w:sz w:val="22"/>
+          <w:szCs w:val="22"/>
+          <w:lang w:val="en-IN" w:eastAsia="en-US" w:bidi="ar-SA"/>
+          <w14:ligatures w14:val="standardContextual"/>
+        </w:rPr>
+      </w:pPr>
+      <w:r>
+        <w:rPr>
+          <w:rFonts w:asciiTheme="minorHAnsi" w:eastAsiaTheme="minorHAnsi" w:hAnsiTheme="minorHAnsi" w:cstheme="minorHAnsi"/>
+          <w:kern w:val="2"/>
+          <w:sz w:val="22"/>
+          <w:szCs w:val="22"/>
+          <w:lang w:val="en-IN" w:eastAsia="en-US" w:bidi="ar-SA"/>
+          <w14:ligatures w14:val="standardContextual"/>
+        </w:rPr>
+        <w:t xml:space="preserve">Built </w:t>
+      </w:r>
+      <w:r>
+        <w:rPr>
+          <w:rFonts w:asciiTheme="minorHAnsi" w:eastAsiaTheme="minorHAnsi" w:hAnsiTheme="minorHAnsi" w:cstheme="minorHAnsi"/>
+          <w:b/>
+          <w:bCs/>
+          <w:kern w:val="2"/>
+          <w:sz w:val="22"/>
+          <w:szCs w:val="22"/>
+          <w:lang w:val="en-IN" w:eastAsia="en-US" w:bidi="ar-SA"/>
+          <w14:ligatures w14:val="standardContextual"/>
+        </w:rPr>
+        <w:t>Azure Databricks pipelines</w:t>
+      </w:r>
+      <w:r>
+        <w:rPr>
+          <w:rFonts w:asciiTheme="minorHAnsi" w:eastAsiaTheme="minorHAnsi" w:hAnsiTheme="minorHAnsi" w:cstheme="minorHAnsi"/>
+          <w:kern w:val="2"/>
+          <w:sz w:val="22"/>
+          <w:szCs w:val="22"/>
+          <w:lang w:val="en-IN" w:eastAsia="en-US" w:bidi="ar-SA"/>
+          <w14:ligatures w14:val="standardContextual"/>
+        </w:rPr>
+        <w:t xml:space="preserve"> for mobility data using </w:t>
+      </w:r>
+      <w:r>
+        <w:rPr>
+          <w:rFonts w:asciiTheme="minorHAnsi" w:eastAsiaTheme="minorHAnsi" w:hAnsiTheme="minorHAnsi" w:cstheme="minorHAnsi"/>
+          <w:b/>
+          <w:bCs/>
+          <w:kern w:val="2"/>
+          <w:sz w:val="22"/>
+          <w:szCs w:val="22"/>
+          <w:lang w:val="en-IN" w:eastAsia="en-US" w:bidi="ar-SA"/>
+          <w14:ligatures w14:val="standardContextual"/>
+        </w:rPr>
+        <w:t>ADF, PySpark, Delta Lake</w:t>
+      </w:r>
+      <w:r>
+        <w:rPr>
+          <w:rFonts w:asciiTheme="minorHAnsi" w:eastAsiaTheme="minorHAnsi" w:hAnsiTheme="minorHAnsi" w:cstheme="minorHAnsi"/>
+          <w:kern w:val="2"/>
+          <w:sz w:val="22"/>
+          <w:szCs w:val="22"/>
+          <w:lang w:val="en-IN" w:eastAsia="en-US" w:bidi="ar-SA"/>
+          <w14:ligatures w14:val="standardContextual"/>
+        </w:rPr>
+        <w:t xml:space="preserve">, incremental loads, schema enforcement, and bad-record quarantine, </w:t>
+      </w:r>
+      <w:r>
+        <w:rPr>
+          <w:rFonts w:asciiTheme="minorHAnsi" w:eastAsiaTheme="minorHAnsi" w:hAnsiTheme="minorHAnsi" w:cstheme="minorHAnsi"/>
+          <w:b/>
+          <w:bCs/>
+          <w:kern w:val="2"/>
+          <w:sz w:val="22"/>
+          <w:szCs w:val="22"/>
+          <w:lang w:val="en-IN" w:eastAsia="en-US" w:bidi="ar-SA"/>
+          <w14:ligatures w14:val="standardContextual"/>
+        </w:rPr>
+        <w:t>reducing reprocessing overhead by 60%</w:t>
+      </w:r>
+      <w:r>
+        <w:rPr>
+          <w:rFonts w:asciiTheme="minorHAnsi" w:eastAsiaTheme="minorHAnsi" w:hAnsiTheme="minorHAnsi" w:cstheme="minorHAnsi"/>
+          <w:kern w:val="2"/>
+          <w:sz w:val="22"/>
+          <w:szCs w:val="22"/>
+          <w:lang w:val="en-IN" w:eastAsia="en-US" w:bidi="ar-SA"/>
+          <w14:ligatures w14:val="standardContextual"/>
+        </w:rPr>
+        <w:t>.</w:t>
+      </w:r>
+    </w:p>
+    <w:p>
+      <w:pPr>
+        <w:pStyle w:val="LO-normal"/>
+        <w:numPr>
+          <w:ilvl w:val="0"/>
+          <w:numId w:val="32"/>
+        </w:numPr>
+        <w:ind w:left="0" w:right="-397"/>
+        <w:jc w:val="both"/>
+        <w:rPr>
+          <w:rFonts w:asciiTheme="minorHAnsi" w:eastAsiaTheme="minorHAnsi" w:hAnsiTheme="minorHAnsi" w:cstheme="minorHAnsi"/>
+          <w:kern w:val="2"/>
+          <w:sz w:val="22"/>
+          <w:szCs w:val="22"/>
+          <w:lang w:val="en-IN" w:eastAsia="en-US" w:bidi="ar-SA"/>
+          <w14:ligatures w14:val="standardContextual"/>
+        </w:rPr>
+      </w:pPr>
+      <w:r>
+        <w:rPr>
+          <w:rFonts w:asciiTheme="minorHAnsi" w:eastAsiaTheme="minorHAnsi" w:hAnsiTheme="minorHAnsi" w:cstheme="minorHAnsi"/>
+          <w:kern w:val="2"/>
+          <w:sz w:val="22"/>
+          <w:szCs w:val="22"/>
+          <w:lang w:val="en-IN" w:eastAsia="en-US" w:bidi="ar-SA"/>
+          <w14:ligatures w14:val="standardContextual"/>
+        </w:rPr>
+        <w:t xml:space="preserve">Developed </w:t>
+      </w:r>
+      <w:r>
+        <w:rPr>
+          <w:rFonts w:asciiTheme="minorHAnsi" w:eastAsiaTheme="minorHAnsi" w:hAnsiTheme="minorHAnsi" w:cstheme="minorHAnsi"/>
+          <w:b/>
+          <w:bCs/>
+          <w:kern w:val="2"/>
+          <w:sz w:val="22"/>
+          <w:szCs w:val="22"/>
+          <w:lang w:val="en-IN" w:eastAsia="en-US" w:bidi="ar-SA"/>
+          <w14:ligatures w14:val="standardContextual"/>
+        </w:rPr>
+        <w:t>Snowflake dimensional marts</w:t>
+      </w:r>
+      <w:r>
+        <w:rPr>
+          <w:rFonts w:asciiTheme="minorHAnsi" w:eastAsiaTheme="minorHAnsi" w:hAnsiTheme="minorHAnsi" w:cstheme="minorHAnsi"/>
+          <w:kern w:val="2"/>
+          <w:sz w:val="22"/>
+          <w:szCs w:val="22"/>
+          <w:lang w:val="en-IN" w:eastAsia="en-US" w:bidi="ar-SA"/>
+          <w14:ligatures w14:val="standardContextual"/>
+        </w:rPr>
+        <w:t xml:space="preserve"> with fact/dimension modeling, </w:t>
+      </w:r>
+      <w:r>
+        <w:rPr>
+          <w:rFonts w:asciiTheme="minorHAnsi" w:eastAsiaTheme="minorHAnsi" w:hAnsiTheme="minorHAnsi" w:cstheme="minorHAnsi"/>
+          <w:b/>
+          <w:bCs/>
+          <w:kern w:val="2"/>
+          <w:sz w:val="22"/>
+          <w:szCs w:val="22"/>
+          <w:lang w:val="en-IN" w:eastAsia="en-US" w:bidi="ar-SA"/>
+          <w14:ligatures w14:val="standardContextual"/>
+        </w:rPr>
+        <w:t>SCD handling</w:t>
+      </w:r>
+      <w:r>
+        <w:rPr>
+          <w:rFonts w:asciiTheme="minorHAnsi" w:eastAsiaTheme="minorHAnsi" w:hAnsiTheme="minorHAnsi" w:cstheme="minorHAnsi"/>
+          <w:kern w:val="2"/>
+          <w:sz w:val="22"/>
+          <w:szCs w:val="22"/>
+          <w:lang w:val="en-IN" w:eastAsia="en-US" w:bidi="ar-SA"/>
+          <w14:ligatures w14:val="standardContextual"/>
+        </w:rPr>
+        <w:t xml:space="preserve">, clustering, RBAC, and quality checks, </w:t>
+      </w:r>
+      <w:r>
+        <w:rPr>
+          <w:rFonts w:asciiTheme="minorHAnsi" w:eastAsiaTheme="minorHAnsi" w:hAnsiTheme="minorHAnsi" w:cstheme="minorHAnsi"/>
+          <w:b/>
+          <w:bCs/>
+          <w:kern w:val="2"/>
+          <w:sz w:val="22"/>
+          <w:szCs w:val="22"/>
+          <w:lang w:val="en-IN" w:eastAsia="en-US" w:bidi="ar-SA"/>
+          <w14:ligatures w14:val="standardContextual"/>
+        </w:rPr>
+        <w:t>improving BI query performance by 50%</w:t>
+      </w:r>
+      <w:r>
+        <w:rPr>
+          <w:rFonts w:asciiTheme="minorHAnsi" w:eastAsiaTheme="minorHAnsi" w:hAnsiTheme="minorHAnsi" w:cstheme="minorHAnsi"/>
+          <w:kern w:val="2"/>
+          <w:sz w:val="22"/>
+          <w:szCs w:val="22"/>
+          <w:lang w:val="en-IN" w:eastAsia="en-US" w:bidi="ar-SA"/>
+          <w14:ligatures w14:val="standardContextual"/>
+        </w:rPr>
+        <w:t xml:space="preserve"> for revenue, demand, and utilization reporting</w:t>
+      </w:r>
+      <w:r>
+        <w:rPr>
+          <w:rFonts w:asciiTheme="minorHAnsi" w:eastAsiaTheme="minorHAnsi" w:hAnsiTheme="minorHAnsi" w:cstheme="minorHAnsi"/>
+          <w:kern w:val="2"/>
+          <w:sz w:val="22"/>
+          <w:szCs w:val="22"/>
+          <w:lang w:val="en-IN" w:eastAsia="en-US" w:bidi="ar-SA"/>
+          <w14:ligatures w14:val="standardContextual"/>
+        </w:rPr>
+        <w:t>.</w:t>
+      </w:r>
+    </w:p>
+    <w:p>
+      <w:pPr>
+        <w:pStyle w:val="LO-normal"/>
+        <w:spacing w:line="120" w:lineRule="auto"/>
+        <w:ind w:right="-397"/>
+        <w:jc w:val="both"/>
+        <w:rPr>
+          <w:rFonts w:asciiTheme="minorHAnsi" w:eastAsiaTheme="minorHAnsi" w:hAnsiTheme="minorHAnsi" w:cstheme="minorHAnsi"/>
+          <w:kern w:val="2"/>
           <w:lang w:val="en-IN" w:eastAsia="en-US" w:bidi="ar-SA"/>
           <w14:ligatures w14:val="standardContextual"/>
         </w:rPr>
@@ -1543,19 +2412,19 @@
           <w:rFonts w:asciiTheme="minorHAnsi" w:eastAsiaTheme="minorHAnsi" w:hAnsiTheme="minorHAnsi" w:cstheme="minorHAnsi"/>
           <w:b/>
           <w:kern w:val="2"/>
-          <w:sz w:val="32"/>
-          <w:szCs w:val="32"/>
-          <w:lang w:val="en-IN" w:eastAsia="en-US" w:bidi="ar-SA"/>
-          <w14:ligatures w14:val="standardContextual"/>
-        </w:rPr>
-      </w:pPr>
-      <w:r>
-        <w:rPr>
-          <w:rFonts w:asciiTheme="minorHAnsi" w:eastAsiaTheme="minorHAnsi" w:hAnsiTheme="minorHAnsi" w:cstheme="minorHAnsi"/>
-          <w:b/>
-          <w:kern w:val="2"/>
-          <w:sz w:val="32"/>
-          <w:szCs w:val="32"/>
+          <w:sz w:val="28"/>
+          <w:szCs w:val="28"/>
+          <w:lang w:val="en-IN" w:eastAsia="en-US" w:bidi="ar-SA"/>
+          <w14:ligatures w14:val="standardContextual"/>
+        </w:rPr>
+      </w:pPr>
+      <w:r>
+        <w:rPr>
+          <w:rFonts w:asciiTheme="minorHAnsi" w:eastAsiaTheme="minorHAnsi" w:hAnsiTheme="minorHAnsi" w:cstheme="minorHAnsi"/>
+          <w:b/>
+          <w:kern w:val="2"/>
+          <w:sz w:val="28"/>
+          <w:szCs w:val="28"/>
           <w:lang w:val="en-IN" w:eastAsia="en-US" w:bidi="ar-SA"/>
           <w14:ligatures w14:val="standardContextual"/>
         </w:rPr>
@@ -1566,8 +2435,8 @@
           <w:rFonts w:asciiTheme="minorHAnsi" w:eastAsiaTheme="minorHAnsi" w:hAnsiTheme="minorHAnsi" w:cstheme="minorHAnsi"/>
           <w:b/>
           <w:kern w:val="2"/>
-          <w:sz w:val="32"/>
-          <w:szCs w:val="32"/>
+          <w:sz w:val="28"/>
+          <w:szCs w:val="28"/>
           <w:lang w:val="en-IN" w:eastAsia="en-US" w:bidi="ar-SA"/>
           <w14:ligatures w14:val="standardContextual"/>
         </w:rPr>
@@ -1586,6 +2455,8 @@
         <w:rPr>
           <w:rFonts w:asciiTheme="minorHAnsi" w:eastAsiaTheme="minorHAnsi" w:hAnsiTheme="minorHAnsi" w:cstheme="minorHAnsi"/>
           <w:kern w:val="2"/>
+          <w:sz w:val="22"/>
+          <w:szCs w:val="22"/>
           <w:lang w:val="en-IN" w:eastAsia="en-US" w:bidi="ar-SA"/>
           <w14:ligatures w14:val="standardContextual"/>
         </w:rPr>
@@ -1596,10 +2467,12 @@
           <w:b/>
           <w:bCs/>
           <w:kern w:val="2"/>
-          <w:lang w:val="en-IN" w:eastAsia="en-US" w:bidi="ar-SA"/>
-          <w14:ligatures w14:val="standardContextual"/>
-        </w:rPr>
-        <w:t xml:space="preserve">Programming </w:t>
+          <w:sz w:val="22"/>
+          <w:szCs w:val="22"/>
+          <w:lang w:val="en-IN" w:eastAsia="en-US" w:bidi="ar-SA"/>
+          <w14:ligatures w14:val="standardContextual"/>
+        </w:rPr>
+        <w:t>Languages</w:t>
       </w:r>
       <w:r>
         <w:rPr>
@@ -1607,17 +2480,8 @@
           <w:b/>
           <w:bCs/>
           <w:kern w:val="2"/>
-          <w:lang w:val="en-IN" w:eastAsia="en-US" w:bidi="ar-SA"/>
-          <w14:ligatures w14:val="standardContextual"/>
-        </w:rPr>
-        <w:t>Languages</w:t>
-      </w:r>
-      <w:r>
-        <w:rPr>
-          <w:rFonts w:asciiTheme="minorHAnsi" w:eastAsiaTheme="minorHAnsi" w:hAnsiTheme="minorHAnsi" w:cstheme="minorHAnsi"/>
-          <w:b/>
-          <w:bCs/>
-          <w:kern w:val="2"/>
+          <w:sz w:val="22"/>
+          <w:szCs w:val="22"/>
           <w:lang w:val="en-IN" w:eastAsia="en-US" w:bidi="ar-SA"/>
           <w14:ligatures w14:val="standardContextual"/>
         </w:rPr>
@@ -1627,6 +2491,8 @@
         <w:rPr>
           <w:rFonts w:asciiTheme="minorHAnsi" w:eastAsiaTheme="minorHAnsi" w:hAnsiTheme="minorHAnsi" w:cstheme="minorHAnsi"/>
           <w:kern w:val="2"/>
+          <w:sz w:val="22"/>
+          <w:szCs w:val="22"/>
           <w:lang w:val="en-IN" w:eastAsia="en-US" w:bidi="ar-SA"/>
           <w14:ligatures w14:val="standardContextual"/>
         </w:rPr>
@@ -1645,6 +2511,8 @@
         <w:rPr>
           <w:rFonts w:asciiTheme="minorHAnsi" w:eastAsiaTheme="minorHAnsi" w:hAnsiTheme="minorHAnsi" w:cstheme="minorHAnsi"/>
           <w:kern w:val="2"/>
+          <w:sz w:val="22"/>
+          <w:szCs w:val="22"/>
           <w:lang w:val="en-IN" w:eastAsia="en-US" w:bidi="ar-SA"/>
           <w14:ligatures w14:val="standardContextual"/>
         </w:rPr>
@@ -1655,10 +2523,12 @@
           <w:b/>
           <w:bCs/>
           <w:kern w:val="2"/>
-          <w:lang w:val="en-IN" w:eastAsia="en-US" w:bidi="ar-SA"/>
-          <w14:ligatures w14:val="standardContextual"/>
-        </w:rPr>
-        <w:t>Tech Stack</w:t>
+          <w:sz w:val="22"/>
+          <w:szCs w:val="22"/>
+          <w:lang w:val="en-IN" w:eastAsia="en-US" w:bidi="ar-SA"/>
+          <w14:ligatures w14:val="standardContextual"/>
+        </w:rPr>
+        <w:t>Data Engineering</w:t>
       </w:r>
       <w:r>
         <w:rPr>
@@ -1666,6 +2536,8 @@
           <w:b/>
           <w:bCs/>
           <w:kern w:val="2"/>
+          <w:sz w:val="22"/>
+          <w:szCs w:val="22"/>
           <w:lang w:val="en-IN" w:eastAsia="en-US" w:bidi="ar-SA"/>
           <w14:ligatures w14:val="standardContextual"/>
         </w:rPr>
@@ -1675,6 +2547,8 @@
         <w:rPr>
           <w:rFonts w:asciiTheme="minorHAnsi" w:eastAsiaTheme="minorHAnsi" w:hAnsiTheme="minorHAnsi" w:cstheme="minorHAnsi"/>
           <w:kern w:val="2"/>
+          <w:sz w:val="22"/>
+          <w:szCs w:val="22"/>
           <w:lang w:val="en-IN" w:eastAsia="en-US" w:bidi="ar-SA"/>
           <w14:ligatures w14:val="standardContextual"/>
         </w:rPr>
@@ -1684,6 +2558,8 @@
         <w:rPr>
           <w:rFonts w:asciiTheme="minorHAnsi" w:eastAsiaTheme="minorHAnsi" w:hAnsiTheme="minorHAnsi" w:cstheme="minorHAnsi"/>
           <w:kern w:val="2"/>
+          <w:sz w:val="22"/>
+          <w:szCs w:val="22"/>
           <w:lang w:val="en-IN" w:eastAsia="en-US" w:bidi="ar-SA"/>
           <w14:ligatures w14:val="standardContextual"/>
         </w:rPr>
@@ -1693,6 +2569,8 @@
         <w:rPr>
           <w:rFonts w:asciiTheme="minorHAnsi" w:eastAsiaTheme="minorHAnsi" w:hAnsiTheme="minorHAnsi" w:cstheme="minorHAnsi"/>
           <w:kern w:val="2"/>
+          <w:sz w:val="22"/>
+          <w:szCs w:val="22"/>
           <w:lang w:val="en-IN" w:eastAsia="en-US" w:bidi="ar-SA"/>
           <w14:ligatures w14:val="standardContextual"/>
         </w:rPr>
@@ -1702,6 +2580,8 @@
         <w:rPr>
           <w:rFonts w:asciiTheme="minorHAnsi" w:eastAsiaTheme="minorHAnsi" w:hAnsiTheme="minorHAnsi" w:cstheme="minorHAnsi"/>
           <w:kern w:val="2"/>
+          <w:sz w:val="22"/>
+          <w:szCs w:val="22"/>
           <w:lang w:val="en-IN" w:eastAsia="en-US" w:bidi="ar-SA"/>
           <w14:ligatures w14:val="standardContextual"/>
         </w:rPr>
@@ -1711,6 +2591,8 @@
         <w:rPr>
           <w:rFonts w:asciiTheme="minorHAnsi" w:eastAsiaTheme="minorHAnsi" w:hAnsiTheme="minorHAnsi" w:cstheme="minorHAnsi"/>
           <w:kern w:val="2"/>
+          <w:sz w:val="22"/>
+          <w:szCs w:val="22"/>
           <w:lang w:val="en-IN" w:eastAsia="en-US" w:bidi="ar-SA"/>
           <w14:ligatures w14:val="standardContextual"/>
         </w:rPr>
@@ -1720,6 +2602,8 @@
         <w:rPr>
           <w:rFonts w:asciiTheme="minorHAnsi" w:eastAsiaTheme="minorHAnsi" w:hAnsiTheme="minorHAnsi" w:cstheme="minorHAnsi"/>
           <w:kern w:val="2"/>
+          <w:sz w:val="22"/>
+          <w:szCs w:val="22"/>
           <w:lang w:val="en-IN" w:eastAsia="en-US" w:bidi="ar-SA"/>
           <w14:ligatures w14:val="standardContextual"/>
         </w:rPr>
@@ -1729,6 +2613,8 @@
         <w:rPr>
           <w:rFonts w:asciiTheme="minorHAnsi" w:eastAsiaTheme="minorHAnsi" w:hAnsiTheme="minorHAnsi" w:cstheme="minorHAnsi"/>
           <w:kern w:val="2"/>
+          <w:sz w:val="22"/>
+          <w:szCs w:val="22"/>
           <w:lang w:val="en-IN" w:eastAsia="en-US" w:bidi="ar-SA"/>
           <w14:ligatures w14:val="standardContextual"/>
         </w:rPr>
@@ -1738,6 +2624,8 @@
         <w:rPr>
           <w:rFonts w:asciiTheme="minorHAnsi" w:eastAsiaTheme="minorHAnsi" w:hAnsiTheme="minorHAnsi" w:cstheme="minorHAnsi"/>
           <w:kern w:val="2"/>
+          <w:sz w:val="22"/>
+          <w:szCs w:val="22"/>
           <w:lang w:val="en-IN" w:eastAsia="en-US" w:bidi="ar-SA"/>
           <w14:ligatures w14:val="standardContextual"/>
         </w:rPr>
@@ -1747,10 +2635,23 @@
         <w:rPr>
           <w:rFonts w:asciiTheme="minorHAnsi" w:eastAsiaTheme="minorHAnsi" w:hAnsiTheme="minorHAnsi" w:cstheme="minorHAnsi"/>
           <w:kern w:val="2"/>
-          <w:lang w:val="en-IN" w:eastAsia="en-US" w:bidi="ar-SA"/>
-          <w14:ligatures w14:val="standardContextual"/>
-        </w:rPr>
-        <w:t>, Power BI</w:t>
+          <w:sz w:val="22"/>
+          <w:szCs w:val="22"/>
+          <w:lang w:val="en-IN" w:eastAsia="en-US" w:bidi="ar-SA"/>
+          <w14:ligatures w14:val="standardContextual"/>
+        </w:rPr>
+        <w:t xml:space="preserve">, </w:t>
+      </w:r>
+      <w:r>
+        <w:rPr>
+          <w:rFonts w:asciiTheme="minorHAnsi" w:eastAsiaTheme="minorHAnsi" w:hAnsiTheme="minorHAnsi" w:cstheme="minorHAnsi"/>
+          <w:kern w:val="2"/>
+          <w:sz w:val="22"/>
+          <w:szCs w:val="22"/>
+          <w:lang w:val="en-IN" w:eastAsia="en-US" w:bidi="ar-SA"/>
+          <w14:ligatures w14:val="standardContextual"/>
+        </w:rPr>
+        <w:t>Delta/Parquet</w:t>
       </w:r>
     </w:p>
     <w:p>
@@ -1765,6 +2666,8 @@
         <w:rPr>
           <w:rFonts w:asciiTheme="minorHAnsi" w:eastAsiaTheme="minorHAnsi" w:hAnsiTheme="minorHAnsi" w:cstheme="minorHAnsi"/>
           <w:kern w:val="2"/>
+          <w:sz w:val="22"/>
+          <w:szCs w:val="22"/>
           <w:lang w:val="en-IN" w:eastAsia="en-US" w:bidi="ar-SA"/>
           <w14:ligatures w14:val="standardContextual"/>
         </w:rPr>
@@ -1775,10 +2678,12 @@
           <w:b/>
           <w:bCs/>
           <w:kern w:val="2"/>
-          <w:lang w:val="en-IN" w:eastAsia="en-US" w:bidi="ar-SA"/>
-          <w14:ligatures w14:val="standardContextual"/>
-        </w:rPr>
-        <w:t>Architecture</w:t>
+          <w:sz w:val="22"/>
+          <w:szCs w:val="22"/>
+          <w:lang w:val="en-IN" w:eastAsia="en-US" w:bidi="ar-SA"/>
+          <w14:ligatures w14:val="standardContextual"/>
+        </w:rPr>
+        <w:t>Cloud</w:t>
       </w:r>
       <w:r>
         <w:rPr>
@@ -1786,55 +2691,113 @@
           <w:b/>
           <w:bCs/>
           <w:kern w:val="2"/>
-          <w:lang w:val="en-IN" w:eastAsia="en-US" w:bidi="ar-SA"/>
-          <w14:ligatures w14:val="standardContextual"/>
-        </w:rPr>
-        <w:t>:</w:t>
-      </w:r>
-      <w:r>
-        <w:rPr>
-          <w:rFonts w:asciiTheme="minorHAnsi" w:eastAsiaTheme="minorHAnsi" w:hAnsiTheme="minorHAnsi" w:cstheme="minorHAnsi"/>
-          <w:kern w:val="2"/>
-          <w:lang w:val="en-IN" w:eastAsia="en-US" w:bidi="ar-SA"/>
-          <w14:ligatures w14:val="standardContextual"/>
-        </w:rPr>
-        <w:t xml:space="preserve"> Medallion</w:t>
-      </w:r>
-      <w:r>
-        <w:rPr>
-          <w:rFonts w:asciiTheme="minorHAnsi" w:eastAsiaTheme="minorHAnsi" w:hAnsiTheme="minorHAnsi" w:cstheme="minorHAnsi"/>
-          <w:kern w:val="2"/>
-          <w:lang w:val="en-IN" w:eastAsia="en-US" w:bidi="ar-SA"/>
-          <w14:ligatures w14:val="standardContextual"/>
-        </w:rPr>
-        <w:t>/Lakehouse</w:t>
-      </w:r>
-      <w:r>
-        <w:rPr>
-          <w:rFonts w:asciiTheme="minorHAnsi" w:eastAsiaTheme="minorHAnsi" w:hAnsiTheme="minorHAnsi" w:cstheme="minorHAnsi"/>
-          <w:kern w:val="2"/>
-          <w:lang w:val="en-IN" w:eastAsia="en-US" w:bidi="ar-SA"/>
-          <w14:ligatures w14:val="standardContextual"/>
-        </w:rPr>
-        <w:t xml:space="preserve"> Architecture, Star Schema, </w:t>
-      </w:r>
-      <w:r>
-        <w:rPr>
-          <w:rFonts w:asciiTheme="minorHAnsi" w:eastAsiaTheme="minorHAnsi" w:hAnsiTheme="minorHAnsi" w:cstheme="minorHAnsi"/>
-          <w:kern w:val="2"/>
-          <w:lang w:val="en-IN" w:eastAsia="en-US" w:bidi="ar-SA"/>
-          <w14:ligatures w14:val="standardContextual"/>
-        </w:rPr>
-        <w:t>ELT/ETL</w:t>
-      </w:r>
-      <w:r>
-        <w:rPr>
-          <w:rFonts w:asciiTheme="minorHAnsi" w:eastAsiaTheme="minorHAnsi" w:hAnsiTheme="minorHAnsi" w:cstheme="minorHAnsi"/>
-          <w:kern w:val="2"/>
-          <w:lang w:val="en-IN" w:eastAsia="en-US" w:bidi="ar-SA"/>
-          <w14:ligatures w14:val="standardContextual"/>
-        </w:rPr>
-        <w:t>, Indexing/Partition strategy, Dimensional Modeling</w:t>
+          <w:sz w:val="22"/>
+          <w:szCs w:val="22"/>
+          <w:lang w:val="en-IN" w:eastAsia="en-US" w:bidi="ar-SA"/>
+          <w14:ligatures w14:val="standardContextual"/>
+        </w:rPr>
+        <w:t>/</w:t>
+      </w:r>
+      <w:r>
+        <w:rPr>
+          <w:rFonts w:asciiTheme="minorHAnsi" w:eastAsiaTheme="minorHAnsi" w:hAnsiTheme="minorHAnsi" w:cstheme="minorHAnsi"/>
+          <w:b/>
+          <w:bCs/>
+          <w:kern w:val="2"/>
+          <w:sz w:val="22"/>
+          <w:szCs w:val="22"/>
+          <w:lang w:val="en-IN" w:eastAsia="en-US" w:bidi="ar-SA"/>
+          <w14:ligatures w14:val="standardContextual"/>
+        </w:rPr>
+        <w:t>Data Platforms:</w:t>
+      </w:r>
+      <w:r>
+        <w:rPr>
+          <w:rFonts w:asciiTheme="minorHAnsi" w:eastAsiaTheme="minorHAnsi" w:hAnsiTheme="minorHAnsi" w:cstheme="minorHAnsi"/>
+          <w:kern w:val="2"/>
+          <w:sz w:val="22"/>
+          <w:szCs w:val="22"/>
+          <w:lang w:val="en-IN" w:eastAsia="en-US" w:bidi="ar-SA"/>
+          <w14:ligatures w14:val="standardContextual"/>
+        </w:rPr>
+        <w:t xml:space="preserve"> Microsoft Fabric, ADLS Gen2, ADF, Azure Synapse, Azure Functions, Databricks</w:t>
+      </w:r>
+      <w:r>
+        <w:rPr>
+          <w:rFonts w:asciiTheme="minorHAnsi" w:eastAsiaTheme="minorHAnsi" w:hAnsiTheme="minorHAnsi" w:cstheme="minorHAnsi"/>
+          <w:kern w:val="2"/>
+          <w:sz w:val="22"/>
+          <w:szCs w:val="22"/>
+          <w:lang w:val="en-IN" w:eastAsia="en-US" w:bidi="ar-SA"/>
+          <w14:ligatures w14:val="standardContextual"/>
+        </w:rPr>
+        <w:t>, Snowflake</w:t>
+      </w:r>
+      <w:r>
+        <w:rPr>
+          <w:rFonts w:asciiTheme="minorHAnsi" w:eastAsiaTheme="minorHAnsi" w:hAnsiTheme="minorHAnsi" w:cstheme="minorHAnsi"/>
+          <w:kern w:val="2"/>
+          <w:sz w:val="22"/>
+          <w:szCs w:val="22"/>
+          <w:lang w:val="en-IN" w:eastAsia="en-US" w:bidi="ar-SA"/>
+          <w14:ligatures w14:val="standardContextual"/>
+        </w:rPr>
+        <w:t>, OneLake</w:t>
+      </w:r>
+      <w:r>
+        <w:rPr>
+          <w:rFonts w:asciiTheme="minorHAnsi" w:eastAsiaTheme="minorHAnsi" w:hAnsiTheme="minorHAnsi" w:cstheme="minorHAnsi"/>
+          <w:kern w:val="2"/>
+          <w:sz w:val="22"/>
+          <w:szCs w:val="22"/>
+          <w:lang w:val="en-IN" w:eastAsia="en-US" w:bidi="ar-SA"/>
+          <w14:ligatures w14:val="standardContextual"/>
+        </w:rPr>
+        <w:t xml:space="preserve"> and </w:t>
+      </w:r>
+      <w:r>
+        <w:rPr>
+          <w:rFonts w:asciiTheme="minorHAnsi" w:eastAsiaTheme="minorHAnsi" w:hAnsiTheme="minorHAnsi" w:cstheme="minorHAnsi"/>
+          <w:kern w:val="2"/>
+          <w:sz w:val="22"/>
+          <w:szCs w:val="22"/>
+          <w:lang w:val="en-IN" w:eastAsia="en-US" w:bidi="ar-SA"/>
+          <w14:ligatures w14:val="standardContextual"/>
+        </w:rPr>
+        <w:t>Delta Lake concepts, Azure Storage/Blob, Events stream</w:t>
+      </w:r>
+      <w:r>
+        <w:rPr>
+          <w:rFonts w:asciiTheme="minorHAnsi" w:eastAsiaTheme="minorHAnsi" w:hAnsiTheme="minorHAnsi" w:cstheme="minorHAnsi"/>
+          <w:kern w:val="2"/>
+          <w:sz w:val="22"/>
+          <w:szCs w:val="22"/>
+          <w:lang w:val="en-IN" w:eastAsia="en-US" w:bidi="ar-SA"/>
+          <w14:ligatures w14:val="standardContextual"/>
+        </w:rPr>
+        <w:t>, Power BI</w:t>
+      </w:r>
+      <w:r>
+        <w:rPr>
+          <w:rFonts w:asciiTheme="minorHAnsi" w:eastAsiaTheme="minorHAnsi" w:hAnsiTheme="minorHAnsi" w:cstheme="minorHAnsi"/>
+          <w:kern w:val="2"/>
+          <w:sz w:val="22"/>
+          <w:szCs w:val="22"/>
+          <w:lang w:val="en-IN" w:eastAsia="en-US" w:bidi="ar-SA"/>
+          <w14:ligatures w14:val="standardContextual"/>
+        </w:rPr>
+        <w:t xml:space="preserve">, </w:t>
+      </w:r>
+      <w:r>
+        <w:rPr>
+          <w:rFonts w:asciiTheme="minorHAnsi" w:eastAsiaTheme="minorHAnsi" w:hAnsiTheme="minorHAnsi" w:cstheme="minorHAnsi"/>
+          <w:kern w:val="2"/>
+          <w:sz w:val="22"/>
+          <w:szCs w:val="22"/>
+          <w:lang w:val="en-IN" w:eastAsia="en-US" w:bidi="ar-SA"/>
+          <w14:ligatures w14:val="standardContextual"/>
+        </w:rPr>
+        <w:t>KQL/Eventhouse</w:t>
       </w:r>
     </w:p>
     <w:p>
@@ -1849,6 +2812,8 @@
         <w:rPr>
           <w:rFonts w:asciiTheme="minorHAnsi" w:eastAsiaTheme="minorHAnsi" w:hAnsiTheme="minorHAnsi" w:cstheme="minorHAnsi"/>
           <w:kern w:val="2"/>
+          <w:sz w:val="22"/>
+          <w:szCs w:val="22"/>
           <w:lang w:val="en-IN" w:eastAsia="en-US" w:bidi="ar-SA"/>
           <w14:ligatures w14:val="standardContextual"/>
         </w:rPr>
@@ -1859,19 +2824,102 @@
           <w:b/>
           <w:bCs/>
           <w:kern w:val="2"/>
-          <w:lang w:val="en-IN" w:eastAsia="en-US" w:bidi="ar-SA"/>
-          <w14:ligatures w14:val="standardContextual"/>
-        </w:rPr>
-        <w:t>Cloud &amp; Data Platforms:</w:t>
-      </w:r>
-      <w:r>
-        <w:rPr>
-          <w:rFonts w:asciiTheme="minorHAnsi" w:eastAsiaTheme="minorHAnsi" w:hAnsiTheme="minorHAnsi" w:cstheme="minorHAnsi"/>
-          <w:kern w:val="2"/>
-          <w:lang w:val="en-IN" w:eastAsia="en-US" w:bidi="ar-SA"/>
-          <w14:ligatures w14:val="standardContextual"/>
-        </w:rPr>
-        <w:t xml:space="preserve"> Microsoft Fabric (Lakehouse, Eventhouse/KQL), ADLS Gen2, Azure Data Factory (ADF), Azure Synapse, Azure Functions, Databricks, OneLake/Delta Lake concepts, Azure Storage/Blob, Events stream</w:t>
+          <w:sz w:val="22"/>
+          <w:szCs w:val="22"/>
+          <w:lang w:val="en-IN" w:eastAsia="en-US" w:bidi="ar-SA"/>
+          <w14:ligatures w14:val="standardContextual"/>
+        </w:rPr>
+        <w:t>Data Modeling</w:t>
+      </w:r>
+      <w:r>
+        <w:rPr>
+          <w:rFonts w:asciiTheme="minorHAnsi" w:eastAsiaTheme="minorHAnsi" w:hAnsiTheme="minorHAnsi" w:cstheme="minorHAnsi"/>
+          <w:b/>
+          <w:bCs/>
+          <w:kern w:val="2"/>
+          <w:sz w:val="22"/>
+          <w:szCs w:val="22"/>
+          <w:lang w:val="en-IN" w:eastAsia="en-US" w:bidi="ar-SA"/>
+          <w14:ligatures w14:val="standardContextual"/>
+        </w:rPr>
+        <w:t>:</w:t>
+      </w:r>
+      <w:r>
+        <w:rPr>
+          <w:rFonts w:asciiTheme="minorHAnsi" w:eastAsiaTheme="minorHAnsi" w:hAnsiTheme="minorHAnsi" w:cstheme="minorHAnsi"/>
+          <w:kern w:val="2"/>
+          <w:sz w:val="22"/>
+          <w:szCs w:val="22"/>
+          <w:lang w:val="en-IN" w:eastAsia="en-US" w:bidi="ar-SA"/>
+          <w14:ligatures w14:val="standardContextual"/>
+        </w:rPr>
+        <w:t xml:space="preserve"> Medallion</w:t>
+      </w:r>
+      <w:r>
+        <w:rPr>
+          <w:rFonts w:asciiTheme="minorHAnsi" w:eastAsiaTheme="minorHAnsi" w:hAnsiTheme="minorHAnsi" w:cstheme="minorHAnsi"/>
+          <w:kern w:val="2"/>
+          <w:sz w:val="22"/>
+          <w:szCs w:val="22"/>
+          <w:lang w:val="en-IN" w:eastAsia="en-US" w:bidi="ar-SA"/>
+          <w14:ligatures w14:val="standardContextual"/>
+        </w:rPr>
+        <w:t>/Lakehouse</w:t>
+      </w:r>
+      <w:r>
+        <w:rPr>
+          <w:rFonts w:asciiTheme="minorHAnsi" w:eastAsiaTheme="minorHAnsi" w:hAnsiTheme="minorHAnsi" w:cstheme="minorHAnsi"/>
+          <w:kern w:val="2"/>
+          <w:sz w:val="22"/>
+          <w:szCs w:val="22"/>
+          <w:lang w:val="en-IN" w:eastAsia="en-US" w:bidi="ar-SA"/>
+          <w14:ligatures w14:val="standardContextual"/>
+        </w:rPr>
+        <w:t xml:space="preserve"> Architecture, Star Schema, </w:t>
+      </w:r>
+      <w:r>
+        <w:rPr>
+          <w:rFonts w:asciiTheme="minorHAnsi" w:eastAsiaTheme="minorHAnsi" w:hAnsiTheme="minorHAnsi" w:cstheme="minorHAnsi"/>
+          <w:kern w:val="2"/>
+          <w:sz w:val="22"/>
+          <w:szCs w:val="22"/>
+          <w:lang w:val="en-IN" w:eastAsia="en-US" w:bidi="ar-SA"/>
+          <w14:ligatures w14:val="standardContextual"/>
+        </w:rPr>
+        <w:t>ELT/ETL</w:t>
+      </w:r>
+      <w:r>
+        <w:rPr>
+          <w:rFonts w:asciiTheme="minorHAnsi" w:eastAsiaTheme="minorHAnsi" w:hAnsiTheme="minorHAnsi" w:cstheme="minorHAnsi"/>
+          <w:kern w:val="2"/>
+          <w:sz w:val="22"/>
+          <w:szCs w:val="22"/>
+          <w:lang w:val="en-IN" w:eastAsia="en-US" w:bidi="ar-SA"/>
+          <w14:ligatures w14:val="standardContextual"/>
+        </w:rPr>
+        <w:t>, Indexing</w:t>
+      </w:r>
+      <w:r>
+        <w:rPr>
+          <w:rFonts w:asciiTheme="minorHAnsi" w:eastAsiaTheme="minorHAnsi" w:hAnsiTheme="minorHAnsi" w:cstheme="minorHAnsi"/>
+          <w:kern w:val="2"/>
+          <w:sz w:val="22"/>
+          <w:szCs w:val="22"/>
+          <w:lang w:val="en-IN" w:eastAsia="en-US" w:bidi="ar-SA"/>
+          <w14:ligatures w14:val="standardContextual"/>
+        </w:rPr>
+        <w:t xml:space="preserve">, </w:t>
+      </w:r>
+      <w:r>
+        <w:rPr>
+          <w:rFonts w:asciiTheme="minorHAnsi" w:eastAsiaTheme="minorHAnsi" w:hAnsiTheme="minorHAnsi" w:cstheme="minorHAnsi"/>
+          <w:kern w:val="2"/>
+          <w:sz w:val="22"/>
+          <w:szCs w:val="22"/>
+          <w:lang w:val="en-IN" w:eastAsia="en-US" w:bidi="ar-SA"/>
+          <w14:ligatures w14:val="standardContextual"/>
+        </w:rPr>
+        <w:t>Partition, Dimensional Modeling</w:t>
       </w:r>
     </w:p>
     <w:p>
@@ -1886,6 +2934,8 @@
         <w:rPr>
           <w:rFonts w:asciiTheme="minorHAnsi" w:eastAsiaTheme="minorHAnsi" w:hAnsiTheme="minorHAnsi" w:cstheme="minorHAnsi"/>
           <w:kern w:val="2"/>
+          <w:sz w:val="22"/>
+          <w:szCs w:val="22"/>
           <w:lang w:val="en-IN" w:eastAsia="en-US" w:bidi="ar-SA"/>
           <w14:ligatures w14:val="standardContextual"/>
         </w:rPr>
@@ -1896,6 +2946,8 @@
           <w:b/>
           <w:bCs/>
           <w:kern w:val="2"/>
+          <w:sz w:val="22"/>
+          <w:szCs w:val="22"/>
           <w:lang w:val="en-IN" w:eastAsia="en-US" w:bidi="ar-SA"/>
           <w14:ligatures w14:val="standardContextual"/>
         </w:rPr>
@@ -1905,6 +2957,8 @@
         <w:rPr>
           <w:rFonts w:asciiTheme="minorHAnsi" w:eastAsiaTheme="minorHAnsi" w:hAnsiTheme="minorHAnsi" w:cstheme="minorHAnsi"/>
           <w:kern w:val="2"/>
+          <w:sz w:val="22"/>
+          <w:szCs w:val="22"/>
           <w:lang w:val="en-IN" w:eastAsia="en-US" w:bidi="ar-SA"/>
           <w14:ligatures w14:val="standardContextual"/>
         </w:rPr>
@@ -1914,6 +2968,8 @@
         <w:rPr>
           <w:rFonts w:asciiTheme="minorHAnsi" w:eastAsiaTheme="minorHAnsi" w:hAnsiTheme="minorHAnsi" w:cstheme="minorHAnsi"/>
           <w:kern w:val="2"/>
+          <w:sz w:val="22"/>
+          <w:szCs w:val="22"/>
           <w:lang w:val="en-IN" w:eastAsia="en-US" w:bidi="ar-SA"/>
           <w14:ligatures w14:val="standardContextual"/>
         </w:rPr>
@@ -1932,6 +2988,8 @@
         <w:rPr>
           <w:rFonts w:asciiTheme="minorHAnsi" w:eastAsiaTheme="minorHAnsi" w:hAnsiTheme="minorHAnsi" w:cstheme="minorHAnsi"/>
           <w:kern w:val="2"/>
+          <w:sz w:val="22"/>
+          <w:szCs w:val="22"/>
           <w:lang w:val="en-IN" w:eastAsia="en-US" w:bidi="ar-SA"/>
           <w14:ligatures w14:val="standardContextual"/>
         </w:rPr>
@@ -1942,6 +3000,8 @@
           <w:b/>
           <w:bCs/>
           <w:kern w:val="2"/>
+          <w:sz w:val="22"/>
+          <w:szCs w:val="22"/>
           <w:lang w:val="en-IN" w:eastAsia="en-US" w:bidi="ar-SA"/>
           <w14:ligatures w14:val="standardContextual"/>
         </w:rPr>
@@ -1951,6 +3011,8 @@
         <w:rPr>
           <w:rFonts w:asciiTheme="minorHAnsi" w:eastAsiaTheme="minorHAnsi" w:hAnsiTheme="minorHAnsi" w:cstheme="minorHAnsi"/>
           <w:kern w:val="2"/>
+          <w:sz w:val="22"/>
+          <w:szCs w:val="22"/>
           <w:lang w:val="en-IN" w:eastAsia="en-US" w:bidi="ar-SA"/>
           <w14:ligatures w14:val="standardContextual"/>
         </w:rPr>
@@ -1960,15 +3022,8 @@
         <w:rPr>
           <w:rFonts w:asciiTheme="minorHAnsi" w:eastAsiaTheme="minorHAnsi" w:hAnsiTheme="minorHAnsi" w:cstheme="minorHAnsi"/>
           <w:kern w:val="2"/>
-          <w:lang w:val="en-IN" w:eastAsia="en-US" w:bidi="ar-SA"/>
-          <w14:ligatures w14:val="standardContextual"/>
-        </w:rPr>
-        <w:t>, Azure Devops</w:t>
-      </w:r>
-      <w:r>
-        <w:rPr>
-          <w:rFonts w:asciiTheme="minorHAnsi" w:eastAsiaTheme="minorHAnsi" w:hAnsiTheme="minorHAnsi" w:cstheme="minorHAnsi"/>
-          <w:kern w:val="2"/>
+          <w:sz w:val="22"/>
+          <w:szCs w:val="22"/>
           <w:lang w:val="en-IN" w:eastAsia="en-US" w:bidi="ar-SA"/>
           <w14:ligatures w14:val="standardContextual"/>
         </w:rPr>
@@ -1978,28 +3033,12 @@
         <w:rPr>
           <w:rFonts w:asciiTheme="minorHAnsi" w:eastAsiaTheme="minorHAnsi" w:hAnsiTheme="minorHAnsi" w:cstheme="minorHAnsi"/>
           <w:kern w:val="2"/>
-          <w:lang w:val="en-IN" w:eastAsia="en-US" w:bidi="ar-SA"/>
-          <w14:ligatures w14:val="standardContextual"/>
-        </w:rPr>
-        <w:t xml:space="preserve"> </w:t>
-      </w:r>
-      <w:r>
-        <w:rPr>
-          <w:rFonts w:asciiTheme="minorHAnsi" w:eastAsiaTheme="minorHAnsi" w:hAnsiTheme="minorHAnsi" w:cstheme="minorHAnsi"/>
-          <w:kern w:val="2"/>
-          <w:lang w:val="en-IN" w:eastAsia="en-US" w:bidi="ar-SA"/>
-          <w14:ligatures w14:val="standardContextual"/>
-        </w:rPr>
-        <w:t>Code Reviews</w:t>
-      </w:r>
-      <w:r>
-        <w:rPr>
-          <w:rFonts w:asciiTheme="minorHAnsi" w:eastAsiaTheme="minorHAnsi" w:hAnsiTheme="minorHAnsi" w:cstheme="minorHAnsi"/>
-          <w:kern w:val="2"/>
-          <w:lang w:val="en-IN" w:eastAsia="en-US" w:bidi="ar-SA"/>
-          <w14:ligatures w14:val="standardContextual"/>
-        </w:rPr>
-        <w:t>, Stakeholder Collaboration</w:t>
+          <w:sz w:val="22"/>
+          <w:szCs w:val="22"/>
+          <w:lang w:val="en-IN" w:eastAsia="en-US" w:bidi="ar-SA"/>
+          <w14:ligatures w14:val="standardContextual"/>
+        </w:rPr>
+        <w:t xml:space="preserve"> CI/CD</w:t>
       </w:r>
     </w:p>
     <w:p>
@@ -2014,6 +3053,8 @@
         <w:rPr>
           <w:rFonts w:asciiTheme="minorHAnsi" w:eastAsiaTheme="minorHAnsi" w:hAnsiTheme="minorHAnsi" w:cstheme="minorHAnsi"/>
           <w:kern w:val="2"/>
+          <w:sz w:val="22"/>
+          <w:szCs w:val="22"/>
           <w:lang w:val="en-IN" w:eastAsia="en-US" w:bidi="ar-SA"/>
           <w14:ligatures w14:val="standardContextual"/>
         </w:rPr>
@@ -2024,6 +3065,8 @@
           <w:b/>
           <w:bCs/>
           <w:kern w:val="2"/>
+          <w:sz w:val="22"/>
+          <w:szCs w:val="22"/>
           <w:lang w:val="en-IN" w:eastAsia="en-US" w:bidi="ar-SA"/>
           <w14:ligatures w14:val="standardContextual"/>
         </w:rPr>
@@ -2035,6 +3078,8 @@
           <w:b/>
           <w:bCs/>
           <w:kern w:val="2"/>
+          <w:sz w:val="22"/>
+          <w:szCs w:val="22"/>
           <w:lang w:val="en-IN" w:eastAsia="en-US" w:bidi="ar-SA"/>
           <w14:ligatures w14:val="standardContextual"/>
         </w:rPr>
@@ -2044,19 +3089,23 @@
         <w:rPr>
           <w:rFonts w:asciiTheme="minorHAnsi" w:eastAsiaTheme="minorHAnsi" w:hAnsiTheme="minorHAnsi" w:cstheme="minorHAnsi"/>
           <w:kern w:val="2"/>
-          <w:lang w:val="en-IN" w:eastAsia="en-US" w:bidi="ar-SA"/>
-          <w14:ligatures w14:val="standardContextual"/>
-        </w:rPr>
-        <w:t xml:space="preserve"> Requirement Analysis, FinOps Awareness, Parquet/Tabular Data Formats</w:t>
-      </w:r>
-      <w:r>
-        <w:rPr>
-          <w:rFonts w:asciiTheme="minorHAnsi" w:eastAsiaTheme="minorHAnsi" w:hAnsiTheme="minorHAnsi" w:cstheme="minorHAnsi"/>
-          <w:kern w:val="2"/>
-          <w:lang w:val="en-IN" w:eastAsia="en-US" w:bidi="ar-SA"/>
-          <w14:ligatures w14:val="standardContextual"/>
-        </w:rPr>
-        <w:t>, Partitioning, Indexing</w:t>
+          <w:sz w:val="22"/>
+          <w:szCs w:val="22"/>
+          <w:lang w:val="en-IN" w:eastAsia="en-US" w:bidi="ar-SA"/>
+          <w14:ligatures w14:val="standardContextual"/>
+        </w:rPr>
+        <w:t xml:space="preserve"> Requirement Analysis, FinOps Awareness, </w:t>
+      </w:r>
+      <w:r>
+        <w:rPr>
+          <w:rFonts w:asciiTheme="minorHAnsi" w:eastAsiaTheme="minorHAnsi" w:hAnsiTheme="minorHAnsi" w:cstheme="minorHAnsi"/>
+          <w:kern w:val="2"/>
+          <w:sz w:val="22"/>
+          <w:szCs w:val="22"/>
+          <w:lang w:val="en-IN" w:eastAsia="en-US" w:bidi="ar-SA"/>
+          <w14:ligatures w14:val="standardContextual"/>
+        </w:rPr>
+        <w:t>Code Reviews, Stakeholder Collaboration</w:t>
       </w:r>
     </w:p>
     <w:p>
@@ -2072,8 +3121,6 @@
           <w:rFonts w:asciiTheme="minorHAnsi" w:eastAsiaTheme="minorHAnsi" w:hAnsiTheme="minorHAnsi" w:cstheme="minorHAnsi"/>
           <w:b/>
           <w:kern w:val="2"/>
-          <w:sz w:val="28"/>
-          <w:szCs w:val="28"/>
           <w:lang w:val="en-IN" w:eastAsia="en-US" w:bidi="ar-SA"/>
           <w14:ligatures w14:val="standardContextual"/>
         </w:rPr>
@@ -2090,17 +3137,17 @@
         <w:rPr>
           <w:rFonts w:asciiTheme="minorHAnsi" w:hAnsiTheme="minorHAnsi" w:cstheme="minorHAnsi"/>
           <w:b/>
-          <w:sz w:val="40"/>
-          <w:szCs w:val="40"/>
-        </w:rPr>
-      </w:pPr>
-      <w:r>
-        <w:rPr>
-          <w:rFonts w:asciiTheme="minorHAnsi" w:eastAsiaTheme="minorHAnsi" w:hAnsiTheme="minorHAnsi" w:cstheme="minorHAnsi"/>
-          <w:b/>
-          <w:kern w:val="2"/>
-          <w:sz w:val="32"/>
-          <w:szCs w:val="32"/>
+          <w:sz w:val="36"/>
+          <w:szCs w:val="36"/>
+        </w:rPr>
+      </w:pPr>
+      <w:r>
+        <w:rPr>
+          <w:rFonts w:asciiTheme="minorHAnsi" w:eastAsiaTheme="minorHAnsi" w:hAnsiTheme="minorHAnsi" w:cstheme="minorHAnsi"/>
+          <w:b/>
+          <w:kern w:val="2"/>
+          <w:sz w:val="28"/>
+          <w:szCs w:val="28"/>
           <w:lang w:val="en-IN" w:eastAsia="en-US" w:bidi="ar-SA"/>
           <w14:ligatures w14:val="standardContextual"/>
         </w:rPr>
@@ -2121,6 +3168,8 @@
           <w:b/>
           <w:bCs/>
           <w:kern w:val="2"/>
+          <w:sz w:val="22"/>
+          <w:szCs w:val="22"/>
           <w:lang w:val="en-IN" w:eastAsia="en-US" w:bidi="ar-SA"/>
           <w14:ligatures w14:val="standardContextual"/>
         </w:rPr>
@@ -2131,6 +3180,8 @@
           <w:b/>
           <w:bCs/>
           <w:kern w:val="2"/>
+          <w:sz w:val="22"/>
+          <w:szCs w:val="22"/>
           <w:lang w:val="en-IN" w:eastAsia="en-US" w:bidi="ar-SA"/>
           <w14:ligatures w14:val="standardContextual"/>
         </w:rPr>
@@ -2140,6 +3191,8 @@
         <w:rPr>
           <w:rFonts w:asciiTheme="minorHAnsi" w:eastAsiaTheme="minorHAnsi" w:hAnsiTheme="minorHAnsi" w:cstheme="minorHAnsi"/>
           <w:kern w:val="2"/>
+          <w:sz w:val="22"/>
+          <w:szCs w:val="22"/>
           <w:lang w:val="en-IN" w:eastAsia="en-US" w:bidi="ar-SA"/>
           <w14:ligatures w14:val="standardContextual"/>
         </w:rPr>
@@ -2151,6 +3204,8 @@
           <w:b/>
           <w:bCs/>
           <w:kern w:val="2"/>
+          <w:sz w:val="22"/>
+          <w:szCs w:val="22"/>
           <w:lang w:val="en-IN" w:eastAsia="en-US" w:bidi="ar-SA"/>
           <w14:ligatures w14:val="standardContextual"/>
         </w:rPr>
@@ -2160,6 +3215,8 @@
         <w:rPr>
           <w:rFonts w:asciiTheme="minorHAnsi" w:eastAsiaTheme="minorHAnsi" w:hAnsiTheme="minorHAnsi" w:cstheme="minorHAnsi"/>
           <w:kern w:val="2"/>
+          <w:sz w:val="22"/>
+          <w:szCs w:val="22"/>
           <w:lang w:val="en-IN" w:eastAsia="en-US" w:bidi="ar-SA"/>
           <w14:ligatures w14:val="standardContextual"/>
         </w:rPr>
@@ -2169,6 +3226,8 @@
         <w:rPr>
           <w:rFonts w:asciiTheme="minorHAnsi" w:eastAsiaTheme="minorHAnsi" w:hAnsiTheme="minorHAnsi" w:cstheme="minorHAnsi"/>
           <w:kern w:val="2"/>
+          <w:sz w:val="22"/>
+          <w:szCs w:val="22"/>
           <w:lang w:val="en-IN" w:eastAsia="en-US" w:bidi="ar-SA"/>
           <w14:ligatures w14:val="standardContextual"/>
         </w:rPr>
@@ -2178,6 +3237,8 @@
         <w:rPr>
           <w:rFonts w:asciiTheme="minorHAnsi" w:eastAsiaTheme="minorHAnsi" w:hAnsiTheme="minorHAnsi" w:cstheme="minorHAnsi"/>
           <w:kern w:val="2"/>
+          <w:sz w:val="22"/>
+          <w:szCs w:val="22"/>
           <w:lang w:val="en-IN" w:eastAsia="en-US" w:bidi="ar-SA"/>
           <w14:ligatures w14:val="standardContextual"/>
         </w:rPr>
@@ -2198,6 +3259,8 @@
           <w:b/>
           <w:bCs/>
           <w:kern w:val="2"/>
+          <w:sz w:val="22"/>
+          <w:szCs w:val="22"/>
           <w:lang w:val="en-IN" w:eastAsia="en-US" w:bidi="ar-SA"/>
           <w14:ligatures w14:val="standardContextual"/>
         </w:rPr>
@@ -2208,6 +3271,8 @@
           <w:b/>
           <w:bCs/>
           <w:kern w:val="2"/>
+          <w:sz w:val="22"/>
+          <w:szCs w:val="22"/>
           <w:lang w:val="en-IN" w:eastAsia="en-US" w:bidi="ar-SA"/>
           <w14:ligatures w14:val="standardContextual"/>
         </w:rPr>
@@ -2217,6 +3282,8 @@
         <w:rPr>
           <w:rFonts w:asciiTheme="minorHAnsi" w:eastAsiaTheme="minorHAnsi" w:hAnsiTheme="minorHAnsi" w:cstheme="minorHAnsi"/>
           <w:kern w:val="2"/>
+          <w:sz w:val="22"/>
+          <w:szCs w:val="22"/>
           <w:lang w:val="en-IN" w:eastAsia="en-US" w:bidi="ar-SA"/>
           <w14:ligatures w14:val="standardContextual"/>
         </w:rPr>
@@ -2228,6 +3295,8 @@
           <w:b/>
           <w:bCs/>
           <w:kern w:val="2"/>
+          <w:sz w:val="22"/>
+          <w:szCs w:val="22"/>
           <w:lang w:val="en-IN" w:eastAsia="en-US" w:bidi="ar-SA"/>
           <w14:ligatures w14:val="standardContextual"/>
         </w:rPr>
@@ -2237,6 +3306,8 @@
         <w:rPr>
           <w:rFonts w:asciiTheme="minorHAnsi" w:eastAsiaTheme="minorHAnsi" w:hAnsiTheme="minorHAnsi" w:cstheme="minorHAnsi"/>
           <w:kern w:val="2"/>
+          <w:sz w:val="22"/>
+          <w:szCs w:val="22"/>
           <w:lang w:val="en-IN" w:eastAsia="en-US" w:bidi="ar-SA"/>
           <w14:ligatures w14:val="standardContextual"/>
         </w:rPr>
@@ -2257,6 +3328,8 @@
           <w:b/>
           <w:bCs/>
           <w:kern w:val="2"/>
+          <w:sz w:val="22"/>
+          <w:szCs w:val="22"/>
           <w:lang w:val="en-IN" w:eastAsia="en-US" w:bidi="ar-SA"/>
           <w14:ligatures w14:val="standardContextual"/>
         </w:rPr>
@@ -2267,6 +3340,8 @@
           <w:b/>
           <w:bCs/>
           <w:kern w:val="2"/>
+          <w:sz w:val="22"/>
+          <w:szCs w:val="22"/>
           <w:lang w:val="en-IN" w:eastAsia="en-US" w:bidi="ar-SA"/>
           <w14:ligatures w14:val="standardContextual"/>
         </w:rPr>
@@ -2276,6 +3351,8 @@
         <w:rPr>
           <w:rFonts w:asciiTheme="minorHAnsi" w:eastAsiaTheme="minorHAnsi" w:hAnsiTheme="minorHAnsi" w:cstheme="minorHAnsi"/>
           <w:kern w:val="2"/>
+          <w:sz w:val="22"/>
+          <w:szCs w:val="22"/>
           <w:lang w:val="en-IN" w:eastAsia="en-US" w:bidi="ar-SA"/>
           <w14:ligatures w14:val="standardContextual"/>
         </w:rPr>
@@ -2287,6 +3364,8 @@
           <w:b/>
           <w:bCs/>
           <w:kern w:val="2"/>
+          <w:sz w:val="22"/>
+          <w:szCs w:val="22"/>
           <w:lang w:val="en-IN" w:eastAsia="en-US" w:bidi="ar-SA"/>
           <w14:ligatures w14:val="standardContextual"/>
         </w:rPr>
@@ -2296,6 +3375,8 @@
         <w:rPr>
           <w:rFonts w:asciiTheme="minorHAnsi" w:eastAsiaTheme="minorHAnsi" w:hAnsiTheme="minorHAnsi" w:cstheme="minorHAnsi"/>
           <w:kern w:val="2"/>
+          <w:sz w:val="22"/>
+          <w:szCs w:val="22"/>
           <w:lang w:val="en-IN" w:eastAsia="en-US" w:bidi="ar-SA"/>
           <w14:ligatures w14:val="standardContextual"/>
         </w:rPr>
@@ -2316,6 +3397,8 @@
           <w:b/>
           <w:bCs/>
           <w:kern w:val="2"/>
+          <w:sz w:val="22"/>
+          <w:szCs w:val="22"/>
           <w:lang w:val="en-IN" w:eastAsia="en-US" w:bidi="ar-SA"/>
           <w14:ligatures w14:val="standardContextual"/>
         </w:rPr>
@@ -2326,6 +3409,8 @@
           <w:b/>
           <w:bCs/>
           <w:kern w:val="2"/>
+          <w:sz w:val="22"/>
+          <w:szCs w:val="22"/>
           <w:lang w:val="en-IN" w:eastAsia="en-US" w:bidi="ar-SA"/>
           <w14:ligatures w14:val="standardContextual"/>
         </w:rPr>
@@ -2335,6 +3420,8 @@
         <w:rPr>
           <w:rFonts w:asciiTheme="minorHAnsi" w:eastAsiaTheme="minorHAnsi" w:hAnsiTheme="minorHAnsi" w:cstheme="minorHAnsi"/>
           <w:kern w:val="2"/>
+          <w:sz w:val="22"/>
+          <w:szCs w:val="22"/>
           <w:lang w:val="en-IN" w:eastAsia="en-US" w:bidi="ar-SA"/>
           <w14:ligatures w14:val="standardContextual"/>
         </w:rPr>
@@ -2344,6 +3431,8 @@
         <w:rPr>
           <w:rFonts w:asciiTheme="minorHAnsi" w:eastAsiaTheme="minorHAnsi" w:hAnsiTheme="minorHAnsi" w:cstheme="minorHAnsi"/>
           <w:kern w:val="2"/>
+          <w:sz w:val="22"/>
+          <w:szCs w:val="22"/>
           <w:lang w:val="en-IN" w:eastAsia="en-US" w:bidi="ar-SA"/>
           <w14:ligatures w14:val="standardContextual"/>
         </w:rPr>
@@ -2353,6 +3442,8 @@
         <w:rPr>
           <w:rFonts w:asciiTheme="minorHAnsi" w:eastAsiaTheme="minorHAnsi" w:hAnsiTheme="minorHAnsi" w:cstheme="minorHAnsi"/>
           <w:kern w:val="2"/>
+          <w:sz w:val="22"/>
+          <w:szCs w:val="22"/>
           <w:lang w:val="en-IN" w:eastAsia="en-US" w:bidi="ar-SA"/>
           <w14:ligatures w14:val="standardContextual"/>
         </w:rPr>
@@ -2362,15 +3453,16 @@
     <w:p>
       <w:pPr>
         <w:pStyle w:val="LO-normal"/>
+        <w:pBdr>
+          <w:bottom w:val="single" w:sz="6" w:space="1" w:color="auto"/>
+        </w:pBdr>
         <w:spacing w:line="120" w:lineRule="auto"/>
-        <w:ind w:right="-397"/>
+        <w:ind w:left="-397" w:right="-397"/>
         <w:jc w:val="both"/>
         <w:rPr>
           <w:rFonts w:asciiTheme="minorHAnsi" w:eastAsiaTheme="minorHAnsi" w:hAnsiTheme="minorHAnsi" w:cstheme="minorHAnsi"/>
           <w:b/>
           <w:kern w:val="2"/>
-          <w:sz w:val="28"/>
-          <w:szCs w:val="28"/>
           <w:lang w:val="en-IN" w:eastAsia="en-US" w:bidi="ar-SA"/>
           <w14:ligatures w14:val="standardContextual"/>
         </w:rPr>
@@ -2387,17 +3479,17 @@
         <w:rPr>
           <w:rFonts w:asciiTheme="minorHAnsi" w:hAnsiTheme="minorHAnsi" w:cstheme="minorHAnsi"/>
           <w:b/>
-          <w:sz w:val="40"/>
-          <w:szCs w:val="40"/>
-        </w:rPr>
-      </w:pPr>
-      <w:r>
-        <w:rPr>
-          <w:rFonts w:asciiTheme="minorHAnsi" w:eastAsiaTheme="minorHAnsi" w:hAnsiTheme="minorHAnsi" w:cstheme="minorHAnsi"/>
-          <w:b/>
-          <w:kern w:val="2"/>
-          <w:sz w:val="32"/>
-          <w:szCs w:val="32"/>
+          <w:sz w:val="36"/>
+          <w:szCs w:val="36"/>
+        </w:rPr>
+      </w:pPr>
+      <w:r>
+        <w:rPr>
+          <w:rFonts w:asciiTheme="minorHAnsi" w:eastAsiaTheme="minorHAnsi" w:hAnsiTheme="minorHAnsi" w:cstheme="minorHAnsi"/>
+          <w:b/>
+          <w:kern w:val="2"/>
+          <w:sz w:val="28"/>
+          <w:szCs w:val="28"/>
           <w:lang w:val="en-IN" w:eastAsia="en-US" w:bidi="ar-SA"/>
           <w14:ligatures w14:val="standardContextual"/>
         </w:rPr>
@@ -2408,8 +3500,8 @@
           <w:rFonts w:asciiTheme="minorHAnsi" w:eastAsiaTheme="minorHAnsi" w:hAnsiTheme="minorHAnsi" w:cstheme="minorHAnsi"/>
           <w:b/>
           <w:kern w:val="2"/>
-          <w:sz w:val="32"/>
-          <w:szCs w:val="32"/>
+          <w:sz w:val="28"/>
+          <w:szCs w:val="28"/>
           <w:lang w:val="en-IN" w:eastAsia="en-US" w:bidi="ar-SA"/>
           <w14:ligatures w14:val="standardContextual"/>
         </w:rPr>
@@ -2428,6 +3520,8 @@
         <w:rPr>
           <w:rFonts w:asciiTheme="minorHAnsi" w:eastAsiaTheme="minorHAnsi" w:hAnsiTheme="minorHAnsi" w:cstheme="minorHAnsi"/>
           <w:kern w:val="2"/>
+          <w:sz w:val="22"/>
+          <w:szCs w:val="22"/>
           <w:lang w:val="en-IN" w:eastAsia="en-US" w:bidi="ar-SA"/>
           <w14:ligatures w14:val="standardContextual"/>
         </w:rPr>
@@ -2438,6 +3532,8 @@
           <w:b/>
           <w:bCs/>
           <w:kern w:val="2"/>
+          <w:sz w:val="22"/>
+          <w:szCs w:val="22"/>
           <w:lang w:val="en-IN" w:eastAsia="en-US" w:bidi="ar-SA"/>
           <w14:ligatures w14:val="standardContextual"/>
         </w:rPr>
@@ -2447,6 +3543,8 @@
         <w:rPr>
           <w:rFonts w:asciiTheme="minorHAnsi" w:eastAsiaTheme="minorHAnsi" w:hAnsiTheme="minorHAnsi" w:cstheme="minorHAnsi"/>
           <w:kern w:val="2"/>
+          <w:sz w:val="22"/>
+          <w:szCs w:val="22"/>
           <w:lang w:val="en-IN" w:eastAsia="en-US" w:bidi="ar-SA"/>
           <w14:ligatures w14:val="standardContextual"/>
         </w:rPr>
@@ -2456,6 +3554,8 @@
         <w:rPr>
           <w:rFonts w:asciiTheme="minorHAnsi" w:eastAsiaTheme="minorHAnsi" w:hAnsiTheme="minorHAnsi" w:cstheme="minorHAnsi"/>
           <w:kern w:val="2"/>
+          <w:sz w:val="22"/>
+          <w:szCs w:val="22"/>
           <w:lang w:val="en-IN" w:eastAsia="en-US" w:bidi="ar-SA"/>
           <w14:ligatures w14:val="standardContextual"/>
         </w:rPr>
@@ -2465,64 +3565,30 @@
         <w:rPr>
           <w:rFonts w:asciiTheme="minorHAnsi" w:eastAsiaTheme="minorHAnsi" w:hAnsiTheme="minorHAnsi" w:cstheme="minorHAnsi"/>
           <w:kern w:val="2"/>
-          <w:lang w:val="en-IN" w:eastAsia="en-US" w:bidi="ar-SA"/>
-          <w14:ligatures w14:val="standardContextual"/>
-        </w:rPr>
-        <w:t xml:space="preserve"> CDAC Bengaluru</w:t>
-      </w:r>
-      <w:r>
-        <w:rPr>
-          <w:rFonts w:asciiTheme="minorHAnsi" w:eastAsiaTheme="minorHAnsi" w:hAnsiTheme="minorHAnsi" w:cstheme="minorHAnsi"/>
-          <w:kern w:val="2"/>
-          <w:lang w:val="en-IN" w:eastAsia="en-US" w:bidi="ar-SA"/>
-          <w14:ligatures w14:val="standardContextual"/>
-        </w:rPr>
-        <w:tab/>
-      </w:r>
-      <w:r>
-        <w:rPr>
-          <w:rFonts w:asciiTheme="minorHAnsi" w:eastAsiaTheme="minorHAnsi" w:hAnsiTheme="minorHAnsi" w:cstheme="minorHAnsi"/>
-          <w:kern w:val="2"/>
-          <w:lang w:val="en-IN" w:eastAsia="en-US" w:bidi="ar-SA"/>
-          <w14:ligatures w14:val="standardContextual"/>
-        </w:rPr>
-        <w:tab/>
-      </w:r>
-      <w:r>
-        <w:rPr>
-          <w:rFonts w:asciiTheme="minorHAnsi" w:eastAsiaTheme="minorHAnsi" w:hAnsiTheme="minorHAnsi" w:cstheme="minorHAnsi"/>
-          <w:kern w:val="2"/>
-          <w:lang w:val="en-IN" w:eastAsia="en-US" w:bidi="ar-SA"/>
-          <w14:ligatures w14:val="standardContextual"/>
-        </w:rPr>
-        <w:tab/>
-      </w:r>
-      <w:r>
-        <w:rPr>
-          <w:rFonts w:asciiTheme="minorHAnsi" w:eastAsiaTheme="minorHAnsi" w:hAnsiTheme="minorHAnsi" w:cstheme="minorHAnsi"/>
-          <w:kern w:val="2"/>
-          <w:lang w:val="en-IN" w:eastAsia="en-US" w:bidi="ar-SA"/>
-          <w14:ligatures w14:val="standardContextual"/>
-        </w:rPr>
-        <w:t xml:space="preserve">           </w:t>
-      </w:r>
-      <w:r>
-        <w:rPr>
-          <w:rFonts w:asciiTheme="minorHAnsi" w:eastAsiaTheme="minorHAnsi" w:hAnsiTheme="minorHAnsi" w:cstheme="minorHAnsi"/>
-          <w:b/>
-          <w:bCs/>
-          <w:kern w:val="2"/>
-          <w:lang w:val="en-IN" w:eastAsia="en-US" w:bidi="ar-SA"/>
-          <w14:ligatures w14:val="standardContextual"/>
-        </w:rPr>
-        <w:t xml:space="preserve">Sept </w:t>
-      </w:r>
-      <w:r>
-        <w:rPr>
-          <w:rFonts w:asciiTheme="minorHAnsi" w:eastAsiaTheme="minorHAnsi" w:hAnsiTheme="minorHAnsi" w:cstheme="minorHAnsi"/>
-          <w:b/>
-          <w:bCs/>
-          <w:kern w:val="2"/>
+          <w:sz w:val="22"/>
+          <w:szCs w:val="22"/>
+          <w:lang w:val="en-IN" w:eastAsia="en-US" w:bidi="ar-SA"/>
+          <w14:ligatures w14:val="standardContextual"/>
+        </w:rPr>
+        <w:t xml:space="preserve"> CDAC Bengaluru | (</w:t>
+      </w:r>
+      <w:r>
+        <w:rPr>
+          <w:rFonts w:asciiTheme="minorHAnsi" w:eastAsiaTheme="minorHAnsi" w:hAnsiTheme="minorHAnsi" w:cstheme="minorHAnsi"/>
+          <w:kern w:val="2"/>
+          <w:sz w:val="22"/>
+          <w:szCs w:val="22"/>
+          <w:lang w:val="en-IN" w:eastAsia="en-US" w:bidi="ar-SA"/>
+          <w14:ligatures w14:val="standardContextual"/>
+        </w:rPr>
+        <w:t xml:space="preserve">September </w:t>
+      </w:r>
+      <w:r>
+        <w:rPr>
+          <w:rFonts w:asciiTheme="minorHAnsi" w:eastAsiaTheme="minorHAnsi" w:hAnsiTheme="minorHAnsi" w:cstheme="minorHAnsi"/>
+          <w:kern w:val="2"/>
+          <w:sz w:val="22"/>
+          <w:szCs w:val="22"/>
           <w:lang w:val="en-IN" w:eastAsia="en-US" w:bidi="ar-SA"/>
           <w14:ligatures w14:val="standardContextual"/>
         </w:rPr>
@@ -2531,9 +3597,9 @@
       <w:r>
         <w:rPr>
           <w:rFonts w:asciiTheme="minorHAnsi" w:eastAsiaTheme="minorHAnsi" w:hAnsiTheme="minorHAnsi" w:cstheme="minorHAnsi"/>
-          <w:b/>
-          <w:bCs/>
-          <w:kern w:val="2"/>
+          <w:kern w:val="2"/>
+          <w:sz w:val="22"/>
+          <w:szCs w:val="22"/>
           <w:lang w:val="en-IN" w:eastAsia="en-US" w:bidi="ar-SA"/>
           <w14:ligatures w14:val="standardContextual"/>
         </w:rPr>
@@ -2542,9 +3608,9 @@
       <w:r>
         <w:rPr>
           <w:rFonts w:asciiTheme="minorHAnsi" w:eastAsiaTheme="minorHAnsi" w:hAnsiTheme="minorHAnsi" w:cstheme="minorHAnsi"/>
-          <w:b/>
-          <w:bCs/>
-          <w:kern w:val="2"/>
+          <w:kern w:val="2"/>
+          <w:sz w:val="22"/>
+          <w:szCs w:val="22"/>
           <w:lang w:val="en-IN" w:eastAsia="en-US" w:bidi="ar-SA"/>
           <w14:ligatures w14:val="standardContextual"/>
         </w:rPr>
@@ -2553,13 +3619,13 @@
       <w:r>
         <w:rPr>
           <w:rFonts w:asciiTheme="minorHAnsi" w:eastAsiaTheme="minorHAnsi" w:hAnsiTheme="minorHAnsi" w:cstheme="minorHAnsi"/>
-          <w:b/>
-          <w:bCs/>
-          <w:kern w:val="2"/>
-          <w:lang w:val="en-IN" w:eastAsia="en-US" w:bidi="ar-SA"/>
-          <w14:ligatures w14:val="standardContextual"/>
-        </w:rPr>
-        <w:t>2023</w:t>
+          <w:kern w:val="2"/>
+          <w:sz w:val="22"/>
+          <w:szCs w:val="22"/>
+          <w:lang w:val="en-IN" w:eastAsia="en-US" w:bidi="ar-SA"/>
+          <w14:ligatures w14:val="standardContextual"/>
+        </w:rPr>
+        <w:t>2023)</w:t>
       </w:r>
     </w:p>
     <w:p>
@@ -2574,6 +3640,8 @@
         <w:rPr>
           <w:rFonts w:asciiTheme="minorHAnsi" w:eastAsiaTheme="minorHAnsi" w:hAnsiTheme="minorHAnsi" w:cstheme="minorHAnsi"/>
           <w:kern w:val="2"/>
+          <w:sz w:val="22"/>
+          <w:szCs w:val="22"/>
           <w:lang w:val="en-IN" w:eastAsia="en-US" w:bidi="ar-SA"/>
           <w14:ligatures w14:val="standardContextual"/>
         </w:rPr>
@@ -2584,6 +3652,8 @@
           <w:b/>
           <w:bCs/>
           <w:kern w:val="2"/>
+          <w:sz w:val="22"/>
+          <w:szCs w:val="22"/>
           <w:lang w:val="en-IN" w:eastAsia="en-US" w:bidi="ar-SA"/>
           <w14:ligatures w14:val="standardContextual"/>
         </w:rPr>
@@ -2593,6 +3663,8 @@
         <w:rPr>
           <w:rFonts w:asciiTheme="minorHAnsi" w:eastAsiaTheme="minorHAnsi" w:hAnsiTheme="minorHAnsi" w:cstheme="minorHAnsi"/>
           <w:kern w:val="2"/>
+          <w:sz w:val="22"/>
+          <w:szCs w:val="22"/>
           <w:lang w:val="en-IN" w:eastAsia="en-US" w:bidi="ar-SA"/>
           <w14:ligatures w14:val="standardContextual"/>
         </w:rPr>
@@ -2602,6 +3674,8 @@
         <w:rPr>
           <w:rFonts w:asciiTheme="minorHAnsi" w:eastAsiaTheme="minorHAnsi" w:hAnsiTheme="minorHAnsi" w:cstheme="minorHAnsi"/>
           <w:kern w:val="2"/>
+          <w:sz w:val="22"/>
+          <w:szCs w:val="22"/>
           <w:lang w:val="en-IN" w:eastAsia="en-US" w:bidi="ar-SA"/>
           <w14:ligatures w14:val="standardContextual"/>
         </w:rPr>
@@ -2611,71 +3685,19 @@
         <w:rPr>
           <w:rFonts w:asciiTheme="minorHAnsi" w:eastAsiaTheme="minorHAnsi" w:hAnsiTheme="minorHAnsi" w:cstheme="minorHAnsi"/>
           <w:kern w:val="2"/>
-          <w:lang w:val="en-IN" w:eastAsia="en-US" w:bidi="ar-SA"/>
-          <w14:ligatures w14:val="standardContextual"/>
-        </w:rPr>
-        <w:t xml:space="preserve"> UIET-MDU, Haryana</w:t>
-      </w:r>
-      <w:r>
-        <w:rPr>
-          <w:rFonts w:asciiTheme="minorHAnsi" w:eastAsiaTheme="minorHAnsi" w:hAnsiTheme="minorHAnsi" w:cstheme="minorHAnsi"/>
-          <w:kern w:val="2"/>
-          <w:lang w:val="en-IN" w:eastAsia="en-US" w:bidi="ar-SA"/>
-          <w14:ligatures w14:val="standardContextual"/>
-        </w:rPr>
-        <w:tab/>
-      </w:r>
-      <w:r>
-        <w:rPr>
-          <w:rFonts w:asciiTheme="minorHAnsi" w:eastAsiaTheme="minorHAnsi" w:hAnsiTheme="minorHAnsi" w:cstheme="minorHAnsi"/>
-          <w:kern w:val="2"/>
-          <w:lang w:val="en-IN" w:eastAsia="en-US" w:bidi="ar-SA"/>
-          <w14:ligatures w14:val="standardContextual"/>
-        </w:rPr>
-        <w:tab/>
-      </w:r>
-      <w:r>
-        <w:rPr>
-          <w:rFonts w:asciiTheme="minorHAnsi" w:eastAsiaTheme="minorHAnsi" w:hAnsiTheme="minorHAnsi" w:cstheme="minorHAnsi"/>
-          <w:kern w:val="2"/>
-          <w:lang w:val="en-IN" w:eastAsia="en-US" w:bidi="ar-SA"/>
-          <w14:ligatures w14:val="standardContextual"/>
-        </w:rPr>
-        <w:tab/>
-      </w:r>
-      <w:r>
-        <w:rPr>
-          <w:rFonts w:asciiTheme="minorHAnsi" w:eastAsiaTheme="minorHAnsi" w:hAnsiTheme="minorHAnsi" w:cstheme="minorHAnsi"/>
-          <w:kern w:val="2"/>
-          <w:lang w:val="en-IN" w:eastAsia="en-US" w:bidi="ar-SA"/>
-          <w14:ligatures w14:val="standardContextual"/>
-        </w:rPr>
-        <w:tab/>
-      </w:r>
-      <w:r>
-        <w:rPr>
-          <w:rFonts w:asciiTheme="minorHAnsi" w:eastAsiaTheme="minorHAnsi" w:hAnsiTheme="minorHAnsi" w:cstheme="minorHAnsi"/>
-          <w:kern w:val="2"/>
-          <w:lang w:val="en-IN" w:eastAsia="en-US" w:bidi="ar-SA"/>
-          <w14:ligatures w14:val="standardContextual"/>
-        </w:rPr>
-        <w:tab/>
-      </w:r>
-      <w:r>
-        <w:rPr>
-          <w:rFonts w:asciiTheme="minorHAnsi" w:eastAsiaTheme="minorHAnsi" w:hAnsiTheme="minorHAnsi" w:cstheme="minorHAnsi"/>
-          <w:kern w:val="2"/>
-          <w:lang w:val="en-IN" w:eastAsia="en-US" w:bidi="ar-SA"/>
-          <w14:ligatures w14:val="standardContextual"/>
-        </w:rPr>
-        <w:t xml:space="preserve">           </w:t>
-      </w:r>
-      <w:r>
-        <w:rPr>
-          <w:rFonts w:asciiTheme="minorHAnsi" w:eastAsiaTheme="minorHAnsi" w:hAnsiTheme="minorHAnsi" w:cstheme="minorHAnsi"/>
-          <w:b/>
-          <w:bCs/>
-          <w:kern w:val="2"/>
+          <w:sz w:val="22"/>
+          <w:szCs w:val="22"/>
+          <w:lang w:val="en-IN" w:eastAsia="en-US" w:bidi="ar-SA"/>
+          <w14:ligatures w14:val="standardContextual"/>
+        </w:rPr>
+        <w:t xml:space="preserve"> UIET-MDU, Haryana | (</w:t>
+      </w:r>
+      <w:r>
+        <w:rPr>
+          <w:rFonts w:asciiTheme="minorHAnsi" w:eastAsiaTheme="minorHAnsi" w:hAnsiTheme="minorHAnsi" w:cstheme="minorHAnsi"/>
+          <w:kern w:val="2"/>
+          <w:sz w:val="22"/>
+          <w:szCs w:val="22"/>
           <w:lang w:val="en-IN" w:eastAsia="en-US" w:bidi="ar-SA"/>
           <w14:ligatures w14:val="standardContextual"/>
         </w:rPr>
@@ -2684,9 +3706,9 @@
       <w:r>
         <w:rPr>
           <w:rFonts w:asciiTheme="minorHAnsi" w:eastAsiaTheme="minorHAnsi" w:hAnsiTheme="minorHAnsi" w:cstheme="minorHAnsi"/>
-          <w:b/>
-          <w:bCs/>
-          <w:kern w:val="2"/>
+          <w:kern w:val="2"/>
+          <w:sz w:val="22"/>
+          <w:szCs w:val="22"/>
           <w:lang w:val="en-IN" w:eastAsia="en-US" w:bidi="ar-SA"/>
           <w14:ligatures w14:val="standardContextual"/>
         </w:rPr>
@@ -2695,9 +3717,9 @@
       <w:r>
         <w:rPr>
           <w:rFonts w:asciiTheme="minorHAnsi" w:eastAsiaTheme="minorHAnsi" w:hAnsiTheme="minorHAnsi" w:cstheme="minorHAnsi"/>
-          <w:b/>
-          <w:bCs/>
-          <w:kern w:val="2"/>
+          <w:kern w:val="2"/>
+          <w:sz w:val="22"/>
+          <w:szCs w:val="22"/>
           <w:lang w:val="en-IN" w:eastAsia="en-US" w:bidi="ar-SA"/>
           <w14:ligatures w14:val="standardContextual"/>
         </w:rPr>
@@ -2706,13 +3728,13 @@
       <w:r>
         <w:rPr>
           <w:rFonts w:asciiTheme="minorHAnsi" w:eastAsiaTheme="minorHAnsi" w:hAnsiTheme="minorHAnsi" w:cstheme="minorHAnsi"/>
-          <w:b/>
-          <w:bCs/>
-          <w:kern w:val="2"/>
-          <w:lang w:val="en-IN" w:eastAsia="en-US" w:bidi="ar-SA"/>
-          <w14:ligatures w14:val="standardContextual"/>
-        </w:rPr>
-        <w:t>2022</w:t>
+          <w:kern w:val="2"/>
+          <w:sz w:val="22"/>
+          <w:szCs w:val="22"/>
+          <w:lang w:val="en-IN" w:eastAsia="en-US" w:bidi="ar-SA"/>
+          <w14:ligatures w14:val="standardContextual"/>
+        </w:rPr>
+        <w:t>2022)</w:t>
       </w:r>
     </w:p>
     <w:sectPr>

</xml_diff>

<commit_message>
Refines resume content and updates formatting for clarity and consistency
</commit_message>
<xml_diff>
--- a/assets/resume/Vidit_Dhull_Data_Engineer.docx
+++ b/assets/resume/Vidit_Dhull_Data_Engineer.docx
@@ -9,16 +9,16 @@
         <w:rPr>
           <w:rFonts w:asciiTheme="minorHAnsi" w:eastAsia="Verdana" w:hAnsiTheme="minorHAnsi" w:cstheme="minorHAnsi"/>
           <w:b/>
-          <w:sz w:val="32"/>
-          <w:szCs w:val="32"/>
+          <w:sz w:val="36"/>
+          <w:szCs w:val="36"/>
         </w:rPr>
       </w:pPr>
       <w:r>
         <w:rPr>
           <w:rFonts w:asciiTheme="minorHAnsi" w:eastAsia="Verdana" w:hAnsiTheme="minorHAnsi" w:cstheme="minorHAnsi"/>
           <w:b/>
-          <w:sz w:val="32"/>
-          <w:szCs w:val="32"/>
+          <w:sz w:val="36"/>
+          <w:szCs w:val="36"/>
         </w:rPr>
         <w:t>Vidit Dhull</w:t>
       </w:r>
@@ -26,8 +26,8 @@
         <w:rPr>
           <w:rFonts w:asciiTheme="minorHAnsi" w:eastAsia="Verdana" w:hAnsiTheme="minorHAnsi" w:cstheme="minorHAnsi"/>
           <w:b/>
-          <w:sz w:val="32"/>
-          <w:szCs w:val="32"/>
+          <w:sz w:val="36"/>
+          <w:szCs w:val="36"/>
         </w:rPr>
         <w:t>, Data Engineer</w:t>
       </w:r>
@@ -38,8 +38,8 @@
         <w:jc w:val="center"/>
         <w:rPr>
           <w:rFonts w:cstheme="minorHAnsi"/>
-          <w:sz w:val="18"/>
-          <w:szCs w:val="18"/>
+          <w:sz w:val="20"/>
+          <w:szCs w:val="20"/>
         </w:rPr>
       </w:pPr>
       <w:hyperlink r:id="rId8" w:history="1">
@@ -47,8 +47,8 @@
           <w:rPr>
             <w:rStyle w:val="Hyperlink"/>
             <w:rFonts w:cstheme="minorHAnsi"/>
-            <w:sz w:val="18"/>
-            <w:szCs w:val="18"/>
+            <w:sz w:val="20"/>
+            <w:szCs w:val="20"/>
           </w:rPr>
           <w:t>vidit.dh@gmail.com</w:t>
         </w:r>
@@ -56,16 +56,16 @@
       <w:r>
         <w:rPr>
           <w:rFonts w:cstheme="minorHAnsi"/>
-          <w:sz w:val="18"/>
-          <w:szCs w:val="18"/>
+          <w:sz w:val="20"/>
+          <w:szCs w:val="20"/>
         </w:rPr>
         <w:t xml:space="preserve"> | </w:t>
       </w:r>
       <w:r>
         <w:rPr>
           <w:rFonts w:cstheme="minorHAnsi"/>
-          <w:sz w:val="18"/>
-          <w:szCs w:val="18"/>
+          <w:sz w:val="20"/>
+          <w:szCs w:val="20"/>
         </w:rPr>
         <w:t xml:space="preserve">Portfolio: </w:t>
       </w:r>
@@ -74,8 +74,8 @@
           <w:rPr>
             <w:rStyle w:val="Hyperlink"/>
             <w:rFonts w:cstheme="minorHAnsi"/>
-            <w:sz w:val="18"/>
-            <w:szCs w:val="18"/>
+            <w:sz w:val="20"/>
+            <w:szCs w:val="20"/>
           </w:rPr>
           <w:t>viditdhull.github.io</w:t>
         </w:r>
@@ -83,16 +83,16 @@
       <w:r>
         <w:rPr>
           <w:rFonts w:cstheme="minorHAnsi"/>
-          <w:sz w:val="18"/>
-          <w:szCs w:val="18"/>
+          <w:sz w:val="20"/>
+          <w:szCs w:val="20"/>
         </w:rPr>
         <w:t xml:space="preserve"> | +91 9355512200  | </w:t>
       </w:r>
       <w:r>
         <w:rPr>
           <w:rFonts w:cstheme="minorHAnsi"/>
-          <w:sz w:val="18"/>
-          <w:szCs w:val="18"/>
+          <w:sz w:val="20"/>
+          <w:szCs w:val="20"/>
         </w:rPr>
         <w:t xml:space="preserve">LinkedIn: </w:t>
       </w:r>
@@ -101,13 +101,17 @@
           <w:rPr>
             <w:rStyle w:val="Hyperlink"/>
             <w:rFonts w:cstheme="minorHAnsi"/>
-            <w:sz w:val="18"/>
-            <w:szCs w:val="18"/>
+            <w:sz w:val="20"/>
+            <w:szCs w:val="20"/>
           </w:rPr>
           <w:t>linkedin/viditdhull/</w:t>
         </w:r>
       </w:hyperlink>
       <w:r>
+        <w:rPr>
+          <w:sz w:val="24"/>
+          <w:szCs w:val="24"/>
+        </w:rPr>
         <w:t xml:space="preserve"> | Bengaluru, India</w:t>
       </w:r>
     </w:p>
@@ -117,6 +121,8 @@
         <w:ind w:right="-397"/>
         <w:rPr>
           <w:rFonts w:cstheme="minorHAnsi"/>
+          <w:sz w:val="24"/>
+          <w:szCs w:val="24"/>
         </w:rPr>
       </w:pPr>
     </w:p>
@@ -130,16 +136,16 @@
         <w:rPr>
           <w:rFonts w:cstheme="minorHAnsi"/>
           <w:b/>
-          <w:sz w:val="28"/>
-          <w:szCs w:val="28"/>
+          <w:sz w:val="32"/>
+          <w:szCs w:val="32"/>
         </w:rPr>
       </w:pPr>
       <w:r>
         <w:rPr>
           <w:rFonts w:cstheme="minorHAnsi"/>
           <w:b/>
-          <w:sz w:val="28"/>
-          <w:szCs w:val="28"/>
+          <w:sz w:val="32"/>
+          <w:szCs w:val="32"/>
         </w:rPr>
         <w:t xml:space="preserve">PROFESSIONAL </w:t>
       </w:r>
@@ -147,8 +153,8 @@
         <w:rPr>
           <w:rFonts w:cstheme="minorHAnsi"/>
           <w:b/>
-          <w:sz w:val="28"/>
-          <w:szCs w:val="28"/>
+          <w:sz w:val="32"/>
+          <w:szCs w:val="32"/>
         </w:rPr>
         <w:t>SUMMARY</w:t>
       </w:r>
@@ -164,8 +170,6 @@
         <w:rPr>
           <w:rFonts w:asciiTheme="minorHAnsi" w:eastAsiaTheme="minorHAnsi" w:hAnsiTheme="minorHAnsi" w:cstheme="minorHAnsi"/>
           <w:kern w:val="2"/>
-          <w:sz w:val="22"/>
-          <w:szCs w:val="22"/>
           <w:lang w:val="en-IN" w:eastAsia="en-US" w:bidi="ar-SA"/>
           <w14:ligatures w14:val="standardContextual"/>
         </w:rPr>
@@ -176,23 +180,10 @@
           <w:b/>
           <w:bCs/>
           <w:kern w:val="2"/>
-          <w:sz w:val="22"/>
-          <w:szCs w:val="22"/>
-          <w:lang w:val="en-IN" w:eastAsia="en-US" w:bidi="ar-SA"/>
-          <w14:ligatures w14:val="standardContextual"/>
-        </w:rPr>
-        <w:t>Data Engineer</w:t>
-      </w:r>
-      <w:r>
-        <w:rPr>
-          <w:rFonts w:asciiTheme="minorHAnsi" w:eastAsiaTheme="minorHAnsi" w:hAnsiTheme="minorHAnsi" w:cstheme="minorHAnsi"/>
-          <w:kern w:val="2"/>
-          <w:sz w:val="22"/>
-          <w:szCs w:val="22"/>
-          <w:lang w:val="en-IN" w:eastAsia="en-US" w:bidi="ar-SA"/>
-          <w14:ligatures w14:val="standardContextual"/>
-        </w:rPr>
-        <w:t xml:space="preserve"> with </w:t>
+          <w:lang w:val="en-IN" w:eastAsia="en-US" w:bidi="ar-SA"/>
+          <w14:ligatures w14:val="standardContextual"/>
+        </w:rPr>
+        <w:t>Data</w:t>
       </w:r>
       <w:r>
         <w:rPr>
@@ -200,34 +191,10 @@
           <w:b/>
           <w:bCs/>
           <w:kern w:val="2"/>
-          <w:sz w:val="22"/>
-          <w:szCs w:val="22"/>
-          <w:lang w:val="en-IN" w:eastAsia="en-US" w:bidi="ar-SA"/>
-          <w14:ligatures w14:val="standardContextual"/>
-        </w:rPr>
-        <w:t>5+ years</w:t>
-      </w:r>
-      <w:r>
-        <w:rPr>
-          <w:rFonts w:asciiTheme="minorHAnsi" w:eastAsiaTheme="minorHAnsi" w:hAnsiTheme="minorHAnsi" w:cstheme="minorHAnsi"/>
-          <w:kern w:val="2"/>
-          <w:sz w:val="22"/>
-          <w:szCs w:val="22"/>
-          <w:lang w:val="en-IN" w:eastAsia="en-US" w:bidi="ar-SA"/>
-          <w14:ligatures w14:val="standardContextual"/>
-        </w:rPr>
-        <w:t xml:space="preserve"> of experience</w:t>
-      </w:r>
-      <w:r>
-        <w:rPr>
-          <w:rFonts w:asciiTheme="minorHAnsi" w:eastAsiaTheme="minorHAnsi" w:hAnsiTheme="minorHAnsi" w:cstheme="minorHAnsi"/>
-          <w:kern w:val="2"/>
-          <w:sz w:val="22"/>
-          <w:szCs w:val="22"/>
-          <w:lang w:val="en-IN" w:eastAsia="en-US" w:bidi="ar-SA"/>
-          <w14:ligatures w14:val="standardContextual"/>
-        </w:rPr>
-        <w:t xml:space="preserve"> building </w:t>
+          <w:lang w:val="en-IN" w:eastAsia="en-US" w:bidi="ar-SA"/>
+          <w14:ligatures w14:val="standardContextual"/>
+        </w:rPr>
+        <w:t xml:space="preserve"> </w:t>
       </w:r>
       <w:r>
         <w:rPr>
@@ -235,23 +202,28 @@
           <w:b/>
           <w:bCs/>
           <w:kern w:val="2"/>
-          <w:sz w:val="22"/>
-          <w:szCs w:val="22"/>
-          <w:lang w:val="en-IN" w:eastAsia="en-US" w:bidi="ar-SA"/>
-          <w14:ligatures w14:val="standardContextual"/>
-        </w:rPr>
-        <w:t>scalable data platforms</w:t>
-      </w:r>
-      <w:r>
-        <w:rPr>
-          <w:rFonts w:asciiTheme="minorHAnsi" w:eastAsiaTheme="minorHAnsi" w:hAnsiTheme="minorHAnsi" w:cstheme="minorHAnsi"/>
-          <w:kern w:val="2"/>
-          <w:sz w:val="22"/>
-          <w:szCs w:val="22"/>
-          <w:lang w:val="en-IN" w:eastAsia="en-US" w:bidi="ar-SA"/>
-          <w14:ligatures w14:val="standardContextual"/>
-        </w:rPr>
-        <w:t xml:space="preserve"> and </w:t>
+          <w:lang w:val="en-IN" w:eastAsia="en-US" w:bidi="ar-SA"/>
+          <w14:ligatures w14:val="standardContextual"/>
+        </w:rPr>
+        <w:t>Engineer</w:t>
+      </w:r>
+      <w:r>
+        <w:rPr>
+          <w:rFonts w:asciiTheme="minorHAnsi" w:eastAsiaTheme="minorHAnsi" w:hAnsiTheme="minorHAnsi" w:cstheme="minorHAnsi"/>
+          <w:kern w:val="2"/>
+          <w:lang w:val="en-IN" w:eastAsia="en-US" w:bidi="ar-SA"/>
+          <w14:ligatures w14:val="standardContextual"/>
+        </w:rPr>
+        <w:t xml:space="preserve"> </w:t>
+      </w:r>
+      <w:r>
+        <w:rPr>
+          <w:rFonts w:asciiTheme="minorHAnsi" w:eastAsiaTheme="minorHAnsi" w:hAnsiTheme="minorHAnsi" w:cstheme="minorHAnsi"/>
+          <w:kern w:val="2"/>
+          <w:lang w:val="en-IN" w:eastAsia="en-US" w:bidi="ar-SA"/>
+          <w14:ligatures w14:val="standardContextual"/>
+        </w:rPr>
+        <w:t xml:space="preserve">with </w:t>
       </w:r>
       <w:r>
         <w:rPr>
@@ -259,23 +231,10 @@
           <w:b/>
           <w:bCs/>
           <w:kern w:val="2"/>
-          <w:sz w:val="22"/>
-          <w:szCs w:val="22"/>
-          <w:lang w:val="en-IN" w:eastAsia="en-US" w:bidi="ar-SA"/>
-          <w14:ligatures w14:val="standardContextual"/>
-        </w:rPr>
-        <w:t>real-time streaming pipelines</w:t>
-      </w:r>
-      <w:r>
-        <w:rPr>
-          <w:rFonts w:asciiTheme="minorHAnsi" w:eastAsiaTheme="minorHAnsi" w:hAnsiTheme="minorHAnsi" w:cstheme="minorHAnsi"/>
-          <w:kern w:val="2"/>
-          <w:sz w:val="22"/>
-          <w:szCs w:val="22"/>
-          <w:lang w:val="en-IN" w:eastAsia="en-US" w:bidi="ar-SA"/>
-          <w14:ligatures w14:val="standardContextual"/>
-        </w:rPr>
-        <w:t xml:space="preserve"> using Spark, Kafka, and both </w:t>
+          <w:lang w:val="en-IN" w:eastAsia="en-US" w:bidi="ar-SA"/>
+          <w14:ligatures w14:val="standardContextual"/>
+        </w:rPr>
+        <w:t>3</w:t>
       </w:r>
       <w:r>
         <w:rPr>
@@ -283,23 +242,10 @@
           <w:b/>
           <w:bCs/>
           <w:kern w:val="2"/>
-          <w:sz w:val="22"/>
-          <w:szCs w:val="22"/>
-          <w:lang w:val="en-IN" w:eastAsia="en-US" w:bidi="ar-SA"/>
-          <w14:ligatures w14:val="standardContextual"/>
-        </w:rPr>
-        <w:t>open-source</w:t>
-      </w:r>
-      <w:r>
-        <w:rPr>
-          <w:rFonts w:asciiTheme="minorHAnsi" w:eastAsiaTheme="minorHAnsi" w:hAnsiTheme="minorHAnsi" w:cstheme="minorHAnsi"/>
-          <w:kern w:val="2"/>
-          <w:sz w:val="22"/>
-          <w:szCs w:val="22"/>
-          <w:lang w:val="en-IN" w:eastAsia="en-US" w:bidi="ar-SA"/>
-          <w14:ligatures w14:val="standardContextual"/>
-        </w:rPr>
-        <w:t xml:space="preserve"> and </w:t>
+          <w:lang w:val="en-IN" w:eastAsia="en-US" w:bidi="ar-SA"/>
+          <w14:ligatures w14:val="standardContextual"/>
+        </w:rPr>
+        <w:t>+ years</w:t>
       </w:r>
       <w:r>
         <w:rPr>
@@ -307,19 +253,35 @@
           <w:b/>
           <w:bCs/>
           <w:kern w:val="2"/>
-          <w:sz w:val="22"/>
-          <w:szCs w:val="22"/>
-          <w:lang w:val="en-IN" w:eastAsia="en-US" w:bidi="ar-SA"/>
-          <w14:ligatures w14:val="standardContextual"/>
-        </w:rPr>
-        <w:t>Azure-based data ecosystems</w:t>
-      </w:r>
-      <w:r>
-        <w:rPr>
-          <w:rFonts w:asciiTheme="minorHAnsi" w:eastAsiaTheme="minorHAnsi" w:hAnsiTheme="minorHAnsi" w:cstheme="minorHAnsi"/>
-          <w:kern w:val="2"/>
-          <w:sz w:val="22"/>
-          <w:szCs w:val="22"/>
+          <w:lang w:val="en-IN" w:eastAsia="en-US" w:bidi="ar-SA"/>
+          <w14:ligatures w14:val="standardContextual"/>
+        </w:rPr>
+        <w:t xml:space="preserve"> experience in</w:t>
+      </w:r>
+      <w:r>
+        <w:rPr>
+          <w:rFonts w:asciiTheme="minorHAnsi" w:eastAsiaTheme="minorHAnsi" w:hAnsiTheme="minorHAnsi" w:cstheme="minorHAnsi"/>
+          <w:b/>
+          <w:bCs/>
+          <w:kern w:val="2"/>
+          <w:lang w:val="en-IN" w:eastAsia="en-US" w:bidi="ar-SA"/>
+          <w14:ligatures w14:val="standardContextual"/>
+        </w:rPr>
+        <w:t xml:space="preserve"> designing scalable lakehouse and event-driven data platforms</w:t>
+      </w:r>
+      <w:r>
+        <w:rPr>
+          <w:rFonts w:asciiTheme="minorHAnsi" w:eastAsiaTheme="minorHAnsi" w:hAnsiTheme="minorHAnsi" w:cstheme="minorHAnsi"/>
+          <w:kern w:val="2"/>
+          <w:lang w:val="en-IN" w:eastAsia="en-US" w:bidi="ar-SA"/>
+          <w14:ligatures w14:val="standardContextual"/>
+        </w:rPr>
+        <w:t xml:space="preserve"> for real-time telemetry analytics and enterprise reporting</w:t>
+      </w:r>
+      <w:r>
+        <w:rPr>
+          <w:rFonts w:asciiTheme="minorHAnsi" w:eastAsiaTheme="minorHAnsi" w:hAnsiTheme="minorHAnsi" w:cstheme="minorHAnsi"/>
+          <w:kern w:val="2"/>
           <w:lang w:val="en-IN" w:eastAsia="en-US" w:bidi="ar-SA"/>
           <w14:ligatures w14:val="standardContextual"/>
         </w:rPr>
@@ -337,46 +299,29 @@
         <w:rPr>
           <w:rFonts w:asciiTheme="minorHAnsi" w:eastAsiaTheme="minorHAnsi" w:hAnsiTheme="minorHAnsi" w:cstheme="minorHAnsi"/>
           <w:kern w:val="2"/>
-          <w:sz w:val="22"/>
-          <w:szCs w:val="22"/>
-          <w:lang w:val="en-IN" w:eastAsia="en-US" w:bidi="ar-SA"/>
-          <w14:ligatures w14:val="standardContextual"/>
-        </w:rPr>
-      </w:pPr>
-      <w:r>
-        <w:rPr>
-          <w:rFonts w:asciiTheme="minorHAnsi" w:eastAsiaTheme="minorHAnsi" w:hAnsiTheme="minorHAnsi" w:cstheme="minorHAnsi"/>
-          <w:kern w:val="2"/>
-          <w:sz w:val="22"/>
-          <w:szCs w:val="22"/>
-          <w:lang w:val="en-IN" w:eastAsia="en-US" w:bidi="ar-SA"/>
-          <w14:ligatures w14:val="standardContextual"/>
-        </w:rPr>
-        <w:t xml:space="preserve">Experienced in designing Medallion Delta Lakehouse architectures, optimizing large-scale ETL pipelines, and delivering </w:t>
-      </w:r>
+          <w:lang w:val="en-IN" w:eastAsia="en-US" w:bidi="ar-SA"/>
+          <w14:ligatures w14:val="standardContextual"/>
+        </w:rPr>
+      </w:pPr>
       <w:r>
         <w:rPr>
           <w:rFonts w:asciiTheme="minorHAnsi" w:eastAsiaTheme="minorHAnsi" w:hAnsiTheme="minorHAnsi" w:cstheme="minorHAnsi"/>
           <w:b/>
           <w:bCs/>
           <w:kern w:val="2"/>
-          <w:sz w:val="22"/>
-          <w:szCs w:val="22"/>
-          <w:lang w:val="en-IN" w:eastAsia="en-US" w:bidi="ar-SA"/>
-          <w14:ligatures w14:val="standardContextual"/>
-        </w:rPr>
-        <w:t>high-throughput event-driven</w:t>
-      </w:r>
-      <w:r>
-        <w:rPr>
-          <w:rFonts w:asciiTheme="minorHAnsi" w:eastAsiaTheme="minorHAnsi" w:hAnsiTheme="minorHAnsi" w:cstheme="minorHAnsi"/>
-          <w:kern w:val="2"/>
-          <w:sz w:val="22"/>
-          <w:szCs w:val="22"/>
-          <w:lang w:val="en-IN" w:eastAsia="en-US" w:bidi="ar-SA"/>
-          <w14:ligatures w14:val="standardContextual"/>
-        </w:rPr>
-        <w:t xml:space="preserve"> </w:t>
+          <w:lang w:val="en-IN" w:eastAsia="en-US" w:bidi="ar-SA"/>
+          <w14:ligatures w14:val="standardContextual"/>
+        </w:rPr>
+        <w:t>Strong ownership mindset</w:t>
+      </w:r>
+      <w:r>
+        <w:rPr>
+          <w:rFonts w:asciiTheme="minorHAnsi" w:eastAsiaTheme="minorHAnsi" w:hAnsiTheme="minorHAnsi" w:cstheme="minorHAnsi"/>
+          <w:kern w:val="2"/>
+          <w:lang w:val="en-IN" w:eastAsia="en-US" w:bidi="ar-SA"/>
+          <w14:ligatures w14:val="standardContextual"/>
+        </w:rPr>
+        <w:t xml:space="preserve"> with hands-on </w:t>
       </w:r>
       <w:r>
         <w:rPr>
@@ -384,34 +329,75 @@
           <w:b/>
           <w:bCs/>
           <w:kern w:val="2"/>
-          <w:sz w:val="22"/>
-          <w:szCs w:val="22"/>
-          <w:lang w:val="en-IN" w:eastAsia="en-US" w:bidi="ar-SA"/>
-          <w14:ligatures w14:val="standardContextual"/>
-        </w:rPr>
-        <w:t>systems</w:t>
-      </w:r>
-      <w:r>
-        <w:rPr>
-          <w:rFonts w:asciiTheme="minorHAnsi" w:eastAsiaTheme="minorHAnsi" w:hAnsiTheme="minorHAnsi" w:cstheme="minorHAnsi"/>
-          <w:kern w:val="2"/>
-          <w:sz w:val="22"/>
-          <w:szCs w:val="22"/>
-          <w:lang w:val="en-IN" w:eastAsia="en-US" w:bidi="ar-SA"/>
-          <w14:ligatures w14:val="standardContextual"/>
-        </w:rPr>
-        <w:t xml:space="preserve"> processing TB-scale telemetry data</w:t>
-      </w:r>
-      <w:r>
-        <w:rPr>
-          <w:rFonts w:asciiTheme="minorHAnsi" w:eastAsiaTheme="minorHAnsi" w:hAnsiTheme="minorHAnsi" w:cstheme="minorHAnsi"/>
-          <w:kern w:val="2"/>
-          <w:sz w:val="22"/>
-          <w:szCs w:val="22"/>
+          <w:lang w:val="en-IN" w:eastAsia="en-US" w:bidi="ar-SA"/>
+          <w14:ligatures w14:val="standardContextual"/>
+        </w:rPr>
+        <w:t>leadership in platform architecture</w:t>
+      </w:r>
+      <w:r>
+        <w:rPr>
+          <w:rFonts w:asciiTheme="minorHAnsi" w:eastAsiaTheme="minorHAnsi" w:hAnsiTheme="minorHAnsi" w:cstheme="minorHAnsi"/>
+          <w:kern w:val="2"/>
+          <w:lang w:val="en-IN" w:eastAsia="en-US" w:bidi="ar-SA"/>
+          <w14:ligatures w14:val="standardContextual"/>
+        </w:rPr>
+        <w:t>, performance optimization</w:t>
+      </w:r>
+      <w:r>
+        <w:rPr>
+          <w:rFonts w:asciiTheme="minorHAnsi" w:eastAsiaTheme="minorHAnsi" w:hAnsiTheme="minorHAnsi" w:cstheme="minorHAnsi"/>
+          <w:kern w:val="2"/>
+          <w:lang w:val="en-IN" w:eastAsia="en-US" w:bidi="ar-SA"/>
+          <w14:ligatures w14:val="standardContextual"/>
+        </w:rPr>
+        <w:t>, code reviews</w:t>
+      </w:r>
+      <w:r>
+        <w:rPr>
+          <w:rFonts w:asciiTheme="minorHAnsi" w:eastAsiaTheme="minorHAnsi" w:hAnsiTheme="minorHAnsi" w:cstheme="minorHAnsi"/>
+          <w:kern w:val="2"/>
+          <w:lang w:val="en-IN" w:eastAsia="en-US" w:bidi="ar-SA"/>
+          <w14:ligatures w14:val="standardContextual"/>
+        </w:rPr>
+        <w:t>, and reusable engineering standards</w:t>
+      </w:r>
+      <w:r>
+        <w:rPr>
+          <w:rFonts w:asciiTheme="minorHAnsi" w:eastAsiaTheme="minorHAnsi" w:hAnsiTheme="minorHAnsi" w:cstheme="minorHAnsi"/>
+          <w:kern w:val="2"/>
           <w:lang w:val="en-IN" w:eastAsia="en-US" w:bidi="ar-SA"/>
           <w14:ligatures w14:val="standardContextual"/>
         </w:rPr>
         <w:t>.</w:t>
+      </w:r>
+      <w:r>
+        <w:rPr>
+          <w:rFonts w:asciiTheme="minorHAnsi" w:eastAsiaTheme="minorHAnsi" w:hAnsiTheme="minorHAnsi" w:cstheme="minorHAnsi"/>
+          <w:kern w:val="2"/>
+          <w:lang w:val="en-IN" w:eastAsia="en-US" w:bidi="ar-SA"/>
+          <w14:ligatures w14:val="standardContextual"/>
+        </w:rPr>
+        <w:t xml:space="preserve"> Developed </w:t>
+      </w:r>
+      <w:r>
+        <w:rPr>
+          <w:rFonts w:asciiTheme="minorHAnsi" w:eastAsiaTheme="minorHAnsi" w:hAnsiTheme="minorHAnsi" w:cstheme="minorHAnsi"/>
+          <w:b/>
+          <w:bCs/>
+          <w:kern w:val="2"/>
+          <w:lang w:val="en-IN" w:eastAsia="en-US" w:bidi="ar-SA"/>
+          <w14:ligatures w14:val="standardContextual"/>
+        </w:rPr>
+        <w:t>AI-assisted SDLC automation</w:t>
+      </w:r>
+      <w:r>
+        <w:rPr>
+          <w:rFonts w:asciiTheme="minorHAnsi" w:eastAsiaTheme="minorHAnsi" w:hAnsiTheme="minorHAnsi" w:cstheme="minorHAnsi"/>
+          <w:kern w:val="2"/>
+          <w:lang w:val="en-IN" w:eastAsia="en-US" w:bidi="ar-SA"/>
+          <w14:ligatures w14:val="standardContextual"/>
+        </w:rPr>
+        <w:t xml:space="preserve"> using Azure OpenAI, agentic workflows, and developer productivity tooling.</w:t>
       </w:r>
     </w:p>
     <w:p>
@@ -425,8 +411,6 @@
         <w:rPr>
           <w:rFonts w:asciiTheme="minorHAnsi" w:eastAsiaTheme="minorHAnsi" w:hAnsiTheme="minorHAnsi" w:cstheme="minorHAnsi"/>
           <w:kern w:val="2"/>
-          <w:sz w:val="22"/>
-          <w:szCs w:val="22"/>
           <w:lang w:val="en-IN" w:eastAsia="en-US" w:bidi="ar-SA"/>
           <w14:ligatures w14:val="standardContextual"/>
         </w:rPr>
@@ -437,23 +421,10 @@
           <w:b/>
           <w:bCs/>
           <w:kern w:val="2"/>
-          <w:sz w:val="22"/>
-          <w:szCs w:val="22"/>
-          <w:lang w:val="en-IN" w:eastAsia="en-US" w:bidi="ar-SA"/>
-          <w14:ligatures w14:val="standardContextual"/>
-        </w:rPr>
-        <w:t>Strong ownership mindset</w:t>
-      </w:r>
-      <w:r>
-        <w:rPr>
-          <w:rFonts w:asciiTheme="minorHAnsi" w:eastAsiaTheme="minorHAnsi" w:hAnsiTheme="minorHAnsi" w:cstheme="minorHAnsi"/>
-          <w:kern w:val="2"/>
-          <w:sz w:val="22"/>
-          <w:szCs w:val="22"/>
-          <w:lang w:val="en-IN" w:eastAsia="en-US" w:bidi="ar-SA"/>
-          <w14:ligatures w14:val="standardContextual"/>
-        </w:rPr>
-        <w:t xml:space="preserve"> with hands-on </w:t>
+          <w:lang w:val="en-IN" w:eastAsia="en-US" w:bidi="ar-SA"/>
+          <w14:ligatures w14:val="standardContextual"/>
+        </w:rPr>
+        <w:t>Ranked 1</w:t>
       </w:r>
       <w:r>
         <w:rPr>
@@ -461,12 +432,10 @@
           <w:b/>
           <w:bCs/>
           <w:kern w:val="2"/>
-          <w:sz w:val="22"/>
-          <w:szCs w:val="22"/>
-          <w:lang w:val="en-IN" w:eastAsia="en-US" w:bidi="ar-SA"/>
-          <w14:ligatures w14:val="standardContextual"/>
-        </w:rPr>
-        <w:t>leadership in</w:t>
+          <w:lang w:val="en-IN" w:eastAsia="en-US" w:bidi="ar-SA"/>
+          <w14:ligatures w14:val="standardContextual"/>
+        </w:rPr>
+        <w:t>st</w:t>
       </w:r>
       <w:r>
         <w:rPr>
@@ -474,12 +443,37 @@
           <w:b/>
           <w:bCs/>
           <w:kern w:val="2"/>
-          <w:sz w:val="22"/>
-          <w:szCs w:val="22"/>
-          <w:lang w:val="en-IN" w:eastAsia="en-US" w:bidi="ar-SA"/>
-          <w14:ligatures w14:val="standardContextual"/>
-        </w:rPr>
-        <w:t xml:space="preserve"> data</w:t>
+          <w:lang w:val="en-IN" w:eastAsia="en-US" w:bidi="ar-SA"/>
+          <w14:ligatures w14:val="standardContextual"/>
+        </w:rPr>
+        <w:t xml:space="preserve">  among 120+ students</w:t>
+      </w:r>
+      <w:r>
+        <w:rPr>
+          <w:rFonts w:asciiTheme="minorHAnsi" w:eastAsiaTheme="minorHAnsi" w:hAnsiTheme="minorHAnsi" w:cstheme="minorHAnsi"/>
+          <w:kern w:val="2"/>
+          <w:lang w:val="en-IN" w:eastAsia="en-US" w:bidi="ar-SA"/>
+          <w14:ligatures w14:val="standardContextual"/>
+        </w:rPr>
+        <w:t xml:space="preserve"> in PG</w:t>
+      </w:r>
+      <w:r>
+        <w:rPr>
+          <w:rFonts w:asciiTheme="minorHAnsi" w:eastAsiaTheme="minorHAnsi" w:hAnsiTheme="minorHAnsi" w:cstheme="minorHAnsi"/>
+          <w:kern w:val="2"/>
+          <w:lang w:val="en-IN" w:eastAsia="en-US" w:bidi="ar-SA"/>
+          <w14:ligatures w14:val="standardContextual"/>
+        </w:rPr>
+        <w:t xml:space="preserve"> - </w:t>
+      </w:r>
+      <w:r>
+        <w:rPr>
+          <w:rFonts w:asciiTheme="minorHAnsi" w:eastAsiaTheme="minorHAnsi" w:hAnsiTheme="minorHAnsi" w:cstheme="minorHAnsi"/>
+          <w:kern w:val="2"/>
+          <w:lang w:val="en-IN" w:eastAsia="en-US" w:bidi="ar-SA"/>
+          <w14:ligatures w14:val="standardContextual"/>
+        </w:rPr>
+        <w:t xml:space="preserve">Diploma (Big Data Analytics) at </w:t>
       </w:r>
       <w:r>
         <w:rPr>
@@ -487,45 +481,46 @@
           <w:b/>
           <w:bCs/>
           <w:kern w:val="2"/>
-          <w:sz w:val="22"/>
-          <w:szCs w:val="22"/>
-          <w:lang w:val="en-IN" w:eastAsia="en-US" w:bidi="ar-SA"/>
-          <w14:ligatures w14:val="standardContextual"/>
-        </w:rPr>
-        <w:t xml:space="preserve"> platform architecture</w:t>
-      </w:r>
-      <w:r>
-        <w:rPr>
-          <w:rFonts w:asciiTheme="minorHAnsi" w:eastAsiaTheme="minorHAnsi" w:hAnsiTheme="minorHAnsi" w:cstheme="minorHAnsi"/>
-          <w:kern w:val="2"/>
-          <w:sz w:val="22"/>
-          <w:szCs w:val="22"/>
-          <w:lang w:val="en-IN" w:eastAsia="en-US" w:bidi="ar-SA"/>
-          <w14:ligatures w14:val="standardContextual"/>
-        </w:rPr>
-        <w:t>, performance optimization, and reusable engineering standards</w:t>
-      </w:r>
-      <w:r>
-        <w:rPr>
-          <w:rFonts w:asciiTheme="minorHAnsi" w:eastAsiaTheme="minorHAnsi" w:hAnsiTheme="minorHAnsi" w:cstheme="minorHAnsi"/>
-          <w:kern w:val="2"/>
-          <w:sz w:val="22"/>
-          <w:szCs w:val="22"/>
+          <w:lang w:val="en-IN" w:eastAsia="en-US" w:bidi="ar-SA"/>
+          <w14:ligatures w14:val="standardContextual"/>
+        </w:rPr>
+        <w:t>CDAC Bengaluru</w:t>
+      </w:r>
+      <w:r>
+        <w:rPr>
+          <w:rFonts w:asciiTheme="minorHAnsi" w:eastAsiaTheme="minorHAnsi" w:hAnsiTheme="minorHAnsi" w:cstheme="minorHAnsi"/>
+          <w:b/>
+          <w:bCs/>
+          <w:kern w:val="2"/>
           <w:lang w:val="en-IN" w:eastAsia="en-US" w:bidi="ar-SA"/>
           <w14:ligatures w14:val="standardContextual"/>
         </w:rPr>
         <w:t>.</w:t>
       </w:r>
-      <w:r>
-        <w:rPr>
-          <w:rFonts w:asciiTheme="minorHAnsi" w:eastAsiaTheme="minorHAnsi" w:hAnsiTheme="minorHAnsi" w:cstheme="minorHAnsi"/>
-          <w:kern w:val="2"/>
-          <w:sz w:val="22"/>
-          <w:szCs w:val="22"/>
-          <w:lang w:val="en-IN" w:eastAsia="en-US" w:bidi="ar-SA"/>
-          <w14:ligatures w14:val="standardContextual"/>
-        </w:rPr>
-        <w:t xml:space="preserve"> Developed </w:t>
+    </w:p>
+    <w:p>
+      <w:pPr>
+        <w:pStyle w:val="LO-normal"/>
+        <w:numPr>
+          <w:ilvl w:val="0"/>
+          <w:numId w:val="26"/>
+        </w:numPr>
+        <w:ind w:left="0" w:right="-397"/>
+        <w:rPr>
+          <w:rFonts w:asciiTheme="minorHAnsi" w:eastAsiaTheme="minorHAnsi" w:hAnsiTheme="minorHAnsi" w:cstheme="minorHAnsi"/>
+          <w:kern w:val="2"/>
+          <w:lang w:val="en-IN" w:eastAsia="en-US" w:bidi="ar-SA"/>
+          <w14:ligatures w14:val="standardContextual"/>
+        </w:rPr>
+      </w:pPr>
+      <w:r>
+        <w:rPr>
+          <w:rFonts w:asciiTheme="minorHAnsi" w:eastAsiaTheme="minorHAnsi" w:hAnsiTheme="minorHAnsi" w:cstheme="minorHAnsi"/>
+          <w:kern w:val="2"/>
+          <w:lang w:val="en-IN" w:eastAsia="en-US" w:bidi="ar-SA"/>
+          <w14:ligatures w14:val="standardContextual"/>
+        </w:rPr>
+        <w:t xml:space="preserve">HackerRank 5 star in </w:t>
       </w:r>
       <w:r>
         <w:rPr>
@@ -533,23 +528,66 @@
           <w:b/>
           <w:bCs/>
           <w:kern w:val="2"/>
-          <w:sz w:val="22"/>
-          <w:szCs w:val="22"/>
-          <w:lang w:val="en-IN" w:eastAsia="en-US" w:bidi="ar-SA"/>
-          <w14:ligatures w14:val="standardContextual"/>
-        </w:rPr>
-        <w:t>AI-assisted SDLC automation</w:t>
-      </w:r>
-      <w:r>
-        <w:rPr>
-          <w:rFonts w:asciiTheme="minorHAnsi" w:eastAsiaTheme="minorHAnsi" w:hAnsiTheme="minorHAnsi" w:cstheme="minorHAnsi"/>
-          <w:kern w:val="2"/>
-          <w:sz w:val="22"/>
-          <w:szCs w:val="22"/>
-          <w:lang w:val="en-IN" w:eastAsia="en-US" w:bidi="ar-SA"/>
-          <w14:ligatures w14:val="standardContextual"/>
-        </w:rPr>
-        <w:t xml:space="preserve"> using Azure OpenAI, agentic workflows, and developer productivity tooling.</w:t>
+          <w:lang w:val="en-IN" w:eastAsia="en-US" w:bidi="ar-SA"/>
+          <w14:ligatures w14:val="standardContextual"/>
+        </w:rPr>
+        <w:t>Python and SQL</w:t>
+      </w:r>
+      <w:r>
+        <w:rPr>
+          <w:rFonts w:asciiTheme="minorHAnsi" w:eastAsiaTheme="minorHAnsi" w:hAnsiTheme="minorHAnsi" w:cstheme="minorHAnsi"/>
+          <w:kern w:val="2"/>
+          <w:lang w:val="en-IN" w:eastAsia="en-US" w:bidi="ar-SA"/>
+          <w14:ligatures w14:val="standardContextual"/>
+        </w:rPr>
+        <w:t>;</w:t>
+      </w:r>
+      <w:r>
+        <w:rPr>
+          <w:rFonts w:asciiTheme="minorHAnsi" w:eastAsiaTheme="minorHAnsi" w:hAnsiTheme="minorHAnsi" w:cstheme="minorHAnsi"/>
+          <w:kern w:val="2"/>
+          <w:lang w:val="en-IN" w:eastAsia="en-US" w:bidi="ar-SA"/>
+          <w14:ligatures w14:val="standardContextual"/>
+        </w:rPr>
+        <w:t xml:space="preserve"> Solved</w:t>
+      </w:r>
+      <w:r>
+        <w:rPr>
+          <w:rFonts w:asciiTheme="minorHAnsi" w:eastAsiaTheme="minorHAnsi" w:hAnsiTheme="minorHAnsi" w:cstheme="minorHAnsi"/>
+          <w:kern w:val="2"/>
+          <w:lang w:val="en-IN" w:eastAsia="en-US" w:bidi="ar-SA"/>
+          <w14:ligatures w14:val="standardContextual"/>
+        </w:rPr>
+        <w:t xml:space="preserve"> </w:t>
+      </w:r>
+      <w:r>
+        <w:rPr>
+          <w:rFonts w:asciiTheme="minorHAnsi" w:eastAsiaTheme="minorHAnsi" w:hAnsiTheme="minorHAnsi" w:cstheme="minorHAnsi"/>
+          <w:b/>
+          <w:bCs/>
+          <w:kern w:val="2"/>
+          <w:lang w:val="en-IN" w:eastAsia="en-US" w:bidi="ar-SA"/>
+          <w14:ligatures w14:val="standardContextual"/>
+        </w:rPr>
+        <w:t>700+ LeetCode problems</w:t>
+      </w:r>
+      <w:r>
+        <w:rPr>
+          <w:rFonts w:asciiTheme="minorHAnsi" w:eastAsiaTheme="minorHAnsi" w:hAnsiTheme="minorHAnsi" w:cstheme="minorHAnsi"/>
+          <w:kern w:val="2"/>
+          <w:lang w:val="en-IN" w:eastAsia="en-US" w:bidi="ar-SA"/>
+          <w14:ligatures w14:val="standardContextual"/>
+        </w:rPr>
+        <w:t xml:space="preserve"> with hands-on CI/CD, and agile collaboratio</w:t>
+      </w:r>
+      <w:r>
+        <w:rPr>
+          <w:rFonts w:asciiTheme="minorHAnsi" w:eastAsiaTheme="minorHAnsi" w:hAnsiTheme="minorHAnsi" w:cstheme="minorHAnsi"/>
+          <w:kern w:val="2"/>
+          <w:lang w:val="en-IN" w:eastAsia="en-US" w:bidi="ar-SA"/>
+          <w14:ligatures w14:val="standardContextual"/>
+        </w:rPr>
+        <w:t>ns.</w:t>
       </w:r>
     </w:p>
     <w:p>
@@ -578,45 +616,18 @@
         <w:rPr>
           <w:rFonts w:cstheme="minorHAnsi"/>
           <w:b/>
-          <w:sz w:val="28"/>
-          <w:szCs w:val="28"/>
+          <w:sz w:val="32"/>
+          <w:szCs w:val="32"/>
         </w:rPr>
       </w:pPr>
       <w:r>
         <w:rPr>
           <w:rFonts w:cstheme="minorHAnsi"/>
           <w:b/>
-          <w:sz w:val="28"/>
-          <w:szCs w:val="28"/>
-        </w:rPr>
-        <w:t>W</w:t>
-      </w:r>
-      <w:r>
-        <w:rPr>
-          <w:rFonts w:cstheme="minorHAnsi"/>
-          <w:b/>
-          <w:sz w:val="28"/>
-          <w:szCs w:val="28"/>
-        </w:rPr>
-        <w:t>ORK</w:t>
-      </w:r>
-      <w:r>
-        <w:rPr>
-          <w:rFonts w:cstheme="minorHAnsi"/>
-          <w:b/>
-          <w:sz w:val="28"/>
-          <w:szCs w:val="28"/>
-        </w:rPr>
-        <w:t xml:space="preserve"> A</w:t>
-      </w:r>
-      <w:r>
-        <w:rPr>
-          <w:rFonts w:cstheme="minorHAnsi"/>
-          <w:b/>
-          <w:sz w:val="28"/>
-          <w:szCs w:val="28"/>
-        </w:rPr>
-        <w:t>UTHORIZATION</w:t>
+          <w:sz w:val="32"/>
+          <w:szCs w:val="32"/>
+        </w:rPr>
+        <w:t>WORK AUTHORIZATION</w:t>
       </w:r>
     </w:p>
     <w:p>
@@ -631,192 +642,72 @@
         <w:rPr>
           <w:rFonts w:asciiTheme="minorHAnsi" w:eastAsiaTheme="minorHAnsi" w:hAnsiTheme="minorHAnsi" w:cstheme="minorHAnsi"/>
           <w:kern w:val="2"/>
-          <w:sz w:val="22"/>
-          <w:szCs w:val="22"/>
-          <w:lang w:val="en-IN" w:eastAsia="en-US" w:bidi="ar-SA"/>
-          <w14:ligatures w14:val="standardContextual"/>
-        </w:rPr>
-      </w:pPr>
-      <w:r>
-        <w:rPr>
-          <w:rFonts w:asciiTheme="minorHAnsi" w:eastAsiaTheme="minorHAnsi" w:hAnsiTheme="minorHAnsi" w:cstheme="minorHAnsi"/>
-          <w:kern w:val="2"/>
-          <w:sz w:val="22"/>
-          <w:szCs w:val="22"/>
-          <w:lang w:val="en-IN" w:eastAsia="en-US" w:bidi="ar-SA"/>
-          <w14:ligatures w14:val="standardContextual"/>
-        </w:rPr>
-        <w:t>Non</w:t>
-      </w:r>
-      <w:r>
-        <w:rPr>
-          <w:rFonts w:asciiTheme="minorHAnsi" w:eastAsiaTheme="minorHAnsi" w:hAnsiTheme="minorHAnsi" w:cstheme="minorHAnsi"/>
-          <w:kern w:val="2"/>
-          <w:sz w:val="22"/>
-          <w:szCs w:val="22"/>
-          <w:lang w:val="en-IN" w:eastAsia="en-US" w:bidi="ar-SA"/>
-          <w14:ligatures w14:val="standardContextual"/>
-        </w:rPr>
-        <w:t>-</w:t>
-      </w:r>
-      <w:r>
-        <w:rPr>
-          <w:rFonts w:asciiTheme="minorHAnsi" w:eastAsiaTheme="minorHAnsi" w:hAnsiTheme="minorHAnsi" w:cstheme="minorHAnsi"/>
-          <w:kern w:val="2"/>
-          <w:sz w:val="22"/>
-          <w:szCs w:val="22"/>
-          <w:lang w:val="en-IN" w:eastAsia="en-US" w:bidi="ar-SA"/>
-          <w14:ligatures w14:val="standardContextual"/>
-        </w:rPr>
-        <w:t xml:space="preserve">EU. </w:t>
-      </w:r>
-      <w:r>
-        <w:rPr>
-          <w:rFonts w:asciiTheme="minorHAnsi" w:eastAsiaTheme="minorHAnsi" w:hAnsiTheme="minorHAnsi" w:cstheme="minorHAnsi"/>
-          <w:kern w:val="2"/>
-          <w:sz w:val="22"/>
-          <w:szCs w:val="22"/>
-          <w:lang w:val="en-IN" w:eastAsia="en-US" w:bidi="ar-SA"/>
-          <w14:ligatures w14:val="standardContextual"/>
-        </w:rPr>
-        <w:t>Requires employer sponsorship (Highly Skilled Migrant / EU Blue Card). Ready to relocate to Netherlands.</w:t>
-      </w:r>
-    </w:p>
-    <w:p>
-      <w:pPr>
-        <w:pStyle w:val="LO-normal"/>
-        <w:numPr>
-          <w:ilvl w:val="0"/>
-          <w:numId w:val="26"/>
-        </w:numPr>
-        <w:ind w:left="0" w:right="-397"/>
-        <w:jc w:val="both"/>
-        <w:rPr>
-          <w:rFonts w:asciiTheme="minorHAnsi" w:eastAsiaTheme="minorHAnsi" w:hAnsiTheme="minorHAnsi" w:cstheme="minorHAnsi"/>
-          <w:kern w:val="2"/>
-          <w:sz w:val="22"/>
-          <w:szCs w:val="22"/>
-          <w:lang w:val="en-IN" w:eastAsia="en-US" w:bidi="ar-SA"/>
-          <w14:ligatures w14:val="standardContextual"/>
-        </w:rPr>
-      </w:pPr>
-      <w:r>
-        <w:rPr>
-          <w:rFonts w:asciiTheme="minorHAnsi" w:eastAsiaTheme="minorHAnsi" w:hAnsiTheme="minorHAnsi" w:cstheme="minorHAnsi"/>
-          <w:b/>
-          <w:bCs/>
-          <w:kern w:val="2"/>
-          <w:sz w:val="22"/>
-          <w:szCs w:val="22"/>
-          <w:lang w:val="en-IN" w:eastAsia="en-US" w:bidi="ar-SA"/>
-          <w14:ligatures w14:val="standardContextual"/>
-        </w:rPr>
-        <w:t xml:space="preserve">Languages: </w:t>
-      </w:r>
-      <w:r>
-        <w:rPr>
-          <w:rFonts w:asciiTheme="minorHAnsi" w:eastAsiaTheme="minorHAnsi" w:hAnsiTheme="minorHAnsi" w:cstheme="minorHAnsi"/>
-          <w:b/>
-          <w:bCs/>
-          <w:kern w:val="2"/>
-          <w:sz w:val="22"/>
-          <w:szCs w:val="22"/>
-          <w:lang w:val="en-IN" w:eastAsia="en-US" w:bidi="ar-SA"/>
-          <w14:ligatures w14:val="standardContextual"/>
-        </w:rPr>
-        <w:t>English</w:t>
-      </w:r>
-      <w:r>
-        <w:rPr>
-          <w:rFonts w:asciiTheme="minorHAnsi" w:eastAsiaTheme="minorHAnsi" w:hAnsiTheme="minorHAnsi" w:cstheme="minorHAnsi"/>
-          <w:kern w:val="2"/>
-          <w:sz w:val="22"/>
-          <w:szCs w:val="22"/>
-          <w:lang w:val="en-IN" w:eastAsia="en-US" w:bidi="ar-SA"/>
-          <w14:ligatures w14:val="standardContextual"/>
-        </w:rPr>
-        <w:t xml:space="preserve"> - </w:t>
-      </w:r>
-      <w:r>
-        <w:rPr>
-          <w:rFonts w:asciiTheme="minorHAnsi" w:eastAsiaTheme="minorHAnsi" w:hAnsiTheme="minorHAnsi" w:cstheme="minorHAnsi"/>
-          <w:kern w:val="2"/>
-          <w:sz w:val="22"/>
-          <w:szCs w:val="22"/>
-          <w:lang w:val="en-IN" w:eastAsia="en-US" w:bidi="ar-SA"/>
-          <w14:ligatures w14:val="standardContextual"/>
-        </w:rPr>
-        <w:t xml:space="preserve">Fluent/Professional; </w:t>
-      </w:r>
-      <w:r>
-        <w:rPr>
-          <w:rFonts w:asciiTheme="minorHAnsi" w:eastAsiaTheme="minorHAnsi" w:hAnsiTheme="minorHAnsi" w:cstheme="minorHAnsi"/>
-          <w:b/>
-          <w:bCs/>
-          <w:kern w:val="2"/>
-          <w:sz w:val="22"/>
-          <w:szCs w:val="22"/>
-          <w:lang w:val="en-IN" w:eastAsia="en-US" w:bidi="ar-SA"/>
-          <w14:ligatures w14:val="standardContextual"/>
-        </w:rPr>
-        <w:t>Hindi</w:t>
-      </w:r>
-      <w:r>
-        <w:rPr>
-          <w:rFonts w:asciiTheme="minorHAnsi" w:eastAsiaTheme="minorHAnsi" w:hAnsiTheme="minorHAnsi" w:cstheme="minorHAnsi"/>
-          <w:kern w:val="2"/>
-          <w:sz w:val="22"/>
-          <w:szCs w:val="22"/>
-          <w:lang w:val="en-IN" w:eastAsia="en-US" w:bidi="ar-SA"/>
-          <w14:ligatures w14:val="standardContextual"/>
-        </w:rPr>
-        <w:t xml:space="preserve"> - </w:t>
-      </w:r>
-      <w:r>
-        <w:rPr>
-          <w:rFonts w:asciiTheme="minorHAnsi" w:eastAsiaTheme="minorHAnsi" w:hAnsiTheme="minorHAnsi" w:cstheme="minorHAnsi"/>
-          <w:kern w:val="2"/>
-          <w:sz w:val="22"/>
-          <w:szCs w:val="22"/>
-          <w:lang w:val="en-IN" w:eastAsia="en-US" w:bidi="ar-SA"/>
-          <w14:ligatures w14:val="standardContextual"/>
-        </w:rPr>
-        <w:t xml:space="preserve">Native; </w:t>
-      </w:r>
-      <w:r>
-        <w:rPr>
-          <w:rFonts w:asciiTheme="minorHAnsi" w:eastAsiaTheme="minorHAnsi" w:hAnsiTheme="minorHAnsi" w:cstheme="minorHAnsi"/>
-          <w:b/>
-          <w:bCs/>
-          <w:kern w:val="2"/>
-          <w:sz w:val="22"/>
-          <w:szCs w:val="22"/>
-          <w:lang w:val="en-IN" w:eastAsia="en-US" w:bidi="ar-SA"/>
-          <w14:ligatures w14:val="standardContextual"/>
-        </w:rPr>
-        <w:t>Dutch</w:t>
-      </w:r>
-      <w:r>
-        <w:rPr>
-          <w:rFonts w:asciiTheme="minorHAnsi" w:eastAsiaTheme="minorHAnsi" w:hAnsiTheme="minorHAnsi" w:cstheme="minorHAnsi"/>
-          <w:kern w:val="2"/>
-          <w:sz w:val="22"/>
-          <w:szCs w:val="22"/>
-          <w:lang w:val="en-IN" w:eastAsia="en-US" w:bidi="ar-SA"/>
-          <w14:ligatures w14:val="standardContextual"/>
-        </w:rPr>
-        <w:t xml:space="preserve"> - </w:t>
-      </w:r>
-      <w:r>
-        <w:rPr>
-          <w:rFonts w:asciiTheme="minorHAnsi" w:eastAsiaTheme="minorHAnsi" w:hAnsiTheme="minorHAnsi" w:cstheme="minorHAnsi"/>
-          <w:kern w:val="2"/>
-          <w:sz w:val="22"/>
-          <w:szCs w:val="22"/>
-          <w:lang w:val="en-IN" w:eastAsia="en-US" w:bidi="ar-SA"/>
-          <w14:ligatures w14:val="standardContextual"/>
-        </w:rPr>
-        <w:t>A1 (learning)</w:t>
+          <w:lang w:val="en-IN" w:eastAsia="en-US" w:bidi="ar-SA"/>
+          <w14:ligatures w14:val="standardContextual"/>
+        </w:rPr>
+      </w:pPr>
+      <w:r>
+        <w:rPr>
+          <w:rFonts w:asciiTheme="minorHAnsi" w:eastAsiaTheme="minorHAnsi" w:hAnsiTheme="minorHAnsi" w:cstheme="minorHAnsi"/>
+          <w:kern w:val="2"/>
+          <w:lang w:val="en-IN" w:eastAsia="en-US" w:bidi="ar-SA"/>
+          <w14:ligatures w14:val="standardContextual"/>
+        </w:rPr>
+        <w:t>Non-EU. Require employer sponsorship</w:t>
+      </w:r>
+      <w:r>
+        <w:rPr>
+          <w:rFonts w:asciiTheme="minorHAnsi" w:eastAsiaTheme="minorHAnsi" w:hAnsiTheme="minorHAnsi" w:cstheme="minorHAnsi"/>
+          <w:kern w:val="2"/>
+          <w:lang w:val="en-IN" w:eastAsia="en-US" w:bidi="ar-SA"/>
+          <w14:ligatures w14:val="standardContextual"/>
+        </w:rPr>
+        <w:t xml:space="preserve"> </w:t>
+      </w:r>
+      <w:r>
+        <w:rPr>
+          <w:rFonts w:asciiTheme="minorHAnsi" w:eastAsiaTheme="minorHAnsi" w:hAnsiTheme="minorHAnsi" w:cstheme="minorHAnsi"/>
+          <w:kern w:val="2"/>
+          <w:lang w:val="en-IN" w:eastAsia="en-US" w:bidi="ar-SA"/>
+          <w14:ligatures w14:val="standardContextual"/>
+        </w:rPr>
+        <w:t>(Highly Skilled Migrant</w:t>
+      </w:r>
+      <w:r>
+        <w:rPr>
+          <w:rFonts w:asciiTheme="minorHAnsi" w:eastAsiaTheme="minorHAnsi" w:hAnsiTheme="minorHAnsi" w:cstheme="minorHAnsi"/>
+          <w:kern w:val="2"/>
+          <w:lang w:val="en-IN" w:eastAsia="en-US" w:bidi="ar-SA"/>
+          <w14:ligatures w14:val="standardContextual"/>
+        </w:rPr>
+        <w:t xml:space="preserve"> / EU</w:t>
+      </w:r>
+      <w:r>
+        <w:rPr>
+          <w:rFonts w:asciiTheme="minorHAnsi" w:eastAsiaTheme="minorHAnsi" w:hAnsiTheme="minorHAnsi" w:cstheme="minorHAnsi"/>
+          <w:kern w:val="2"/>
+          <w:lang w:val="en-IN" w:eastAsia="en-US" w:bidi="ar-SA"/>
+          <w14:ligatures w14:val="standardContextual"/>
+        </w:rPr>
+        <w:t xml:space="preserve"> </w:t>
+      </w:r>
+      <w:r>
+        <w:rPr>
+          <w:rFonts w:asciiTheme="minorHAnsi" w:eastAsiaTheme="minorHAnsi" w:hAnsiTheme="minorHAnsi" w:cstheme="minorHAnsi"/>
+          <w:kern w:val="2"/>
+          <w:lang w:val="en-IN" w:eastAsia="en-US" w:bidi="ar-SA"/>
+          <w14:ligatures w14:val="standardContextual"/>
+        </w:rPr>
+        <w:t>Blue Card</w:t>
+      </w:r>
+      <w:r>
+        <w:rPr>
+          <w:rFonts w:asciiTheme="minorHAnsi" w:eastAsiaTheme="minorHAnsi" w:hAnsiTheme="minorHAnsi" w:cstheme="minorHAnsi"/>
+          <w:kern w:val="2"/>
+          <w:lang w:val="en-IN" w:eastAsia="en-US" w:bidi="ar-SA"/>
+          <w14:ligatures w14:val="standardContextual"/>
+        </w:rPr>
+        <w:t>). Ready to relocate to Netherlands.</w:t>
       </w:r>
     </w:p>
     <w:p>
@@ -830,8 +721,8 @@
           <w:b/>
           <w:bCs/>
           <w:kern w:val="2"/>
-          <w:sz w:val="20"/>
-          <w:szCs w:val="20"/>
+          <w:sz w:val="22"/>
+          <w:szCs w:val="22"/>
           <w:lang w:val="en-IN" w:eastAsia="en-US" w:bidi="ar-SA"/>
           <w14:ligatures w14:val="standardContextual"/>
         </w:rPr>
@@ -846,14 +737,16 @@
         <w:ind w:left="-397" w:right="-397"/>
         <w:rPr>
           <w:rFonts w:cstheme="minorHAnsi"/>
+          <w:sz w:val="24"/>
+          <w:szCs w:val="24"/>
         </w:rPr>
       </w:pPr>
       <w:r>
         <w:rPr>
           <w:rFonts w:cstheme="minorHAnsi"/>
           <w:b/>
-          <w:sz w:val="28"/>
-          <w:szCs w:val="28"/>
+          <w:sz w:val="32"/>
+          <w:szCs w:val="32"/>
         </w:rPr>
         <w:t>EXPERIENCE</w:t>
       </w:r>
@@ -867,20 +760,22 @@
           <w:rFonts w:asciiTheme="minorHAnsi" w:eastAsiaTheme="minorHAnsi" w:hAnsiTheme="minorHAnsi" w:cstheme="minorHAnsi"/>
           <w:b/>
           <w:kern w:val="2"/>
+          <w:sz w:val="32"/>
+          <w:szCs w:val="32"/>
+          <w:lang w:val="en-IN" w:eastAsia="en-US" w:bidi="ar-SA"/>
+          <w14:ligatures w14:val="standardContextual"/>
+        </w:rPr>
+      </w:pPr>
+      <w:r>
+        <w:rPr>
+          <w:rFonts w:asciiTheme="minorHAnsi" w:eastAsiaTheme="minorHAnsi" w:hAnsiTheme="minorHAnsi" w:cstheme="minorHAnsi"/>
+          <w:b/>
+          <w:kern w:val="2"/>
           <w:sz w:val="28"/>
           <w:szCs w:val="28"/>
           <w:lang w:val="en-IN" w:eastAsia="en-US" w:bidi="ar-SA"/>
           <w14:ligatures w14:val="standardContextual"/>
         </w:rPr>
-      </w:pPr>
-      <w:r>
-        <w:rPr>
-          <w:rFonts w:asciiTheme="minorHAnsi" w:eastAsiaTheme="minorHAnsi" w:hAnsiTheme="minorHAnsi" w:cstheme="minorHAnsi"/>
-          <w:b/>
-          <w:kern w:val="2"/>
-          <w:lang w:val="en-IN" w:eastAsia="en-US" w:bidi="ar-SA"/>
-          <w14:ligatures w14:val="standardContextual"/>
-        </w:rPr>
         <w:t>Data Engineer, Alstom</w:t>
       </w:r>
       <w:r>
@@ -888,6 +783,8 @@
           <w:rFonts w:asciiTheme="minorHAnsi" w:eastAsiaTheme="minorHAnsi" w:hAnsiTheme="minorHAnsi" w:cstheme="minorHAnsi"/>
           <w:b/>
           <w:kern w:val="2"/>
+          <w:sz w:val="28"/>
+          <w:szCs w:val="28"/>
           <w:lang w:val="en-IN" w:eastAsia="en-US" w:bidi="ar-SA"/>
           <w14:ligatures w14:val="standardContextual"/>
         </w:rPr>
@@ -898,6 +795,8 @@
           <w:rFonts w:asciiTheme="minorHAnsi" w:eastAsiaTheme="minorHAnsi" w:hAnsiTheme="minorHAnsi" w:cstheme="minorHAnsi"/>
           <w:b/>
           <w:kern w:val="2"/>
+          <w:sz w:val="28"/>
+          <w:szCs w:val="28"/>
           <w:lang w:val="en-IN" w:eastAsia="en-US" w:bidi="ar-SA"/>
           <w14:ligatures w14:val="standardContextual"/>
         </w:rPr>
@@ -908,6 +807,8 @@
           <w:rFonts w:asciiTheme="minorHAnsi" w:eastAsiaTheme="minorHAnsi" w:hAnsiTheme="minorHAnsi" w:cstheme="minorHAnsi"/>
           <w:b/>
           <w:kern w:val="2"/>
+          <w:sz w:val="28"/>
+          <w:szCs w:val="28"/>
           <w:lang w:val="en-IN" w:eastAsia="en-US" w:bidi="ar-SA"/>
           <w14:ligatures w14:val="standardContextual"/>
         </w:rPr>
@@ -918,6 +819,8 @@
           <w:rFonts w:asciiTheme="minorHAnsi" w:eastAsiaTheme="minorHAnsi" w:hAnsiTheme="minorHAnsi" w:cstheme="minorHAnsi"/>
           <w:b/>
           <w:kern w:val="2"/>
+          <w:sz w:val="28"/>
+          <w:szCs w:val="28"/>
           <w:lang w:val="en-IN" w:eastAsia="en-US" w:bidi="ar-SA"/>
           <w14:ligatures w14:val="standardContextual"/>
         </w:rPr>
@@ -928,6 +831,8 @@
           <w:rFonts w:asciiTheme="minorHAnsi" w:eastAsiaTheme="minorHAnsi" w:hAnsiTheme="minorHAnsi" w:cstheme="minorHAnsi"/>
           <w:b/>
           <w:kern w:val="2"/>
+          <w:sz w:val="28"/>
+          <w:szCs w:val="28"/>
           <w:lang w:val="en-IN" w:eastAsia="en-US" w:bidi="ar-SA"/>
           <w14:ligatures w14:val="standardContextual"/>
         </w:rPr>
@@ -938,6 +843,8 @@
           <w:rFonts w:asciiTheme="minorHAnsi" w:eastAsiaTheme="minorHAnsi" w:hAnsiTheme="minorHAnsi" w:cstheme="minorHAnsi"/>
           <w:b/>
           <w:kern w:val="2"/>
+          <w:sz w:val="28"/>
+          <w:szCs w:val="28"/>
           <w:lang w:val="en-IN" w:eastAsia="en-US" w:bidi="ar-SA"/>
           <w14:ligatures w14:val="standardContextual"/>
         </w:rPr>
@@ -948,6 +855,8 @@
           <w:rFonts w:asciiTheme="minorHAnsi" w:eastAsiaTheme="minorHAnsi" w:hAnsiTheme="minorHAnsi" w:cstheme="minorHAnsi"/>
           <w:b/>
           <w:kern w:val="2"/>
+          <w:sz w:val="28"/>
+          <w:szCs w:val="28"/>
           <w:lang w:val="en-IN" w:eastAsia="en-US" w:bidi="ar-SA"/>
           <w14:ligatures w14:val="standardContextual"/>
         </w:rPr>
@@ -958,26 +867,8 @@
           <w:rFonts w:asciiTheme="minorHAnsi" w:eastAsiaTheme="minorHAnsi" w:hAnsiTheme="minorHAnsi" w:cstheme="minorHAnsi"/>
           <w:b/>
           <w:kern w:val="2"/>
-          <w:lang w:val="en-IN" w:eastAsia="en-US" w:bidi="ar-SA"/>
-          <w14:ligatures w14:val="standardContextual"/>
-        </w:rPr>
-        <w:tab/>
-      </w:r>
-      <w:r>
-        <w:rPr>
-          <w:rFonts w:asciiTheme="minorHAnsi" w:eastAsiaTheme="minorHAnsi" w:hAnsiTheme="minorHAnsi" w:cstheme="minorHAnsi"/>
-          <w:b/>
-          <w:kern w:val="2"/>
-          <w:lang w:val="en-IN" w:eastAsia="en-US" w:bidi="ar-SA"/>
-          <w14:ligatures w14:val="standardContextual"/>
-        </w:rPr>
-        <w:tab/>
-      </w:r>
-      <w:r>
-        <w:rPr>
-          <w:rFonts w:asciiTheme="minorHAnsi" w:eastAsiaTheme="minorHAnsi" w:hAnsiTheme="minorHAnsi" w:cstheme="minorHAnsi"/>
-          <w:b/>
-          <w:kern w:val="2"/>
+          <w:sz w:val="28"/>
+          <w:szCs w:val="28"/>
           <w:lang w:val="en-IN" w:eastAsia="en-US" w:bidi="ar-SA"/>
           <w14:ligatures w14:val="standardContextual"/>
         </w:rPr>
@@ -989,6 +880,8 @@
           <w:rFonts w:asciiTheme="minorHAnsi" w:eastAsiaTheme="minorHAnsi" w:hAnsiTheme="minorHAnsi" w:cstheme="minorHAnsi"/>
           <w:b/>
           <w:kern w:val="2"/>
+          <w:sz w:val="28"/>
+          <w:szCs w:val="28"/>
           <w:lang w:val="en-IN" w:eastAsia="en-US" w:bidi="ar-SA"/>
           <w14:ligatures w14:val="standardContextual"/>
         </w:rPr>
@@ -999,6 +892,8 @@
           <w:rFonts w:asciiTheme="minorHAnsi" w:eastAsiaTheme="minorHAnsi" w:hAnsiTheme="minorHAnsi" w:cstheme="minorHAnsi"/>
           <w:b/>
           <w:kern w:val="2"/>
+          <w:sz w:val="28"/>
+          <w:szCs w:val="28"/>
           <w:lang w:val="en-IN" w:eastAsia="en-US" w:bidi="ar-SA"/>
           <w14:ligatures w14:val="standardContextual"/>
         </w:rPr>
@@ -1009,6 +904,8 @@
           <w:rFonts w:asciiTheme="minorHAnsi" w:eastAsiaTheme="minorHAnsi" w:hAnsiTheme="minorHAnsi" w:cstheme="minorHAnsi"/>
           <w:b/>
           <w:kern w:val="2"/>
+          <w:sz w:val="28"/>
+          <w:szCs w:val="28"/>
           <w:lang w:val="en-IN" w:eastAsia="en-US" w:bidi="ar-SA"/>
           <w14:ligatures w14:val="standardContextual"/>
         </w:rPr>
@@ -1027,33 +924,18 @@
         <w:rPr>
           <w:rFonts w:asciiTheme="minorHAnsi" w:eastAsiaTheme="minorHAnsi" w:hAnsiTheme="minorHAnsi" w:cstheme="minorHAnsi"/>
           <w:kern w:val="2"/>
-          <w:sz w:val="22"/>
-          <w:szCs w:val="22"/>
-          <w:lang w:val="en-IN" w:eastAsia="en-US" w:bidi="ar-SA"/>
-          <w14:ligatures w14:val="standardContextual"/>
-        </w:rPr>
-      </w:pPr>
-      <w:r>
-        <w:rPr>
-          <w:rFonts w:asciiTheme="minorHAnsi" w:eastAsiaTheme="minorHAnsi" w:hAnsiTheme="minorHAnsi" w:cstheme="minorHAnsi"/>
-          <w:kern w:val="2"/>
-          <w:sz w:val="22"/>
-          <w:szCs w:val="22"/>
-          <w:lang w:val="en-IN" w:eastAsia="en-US" w:bidi="ar-SA"/>
-          <w14:ligatures w14:val="standardContextual"/>
-        </w:rPr>
-        <w:t>Took</w:t>
-      </w:r>
-      <w:r>
-        <w:rPr>
-          <w:rFonts w:asciiTheme="minorHAnsi" w:eastAsiaTheme="minorHAnsi" w:hAnsiTheme="minorHAnsi" w:cstheme="minorHAnsi"/>
-          <w:kern w:val="2"/>
-          <w:sz w:val="22"/>
-          <w:szCs w:val="22"/>
-          <w:lang w:val="en-IN" w:eastAsia="en-US" w:bidi="ar-SA"/>
-          <w14:ligatures w14:val="standardContextual"/>
-        </w:rPr>
-        <w:t xml:space="preserve"> </w:t>
+          <w:lang w:val="en-IN" w:eastAsia="en-US" w:bidi="ar-SA"/>
+          <w14:ligatures w14:val="standardContextual"/>
+        </w:rPr>
+      </w:pPr>
+      <w:r>
+        <w:rPr>
+          <w:rFonts w:asciiTheme="minorHAnsi" w:eastAsiaTheme="minorHAnsi" w:hAnsiTheme="minorHAnsi" w:cstheme="minorHAnsi"/>
+          <w:kern w:val="2"/>
+          <w:lang w:val="en-IN" w:eastAsia="en-US" w:bidi="ar-SA"/>
+          <w14:ligatures w14:val="standardContextual"/>
+        </w:rPr>
+        <w:t xml:space="preserve">Took </w:t>
       </w:r>
       <w:r>
         <w:rPr>
@@ -1061,8 +943,6 @@
           <w:b/>
           <w:bCs/>
           <w:kern w:val="2"/>
-          <w:sz w:val="22"/>
-          <w:szCs w:val="22"/>
           <w:lang w:val="en-IN" w:eastAsia="en-US" w:bidi="ar-SA"/>
           <w14:ligatures w14:val="standardContextual"/>
         </w:rPr>
@@ -1072,8 +952,6 @@
         <w:rPr>
           <w:rFonts w:asciiTheme="minorHAnsi" w:eastAsiaTheme="minorHAnsi" w:hAnsiTheme="minorHAnsi" w:cstheme="minorHAnsi"/>
           <w:kern w:val="2"/>
-          <w:sz w:val="22"/>
-          <w:szCs w:val="22"/>
           <w:lang w:val="en-IN" w:eastAsia="en-US" w:bidi="ar-SA"/>
           <w14:ligatures w14:val="standardContextual"/>
         </w:rPr>
@@ -1085,8 +963,6 @@
           <w:b/>
           <w:bCs/>
           <w:kern w:val="2"/>
-          <w:sz w:val="22"/>
-          <w:szCs w:val="22"/>
           <w:lang w:val="en-IN" w:eastAsia="en-US" w:bidi="ar-SA"/>
           <w14:ligatures w14:val="standardContextual"/>
         </w:rPr>
@@ -1096,8 +972,6 @@
         <w:rPr>
           <w:rFonts w:asciiTheme="minorHAnsi" w:eastAsiaTheme="minorHAnsi" w:hAnsiTheme="minorHAnsi" w:cstheme="minorHAnsi"/>
           <w:kern w:val="2"/>
-          <w:sz w:val="22"/>
-          <w:szCs w:val="22"/>
           <w:lang w:val="en-IN" w:eastAsia="en-US" w:bidi="ar-SA"/>
           <w14:ligatures w14:val="standardContextual"/>
         </w:rPr>
@@ -1109,8 +983,6 @@
           <w:b/>
           <w:bCs/>
           <w:kern w:val="2"/>
-          <w:sz w:val="22"/>
-          <w:szCs w:val="22"/>
           <w:lang w:val="en-IN" w:eastAsia="en-US" w:bidi="ar-SA"/>
           <w14:ligatures w14:val="standardContextual"/>
         </w:rPr>
@@ -1120,23 +992,10 @@
         <w:rPr>
           <w:rFonts w:asciiTheme="minorHAnsi" w:eastAsiaTheme="minorHAnsi" w:hAnsiTheme="minorHAnsi" w:cstheme="minorHAnsi"/>
           <w:kern w:val="2"/>
-          <w:sz w:val="22"/>
-          <w:szCs w:val="22"/>
-          <w:lang w:val="en-IN" w:eastAsia="en-US" w:bidi="ar-SA"/>
-          <w14:ligatures w14:val="standardContextual"/>
-        </w:rPr>
-        <w:t xml:space="preserve"> for KPI monitoring, log exploration, and pattern analysis</w:t>
-      </w:r>
-      <w:r>
-        <w:rPr>
-          <w:rFonts w:asciiTheme="minorHAnsi" w:eastAsiaTheme="minorHAnsi" w:hAnsiTheme="minorHAnsi" w:cstheme="minorHAnsi"/>
-          <w:kern w:val="2"/>
-          <w:sz w:val="22"/>
-          <w:szCs w:val="22"/>
-          <w:lang w:val="en-IN" w:eastAsia="en-US" w:bidi="ar-SA"/>
-          <w14:ligatures w14:val="standardContextual"/>
-        </w:rPr>
-        <w:t xml:space="preserve">; </w:t>
+          <w:lang w:val="en-IN" w:eastAsia="en-US" w:bidi="ar-SA"/>
+          <w14:ligatures w14:val="standardContextual"/>
+        </w:rPr>
+        <w:t xml:space="preserve"> for KPI monitoring, log exploration, and pattern analysis; </w:t>
       </w:r>
       <w:r>
         <w:rPr>
@@ -1144,8 +1003,6 @@
           <w:b/>
           <w:bCs/>
           <w:kern w:val="2"/>
-          <w:sz w:val="22"/>
-          <w:szCs w:val="22"/>
           <w:lang w:val="en-IN" w:eastAsia="en-US" w:bidi="ar-SA"/>
           <w14:ligatures w14:val="standardContextual"/>
         </w:rPr>
@@ -1155,8 +1012,6 @@
         <w:rPr>
           <w:rFonts w:asciiTheme="minorHAnsi" w:eastAsiaTheme="minorHAnsi" w:hAnsiTheme="minorHAnsi" w:cstheme="minorHAnsi"/>
           <w:kern w:val="2"/>
-          <w:sz w:val="22"/>
-          <w:szCs w:val="22"/>
           <w:lang w:val="en-IN" w:eastAsia="en-US" w:bidi="ar-SA"/>
           <w14:ligatures w14:val="standardContextual"/>
         </w:rPr>
@@ -1175,8 +1030,6 @@
         <w:rPr>
           <w:rFonts w:asciiTheme="minorHAnsi" w:eastAsiaTheme="minorHAnsi" w:hAnsiTheme="minorHAnsi" w:cstheme="minorHAnsi"/>
           <w:kern w:val="2"/>
-          <w:sz w:val="22"/>
-          <w:szCs w:val="22"/>
           <w:lang w:val="en-IN" w:eastAsia="en-US" w:bidi="ar-SA"/>
           <w14:ligatures w14:val="standardContextual"/>
         </w:rPr>
@@ -1187,8 +1040,6 @@
           <w:b/>
           <w:bCs/>
           <w:kern w:val="2"/>
-          <w:sz w:val="22"/>
-          <w:szCs w:val="22"/>
           <w:lang w:val="en-IN" w:eastAsia="en-US" w:bidi="ar-SA"/>
           <w14:ligatures w14:val="standardContextual"/>
         </w:rPr>
@@ -1198,8 +1049,6 @@
         <w:rPr>
           <w:rFonts w:asciiTheme="minorHAnsi" w:eastAsiaTheme="minorHAnsi" w:hAnsiTheme="minorHAnsi" w:cstheme="minorHAnsi"/>
           <w:kern w:val="2"/>
-          <w:sz w:val="22"/>
-          <w:szCs w:val="22"/>
           <w:lang w:val="en-IN" w:eastAsia="en-US" w:bidi="ar-SA"/>
           <w14:ligatures w14:val="standardContextual"/>
         </w:rPr>
@@ -1211,8 +1060,6 @@
           <w:b/>
           <w:bCs/>
           <w:kern w:val="2"/>
-          <w:sz w:val="22"/>
-          <w:szCs w:val="22"/>
           <w:lang w:val="en-IN" w:eastAsia="en-US" w:bidi="ar-SA"/>
           <w14:ligatures w14:val="standardContextual"/>
         </w:rPr>
@@ -1222,34 +1069,10 @@
         <w:rPr>
           <w:rFonts w:asciiTheme="minorHAnsi" w:eastAsiaTheme="minorHAnsi" w:hAnsiTheme="minorHAnsi" w:cstheme="minorHAnsi"/>
           <w:kern w:val="2"/>
-          <w:sz w:val="22"/>
-          <w:szCs w:val="22"/>
-          <w:lang w:val="en-IN" w:eastAsia="en-US" w:bidi="ar-SA"/>
-          <w14:ligatures w14:val="standardContextual"/>
-        </w:rPr>
-        <w:t xml:space="preserve"> </w:t>
-      </w:r>
-      <w:r>
-        <w:rPr>
-          <w:rFonts w:asciiTheme="minorHAnsi" w:eastAsiaTheme="minorHAnsi" w:hAnsiTheme="minorHAnsi" w:cstheme="minorHAnsi"/>
-          <w:kern w:val="2"/>
-          <w:sz w:val="22"/>
-          <w:szCs w:val="22"/>
-          <w:lang w:val="en-IN" w:eastAsia="en-US" w:bidi="ar-SA"/>
-          <w14:ligatures w14:val="standardContextual"/>
-        </w:rPr>
-        <w:t>framework</w:t>
-      </w:r>
-      <w:r>
-        <w:rPr>
-          <w:rFonts w:asciiTheme="minorHAnsi" w:eastAsiaTheme="minorHAnsi" w:hAnsiTheme="minorHAnsi" w:cstheme="minorHAnsi"/>
-          <w:kern w:val="2"/>
-          <w:sz w:val="22"/>
-          <w:szCs w:val="22"/>
-          <w:lang w:val="en-IN" w:eastAsia="en-US" w:bidi="ar-SA"/>
-          <w14:ligatures w14:val="standardContextual"/>
-        </w:rPr>
-        <w:t xml:space="preserve"> in </w:t>
+          <w:lang w:val="en-IN" w:eastAsia="en-US" w:bidi="ar-SA"/>
+          <w14:ligatures w14:val="standardContextual"/>
+        </w:rPr>
+        <w:t xml:space="preserve"> framework in </w:t>
       </w:r>
       <w:r>
         <w:rPr>
@@ -1257,8 +1080,6 @@
           <w:b/>
           <w:bCs/>
           <w:kern w:val="2"/>
-          <w:sz w:val="22"/>
-          <w:szCs w:val="22"/>
           <w:lang w:val="en-IN" w:eastAsia="en-US" w:bidi="ar-SA"/>
           <w14:ligatures w14:val="standardContextual"/>
         </w:rPr>
@@ -1268,45 +1089,10 @@
         <w:rPr>
           <w:rFonts w:asciiTheme="minorHAnsi" w:eastAsiaTheme="minorHAnsi" w:hAnsiTheme="minorHAnsi" w:cstheme="minorHAnsi"/>
           <w:kern w:val="2"/>
-          <w:sz w:val="22"/>
-          <w:szCs w:val="22"/>
-          <w:lang w:val="en-IN" w:eastAsia="en-US" w:bidi="ar-SA"/>
-          <w14:ligatures w14:val="standardContextual"/>
-        </w:rPr>
-        <w:t xml:space="preserve"> (Blob → Event stream/hub → Lakehouse</w:t>
-      </w:r>
-      <w:r>
-        <w:rPr>
-          <w:rFonts w:asciiTheme="minorHAnsi" w:eastAsiaTheme="minorHAnsi" w:hAnsiTheme="minorHAnsi" w:cstheme="minorHAnsi"/>
-          <w:kern w:val="2"/>
-          <w:sz w:val="22"/>
-          <w:szCs w:val="22"/>
-          <w:lang w:val="en-IN" w:eastAsia="en-US" w:bidi="ar-SA"/>
-          <w14:ligatures w14:val="standardContextual"/>
-        </w:rPr>
-        <w:t>/Warehouse/Eventhouse</w:t>
-      </w:r>
-      <w:r>
-        <w:rPr>
-          <w:rFonts w:asciiTheme="minorHAnsi" w:eastAsiaTheme="minorHAnsi" w:hAnsiTheme="minorHAnsi" w:cstheme="minorHAnsi"/>
-          <w:kern w:val="2"/>
-          <w:sz w:val="22"/>
-          <w:szCs w:val="22"/>
-          <w:lang w:val="en-IN" w:eastAsia="en-US" w:bidi="ar-SA"/>
-          <w14:ligatures w14:val="standardContextual"/>
-        </w:rPr>
-        <w:t xml:space="preserve">), </w:t>
-      </w:r>
-      <w:r>
-        <w:rPr>
-          <w:rFonts w:asciiTheme="minorHAnsi" w:eastAsiaTheme="minorHAnsi" w:hAnsiTheme="minorHAnsi" w:cstheme="minorHAnsi"/>
-          <w:kern w:val="2"/>
-          <w:sz w:val="22"/>
-          <w:szCs w:val="22"/>
-          <w:lang w:val="en-IN" w:eastAsia="en-US" w:bidi="ar-SA"/>
-          <w14:ligatures w14:val="standardContextual"/>
-        </w:rPr>
-        <w:t xml:space="preserve">supporting </w:t>
+          <w:lang w:val="en-IN" w:eastAsia="en-US" w:bidi="ar-SA"/>
+          <w14:ligatures w14:val="standardContextual"/>
+        </w:rPr>
+        <w:t xml:space="preserve"> (Blob → Event stream/hub → Warehouse/Eventhouse), supporting </w:t>
       </w:r>
       <w:r>
         <w:rPr>
@@ -1314,58 +1100,15 @@
           <w:b/>
           <w:bCs/>
           <w:kern w:val="2"/>
-          <w:sz w:val="22"/>
-          <w:szCs w:val="22"/>
-          <w:lang w:val="en-IN" w:eastAsia="en-US" w:bidi="ar-SA"/>
-          <w14:ligatures w14:val="standardContextual"/>
-        </w:rPr>
-        <w:t>30+ GB</w:t>
-      </w:r>
-      <w:r>
-        <w:rPr>
-          <w:rFonts w:asciiTheme="minorHAnsi" w:eastAsiaTheme="minorHAnsi" w:hAnsiTheme="minorHAnsi" w:cstheme="minorHAnsi"/>
-          <w:b/>
-          <w:bCs/>
-          <w:kern w:val="2"/>
-          <w:sz w:val="22"/>
-          <w:szCs w:val="22"/>
-          <w:lang w:val="en-IN" w:eastAsia="en-US" w:bidi="ar-SA"/>
-          <w14:ligatures w14:val="standardContextual"/>
-        </w:rPr>
-        <w:t xml:space="preserve"> (5</w:t>
-      </w:r>
-      <w:r>
-        <w:rPr>
-          <w:rFonts w:asciiTheme="minorHAnsi" w:eastAsiaTheme="minorHAnsi" w:hAnsiTheme="minorHAnsi" w:cstheme="minorHAnsi"/>
-          <w:b/>
-          <w:bCs/>
-          <w:kern w:val="2"/>
-          <w:sz w:val="22"/>
-          <w:szCs w:val="22"/>
-          <w:lang w:val="en-IN" w:eastAsia="en-US" w:bidi="ar-SA"/>
-          <w14:ligatures w14:val="standardContextual"/>
-        </w:rPr>
-        <w:t>M+</w:t>
-      </w:r>
-      <w:r>
-        <w:rPr>
-          <w:rFonts w:asciiTheme="minorHAnsi" w:eastAsiaTheme="minorHAnsi" w:hAnsiTheme="minorHAnsi" w:cstheme="minorHAnsi"/>
-          <w:b/>
-          <w:bCs/>
-          <w:kern w:val="2"/>
-          <w:sz w:val="22"/>
-          <w:szCs w:val="22"/>
-          <w:lang w:val="en-IN" w:eastAsia="en-US" w:bidi="ar-SA"/>
-          <w14:ligatures w14:val="standardContextual"/>
-        </w:rPr>
-        <w:t xml:space="preserve"> events)</w:t>
-      </w:r>
-      <w:r>
-        <w:rPr>
-          <w:rFonts w:asciiTheme="minorHAnsi" w:eastAsiaTheme="minorHAnsi" w:hAnsiTheme="minorHAnsi" w:cstheme="minorHAnsi"/>
-          <w:kern w:val="2"/>
-          <w:sz w:val="22"/>
-          <w:szCs w:val="22"/>
+          <w:lang w:val="en-IN" w:eastAsia="en-US" w:bidi="ar-SA"/>
+          <w14:ligatures w14:val="standardContextual"/>
+        </w:rPr>
+        <w:t>30+ GB (5M+ events)</w:t>
+      </w:r>
+      <w:r>
+        <w:rPr>
+          <w:rFonts w:asciiTheme="minorHAnsi" w:eastAsiaTheme="minorHAnsi" w:hAnsiTheme="minorHAnsi" w:cstheme="minorHAnsi"/>
+          <w:kern w:val="2"/>
           <w:lang w:val="en-IN" w:eastAsia="en-US" w:bidi="ar-SA"/>
           <w14:ligatures w14:val="standardContextual"/>
         </w:rPr>
@@ -1384,8 +1127,6 @@
         <w:rPr>
           <w:rFonts w:asciiTheme="minorHAnsi" w:eastAsiaTheme="minorHAnsi" w:hAnsiTheme="minorHAnsi" w:cstheme="minorHAnsi"/>
           <w:kern w:val="2"/>
-          <w:sz w:val="22"/>
-          <w:szCs w:val="22"/>
           <w:lang w:val="en-IN" w:eastAsia="en-US" w:bidi="ar-SA"/>
           <w14:ligatures w14:val="standardContextual"/>
         </w:rPr>
@@ -1396,8 +1137,6 @@
           <w:b/>
           <w:bCs/>
           <w:kern w:val="2"/>
-          <w:sz w:val="22"/>
-          <w:szCs w:val="22"/>
           <w:lang w:val="en-IN" w:eastAsia="en-US" w:bidi="ar-SA"/>
           <w14:ligatures w14:val="standardContextual"/>
         </w:rPr>
@@ -1407,8 +1146,6 @@
         <w:rPr>
           <w:rFonts w:asciiTheme="minorHAnsi" w:eastAsiaTheme="minorHAnsi" w:hAnsiTheme="minorHAnsi" w:cstheme="minorHAnsi"/>
           <w:kern w:val="2"/>
-          <w:sz w:val="22"/>
-          <w:szCs w:val="22"/>
           <w:lang w:val="en-IN" w:eastAsia="en-US" w:bidi="ar-SA"/>
           <w14:ligatures w14:val="standardContextual"/>
         </w:rPr>
@@ -1420,8 +1157,6 @@
           <w:b/>
           <w:bCs/>
           <w:kern w:val="2"/>
-          <w:sz w:val="22"/>
-          <w:szCs w:val="22"/>
           <w:lang w:val="en-IN" w:eastAsia="en-US" w:bidi="ar-SA"/>
           <w14:ligatures w14:val="standardContextual"/>
         </w:rPr>
@@ -1431,8 +1166,6 @@
         <w:rPr>
           <w:rFonts w:asciiTheme="minorHAnsi" w:eastAsiaTheme="minorHAnsi" w:hAnsiTheme="minorHAnsi" w:cstheme="minorHAnsi"/>
           <w:kern w:val="2"/>
-          <w:sz w:val="22"/>
-          <w:szCs w:val="22"/>
           <w:lang w:val="en-IN" w:eastAsia="en-US" w:bidi="ar-SA"/>
           <w14:ligatures w14:val="standardContextual"/>
         </w:rPr>
@@ -1444,8 +1177,6 @@
           <w:b/>
           <w:bCs/>
           <w:kern w:val="2"/>
-          <w:sz w:val="22"/>
-          <w:szCs w:val="22"/>
           <w:lang w:val="en-IN" w:eastAsia="en-US" w:bidi="ar-SA"/>
           <w14:ligatures w14:val="standardContextual"/>
         </w:rPr>
@@ -1455,8 +1186,6 @@
         <w:rPr>
           <w:rFonts w:asciiTheme="minorHAnsi" w:eastAsiaTheme="minorHAnsi" w:hAnsiTheme="minorHAnsi" w:cstheme="minorHAnsi"/>
           <w:kern w:val="2"/>
-          <w:sz w:val="22"/>
-          <w:szCs w:val="22"/>
           <w:lang w:val="en-IN" w:eastAsia="en-US" w:bidi="ar-SA"/>
           <w14:ligatures w14:val="standardContextual"/>
         </w:rPr>
@@ -1468,8 +1197,6 @@
           <w:b/>
           <w:bCs/>
           <w:kern w:val="2"/>
-          <w:sz w:val="22"/>
-          <w:szCs w:val="22"/>
           <w:lang w:val="en-IN" w:eastAsia="en-US" w:bidi="ar-SA"/>
           <w14:ligatures w14:val="standardContextual"/>
         </w:rPr>
@@ -1479,8 +1206,6 @@
         <w:rPr>
           <w:rFonts w:asciiTheme="minorHAnsi" w:eastAsiaTheme="minorHAnsi" w:hAnsiTheme="minorHAnsi" w:cstheme="minorHAnsi"/>
           <w:kern w:val="2"/>
-          <w:sz w:val="22"/>
-          <w:szCs w:val="22"/>
           <w:lang w:val="en-IN" w:eastAsia="en-US" w:bidi="ar-SA"/>
           <w14:ligatures w14:val="standardContextual"/>
         </w:rPr>
@@ -1499,8 +1224,6 @@
         <w:rPr>
           <w:rFonts w:asciiTheme="minorHAnsi" w:eastAsiaTheme="minorHAnsi" w:hAnsiTheme="minorHAnsi" w:cstheme="minorHAnsi"/>
           <w:kern w:val="2"/>
-          <w:sz w:val="22"/>
-          <w:szCs w:val="22"/>
           <w:lang w:val="en-IN" w:eastAsia="en-US" w:bidi="ar-SA"/>
           <w14:ligatures w14:val="standardContextual"/>
         </w:rPr>
@@ -1511,8 +1234,6 @@
           <w:b/>
           <w:bCs/>
           <w:kern w:val="2"/>
-          <w:sz w:val="22"/>
-          <w:szCs w:val="22"/>
           <w:lang w:val="en-IN" w:eastAsia="en-US" w:bidi="ar-SA"/>
           <w14:ligatures w14:val="standardContextual"/>
         </w:rPr>
@@ -1522,8 +1243,6 @@
         <w:rPr>
           <w:rFonts w:asciiTheme="minorHAnsi" w:eastAsiaTheme="minorHAnsi" w:hAnsiTheme="minorHAnsi" w:cstheme="minorHAnsi"/>
           <w:kern w:val="2"/>
-          <w:sz w:val="22"/>
-          <w:szCs w:val="22"/>
           <w:lang w:val="en-IN" w:eastAsia="en-US" w:bidi="ar-SA"/>
           <w14:ligatures w14:val="standardContextual"/>
         </w:rPr>
@@ -1535,8 +1254,6 @@
           <w:b/>
           <w:bCs/>
           <w:kern w:val="2"/>
-          <w:sz w:val="22"/>
-          <w:szCs w:val="22"/>
           <w:lang w:val="en-IN" w:eastAsia="en-US" w:bidi="ar-SA"/>
           <w14:ligatures w14:val="standardContextual"/>
         </w:rPr>
@@ -1546,34 +1263,10 @@
         <w:rPr>
           <w:rFonts w:asciiTheme="minorHAnsi" w:eastAsiaTheme="minorHAnsi" w:hAnsiTheme="minorHAnsi" w:cstheme="minorHAnsi"/>
           <w:kern w:val="2"/>
-          <w:sz w:val="22"/>
-          <w:szCs w:val="22"/>
-          <w:lang w:val="en-IN" w:eastAsia="en-US" w:bidi="ar-SA"/>
-          <w14:ligatures w14:val="standardContextual"/>
-        </w:rPr>
-        <w:t xml:space="preserve"> </w:t>
-      </w:r>
-      <w:r>
-        <w:rPr>
-          <w:rFonts w:asciiTheme="minorHAnsi" w:eastAsiaTheme="minorHAnsi" w:hAnsiTheme="minorHAnsi" w:cstheme="minorHAnsi"/>
-          <w:kern w:val="2"/>
-          <w:sz w:val="22"/>
-          <w:szCs w:val="22"/>
-          <w:lang w:val="en-IN" w:eastAsia="en-US" w:bidi="ar-SA"/>
-          <w14:ligatures w14:val="standardContextual"/>
-        </w:rPr>
-        <w:t>partial-run handling</w:t>
-      </w:r>
-      <w:r>
-        <w:rPr>
-          <w:rFonts w:asciiTheme="minorHAnsi" w:eastAsiaTheme="minorHAnsi" w:hAnsiTheme="minorHAnsi" w:cstheme="minorHAnsi"/>
-          <w:kern w:val="2"/>
-          <w:sz w:val="22"/>
-          <w:szCs w:val="22"/>
-          <w:lang w:val="en-IN" w:eastAsia="en-US" w:bidi="ar-SA"/>
-          <w14:ligatures w14:val="standardContextual"/>
-        </w:rPr>
-        <w:t xml:space="preserve"> (late/partial/complete arrivals) with </w:t>
+          <w:lang w:val="en-IN" w:eastAsia="en-US" w:bidi="ar-SA"/>
+          <w14:ligatures w14:val="standardContextual"/>
+        </w:rPr>
+        <w:t xml:space="preserve"> partial-run handling (late/partial/complete arrivals) with </w:t>
       </w:r>
       <w:r>
         <w:rPr>
@@ -1581,8 +1274,6 @@
           <w:b/>
           <w:bCs/>
           <w:kern w:val="2"/>
-          <w:sz w:val="22"/>
-          <w:szCs w:val="22"/>
           <w:lang w:val="en-IN" w:eastAsia="en-US" w:bidi="ar-SA"/>
           <w14:ligatures w14:val="standardContextual"/>
         </w:rPr>
@@ -1592,8 +1283,6 @@
         <w:rPr>
           <w:rFonts w:asciiTheme="minorHAnsi" w:eastAsiaTheme="minorHAnsi" w:hAnsiTheme="minorHAnsi" w:cstheme="minorHAnsi"/>
           <w:kern w:val="2"/>
-          <w:sz w:val="22"/>
-          <w:szCs w:val="22"/>
           <w:lang w:val="en-IN" w:eastAsia="en-US" w:bidi="ar-SA"/>
           <w14:ligatures w14:val="standardContextual"/>
         </w:rPr>
@@ -1605,8 +1294,6 @@
           <w:b/>
           <w:bCs/>
           <w:kern w:val="2"/>
-          <w:sz w:val="22"/>
-          <w:szCs w:val="22"/>
           <w:lang w:val="en-IN" w:eastAsia="en-US" w:bidi="ar-SA"/>
           <w14:ligatures w14:val="standardContextual"/>
         </w:rPr>
@@ -1616,8 +1303,6 @@
         <w:rPr>
           <w:rFonts w:asciiTheme="minorHAnsi" w:eastAsiaTheme="minorHAnsi" w:hAnsiTheme="minorHAnsi" w:cstheme="minorHAnsi"/>
           <w:kern w:val="2"/>
-          <w:sz w:val="22"/>
-          <w:szCs w:val="22"/>
           <w:lang w:val="en-IN" w:eastAsia="en-US" w:bidi="ar-SA"/>
           <w14:ligatures w14:val="standardContextual"/>
         </w:rPr>
@@ -1636,8 +1321,6 @@
         <w:rPr>
           <w:rFonts w:asciiTheme="minorHAnsi" w:eastAsiaTheme="minorHAnsi" w:hAnsiTheme="minorHAnsi" w:cstheme="minorHAnsi"/>
           <w:kern w:val="2"/>
-          <w:sz w:val="22"/>
-          <w:szCs w:val="22"/>
           <w:lang w:val="en-IN" w:eastAsia="en-US" w:bidi="ar-SA"/>
           <w14:ligatures w14:val="standardContextual"/>
         </w:rPr>
@@ -1648,8 +1331,6 @@
           <w:b/>
           <w:bCs/>
           <w:kern w:val="2"/>
-          <w:sz w:val="22"/>
-          <w:szCs w:val="22"/>
           <w:lang w:val="en-IN" w:eastAsia="en-US" w:bidi="ar-SA"/>
           <w14:ligatures w14:val="standardContextual"/>
         </w:rPr>
@@ -1659,8 +1340,6 @@
         <w:rPr>
           <w:rFonts w:asciiTheme="minorHAnsi" w:eastAsiaTheme="minorHAnsi" w:hAnsiTheme="minorHAnsi" w:cstheme="minorHAnsi"/>
           <w:kern w:val="2"/>
-          <w:sz w:val="22"/>
-          <w:szCs w:val="22"/>
           <w:lang w:val="en-IN" w:eastAsia="en-US" w:bidi="ar-SA"/>
           <w14:ligatures w14:val="standardContextual"/>
         </w:rPr>
@@ -1672,8 +1351,6 @@
           <w:b/>
           <w:bCs/>
           <w:kern w:val="2"/>
-          <w:sz w:val="22"/>
-          <w:szCs w:val="22"/>
           <w:lang w:val="en-IN" w:eastAsia="en-US" w:bidi="ar-SA"/>
           <w14:ligatures w14:val="standardContextual"/>
         </w:rPr>
@@ -1683,34 +1360,10 @@
         <w:rPr>
           <w:rFonts w:asciiTheme="minorHAnsi" w:eastAsiaTheme="minorHAnsi" w:hAnsiTheme="minorHAnsi" w:cstheme="minorHAnsi"/>
           <w:kern w:val="2"/>
-          <w:sz w:val="22"/>
-          <w:szCs w:val="22"/>
-          <w:lang w:val="en-IN" w:eastAsia="en-US" w:bidi="ar-SA"/>
-          <w14:ligatures w14:val="standardContextual"/>
-        </w:rPr>
-        <w:t xml:space="preserve"> (partitioning, broadcast joins, shuffle reduction</w:t>
-      </w:r>
-      <w:r>
-        <w:rPr>
-          <w:rFonts w:asciiTheme="minorHAnsi" w:eastAsiaTheme="minorHAnsi" w:hAnsiTheme="minorHAnsi" w:cstheme="minorHAnsi"/>
-          <w:kern w:val="2"/>
-          <w:sz w:val="22"/>
-          <w:szCs w:val="22"/>
-          <w:lang w:val="en-IN" w:eastAsia="en-US" w:bidi="ar-SA"/>
-          <w14:ligatures w14:val="standardContextual"/>
-        </w:rPr>
-        <w:t>, handling data skew</w:t>
-      </w:r>
-      <w:r>
-        <w:rPr>
-          <w:rFonts w:asciiTheme="minorHAnsi" w:eastAsiaTheme="minorHAnsi" w:hAnsiTheme="minorHAnsi" w:cstheme="minorHAnsi"/>
-          <w:kern w:val="2"/>
-          <w:sz w:val="22"/>
-          <w:szCs w:val="22"/>
-          <w:lang w:val="en-IN" w:eastAsia="en-US" w:bidi="ar-SA"/>
-          <w14:ligatures w14:val="standardContextual"/>
-        </w:rPr>
-        <w:t xml:space="preserve">); cut backfill time by </w:t>
+          <w:lang w:val="en-IN" w:eastAsia="en-US" w:bidi="ar-SA"/>
+          <w14:ligatures w14:val="standardContextual"/>
+        </w:rPr>
+        <w:t xml:space="preserve"> (partitioning, broadcast joins, shuffle reduction, handling data skew); cut backfill time by </w:t>
       </w:r>
       <w:r>
         <w:rPr>
@@ -1718,8 +1371,6 @@
           <w:b/>
           <w:bCs/>
           <w:kern w:val="2"/>
-          <w:sz w:val="22"/>
-          <w:szCs w:val="22"/>
           <w:lang w:val="en-IN" w:eastAsia="en-US" w:bidi="ar-SA"/>
           <w14:ligatures w14:val="standardContextual"/>
         </w:rPr>
@@ -1729,8 +1380,6 @@
         <w:rPr>
           <w:rFonts w:asciiTheme="minorHAnsi" w:eastAsiaTheme="minorHAnsi" w:hAnsiTheme="minorHAnsi" w:cstheme="minorHAnsi"/>
           <w:kern w:val="2"/>
-          <w:sz w:val="22"/>
-          <w:szCs w:val="22"/>
           <w:lang w:val="en-IN" w:eastAsia="en-US" w:bidi="ar-SA"/>
           <w14:ligatures w14:val="standardContextual"/>
         </w:rPr>
@@ -1742,8 +1391,6 @@
           <w:b/>
           <w:bCs/>
           <w:kern w:val="2"/>
-          <w:sz w:val="22"/>
-          <w:szCs w:val="22"/>
           <w:lang w:val="en-IN" w:eastAsia="en-US" w:bidi="ar-SA"/>
           <w14:ligatures w14:val="standardContextual"/>
         </w:rPr>
@@ -1753,8 +1400,6 @@
         <w:rPr>
           <w:rFonts w:asciiTheme="minorHAnsi" w:eastAsiaTheme="minorHAnsi" w:hAnsiTheme="minorHAnsi" w:cstheme="minorHAnsi"/>
           <w:kern w:val="2"/>
-          <w:sz w:val="22"/>
-          <w:szCs w:val="22"/>
           <w:lang w:val="en-IN" w:eastAsia="en-US" w:bidi="ar-SA"/>
           <w14:ligatures w14:val="standardContextual"/>
         </w:rPr>
@@ -1773,18 +1418,14 @@
         <w:rPr>
           <w:rFonts w:asciiTheme="minorHAnsi" w:eastAsiaTheme="minorHAnsi" w:hAnsiTheme="minorHAnsi" w:cstheme="minorHAnsi"/>
           <w:kern w:val="2"/>
-          <w:sz w:val="22"/>
-          <w:szCs w:val="22"/>
-          <w:lang w:val="en-IN" w:eastAsia="en-US" w:bidi="ar-SA"/>
-          <w14:ligatures w14:val="standardContextual"/>
-        </w:rPr>
-      </w:pPr>
-      <w:r>
-        <w:rPr>
-          <w:rFonts w:asciiTheme="minorHAnsi" w:eastAsiaTheme="minorHAnsi" w:hAnsiTheme="minorHAnsi" w:cstheme="minorHAnsi"/>
-          <w:kern w:val="2"/>
-          <w:sz w:val="22"/>
-          <w:szCs w:val="22"/>
+          <w:lang w:val="en-IN" w:eastAsia="en-US" w:bidi="ar-SA"/>
+          <w14:ligatures w14:val="standardContextual"/>
+        </w:rPr>
+      </w:pPr>
+      <w:r>
+        <w:rPr>
+          <w:rFonts w:asciiTheme="minorHAnsi" w:eastAsiaTheme="minorHAnsi" w:hAnsiTheme="minorHAnsi" w:cstheme="minorHAnsi"/>
+          <w:kern w:val="2"/>
           <w:lang w:val="en-IN" w:eastAsia="en-US" w:bidi="ar-SA"/>
           <w14:ligatures w14:val="standardContextual"/>
         </w:rPr>
@@ -1796,8 +1437,6 @@
           <w:b/>
           <w:bCs/>
           <w:kern w:val="2"/>
-          <w:sz w:val="22"/>
-          <w:szCs w:val="22"/>
           <w:lang w:val="en-IN" w:eastAsia="en-US" w:bidi="ar-SA"/>
           <w14:ligatures w14:val="standardContextual"/>
         </w:rPr>
@@ -1807,8 +1446,6 @@
         <w:rPr>
           <w:rFonts w:asciiTheme="minorHAnsi" w:eastAsiaTheme="minorHAnsi" w:hAnsiTheme="minorHAnsi" w:cstheme="minorHAnsi"/>
           <w:kern w:val="2"/>
-          <w:sz w:val="22"/>
-          <w:szCs w:val="22"/>
           <w:lang w:val="en-IN" w:eastAsia="en-US" w:bidi="ar-SA"/>
           <w14:ligatures w14:val="standardContextual"/>
         </w:rPr>
@@ -1820,8 +1457,6 @@
           <w:b/>
           <w:bCs/>
           <w:kern w:val="2"/>
-          <w:sz w:val="22"/>
-          <w:szCs w:val="22"/>
           <w:lang w:val="en-IN" w:eastAsia="en-US" w:bidi="ar-SA"/>
           <w14:ligatures w14:val="standardContextual"/>
         </w:rPr>
@@ -1831,8 +1466,6 @@
         <w:rPr>
           <w:rFonts w:asciiTheme="minorHAnsi" w:eastAsiaTheme="minorHAnsi" w:hAnsiTheme="minorHAnsi" w:cstheme="minorHAnsi"/>
           <w:kern w:val="2"/>
-          <w:sz w:val="22"/>
-          <w:szCs w:val="22"/>
           <w:lang w:val="en-IN" w:eastAsia="en-US" w:bidi="ar-SA"/>
           <w14:ligatures w14:val="standardContextual"/>
         </w:rPr>
@@ -1844,8 +1477,6 @@
           <w:b/>
           <w:bCs/>
           <w:kern w:val="2"/>
-          <w:sz w:val="22"/>
-          <w:szCs w:val="22"/>
           <w:lang w:val="en-IN" w:eastAsia="en-US" w:bidi="ar-SA"/>
           <w14:ligatures w14:val="standardContextual"/>
         </w:rPr>
@@ -1855,34 +1486,10 @@
         <w:rPr>
           <w:rFonts w:asciiTheme="minorHAnsi" w:eastAsiaTheme="minorHAnsi" w:hAnsiTheme="minorHAnsi" w:cstheme="minorHAnsi"/>
           <w:kern w:val="2"/>
-          <w:sz w:val="22"/>
-          <w:szCs w:val="22"/>
-          <w:lang w:val="en-IN" w:eastAsia="en-US" w:bidi="ar-SA"/>
-          <w14:ligatures w14:val="standardContextual"/>
-        </w:rPr>
-        <w:t>, to support data quality checks, test generation, validation</w:t>
-      </w:r>
-      <w:r>
-        <w:rPr>
-          <w:rFonts w:asciiTheme="minorHAnsi" w:eastAsiaTheme="minorHAnsi" w:hAnsiTheme="minorHAnsi" w:cstheme="minorHAnsi"/>
-          <w:kern w:val="2"/>
-          <w:sz w:val="22"/>
-          <w:szCs w:val="22"/>
-          <w:lang w:val="en-IN" w:eastAsia="en-US" w:bidi="ar-SA"/>
-          <w14:ligatures w14:val="standardContextual"/>
-        </w:rPr>
-        <w:t>, spec-driven development</w:t>
-      </w:r>
-      <w:r>
-        <w:rPr>
-          <w:rFonts w:asciiTheme="minorHAnsi" w:eastAsiaTheme="minorHAnsi" w:hAnsiTheme="minorHAnsi" w:cstheme="minorHAnsi"/>
-          <w:kern w:val="2"/>
-          <w:sz w:val="22"/>
-          <w:szCs w:val="22"/>
-          <w:lang w:val="en-IN" w:eastAsia="en-US" w:bidi="ar-SA"/>
-          <w14:ligatures w14:val="standardContextual"/>
-        </w:rPr>
-        <w:t>.</w:t>
+          <w:lang w:val="en-IN" w:eastAsia="en-US" w:bidi="ar-SA"/>
+          <w14:ligatures w14:val="standardContextual"/>
+        </w:rPr>
+        <w:t>, to support data quality checks, test generation, validation, spec-driven development.</w:t>
       </w:r>
     </w:p>
     <w:p>
@@ -1897,8 +1504,6 @@
         <w:rPr>
           <w:rFonts w:asciiTheme="minorHAnsi" w:eastAsiaTheme="minorHAnsi" w:hAnsiTheme="minorHAnsi" w:cstheme="minorHAnsi"/>
           <w:kern w:val="2"/>
-          <w:sz w:val="22"/>
-          <w:szCs w:val="22"/>
           <w:lang w:val="en-IN" w:eastAsia="en-US" w:bidi="ar-SA"/>
           <w14:ligatures w14:val="standardContextual"/>
         </w:rPr>
@@ -1909,8 +1514,6 @@
           <w:b/>
           <w:bCs/>
           <w:kern w:val="2"/>
-          <w:sz w:val="22"/>
-          <w:szCs w:val="22"/>
           <w:lang w:val="en-IN" w:eastAsia="en-US" w:bidi="ar-SA"/>
           <w14:ligatures w14:val="standardContextual"/>
         </w:rPr>
@@ -1920,8 +1523,6 @@
         <w:rPr>
           <w:rFonts w:asciiTheme="minorHAnsi" w:eastAsiaTheme="minorHAnsi" w:hAnsiTheme="minorHAnsi" w:cstheme="minorHAnsi"/>
           <w:kern w:val="2"/>
-          <w:sz w:val="22"/>
-          <w:szCs w:val="22"/>
           <w:lang w:val="en-IN" w:eastAsia="en-US" w:bidi="ar-SA"/>
           <w14:ligatures w14:val="standardContextual"/>
         </w:rPr>
@@ -1933,8 +1534,6 @@
           <w:b/>
           <w:bCs/>
           <w:kern w:val="2"/>
-          <w:sz w:val="22"/>
-          <w:szCs w:val="22"/>
           <w:lang w:val="en-IN" w:eastAsia="en-US" w:bidi="ar-SA"/>
           <w14:ligatures w14:val="standardContextual"/>
         </w:rPr>
@@ -1944,8 +1543,6 @@
         <w:rPr>
           <w:rFonts w:asciiTheme="minorHAnsi" w:eastAsiaTheme="minorHAnsi" w:hAnsiTheme="minorHAnsi" w:cstheme="minorHAnsi"/>
           <w:kern w:val="2"/>
-          <w:sz w:val="22"/>
-          <w:szCs w:val="22"/>
           <w:lang w:val="en-IN" w:eastAsia="en-US" w:bidi="ar-SA"/>
           <w14:ligatures w14:val="standardContextual"/>
         </w:rPr>
@@ -1957,8 +1554,6 @@
           <w:b/>
           <w:bCs/>
           <w:kern w:val="2"/>
-          <w:sz w:val="22"/>
-          <w:szCs w:val="22"/>
           <w:lang w:val="en-IN" w:eastAsia="en-US" w:bidi="ar-SA"/>
           <w14:ligatures w14:val="standardContextual"/>
         </w:rPr>
@@ -1968,8 +1563,6 @@
         <w:rPr>
           <w:rFonts w:asciiTheme="minorHAnsi" w:eastAsiaTheme="minorHAnsi" w:hAnsiTheme="minorHAnsi" w:cstheme="minorHAnsi"/>
           <w:kern w:val="2"/>
-          <w:sz w:val="22"/>
-          <w:szCs w:val="22"/>
           <w:lang w:val="en-IN" w:eastAsia="en-US" w:bidi="ar-SA"/>
           <w14:ligatures w14:val="standardContextual"/>
         </w:rPr>
@@ -1981,12 +1574,19 @@
           <w:b/>
           <w:bCs/>
           <w:kern w:val="2"/>
-          <w:sz w:val="22"/>
-          <w:szCs w:val="22"/>
-          <w:lang w:val="en-IN" w:eastAsia="en-US" w:bidi="ar-SA"/>
-          <w14:ligatures w14:val="standardContextual"/>
-        </w:rPr>
-        <w:t>driving</w:t>
+          <w:lang w:val="en-IN" w:eastAsia="en-US" w:bidi="ar-SA"/>
+          <w14:ligatures w14:val="standardContextual"/>
+        </w:rPr>
+        <w:t>driving end-to-end delivery</w:t>
+      </w:r>
+      <w:r>
+        <w:rPr>
+          <w:rFonts w:asciiTheme="minorHAnsi" w:eastAsiaTheme="minorHAnsi" w:hAnsiTheme="minorHAnsi" w:cstheme="minorHAnsi"/>
+          <w:kern w:val="2"/>
+          <w:lang w:val="en-IN" w:eastAsia="en-US" w:bidi="ar-SA"/>
+          <w14:ligatures w14:val="standardContextual"/>
+        </w:rPr>
+        <w:t xml:space="preserve"> of features/data</w:t>
       </w:r>
       <w:r>
         <w:rPr>
@@ -1994,56 +1594,6 @@
           <w:b/>
           <w:bCs/>
           <w:kern w:val="2"/>
-          <w:sz w:val="22"/>
-          <w:szCs w:val="22"/>
-          <w:lang w:val="en-IN" w:eastAsia="en-US" w:bidi="ar-SA"/>
-          <w14:ligatures w14:val="standardContextual"/>
-        </w:rPr>
-        <w:t xml:space="preserve"> end-to-end</w:t>
-      </w:r>
-      <w:r>
-        <w:rPr>
-          <w:rFonts w:asciiTheme="minorHAnsi" w:eastAsiaTheme="minorHAnsi" w:hAnsiTheme="minorHAnsi" w:cstheme="minorHAnsi"/>
-          <w:b/>
-          <w:bCs/>
-          <w:kern w:val="2"/>
-          <w:sz w:val="22"/>
-          <w:szCs w:val="22"/>
-          <w:lang w:val="en-IN" w:eastAsia="en-US" w:bidi="ar-SA"/>
-          <w14:ligatures w14:val="standardContextual"/>
-        </w:rPr>
-        <w:t xml:space="preserve"> delivery</w:t>
-      </w:r>
-      <w:r>
-        <w:rPr>
-          <w:rFonts w:asciiTheme="minorHAnsi" w:eastAsiaTheme="minorHAnsi" w:hAnsiTheme="minorHAnsi" w:cstheme="minorHAnsi"/>
-          <w:kern w:val="2"/>
-          <w:sz w:val="22"/>
-          <w:szCs w:val="22"/>
-          <w:lang w:val="en-IN" w:eastAsia="en-US" w:bidi="ar-SA"/>
-          <w14:ligatures w14:val="standardContextual"/>
-        </w:rPr>
-        <w:t xml:space="preserve"> of features</w:t>
-      </w:r>
-      <w:r>
-        <w:rPr>
-          <w:rFonts w:asciiTheme="minorHAnsi" w:eastAsiaTheme="minorHAnsi" w:hAnsiTheme="minorHAnsi" w:cstheme="minorHAnsi"/>
-          <w:kern w:val="2"/>
-          <w:sz w:val="22"/>
-          <w:szCs w:val="22"/>
-          <w:lang w:val="en-IN" w:eastAsia="en-US" w:bidi="ar-SA"/>
-          <w14:ligatures w14:val="standardContextual"/>
-        </w:rPr>
-        <w:t>/data</w:t>
-      </w:r>
-      <w:r>
-        <w:rPr>
-          <w:rFonts w:asciiTheme="minorHAnsi" w:eastAsiaTheme="minorHAnsi" w:hAnsiTheme="minorHAnsi" w:cstheme="minorHAnsi"/>
-          <w:b/>
-          <w:bCs/>
-          <w:kern w:val="2"/>
-          <w:sz w:val="22"/>
-          <w:szCs w:val="22"/>
           <w:lang w:val="en-IN" w:eastAsia="en-US" w:bidi="ar-SA"/>
           <w14:ligatures w14:val="standardContextual"/>
         </w:rPr>
@@ -2059,342 +1609,8 @@
         <w:rPr>
           <w:rFonts w:asciiTheme="minorHAnsi" w:eastAsiaTheme="minorHAnsi" w:hAnsiTheme="minorHAnsi" w:cstheme="minorHAnsi"/>
           <w:kern w:val="2"/>
-          <w:sz w:val="22"/>
-          <w:szCs w:val="22"/>
-          <w:lang w:val="en-IN" w:eastAsia="en-US" w:bidi="ar-SA"/>
-          <w14:ligatures w14:val="standardContextual"/>
-        </w:rPr>
-      </w:pPr>
-    </w:p>
-    <w:p>
-      <w:pPr>
-        <w:pStyle w:val="LO-normal"/>
-        <w:ind w:left="-397" w:right="-397"/>
-        <w:jc w:val="both"/>
-        <w:rPr>
-          <w:rFonts w:asciiTheme="minorHAnsi" w:eastAsiaTheme="minorHAnsi" w:hAnsiTheme="minorHAnsi" w:cstheme="minorHAnsi"/>
-          <w:b/>
-          <w:kern w:val="2"/>
-          <w:lang w:val="en-IN" w:eastAsia="en-US" w:bidi="ar-SA"/>
-          <w14:ligatures w14:val="standardContextual"/>
-        </w:rPr>
-      </w:pPr>
-      <w:r>
-        <w:rPr>
-          <w:rFonts w:asciiTheme="minorHAnsi" w:eastAsiaTheme="minorHAnsi" w:hAnsiTheme="minorHAnsi" w:cstheme="minorHAnsi"/>
-          <w:b/>
-          <w:kern w:val="2"/>
-          <w:lang w:val="en-IN" w:eastAsia="en-US" w:bidi="ar-SA"/>
-          <w14:ligatures w14:val="standardContextual"/>
-        </w:rPr>
-        <w:t>Software Engineer, Nextsavy Technologies</w:t>
-      </w:r>
-      <w:r>
-        <w:rPr>
-          <w:rFonts w:asciiTheme="minorHAnsi" w:eastAsiaTheme="minorHAnsi" w:hAnsiTheme="minorHAnsi" w:cstheme="minorHAnsi"/>
-          <w:b/>
-          <w:kern w:val="2"/>
-          <w:lang w:val="en-IN" w:eastAsia="en-US" w:bidi="ar-SA"/>
-          <w14:ligatures w14:val="standardContextual"/>
-        </w:rPr>
-        <w:tab/>
-      </w:r>
-      <w:r>
-        <w:rPr>
-          <w:rFonts w:asciiTheme="minorHAnsi" w:eastAsiaTheme="minorHAnsi" w:hAnsiTheme="minorHAnsi" w:cstheme="minorHAnsi"/>
-          <w:b/>
-          <w:kern w:val="2"/>
-          <w:lang w:val="en-IN" w:eastAsia="en-US" w:bidi="ar-SA"/>
-          <w14:ligatures w14:val="standardContextual"/>
-        </w:rPr>
-        <w:tab/>
-      </w:r>
-      <w:r>
-        <w:rPr>
-          <w:rFonts w:asciiTheme="minorHAnsi" w:eastAsiaTheme="minorHAnsi" w:hAnsiTheme="minorHAnsi" w:cstheme="minorHAnsi"/>
-          <w:b/>
-          <w:kern w:val="2"/>
-          <w:lang w:val="en-IN" w:eastAsia="en-US" w:bidi="ar-SA"/>
-          <w14:ligatures w14:val="standardContextual"/>
-        </w:rPr>
-        <w:tab/>
-      </w:r>
-      <w:r>
-        <w:rPr>
-          <w:rFonts w:asciiTheme="minorHAnsi" w:eastAsiaTheme="minorHAnsi" w:hAnsiTheme="minorHAnsi" w:cstheme="minorHAnsi"/>
-          <w:b/>
-          <w:kern w:val="2"/>
-          <w:lang w:val="en-IN" w:eastAsia="en-US" w:bidi="ar-SA"/>
-          <w14:ligatures w14:val="standardContextual"/>
-        </w:rPr>
-        <w:tab/>
-      </w:r>
-      <w:r>
-        <w:rPr>
-          <w:rFonts w:asciiTheme="minorHAnsi" w:eastAsiaTheme="minorHAnsi" w:hAnsiTheme="minorHAnsi" w:cstheme="minorHAnsi"/>
-          <w:b/>
-          <w:kern w:val="2"/>
-          <w:lang w:val="en-IN" w:eastAsia="en-US" w:bidi="ar-SA"/>
-          <w14:ligatures w14:val="standardContextual"/>
-        </w:rPr>
-        <w:tab/>
-        <w:t xml:space="preserve">            September</w:t>
-      </w:r>
-      <w:r>
-        <w:rPr>
-          <w:rFonts w:asciiTheme="minorHAnsi" w:eastAsiaTheme="minorHAnsi" w:hAnsiTheme="minorHAnsi" w:cstheme="minorHAnsi"/>
-          <w:b/>
-          <w:kern w:val="2"/>
-          <w:lang w:val="en-IN" w:eastAsia="en-US" w:bidi="ar-SA"/>
-          <w14:ligatures w14:val="standardContextual"/>
-        </w:rPr>
-        <w:t xml:space="preserve"> 2020</w:t>
-      </w:r>
-      <w:r>
-        <w:rPr>
-          <w:rFonts w:asciiTheme="minorHAnsi" w:eastAsiaTheme="minorHAnsi" w:hAnsiTheme="minorHAnsi" w:cstheme="minorHAnsi"/>
-          <w:b/>
-          <w:kern w:val="2"/>
-          <w:lang w:val="en-IN" w:eastAsia="en-US" w:bidi="ar-SA"/>
-          <w14:ligatures w14:val="standardContextual"/>
-        </w:rPr>
-        <w:t xml:space="preserve"> - </w:t>
-      </w:r>
-      <w:r>
-        <w:rPr>
-          <w:rFonts w:asciiTheme="minorHAnsi" w:eastAsiaTheme="minorHAnsi" w:hAnsiTheme="minorHAnsi" w:cstheme="minorHAnsi"/>
-          <w:b/>
-          <w:kern w:val="2"/>
-          <w:lang w:val="en-IN" w:eastAsia="en-US" w:bidi="ar-SA"/>
-          <w14:ligatures w14:val="standardContextual"/>
-        </w:rPr>
-        <w:t>August 2022</w:t>
-      </w:r>
-    </w:p>
-    <w:p>
-      <w:pPr>
-        <w:pStyle w:val="LO-normal"/>
-        <w:numPr>
-          <w:ilvl w:val="0"/>
-          <w:numId w:val="32"/>
-        </w:numPr>
-        <w:ind w:left="0" w:right="-397"/>
-        <w:jc w:val="both"/>
-        <w:rPr>
-          <w:rFonts w:asciiTheme="minorHAnsi" w:eastAsiaTheme="minorHAnsi" w:hAnsiTheme="minorHAnsi" w:cstheme="minorHAnsi"/>
-          <w:kern w:val="2"/>
-          <w:sz w:val="22"/>
-          <w:szCs w:val="22"/>
-          <w:lang w:val="en-IN" w:eastAsia="en-US" w:bidi="ar-SA"/>
-          <w14:ligatures w14:val="standardContextual"/>
-        </w:rPr>
-      </w:pPr>
-      <w:r>
-        <w:rPr>
-          <w:rFonts w:asciiTheme="minorHAnsi" w:eastAsiaTheme="minorHAnsi" w:hAnsiTheme="minorHAnsi" w:cstheme="minorHAnsi"/>
-          <w:kern w:val="2"/>
-          <w:sz w:val="22"/>
-          <w:szCs w:val="22"/>
-          <w:lang w:val="en-IN" w:eastAsia="en-US" w:bidi="ar-SA"/>
-          <w14:ligatures w14:val="standardContextual"/>
-        </w:rPr>
-        <w:t xml:space="preserve">Built </w:t>
-      </w:r>
-      <w:r>
-        <w:rPr>
-          <w:rFonts w:asciiTheme="minorHAnsi" w:eastAsiaTheme="minorHAnsi" w:hAnsiTheme="minorHAnsi" w:cstheme="minorHAnsi"/>
-          <w:b/>
-          <w:bCs/>
-          <w:kern w:val="2"/>
-          <w:sz w:val="22"/>
-          <w:szCs w:val="22"/>
-          <w:lang w:val="en-IN" w:eastAsia="en-US" w:bidi="ar-SA"/>
-          <w14:ligatures w14:val="standardContextual"/>
-        </w:rPr>
-        <w:t>Azure Databricks pipelines</w:t>
-      </w:r>
-      <w:r>
-        <w:rPr>
-          <w:rFonts w:asciiTheme="minorHAnsi" w:eastAsiaTheme="minorHAnsi" w:hAnsiTheme="minorHAnsi" w:cstheme="minorHAnsi"/>
-          <w:kern w:val="2"/>
-          <w:sz w:val="22"/>
-          <w:szCs w:val="22"/>
-          <w:lang w:val="en-IN" w:eastAsia="en-US" w:bidi="ar-SA"/>
-          <w14:ligatures w14:val="standardContextual"/>
-        </w:rPr>
-        <w:t xml:space="preserve"> for mobility data using </w:t>
-      </w:r>
-      <w:r>
-        <w:rPr>
-          <w:rFonts w:asciiTheme="minorHAnsi" w:eastAsiaTheme="minorHAnsi" w:hAnsiTheme="minorHAnsi" w:cstheme="minorHAnsi"/>
-          <w:b/>
-          <w:bCs/>
-          <w:kern w:val="2"/>
-          <w:sz w:val="22"/>
-          <w:szCs w:val="22"/>
-          <w:lang w:val="en-IN" w:eastAsia="en-US" w:bidi="ar-SA"/>
-          <w14:ligatures w14:val="standardContextual"/>
-        </w:rPr>
-        <w:t>ADF, PySpark, Delta Lake</w:t>
-      </w:r>
-      <w:r>
-        <w:rPr>
-          <w:rFonts w:asciiTheme="minorHAnsi" w:eastAsiaTheme="minorHAnsi" w:hAnsiTheme="minorHAnsi" w:cstheme="minorHAnsi"/>
-          <w:kern w:val="2"/>
-          <w:sz w:val="22"/>
-          <w:szCs w:val="22"/>
-          <w:lang w:val="en-IN" w:eastAsia="en-US" w:bidi="ar-SA"/>
-          <w14:ligatures w14:val="standardContextual"/>
-        </w:rPr>
-        <w:t xml:space="preserve">, incremental loads, schema enforcement, and bad-record quarantine, </w:t>
-      </w:r>
-      <w:r>
-        <w:rPr>
-          <w:rFonts w:asciiTheme="minorHAnsi" w:eastAsiaTheme="minorHAnsi" w:hAnsiTheme="minorHAnsi" w:cstheme="minorHAnsi"/>
-          <w:b/>
-          <w:bCs/>
-          <w:kern w:val="2"/>
-          <w:sz w:val="22"/>
-          <w:szCs w:val="22"/>
-          <w:lang w:val="en-IN" w:eastAsia="en-US" w:bidi="ar-SA"/>
-          <w14:ligatures w14:val="standardContextual"/>
-        </w:rPr>
-        <w:t>reducing reprocessing overhead by 60%</w:t>
-      </w:r>
-      <w:r>
-        <w:rPr>
-          <w:rFonts w:asciiTheme="minorHAnsi" w:eastAsiaTheme="minorHAnsi" w:hAnsiTheme="minorHAnsi" w:cstheme="minorHAnsi"/>
-          <w:kern w:val="2"/>
-          <w:sz w:val="22"/>
-          <w:szCs w:val="22"/>
-          <w:lang w:val="en-IN" w:eastAsia="en-US" w:bidi="ar-SA"/>
-          <w14:ligatures w14:val="standardContextual"/>
-        </w:rPr>
-        <w:t>.</w:t>
-      </w:r>
-    </w:p>
-    <w:p>
-      <w:pPr>
-        <w:pStyle w:val="LO-normal"/>
-        <w:numPr>
-          <w:ilvl w:val="0"/>
-          <w:numId w:val="32"/>
-        </w:numPr>
-        <w:ind w:left="0" w:right="-397"/>
-        <w:jc w:val="both"/>
-        <w:rPr>
-          <w:rFonts w:asciiTheme="minorHAnsi" w:eastAsiaTheme="minorHAnsi" w:hAnsiTheme="minorHAnsi" w:cstheme="minorHAnsi"/>
-          <w:kern w:val="2"/>
-          <w:sz w:val="22"/>
-          <w:szCs w:val="22"/>
-          <w:lang w:val="en-IN" w:eastAsia="en-US" w:bidi="ar-SA"/>
-          <w14:ligatures w14:val="standardContextual"/>
-        </w:rPr>
-      </w:pPr>
-      <w:r>
-        <w:rPr>
-          <w:rFonts w:asciiTheme="minorHAnsi" w:eastAsiaTheme="minorHAnsi" w:hAnsiTheme="minorHAnsi" w:cstheme="minorHAnsi"/>
-          <w:kern w:val="2"/>
-          <w:sz w:val="22"/>
-          <w:szCs w:val="22"/>
-          <w:lang w:val="en-IN" w:eastAsia="en-US" w:bidi="ar-SA"/>
-          <w14:ligatures w14:val="standardContextual"/>
-        </w:rPr>
-        <w:t xml:space="preserve">Developed </w:t>
-      </w:r>
-      <w:r>
-        <w:rPr>
-          <w:rFonts w:asciiTheme="minorHAnsi" w:eastAsiaTheme="minorHAnsi" w:hAnsiTheme="minorHAnsi" w:cstheme="minorHAnsi"/>
-          <w:b/>
-          <w:bCs/>
-          <w:kern w:val="2"/>
-          <w:sz w:val="22"/>
-          <w:szCs w:val="22"/>
-          <w:lang w:val="en-IN" w:eastAsia="en-US" w:bidi="ar-SA"/>
-          <w14:ligatures w14:val="standardContextual"/>
-        </w:rPr>
-        <w:t>Snowflake dimensional marts</w:t>
-      </w:r>
-      <w:r>
-        <w:rPr>
-          <w:rFonts w:asciiTheme="minorHAnsi" w:eastAsiaTheme="minorHAnsi" w:hAnsiTheme="minorHAnsi" w:cstheme="minorHAnsi"/>
-          <w:kern w:val="2"/>
-          <w:sz w:val="22"/>
-          <w:szCs w:val="22"/>
-          <w:lang w:val="en-IN" w:eastAsia="en-US" w:bidi="ar-SA"/>
-          <w14:ligatures w14:val="standardContextual"/>
-        </w:rPr>
-        <w:t xml:space="preserve"> with fact/dimension modeling, </w:t>
-      </w:r>
-      <w:r>
-        <w:rPr>
-          <w:rFonts w:asciiTheme="minorHAnsi" w:eastAsiaTheme="minorHAnsi" w:hAnsiTheme="minorHAnsi" w:cstheme="minorHAnsi"/>
-          <w:b/>
-          <w:bCs/>
-          <w:kern w:val="2"/>
-          <w:sz w:val="22"/>
-          <w:szCs w:val="22"/>
-          <w:lang w:val="en-IN" w:eastAsia="en-US" w:bidi="ar-SA"/>
-          <w14:ligatures w14:val="standardContextual"/>
-        </w:rPr>
-        <w:t>SCD handling</w:t>
-      </w:r>
-      <w:r>
-        <w:rPr>
-          <w:rFonts w:asciiTheme="minorHAnsi" w:eastAsiaTheme="minorHAnsi" w:hAnsiTheme="minorHAnsi" w:cstheme="minorHAnsi"/>
-          <w:kern w:val="2"/>
-          <w:sz w:val="22"/>
-          <w:szCs w:val="22"/>
-          <w:lang w:val="en-IN" w:eastAsia="en-US" w:bidi="ar-SA"/>
-          <w14:ligatures w14:val="standardContextual"/>
-        </w:rPr>
-        <w:t xml:space="preserve">, clustering, RBAC, and quality checks, </w:t>
-      </w:r>
-      <w:r>
-        <w:rPr>
-          <w:rFonts w:asciiTheme="minorHAnsi" w:eastAsiaTheme="minorHAnsi" w:hAnsiTheme="minorHAnsi" w:cstheme="minorHAnsi"/>
-          <w:b/>
-          <w:bCs/>
-          <w:kern w:val="2"/>
-          <w:sz w:val="22"/>
-          <w:szCs w:val="22"/>
-          <w:lang w:val="en-IN" w:eastAsia="en-US" w:bidi="ar-SA"/>
-          <w14:ligatures w14:val="standardContextual"/>
-        </w:rPr>
-        <w:t>improving BI query performance by 50%</w:t>
-      </w:r>
-      <w:r>
-        <w:rPr>
-          <w:rFonts w:asciiTheme="minorHAnsi" w:eastAsiaTheme="minorHAnsi" w:hAnsiTheme="minorHAnsi" w:cstheme="minorHAnsi"/>
-          <w:kern w:val="2"/>
-          <w:sz w:val="22"/>
-          <w:szCs w:val="22"/>
-          <w:lang w:val="en-IN" w:eastAsia="en-US" w:bidi="ar-SA"/>
-          <w14:ligatures w14:val="standardContextual"/>
-        </w:rPr>
-        <w:t xml:space="preserve"> for revenue, demand, and utilization reporting</w:t>
-      </w:r>
-      <w:r>
-        <w:rPr>
-          <w:rFonts w:asciiTheme="minorHAnsi" w:eastAsiaTheme="minorHAnsi" w:hAnsiTheme="minorHAnsi" w:cstheme="minorHAnsi"/>
-          <w:kern w:val="2"/>
-          <w:sz w:val="22"/>
-          <w:szCs w:val="22"/>
-          <w:lang w:val="en-IN" w:eastAsia="en-US" w:bidi="ar-SA"/>
-          <w14:ligatures w14:val="standardContextual"/>
-        </w:rPr>
-        <w:t>.</w:t>
-      </w:r>
-    </w:p>
-    <w:p>
-      <w:pPr>
-        <w:pStyle w:val="LO-normal"/>
-        <w:spacing w:line="120" w:lineRule="auto"/>
-        <w:ind w:right="-397"/>
-        <w:jc w:val="both"/>
-        <w:rPr>
-          <w:rFonts w:asciiTheme="minorHAnsi" w:eastAsiaTheme="minorHAnsi" w:hAnsiTheme="minorHAnsi" w:cstheme="minorHAnsi"/>
-          <w:kern w:val="2"/>
+          <w:sz w:val="28"/>
+          <w:szCs w:val="28"/>
           <w:lang w:val="en-IN" w:eastAsia="en-US" w:bidi="ar-SA"/>
           <w14:ligatures w14:val="standardContextual"/>
         </w:rPr>
@@ -2412,19 +1628,19 @@
           <w:rFonts w:asciiTheme="minorHAnsi" w:eastAsiaTheme="minorHAnsi" w:hAnsiTheme="minorHAnsi" w:cstheme="minorHAnsi"/>
           <w:b/>
           <w:kern w:val="2"/>
-          <w:sz w:val="28"/>
-          <w:szCs w:val="28"/>
-          <w:lang w:val="en-IN" w:eastAsia="en-US" w:bidi="ar-SA"/>
-          <w14:ligatures w14:val="standardContextual"/>
-        </w:rPr>
-      </w:pPr>
-      <w:r>
-        <w:rPr>
-          <w:rFonts w:asciiTheme="minorHAnsi" w:eastAsiaTheme="minorHAnsi" w:hAnsiTheme="minorHAnsi" w:cstheme="minorHAnsi"/>
-          <w:b/>
-          <w:kern w:val="2"/>
-          <w:sz w:val="28"/>
-          <w:szCs w:val="28"/>
+          <w:sz w:val="32"/>
+          <w:szCs w:val="32"/>
+          <w:lang w:val="en-IN" w:eastAsia="en-US" w:bidi="ar-SA"/>
+          <w14:ligatures w14:val="standardContextual"/>
+        </w:rPr>
+      </w:pPr>
+      <w:r>
+        <w:rPr>
+          <w:rFonts w:asciiTheme="minorHAnsi" w:eastAsiaTheme="minorHAnsi" w:hAnsiTheme="minorHAnsi" w:cstheme="minorHAnsi"/>
+          <w:b/>
+          <w:kern w:val="2"/>
+          <w:sz w:val="32"/>
+          <w:szCs w:val="32"/>
           <w:lang w:val="en-IN" w:eastAsia="en-US" w:bidi="ar-SA"/>
           <w14:ligatures w14:val="standardContextual"/>
         </w:rPr>
@@ -2435,8 +1651,8 @@
           <w:rFonts w:asciiTheme="minorHAnsi" w:eastAsiaTheme="minorHAnsi" w:hAnsiTheme="minorHAnsi" w:cstheme="minorHAnsi"/>
           <w:b/>
           <w:kern w:val="2"/>
-          <w:sz w:val="28"/>
-          <w:szCs w:val="28"/>
+          <w:sz w:val="32"/>
+          <w:szCs w:val="32"/>
           <w:lang w:val="en-IN" w:eastAsia="en-US" w:bidi="ar-SA"/>
           <w14:ligatures w14:val="standardContextual"/>
         </w:rPr>
@@ -2455,8 +1671,6 @@
         <w:rPr>
           <w:rFonts w:asciiTheme="minorHAnsi" w:eastAsiaTheme="minorHAnsi" w:hAnsiTheme="minorHAnsi" w:cstheme="minorHAnsi"/>
           <w:kern w:val="2"/>
-          <w:sz w:val="22"/>
-          <w:szCs w:val="22"/>
           <w:lang w:val="en-IN" w:eastAsia="en-US" w:bidi="ar-SA"/>
           <w14:ligatures w14:val="standardContextual"/>
         </w:rPr>
@@ -2467,32 +1681,15 @@
           <w:b/>
           <w:bCs/>
           <w:kern w:val="2"/>
-          <w:sz w:val="22"/>
-          <w:szCs w:val="22"/>
-          <w:lang w:val="en-IN" w:eastAsia="en-US" w:bidi="ar-SA"/>
-          <w14:ligatures w14:val="standardContextual"/>
-        </w:rPr>
-        <w:t>Languages</w:t>
-      </w:r>
-      <w:r>
-        <w:rPr>
-          <w:rFonts w:asciiTheme="minorHAnsi" w:eastAsiaTheme="minorHAnsi" w:hAnsiTheme="minorHAnsi" w:cstheme="minorHAnsi"/>
-          <w:b/>
-          <w:bCs/>
-          <w:kern w:val="2"/>
-          <w:sz w:val="22"/>
-          <w:szCs w:val="22"/>
-          <w:lang w:val="en-IN" w:eastAsia="en-US" w:bidi="ar-SA"/>
-          <w14:ligatures w14:val="standardContextual"/>
-        </w:rPr>
-        <w:t>:</w:t>
-      </w:r>
-      <w:r>
-        <w:rPr>
-          <w:rFonts w:asciiTheme="minorHAnsi" w:eastAsiaTheme="minorHAnsi" w:hAnsiTheme="minorHAnsi" w:cstheme="minorHAnsi"/>
-          <w:kern w:val="2"/>
-          <w:sz w:val="22"/>
-          <w:szCs w:val="22"/>
+          <w:lang w:val="en-IN" w:eastAsia="en-US" w:bidi="ar-SA"/>
+          <w14:ligatures w14:val="standardContextual"/>
+        </w:rPr>
+        <w:t>Languages:</w:t>
+      </w:r>
+      <w:r>
+        <w:rPr>
+          <w:rFonts w:asciiTheme="minorHAnsi" w:eastAsiaTheme="minorHAnsi" w:hAnsiTheme="minorHAnsi" w:cstheme="minorHAnsi"/>
+          <w:kern w:val="2"/>
           <w:lang w:val="en-IN" w:eastAsia="en-US" w:bidi="ar-SA"/>
           <w14:ligatures w14:val="standardContextual"/>
         </w:rPr>
@@ -2511,8 +1708,6 @@
         <w:rPr>
           <w:rFonts w:asciiTheme="minorHAnsi" w:eastAsiaTheme="minorHAnsi" w:hAnsiTheme="minorHAnsi" w:cstheme="minorHAnsi"/>
           <w:kern w:val="2"/>
-          <w:sz w:val="22"/>
-          <w:szCs w:val="22"/>
           <w:lang w:val="en-IN" w:eastAsia="en-US" w:bidi="ar-SA"/>
           <w14:ligatures w14:val="standardContextual"/>
         </w:rPr>
@@ -2523,135 +1718,19 @@
           <w:b/>
           <w:bCs/>
           <w:kern w:val="2"/>
-          <w:sz w:val="22"/>
-          <w:szCs w:val="22"/>
-          <w:lang w:val="en-IN" w:eastAsia="en-US" w:bidi="ar-SA"/>
-          <w14:ligatures w14:val="standardContextual"/>
-        </w:rPr>
-        <w:t>Data Engineering</w:t>
-      </w:r>
-      <w:r>
-        <w:rPr>
-          <w:rFonts w:asciiTheme="minorHAnsi" w:eastAsiaTheme="minorHAnsi" w:hAnsiTheme="minorHAnsi" w:cstheme="minorHAnsi"/>
-          <w:b/>
-          <w:bCs/>
-          <w:kern w:val="2"/>
-          <w:sz w:val="22"/>
-          <w:szCs w:val="22"/>
-          <w:lang w:val="en-IN" w:eastAsia="en-US" w:bidi="ar-SA"/>
-          <w14:ligatures w14:val="standardContextual"/>
-        </w:rPr>
-        <w:t>:</w:t>
-      </w:r>
-      <w:r>
-        <w:rPr>
-          <w:rFonts w:asciiTheme="minorHAnsi" w:eastAsiaTheme="minorHAnsi" w:hAnsiTheme="minorHAnsi" w:cstheme="minorHAnsi"/>
-          <w:kern w:val="2"/>
-          <w:sz w:val="22"/>
-          <w:szCs w:val="22"/>
-          <w:lang w:val="en-IN" w:eastAsia="en-US" w:bidi="ar-SA"/>
-          <w14:ligatures w14:val="standardContextual"/>
-        </w:rPr>
-        <w:t xml:space="preserve"> </w:t>
-      </w:r>
-      <w:r>
-        <w:rPr>
-          <w:rFonts w:asciiTheme="minorHAnsi" w:eastAsiaTheme="minorHAnsi" w:hAnsiTheme="minorHAnsi" w:cstheme="minorHAnsi"/>
-          <w:kern w:val="2"/>
-          <w:sz w:val="22"/>
-          <w:szCs w:val="22"/>
-          <w:lang w:val="en-IN" w:eastAsia="en-US" w:bidi="ar-SA"/>
-          <w14:ligatures w14:val="standardContextual"/>
-        </w:rPr>
-        <w:t xml:space="preserve">Apache </w:t>
-      </w:r>
-      <w:r>
-        <w:rPr>
-          <w:rFonts w:asciiTheme="minorHAnsi" w:eastAsiaTheme="minorHAnsi" w:hAnsiTheme="minorHAnsi" w:cstheme="minorHAnsi"/>
-          <w:kern w:val="2"/>
-          <w:sz w:val="22"/>
-          <w:szCs w:val="22"/>
-          <w:lang w:val="en-IN" w:eastAsia="en-US" w:bidi="ar-SA"/>
-          <w14:ligatures w14:val="standardContextual"/>
-        </w:rPr>
-        <w:t>Spark</w:t>
-      </w:r>
-      <w:r>
-        <w:rPr>
-          <w:rFonts w:asciiTheme="minorHAnsi" w:eastAsiaTheme="minorHAnsi" w:hAnsiTheme="minorHAnsi" w:cstheme="minorHAnsi"/>
-          <w:kern w:val="2"/>
-          <w:sz w:val="22"/>
-          <w:szCs w:val="22"/>
-          <w:lang w:val="en-IN" w:eastAsia="en-US" w:bidi="ar-SA"/>
-          <w14:ligatures w14:val="standardContextual"/>
-        </w:rPr>
-        <w:t xml:space="preserve">, </w:t>
-      </w:r>
-      <w:r>
-        <w:rPr>
-          <w:rFonts w:asciiTheme="minorHAnsi" w:eastAsiaTheme="minorHAnsi" w:hAnsiTheme="minorHAnsi" w:cstheme="minorHAnsi"/>
-          <w:kern w:val="2"/>
-          <w:sz w:val="22"/>
-          <w:szCs w:val="22"/>
-          <w:lang w:val="en-IN" w:eastAsia="en-US" w:bidi="ar-SA"/>
-          <w14:ligatures w14:val="standardContextual"/>
-        </w:rPr>
-        <w:t xml:space="preserve">Apache </w:t>
-      </w:r>
-      <w:r>
-        <w:rPr>
-          <w:rFonts w:asciiTheme="minorHAnsi" w:eastAsiaTheme="minorHAnsi" w:hAnsiTheme="minorHAnsi" w:cstheme="minorHAnsi"/>
-          <w:kern w:val="2"/>
-          <w:sz w:val="22"/>
-          <w:szCs w:val="22"/>
-          <w:lang w:val="en-IN" w:eastAsia="en-US" w:bidi="ar-SA"/>
-          <w14:ligatures w14:val="standardContextual"/>
-        </w:rPr>
-        <w:t>Airflow</w:t>
-      </w:r>
-      <w:r>
-        <w:rPr>
-          <w:rFonts w:asciiTheme="minorHAnsi" w:eastAsiaTheme="minorHAnsi" w:hAnsiTheme="minorHAnsi" w:cstheme="minorHAnsi"/>
-          <w:kern w:val="2"/>
-          <w:sz w:val="22"/>
-          <w:szCs w:val="22"/>
-          <w:lang w:val="en-IN" w:eastAsia="en-US" w:bidi="ar-SA"/>
-          <w14:ligatures w14:val="standardContextual"/>
-        </w:rPr>
-        <w:t xml:space="preserve">, Kafka, </w:t>
-      </w:r>
-      <w:r>
-        <w:rPr>
-          <w:rFonts w:asciiTheme="minorHAnsi" w:eastAsiaTheme="minorHAnsi" w:hAnsiTheme="minorHAnsi" w:cstheme="minorHAnsi"/>
-          <w:kern w:val="2"/>
-          <w:sz w:val="22"/>
-          <w:szCs w:val="22"/>
-          <w:lang w:val="en-IN" w:eastAsia="en-US" w:bidi="ar-SA"/>
-          <w14:ligatures w14:val="standardContextual"/>
-        </w:rPr>
-        <w:t>Batch and Real-time processing</w:t>
-      </w:r>
-      <w:r>
-        <w:rPr>
-          <w:rFonts w:asciiTheme="minorHAnsi" w:eastAsiaTheme="minorHAnsi" w:hAnsiTheme="minorHAnsi" w:cstheme="minorHAnsi"/>
-          <w:kern w:val="2"/>
-          <w:sz w:val="22"/>
-          <w:szCs w:val="22"/>
-          <w:lang w:val="en-IN" w:eastAsia="en-US" w:bidi="ar-SA"/>
-          <w14:ligatures w14:val="standardContextual"/>
-        </w:rPr>
-        <w:t xml:space="preserve">, </w:t>
-      </w:r>
-      <w:r>
-        <w:rPr>
-          <w:rFonts w:asciiTheme="minorHAnsi" w:eastAsiaTheme="minorHAnsi" w:hAnsiTheme="minorHAnsi" w:cstheme="minorHAnsi"/>
-          <w:kern w:val="2"/>
-          <w:sz w:val="22"/>
-          <w:szCs w:val="22"/>
-          <w:lang w:val="en-IN" w:eastAsia="en-US" w:bidi="ar-SA"/>
-          <w14:ligatures w14:val="standardContextual"/>
-        </w:rPr>
-        <w:t>Delta/Parquet</w:t>
+          <w:lang w:val="en-IN" w:eastAsia="en-US" w:bidi="ar-SA"/>
+          <w14:ligatures w14:val="standardContextual"/>
+        </w:rPr>
+        <w:t>Data Engineering:</w:t>
+      </w:r>
+      <w:r>
+        <w:rPr>
+          <w:rFonts w:asciiTheme="minorHAnsi" w:eastAsiaTheme="minorHAnsi" w:hAnsiTheme="minorHAnsi" w:cstheme="minorHAnsi"/>
+          <w:kern w:val="2"/>
+          <w:lang w:val="en-IN" w:eastAsia="en-US" w:bidi="ar-SA"/>
+          <w14:ligatures w14:val="standardContextual"/>
+        </w:rPr>
+        <w:t xml:space="preserve"> Apache Spark, Apache Airflow, Kafka, Batch and Real-time processing, Delta/Parquet</w:t>
       </w:r>
     </w:p>
     <w:p>
@@ -2666,8 +1745,6 @@
         <w:rPr>
           <w:rFonts w:asciiTheme="minorHAnsi" w:eastAsiaTheme="minorHAnsi" w:hAnsiTheme="minorHAnsi" w:cstheme="minorHAnsi"/>
           <w:kern w:val="2"/>
-          <w:sz w:val="22"/>
-          <w:szCs w:val="22"/>
           <w:lang w:val="en-IN" w:eastAsia="en-US" w:bidi="ar-SA"/>
           <w14:ligatures w14:val="standardContextual"/>
         </w:rPr>
@@ -2678,126 +1755,19 @@
           <w:b/>
           <w:bCs/>
           <w:kern w:val="2"/>
-          <w:sz w:val="22"/>
-          <w:szCs w:val="22"/>
-          <w:lang w:val="en-IN" w:eastAsia="en-US" w:bidi="ar-SA"/>
-          <w14:ligatures w14:val="standardContextual"/>
-        </w:rPr>
-        <w:t>Cloud</w:t>
-      </w:r>
-      <w:r>
-        <w:rPr>
-          <w:rFonts w:asciiTheme="minorHAnsi" w:eastAsiaTheme="minorHAnsi" w:hAnsiTheme="minorHAnsi" w:cstheme="minorHAnsi"/>
-          <w:b/>
-          <w:bCs/>
-          <w:kern w:val="2"/>
-          <w:sz w:val="22"/>
-          <w:szCs w:val="22"/>
-          <w:lang w:val="en-IN" w:eastAsia="en-US" w:bidi="ar-SA"/>
-          <w14:ligatures w14:val="standardContextual"/>
-        </w:rPr>
-        <w:t>/</w:t>
-      </w:r>
-      <w:r>
-        <w:rPr>
-          <w:rFonts w:asciiTheme="minorHAnsi" w:eastAsiaTheme="minorHAnsi" w:hAnsiTheme="minorHAnsi" w:cstheme="minorHAnsi"/>
-          <w:b/>
-          <w:bCs/>
-          <w:kern w:val="2"/>
-          <w:sz w:val="22"/>
-          <w:szCs w:val="22"/>
-          <w:lang w:val="en-IN" w:eastAsia="en-US" w:bidi="ar-SA"/>
-          <w14:ligatures w14:val="standardContextual"/>
-        </w:rPr>
-        <w:t>Data Platforms:</w:t>
-      </w:r>
-      <w:r>
-        <w:rPr>
-          <w:rFonts w:asciiTheme="minorHAnsi" w:eastAsiaTheme="minorHAnsi" w:hAnsiTheme="minorHAnsi" w:cstheme="minorHAnsi"/>
-          <w:kern w:val="2"/>
-          <w:sz w:val="22"/>
-          <w:szCs w:val="22"/>
-          <w:lang w:val="en-IN" w:eastAsia="en-US" w:bidi="ar-SA"/>
-          <w14:ligatures w14:val="standardContextual"/>
-        </w:rPr>
-        <w:t xml:space="preserve"> Microsoft Fabric, ADLS Gen2, ADF, Azure Synapse, Azure Functions, Databricks</w:t>
-      </w:r>
-      <w:r>
-        <w:rPr>
-          <w:rFonts w:asciiTheme="minorHAnsi" w:eastAsiaTheme="minorHAnsi" w:hAnsiTheme="minorHAnsi" w:cstheme="minorHAnsi"/>
-          <w:kern w:val="2"/>
-          <w:sz w:val="22"/>
-          <w:szCs w:val="22"/>
-          <w:lang w:val="en-IN" w:eastAsia="en-US" w:bidi="ar-SA"/>
-          <w14:ligatures w14:val="standardContextual"/>
-        </w:rPr>
-        <w:t>, Snowflake</w:t>
-      </w:r>
-      <w:r>
-        <w:rPr>
-          <w:rFonts w:asciiTheme="minorHAnsi" w:eastAsiaTheme="minorHAnsi" w:hAnsiTheme="minorHAnsi" w:cstheme="minorHAnsi"/>
-          <w:kern w:val="2"/>
-          <w:sz w:val="22"/>
-          <w:szCs w:val="22"/>
-          <w:lang w:val="en-IN" w:eastAsia="en-US" w:bidi="ar-SA"/>
-          <w14:ligatures w14:val="standardContextual"/>
-        </w:rPr>
-        <w:t>, OneLake</w:t>
-      </w:r>
-      <w:r>
-        <w:rPr>
-          <w:rFonts w:asciiTheme="minorHAnsi" w:eastAsiaTheme="minorHAnsi" w:hAnsiTheme="minorHAnsi" w:cstheme="minorHAnsi"/>
-          <w:kern w:val="2"/>
-          <w:sz w:val="22"/>
-          <w:szCs w:val="22"/>
-          <w:lang w:val="en-IN" w:eastAsia="en-US" w:bidi="ar-SA"/>
-          <w14:ligatures w14:val="standardContextual"/>
-        </w:rPr>
-        <w:t xml:space="preserve"> and </w:t>
-      </w:r>
-      <w:r>
-        <w:rPr>
-          <w:rFonts w:asciiTheme="minorHAnsi" w:eastAsiaTheme="minorHAnsi" w:hAnsiTheme="minorHAnsi" w:cstheme="minorHAnsi"/>
-          <w:kern w:val="2"/>
-          <w:sz w:val="22"/>
-          <w:szCs w:val="22"/>
-          <w:lang w:val="en-IN" w:eastAsia="en-US" w:bidi="ar-SA"/>
-          <w14:ligatures w14:val="standardContextual"/>
-        </w:rPr>
-        <w:t>Delta Lake concepts, Azure Storage/Blob, Events stream</w:t>
-      </w:r>
-      <w:r>
-        <w:rPr>
-          <w:rFonts w:asciiTheme="minorHAnsi" w:eastAsiaTheme="minorHAnsi" w:hAnsiTheme="minorHAnsi" w:cstheme="minorHAnsi"/>
-          <w:kern w:val="2"/>
-          <w:sz w:val="22"/>
-          <w:szCs w:val="22"/>
-          <w:lang w:val="en-IN" w:eastAsia="en-US" w:bidi="ar-SA"/>
-          <w14:ligatures w14:val="standardContextual"/>
-        </w:rPr>
-        <w:t>, Power BI</w:t>
-      </w:r>
-      <w:r>
-        <w:rPr>
-          <w:rFonts w:asciiTheme="minorHAnsi" w:eastAsiaTheme="minorHAnsi" w:hAnsiTheme="minorHAnsi" w:cstheme="minorHAnsi"/>
-          <w:kern w:val="2"/>
-          <w:sz w:val="22"/>
-          <w:szCs w:val="22"/>
-          <w:lang w:val="en-IN" w:eastAsia="en-US" w:bidi="ar-SA"/>
-          <w14:ligatures w14:val="standardContextual"/>
-        </w:rPr>
-        <w:t xml:space="preserve">, </w:t>
-      </w:r>
-      <w:r>
-        <w:rPr>
-          <w:rFonts w:asciiTheme="minorHAnsi" w:eastAsiaTheme="minorHAnsi" w:hAnsiTheme="minorHAnsi" w:cstheme="minorHAnsi"/>
-          <w:kern w:val="2"/>
-          <w:sz w:val="22"/>
-          <w:szCs w:val="22"/>
-          <w:lang w:val="en-IN" w:eastAsia="en-US" w:bidi="ar-SA"/>
-          <w14:ligatures w14:val="standardContextual"/>
-        </w:rPr>
-        <w:t>KQL/Eventhouse</w:t>
+          <w:lang w:val="en-IN" w:eastAsia="en-US" w:bidi="ar-SA"/>
+          <w14:ligatures w14:val="standardContextual"/>
+        </w:rPr>
+        <w:t>Cloud/Data Platforms:</w:t>
+      </w:r>
+      <w:r>
+        <w:rPr>
+          <w:rFonts w:asciiTheme="minorHAnsi" w:eastAsiaTheme="minorHAnsi" w:hAnsiTheme="minorHAnsi" w:cstheme="minorHAnsi"/>
+          <w:kern w:val="2"/>
+          <w:lang w:val="en-IN" w:eastAsia="en-US" w:bidi="ar-SA"/>
+          <w14:ligatures w14:val="standardContextual"/>
+        </w:rPr>
+        <w:t xml:space="preserve"> Microsoft Fabric, ADLS Gen2, ADF, Azure Synapse, Azure Functions, Databricks, OneLake and Delta Lake concepts, Azure Storage/Blob, Events stream, Power BI, KQL/Eventhouse</w:t>
       </w:r>
     </w:p>
     <w:p>
@@ -2812,8 +1782,6 @@
         <w:rPr>
           <w:rFonts w:asciiTheme="minorHAnsi" w:eastAsiaTheme="minorHAnsi" w:hAnsiTheme="minorHAnsi" w:cstheme="minorHAnsi"/>
           <w:kern w:val="2"/>
-          <w:sz w:val="22"/>
-          <w:szCs w:val="22"/>
           <w:lang w:val="en-IN" w:eastAsia="en-US" w:bidi="ar-SA"/>
           <w14:ligatures w14:val="standardContextual"/>
         </w:rPr>
@@ -2824,102 +1792,19 @@
           <w:b/>
           <w:bCs/>
           <w:kern w:val="2"/>
-          <w:sz w:val="22"/>
-          <w:szCs w:val="22"/>
-          <w:lang w:val="en-IN" w:eastAsia="en-US" w:bidi="ar-SA"/>
-          <w14:ligatures w14:val="standardContextual"/>
-        </w:rPr>
-        <w:t>Data Modeling</w:t>
-      </w:r>
-      <w:r>
-        <w:rPr>
-          <w:rFonts w:asciiTheme="minorHAnsi" w:eastAsiaTheme="minorHAnsi" w:hAnsiTheme="minorHAnsi" w:cstheme="minorHAnsi"/>
-          <w:b/>
-          <w:bCs/>
-          <w:kern w:val="2"/>
-          <w:sz w:val="22"/>
-          <w:szCs w:val="22"/>
-          <w:lang w:val="en-IN" w:eastAsia="en-US" w:bidi="ar-SA"/>
-          <w14:ligatures w14:val="standardContextual"/>
-        </w:rPr>
-        <w:t>:</w:t>
-      </w:r>
-      <w:r>
-        <w:rPr>
-          <w:rFonts w:asciiTheme="minorHAnsi" w:eastAsiaTheme="minorHAnsi" w:hAnsiTheme="minorHAnsi" w:cstheme="minorHAnsi"/>
-          <w:kern w:val="2"/>
-          <w:sz w:val="22"/>
-          <w:szCs w:val="22"/>
-          <w:lang w:val="en-IN" w:eastAsia="en-US" w:bidi="ar-SA"/>
-          <w14:ligatures w14:val="standardContextual"/>
-        </w:rPr>
-        <w:t xml:space="preserve"> Medallion</w:t>
-      </w:r>
-      <w:r>
-        <w:rPr>
-          <w:rFonts w:asciiTheme="minorHAnsi" w:eastAsiaTheme="minorHAnsi" w:hAnsiTheme="minorHAnsi" w:cstheme="minorHAnsi"/>
-          <w:kern w:val="2"/>
-          <w:sz w:val="22"/>
-          <w:szCs w:val="22"/>
-          <w:lang w:val="en-IN" w:eastAsia="en-US" w:bidi="ar-SA"/>
-          <w14:ligatures w14:val="standardContextual"/>
-        </w:rPr>
-        <w:t>/Lakehouse</w:t>
-      </w:r>
-      <w:r>
-        <w:rPr>
-          <w:rFonts w:asciiTheme="minorHAnsi" w:eastAsiaTheme="minorHAnsi" w:hAnsiTheme="minorHAnsi" w:cstheme="minorHAnsi"/>
-          <w:kern w:val="2"/>
-          <w:sz w:val="22"/>
-          <w:szCs w:val="22"/>
-          <w:lang w:val="en-IN" w:eastAsia="en-US" w:bidi="ar-SA"/>
-          <w14:ligatures w14:val="standardContextual"/>
-        </w:rPr>
-        <w:t xml:space="preserve"> Architecture, Star Schema, </w:t>
-      </w:r>
-      <w:r>
-        <w:rPr>
-          <w:rFonts w:asciiTheme="minorHAnsi" w:eastAsiaTheme="minorHAnsi" w:hAnsiTheme="minorHAnsi" w:cstheme="minorHAnsi"/>
-          <w:kern w:val="2"/>
-          <w:sz w:val="22"/>
-          <w:szCs w:val="22"/>
-          <w:lang w:val="en-IN" w:eastAsia="en-US" w:bidi="ar-SA"/>
-          <w14:ligatures w14:val="standardContextual"/>
-        </w:rPr>
-        <w:t>ELT/ETL</w:t>
-      </w:r>
-      <w:r>
-        <w:rPr>
-          <w:rFonts w:asciiTheme="minorHAnsi" w:eastAsiaTheme="minorHAnsi" w:hAnsiTheme="minorHAnsi" w:cstheme="minorHAnsi"/>
-          <w:kern w:val="2"/>
-          <w:sz w:val="22"/>
-          <w:szCs w:val="22"/>
-          <w:lang w:val="en-IN" w:eastAsia="en-US" w:bidi="ar-SA"/>
-          <w14:ligatures w14:val="standardContextual"/>
-        </w:rPr>
-        <w:t>, Indexing</w:t>
-      </w:r>
-      <w:r>
-        <w:rPr>
-          <w:rFonts w:asciiTheme="minorHAnsi" w:eastAsiaTheme="minorHAnsi" w:hAnsiTheme="minorHAnsi" w:cstheme="minorHAnsi"/>
-          <w:kern w:val="2"/>
-          <w:sz w:val="22"/>
-          <w:szCs w:val="22"/>
-          <w:lang w:val="en-IN" w:eastAsia="en-US" w:bidi="ar-SA"/>
-          <w14:ligatures w14:val="standardContextual"/>
-        </w:rPr>
-        <w:t xml:space="preserve">, </w:t>
-      </w:r>
-      <w:r>
-        <w:rPr>
-          <w:rFonts w:asciiTheme="minorHAnsi" w:eastAsiaTheme="minorHAnsi" w:hAnsiTheme="minorHAnsi" w:cstheme="minorHAnsi"/>
-          <w:kern w:val="2"/>
-          <w:sz w:val="22"/>
-          <w:szCs w:val="22"/>
-          <w:lang w:val="en-IN" w:eastAsia="en-US" w:bidi="ar-SA"/>
-          <w14:ligatures w14:val="standardContextual"/>
-        </w:rPr>
-        <w:t>Partition, Dimensional Modeling</w:t>
+          <w:lang w:val="en-IN" w:eastAsia="en-US" w:bidi="ar-SA"/>
+          <w14:ligatures w14:val="standardContextual"/>
+        </w:rPr>
+        <w:t>Data Modeling:</w:t>
+      </w:r>
+      <w:r>
+        <w:rPr>
+          <w:rFonts w:asciiTheme="minorHAnsi" w:eastAsiaTheme="minorHAnsi" w:hAnsiTheme="minorHAnsi" w:cstheme="minorHAnsi"/>
+          <w:kern w:val="2"/>
+          <w:lang w:val="en-IN" w:eastAsia="en-US" w:bidi="ar-SA"/>
+          <w14:ligatures w14:val="standardContextual"/>
+        </w:rPr>
+        <w:t xml:space="preserve"> Medallion/Lakehouse Architecture, Star Schema, ELT/ETL, Dimensional Modeling</w:t>
       </w:r>
     </w:p>
     <w:p>
@@ -2934,8 +1819,6 @@
         <w:rPr>
           <w:rFonts w:asciiTheme="minorHAnsi" w:eastAsiaTheme="minorHAnsi" w:hAnsiTheme="minorHAnsi" w:cstheme="minorHAnsi"/>
           <w:kern w:val="2"/>
-          <w:sz w:val="22"/>
-          <w:szCs w:val="22"/>
           <w:lang w:val="en-IN" w:eastAsia="en-US" w:bidi="ar-SA"/>
           <w14:ligatures w14:val="standardContextual"/>
         </w:rPr>
@@ -2946,8 +1829,6 @@
           <w:b/>
           <w:bCs/>
           <w:kern w:val="2"/>
-          <w:sz w:val="22"/>
-          <w:szCs w:val="22"/>
           <w:lang w:val="en-IN" w:eastAsia="en-US" w:bidi="ar-SA"/>
           <w14:ligatures w14:val="standardContextual"/>
         </w:rPr>
@@ -2957,23 +1838,10 @@
         <w:rPr>
           <w:rFonts w:asciiTheme="minorHAnsi" w:eastAsiaTheme="minorHAnsi" w:hAnsiTheme="minorHAnsi" w:cstheme="minorHAnsi"/>
           <w:kern w:val="2"/>
-          <w:sz w:val="22"/>
-          <w:szCs w:val="22"/>
-          <w:lang w:val="en-IN" w:eastAsia="en-US" w:bidi="ar-SA"/>
-          <w14:ligatures w14:val="standardContextual"/>
-        </w:rPr>
-        <w:t xml:space="preserve"> Validation Automation, Logging Frameworks, KPI Modeling</w:t>
-      </w:r>
-      <w:r>
-        <w:rPr>
-          <w:rFonts w:asciiTheme="minorHAnsi" w:eastAsiaTheme="minorHAnsi" w:hAnsiTheme="minorHAnsi" w:cstheme="minorHAnsi"/>
-          <w:kern w:val="2"/>
-          <w:sz w:val="22"/>
-          <w:szCs w:val="22"/>
-          <w:lang w:val="en-IN" w:eastAsia="en-US" w:bidi="ar-SA"/>
-          <w14:ligatures w14:val="standardContextual"/>
-        </w:rPr>
-        <w:t>, RBAC, Access Control</w:t>
+          <w:lang w:val="en-IN" w:eastAsia="en-US" w:bidi="ar-SA"/>
+          <w14:ligatures w14:val="standardContextual"/>
+        </w:rPr>
+        <w:t xml:space="preserve"> Validation Automation, Logging Frameworks, KPI Modeling, RBAC, Access Control</w:t>
       </w:r>
     </w:p>
     <w:p>
@@ -2988,8 +1856,6 @@
         <w:rPr>
           <w:rFonts w:asciiTheme="minorHAnsi" w:eastAsiaTheme="minorHAnsi" w:hAnsiTheme="minorHAnsi" w:cstheme="minorHAnsi"/>
           <w:kern w:val="2"/>
-          <w:sz w:val="22"/>
-          <w:szCs w:val="22"/>
           <w:lang w:val="en-IN" w:eastAsia="en-US" w:bidi="ar-SA"/>
           <w14:ligatures w14:val="standardContextual"/>
         </w:rPr>
@@ -3000,8 +1866,6 @@
           <w:b/>
           <w:bCs/>
           <w:kern w:val="2"/>
-          <w:sz w:val="22"/>
-          <w:szCs w:val="22"/>
           <w:lang w:val="en-IN" w:eastAsia="en-US" w:bidi="ar-SA"/>
           <w14:ligatures w14:val="standardContextual"/>
         </w:rPr>
@@ -3011,34 +1875,10 @@
         <w:rPr>
           <w:rFonts w:asciiTheme="minorHAnsi" w:eastAsiaTheme="minorHAnsi" w:hAnsiTheme="minorHAnsi" w:cstheme="minorHAnsi"/>
           <w:kern w:val="2"/>
-          <w:sz w:val="22"/>
-          <w:szCs w:val="22"/>
-          <w:lang w:val="en-IN" w:eastAsia="en-US" w:bidi="ar-SA"/>
-          <w14:ligatures w14:val="standardContextual"/>
-        </w:rPr>
-        <w:t>GitLab, Agile/Scrum</w:t>
-      </w:r>
-      <w:r>
-        <w:rPr>
-          <w:rFonts w:asciiTheme="minorHAnsi" w:eastAsiaTheme="minorHAnsi" w:hAnsiTheme="minorHAnsi" w:cstheme="minorHAnsi"/>
-          <w:kern w:val="2"/>
-          <w:sz w:val="22"/>
-          <w:szCs w:val="22"/>
-          <w:lang w:val="en-IN" w:eastAsia="en-US" w:bidi="ar-SA"/>
-          <w14:ligatures w14:val="standardContextual"/>
-        </w:rPr>
-        <w:t>,</w:t>
-      </w:r>
-      <w:r>
-        <w:rPr>
-          <w:rFonts w:asciiTheme="minorHAnsi" w:eastAsiaTheme="minorHAnsi" w:hAnsiTheme="minorHAnsi" w:cstheme="minorHAnsi"/>
-          <w:kern w:val="2"/>
-          <w:sz w:val="22"/>
-          <w:szCs w:val="22"/>
-          <w:lang w:val="en-IN" w:eastAsia="en-US" w:bidi="ar-SA"/>
-          <w14:ligatures w14:val="standardContextual"/>
-        </w:rPr>
-        <w:t xml:space="preserve"> CI/CD</w:t>
+          <w:lang w:val="en-IN" w:eastAsia="en-US" w:bidi="ar-SA"/>
+          <w14:ligatures w14:val="standardContextual"/>
+        </w:rPr>
+        <w:t>GitLab, Agile/Scrum, CI/CD</w:t>
       </w:r>
     </w:p>
     <w:p>
@@ -3053,8 +1893,6 @@
         <w:rPr>
           <w:rFonts w:asciiTheme="minorHAnsi" w:eastAsiaTheme="minorHAnsi" w:hAnsiTheme="minorHAnsi" w:cstheme="minorHAnsi"/>
           <w:kern w:val="2"/>
-          <w:sz w:val="22"/>
-          <w:szCs w:val="22"/>
           <w:lang w:val="en-IN" w:eastAsia="en-US" w:bidi="ar-SA"/>
           <w14:ligatures w14:val="standardContextual"/>
         </w:rPr>
@@ -3065,47 +1903,19 @@
           <w:b/>
           <w:bCs/>
           <w:kern w:val="2"/>
-          <w:sz w:val="22"/>
-          <w:szCs w:val="22"/>
-          <w:lang w:val="en-IN" w:eastAsia="en-US" w:bidi="ar-SA"/>
-          <w14:ligatures w14:val="standardContextual"/>
-        </w:rPr>
-        <w:t>Additional Skills</w:t>
-      </w:r>
-      <w:r>
-        <w:rPr>
-          <w:rFonts w:asciiTheme="minorHAnsi" w:eastAsiaTheme="minorHAnsi" w:hAnsiTheme="minorHAnsi" w:cstheme="minorHAnsi"/>
-          <w:b/>
-          <w:bCs/>
-          <w:kern w:val="2"/>
-          <w:sz w:val="22"/>
-          <w:szCs w:val="22"/>
-          <w:lang w:val="en-IN" w:eastAsia="en-US" w:bidi="ar-SA"/>
-          <w14:ligatures w14:val="standardContextual"/>
-        </w:rPr>
-        <w:t>:</w:t>
-      </w:r>
-      <w:r>
-        <w:rPr>
-          <w:rFonts w:asciiTheme="minorHAnsi" w:eastAsiaTheme="minorHAnsi" w:hAnsiTheme="minorHAnsi" w:cstheme="minorHAnsi"/>
-          <w:kern w:val="2"/>
-          <w:sz w:val="22"/>
-          <w:szCs w:val="22"/>
-          <w:lang w:val="en-IN" w:eastAsia="en-US" w:bidi="ar-SA"/>
-          <w14:ligatures w14:val="standardContextual"/>
-        </w:rPr>
-        <w:t xml:space="preserve"> Requirement Analysis, FinOps Awareness, </w:t>
-      </w:r>
-      <w:r>
-        <w:rPr>
-          <w:rFonts w:asciiTheme="minorHAnsi" w:eastAsiaTheme="minorHAnsi" w:hAnsiTheme="minorHAnsi" w:cstheme="minorHAnsi"/>
-          <w:kern w:val="2"/>
-          <w:sz w:val="22"/>
-          <w:szCs w:val="22"/>
-          <w:lang w:val="en-IN" w:eastAsia="en-US" w:bidi="ar-SA"/>
-          <w14:ligatures w14:val="standardContextual"/>
-        </w:rPr>
-        <w:t>Code Reviews, Stakeholder Collaboration</w:t>
+          <w:lang w:val="en-IN" w:eastAsia="en-US" w:bidi="ar-SA"/>
+          <w14:ligatures w14:val="standardContextual"/>
+        </w:rPr>
+        <w:t>Additional Skills:</w:t>
+      </w:r>
+      <w:r>
+        <w:rPr>
+          <w:rFonts w:asciiTheme="minorHAnsi" w:eastAsiaTheme="minorHAnsi" w:hAnsiTheme="minorHAnsi" w:cstheme="minorHAnsi"/>
+          <w:kern w:val="2"/>
+          <w:lang w:val="en-IN" w:eastAsia="en-US" w:bidi="ar-SA"/>
+          <w14:ligatures w14:val="standardContextual"/>
+        </w:rPr>
+        <w:t xml:space="preserve"> Requirement Analysis, FinOps Awareness, Code Reviews, Stakeholder Collaboration</w:t>
       </w:r>
     </w:p>
     <w:p>
@@ -3121,6 +1931,8 @@
           <w:rFonts w:asciiTheme="minorHAnsi" w:eastAsiaTheme="minorHAnsi" w:hAnsiTheme="minorHAnsi" w:cstheme="minorHAnsi"/>
           <w:b/>
           <w:kern w:val="2"/>
+          <w:sz w:val="28"/>
+          <w:szCs w:val="28"/>
           <w:lang w:val="en-IN" w:eastAsia="en-US" w:bidi="ar-SA"/>
           <w14:ligatures w14:val="standardContextual"/>
         </w:rPr>
@@ -3137,17 +1949,17 @@
         <w:rPr>
           <w:rFonts w:asciiTheme="minorHAnsi" w:hAnsiTheme="minorHAnsi" w:cstheme="minorHAnsi"/>
           <w:b/>
-          <w:sz w:val="36"/>
-          <w:szCs w:val="36"/>
-        </w:rPr>
-      </w:pPr>
-      <w:r>
-        <w:rPr>
-          <w:rFonts w:asciiTheme="minorHAnsi" w:eastAsiaTheme="minorHAnsi" w:hAnsiTheme="minorHAnsi" w:cstheme="minorHAnsi"/>
-          <w:b/>
-          <w:kern w:val="2"/>
-          <w:sz w:val="28"/>
-          <w:szCs w:val="28"/>
+          <w:sz w:val="40"/>
+          <w:szCs w:val="40"/>
+        </w:rPr>
+      </w:pPr>
+      <w:r>
+        <w:rPr>
+          <w:rFonts w:asciiTheme="minorHAnsi" w:eastAsiaTheme="minorHAnsi" w:hAnsiTheme="minorHAnsi" w:cstheme="minorHAnsi"/>
+          <w:b/>
+          <w:kern w:val="2"/>
+          <w:sz w:val="32"/>
+          <w:szCs w:val="32"/>
           <w:lang w:val="en-IN" w:eastAsia="en-US" w:bidi="ar-SA"/>
           <w14:ligatures w14:val="standardContextual"/>
         </w:rPr>
@@ -3168,8 +1980,6 @@
           <w:b/>
           <w:bCs/>
           <w:kern w:val="2"/>
-          <w:sz w:val="22"/>
-          <w:szCs w:val="22"/>
           <w:lang w:val="en-IN" w:eastAsia="en-US" w:bidi="ar-SA"/>
           <w14:ligatures w14:val="standardContextual"/>
         </w:rPr>
@@ -3180,8 +1990,6 @@
           <w:b/>
           <w:bCs/>
           <w:kern w:val="2"/>
-          <w:sz w:val="22"/>
-          <w:szCs w:val="22"/>
           <w:lang w:val="en-IN" w:eastAsia="en-US" w:bidi="ar-SA"/>
           <w14:ligatures w14:val="standardContextual"/>
         </w:rPr>
@@ -3191,8 +1999,6 @@
         <w:rPr>
           <w:rFonts w:asciiTheme="minorHAnsi" w:eastAsiaTheme="minorHAnsi" w:hAnsiTheme="minorHAnsi" w:cstheme="minorHAnsi"/>
           <w:kern w:val="2"/>
-          <w:sz w:val="22"/>
-          <w:szCs w:val="22"/>
           <w:lang w:val="en-IN" w:eastAsia="en-US" w:bidi="ar-SA"/>
           <w14:ligatures w14:val="standardContextual"/>
         </w:rPr>
@@ -3204,8 +2010,6 @@
           <w:b/>
           <w:bCs/>
           <w:kern w:val="2"/>
-          <w:sz w:val="22"/>
-          <w:szCs w:val="22"/>
           <w:lang w:val="en-IN" w:eastAsia="en-US" w:bidi="ar-SA"/>
           <w14:ligatures w14:val="standardContextual"/>
         </w:rPr>
@@ -3215,8 +2019,6 @@
         <w:rPr>
           <w:rFonts w:asciiTheme="minorHAnsi" w:eastAsiaTheme="minorHAnsi" w:hAnsiTheme="minorHAnsi" w:cstheme="minorHAnsi"/>
           <w:kern w:val="2"/>
-          <w:sz w:val="22"/>
-          <w:szCs w:val="22"/>
           <w:lang w:val="en-IN" w:eastAsia="en-US" w:bidi="ar-SA"/>
           <w14:ligatures w14:val="standardContextual"/>
         </w:rPr>
@@ -3226,8 +2028,6 @@
         <w:rPr>
           <w:rFonts w:asciiTheme="minorHAnsi" w:eastAsiaTheme="minorHAnsi" w:hAnsiTheme="minorHAnsi" w:cstheme="minorHAnsi"/>
           <w:kern w:val="2"/>
-          <w:sz w:val="22"/>
-          <w:szCs w:val="22"/>
           <w:lang w:val="en-IN" w:eastAsia="en-US" w:bidi="ar-SA"/>
           <w14:ligatures w14:val="standardContextual"/>
         </w:rPr>
@@ -3237,8 +2037,6 @@
         <w:rPr>
           <w:rFonts w:asciiTheme="minorHAnsi" w:eastAsiaTheme="minorHAnsi" w:hAnsiTheme="minorHAnsi" w:cstheme="minorHAnsi"/>
           <w:kern w:val="2"/>
-          <w:sz w:val="22"/>
-          <w:szCs w:val="22"/>
           <w:lang w:val="en-IN" w:eastAsia="en-US" w:bidi="ar-SA"/>
           <w14:ligatures w14:val="standardContextual"/>
         </w:rPr>
@@ -3259,8 +2057,6 @@
           <w:b/>
           <w:bCs/>
           <w:kern w:val="2"/>
-          <w:sz w:val="22"/>
-          <w:szCs w:val="22"/>
           <w:lang w:val="en-IN" w:eastAsia="en-US" w:bidi="ar-SA"/>
           <w14:ligatures w14:val="standardContextual"/>
         </w:rPr>
@@ -3271,8 +2067,6 @@
           <w:b/>
           <w:bCs/>
           <w:kern w:val="2"/>
-          <w:sz w:val="22"/>
-          <w:szCs w:val="22"/>
           <w:lang w:val="en-IN" w:eastAsia="en-US" w:bidi="ar-SA"/>
           <w14:ligatures w14:val="standardContextual"/>
         </w:rPr>
@@ -3282,8 +2076,6 @@
         <w:rPr>
           <w:rFonts w:asciiTheme="minorHAnsi" w:eastAsiaTheme="minorHAnsi" w:hAnsiTheme="minorHAnsi" w:cstheme="minorHAnsi"/>
           <w:kern w:val="2"/>
-          <w:sz w:val="22"/>
-          <w:szCs w:val="22"/>
           <w:lang w:val="en-IN" w:eastAsia="en-US" w:bidi="ar-SA"/>
           <w14:ligatures w14:val="standardContextual"/>
         </w:rPr>
@@ -3295,8 +2087,6 @@
           <w:b/>
           <w:bCs/>
           <w:kern w:val="2"/>
-          <w:sz w:val="22"/>
-          <w:szCs w:val="22"/>
           <w:lang w:val="en-IN" w:eastAsia="en-US" w:bidi="ar-SA"/>
           <w14:ligatures w14:val="standardContextual"/>
         </w:rPr>
@@ -3306,8 +2096,6 @@
         <w:rPr>
           <w:rFonts w:asciiTheme="minorHAnsi" w:eastAsiaTheme="minorHAnsi" w:hAnsiTheme="minorHAnsi" w:cstheme="minorHAnsi"/>
           <w:kern w:val="2"/>
-          <w:sz w:val="22"/>
-          <w:szCs w:val="22"/>
           <w:lang w:val="en-IN" w:eastAsia="en-US" w:bidi="ar-SA"/>
           <w14:ligatures w14:val="standardContextual"/>
         </w:rPr>
@@ -3328,8 +2116,6 @@
           <w:b/>
           <w:bCs/>
           <w:kern w:val="2"/>
-          <w:sz w:val="22"/>
-          <w:szCs w:val="22"/>
           <w:lang w:val="en-IN" w:eastAsia="en-US" w:bidi="ar-SA"/>
           <w14:ligatures w14:val="standardContextual"/>
         </w:rPr>
@@ -3340,8 +2126,6 @@
           <w:b/>
           <w:bCs/>
           <w:kern w:val="2"/>
-          <w:sz w:val="22"/>
-          <w:szCs w:val="22"/>
           <w:lang w:val="en-IN" w:eastAsia="en-US" w:bidi="ar-SA"/>
           <w14:ligatures w14:val="standardContextual"/>
         </w:rPr>
@@ -3351,8 +2135,6 @@
         <w:rPr>
           <w:rFonts w:asciiTheme="minorHAnsi" w:eastAsiaTheme="minorHAnsi" w:hAnsiTheme="minorHAnsi" w:cstheme="minorHAnsi"/>
           <w:kern w:val="2"/>
-          <w:sz w:val="22"/>
-          <w:szCs w:val="22"/>
           <w:lang w:val="en-IN" w:eastAsia="en-US" w:bidi="ar-SA"/>
           <w14:ligatures w14:val="standardContextual"/>
         </w:rPr>
@@ -3364,8 +2146,6 @@
           <w:b/>
           <w:bCs/>
           <w:kern w:val="2"/>
-          <w:sz w:val="22"/>
-          <w:szCs w:val="22"/>
           <w:lang w:val="en-IN" w:eastAsia="en-US" w:bidi="ar-SA"/>
           <w14:ligatures w14:val="standardContextual"/>
         </w:rPr>
@@ -3375,8 +2155,6 @@
         <w:rPr>
           <w:rFonts w:asciiTheme="minorHAnsi" w:eastAsiaTheme="minorHAnsi" w:hAnsiTheme="minorHAnsi" w:cstheme="minorHAnsi"/>
           <w:kern w:val="2"/>
-          <w:sz w:val="22"/>
-          <w:szCs w:val="22"/>
           <w:lang w:val="en-IN" w:eastAsia="en-US" w:bidi="ar-SA"/>
           <w14:ligatures w14:val="standardContextual"/>
         </w:rPr>
@@ -3397,8 +2175,6 @@
           <w:b/>
           <w:bCs/>
           <w:kern w:val="2"/>
-          <w:sz w:val="22"/>
-          <w:szCs w:val="22"/>
           <w:lang w:val="en-IN" w:eastAsia="en-US" w:bidi="ar-SA"/>
           <w14:ligatures w14:val="standardContextual"/>
         </w:rPr>
@@ -3409,8 +2185,6 @@
           <w:b/>
           <w:bCs/>
           <w:kern w:val="2"/>
-          <w:sz w:val="22"/>
-          <w:szCs w:val="22"/>
           <w:lang w:val="en-IN" w:eastAsia="en-US" w:bidi="ar-SA"/>
           <w14:ligatures w14:val="standardContextual"/>
         </w:rPr>
@@ -3420,8 +2194,6 @@
         <w:rPr>
           <w:rFonts w:asciiTheme="minorHAnsi" w:eastAsiaTheme="minorHAnsi" w:hAnsiTheme="minorHAnsi" w:cstheme="minorHAnsi"/>
           <w:kern w:val="2"/>
-          <w:sz w:val="22"/>
-          <w:szCs w:val="22"/>
           <w:lang w:val="en-IN" w:eastAsia="en-US" w:bidi="ar-SA"/>
           <w14:ligatures w14:val="standardContextual"/>
         </w:rPr>
@@ -3431,8 +2203,6 @@
         <w:rPr>
           <w:rFonts w:asciiTheme="minorHAnsi" w:eastAsiaTheme="minorHAnsi" w:hAnsiTheme="minorHAnsi" w:cstheme="minorHAnsi"/>
           <w:kern w:val="2"/>
-          <w:sz w:val="22"/>
-          <w:szCs w:val="22"/>
           <w:lang w:val="en-IN" w:eastAsia="en-US" w:bidi="ar-SA"/>
           <w14:ligatures w14:val="standardContextual"/>
         </w:rPr>
@@ -3442,8 +2212,6 @@
         <w:rPr>
           <w:rFonts w:asciiTheme="minorHAnsi" w:eastAsiaTheme="minorHAnsi" w:hAnsiTheme="minorHAnsi" w:cstheme="minorHAnsi"/>
           <w:kern w:val="2"/>
-          <w:sz w:val="22"/>
-          <w:szCs w:val="22"/>
           <w:lang w:val="en-IN" w:eastAsia="en-US" w:bidi="ar-SA"/>
           <w14:ligatures w14:val="standardContextual"/>
         </w:rPr>
@@ -3453,16 +2221,15 @@
     <w:p>
       <w:pPr>
         <w:pStyle w:val="LO-normal"/>
-        <w:pBdr>
-          <w:bottom w:val="single" w:sz="6" w:space="1" w:color="auto"/>
-        </w:pBdr>
         <w:spacing w:line="120" w:lineRule="auto"/>
-        <w:ind w:left="-397" w:right="-397"/>
+        <w:ind w:right="-397"/>
         <w:jc w:val="both"/>
         <w:rPr>
           <w:rFonts w:asciiTheme="minorHAnsi" w:eastAsiaTheme="minorHAnsi" w:hAnsiTheme="minorHAnsi" w:cstheme="minorHAnsi"/>
           <w:b/>
           <w:kern w:val="2"/>
+          <w:sz w:val="28"/>
+          <w:szCs w:val="28"/>
           <w:lang w:val="en-IN" w:eastAsia="en-US" w:bidi="ar-SA"/>
           <w14:ligatures w14:val="standardContextual"/>
         </w:rPr>
@@ -3479,17 +2246,17 @@
         <w:rPr>
           <w:rFonts w:asciiTheme="minorHAnsi" w:hAnsiTheme="minorHAnsi" w:cstheme="minorHAnsi"/>
           <w:b/>
-          <w:sz w:val="36"/>
-          <w:szCs w:val="36"/>
-        </w:rPr>
-      </w:pPr>
-      <w:r>
-        <w:rPr>
-          <w:rFonts w:asciiTheme="minorHAnsi" w:eastAsiaTheme="minorHAnsi" w:hAnsiTheme="minorHAnsi" w:cstheme="minorHAnsi"/>
-          <w:b/>
-          <w:kern w:val="2"/>
-          <w:sz w:val="28"/>
-          <w:szCs w:val="28"/>
+          <w:sz w:val="40"/>
+          <w:szCs w:val="40"/>
+        </w:rPr>
+      </w:pPr>
+      <w:r>
+        <w:rPr>
+          <w:rFonts w:asciiTheme="minorHAnsi" w:eastAsiaTheme="minorHAnsi" w:hAnsiTheme="minorHAnsi" w:cstheme="minorHAnsi"/>
+          <w:b/>
+          <w:kern w:val="2"/>
+          <w:sz w:val="32"/>
+          <w:szCs w:val="32"/>
           <w:lang w:val="en-IN" w:eastAsia="en-US" w:bidi="ar-SA"/>
           <w14:ligatures w14:val="standardContextual"/>
         </w:rPr>
@@ -3500,8 +2267,8 @@
           <w:rFonts w:asciiTheme="minorHAnsi" w:eastAsiaTheme="minorHAnsi" w:hAnsiTheme="minorHAnsi" w:cstheme="minorHAnsi"/>
           <w:b/>
           <w:kern w:val="2"/>
-          <w:sz w:val="28"/>
-          <w:szCs w:val="28"/>
+          <w:sz w:val="32"/>
+          <w:szCs w:val="32"/>
           <w:lang w:val="en-IN" w:eastAsia="en-US" w:bidi="ar-SA"/>
           <w14:ligatures w14:val="standardContextual"/>
         </w:rPr>
@@ -3520,8 +2287,6 @@
         <w:rPr>
           <w:rFonts w:asciiTheme="minorHAnsi" w:eastAsiaTheme="minorHAnsi" w:hAnsiTheme="minorHAnsi" w:cstheme="minorHAnsi"/>
           <w:kern w:val="2"/>
-          <w:sz w:val="22"/>
-          <w:szCs w:val="22"/>
           <w:lang w:val="en-IN" w:eastAsia="en-US" w:bidi="ar-SA"/>
           <w14:ligatures w14:val="standardContextual"/>
         </w:rPr>
@@ -3532,8 +2297,6 @@
           <w:b/>
           <w:bCs/>
           <w:kern w:val="2"/>
-          <w:sz w:val="22"/>
-          <w:szCs w:val="22"/>
           <w:lang w:val="en-IN" w:eastAsia="en-US" w:bidi="ar-SA"/>
           <w14:ligatures w14:val="standardContextual"/>
         </w:rPr>
@@ -3543,8 +2306,6 @@
         <w:rPr>
           <w:rFonts w:asciiTheme="minorHAnsi" w:eastAsiaTheme="minorHAnsi" w:hAnsiTheme="minorHAnsi" w:cstheme="minorHAnsi"/>
           <w:kern w:val="2"/>
-          <w:sz w:val="22"/>
-          <w:szCs w:val="22"/>
           <w:lang w:val="en-IN" w:eastAsia="en-US" w:bidi="ar-SA"/>
           <w14:ligatures w14:val="standardContextual"/>
         </w:rPr>
@@ -3554,8 +2315,6 @@
         <w:rPr>
           <w:rFonts w:asciiTheme="minorHAnsi" w:eastAsiaTheme="minorHAnsi" w:hAnsiTheme="minorHAnsi" w:cstheme="minorHAnsi"/>
           <w:kern w:val="2"/>
-          <w:sz w:val="22"/>
-          <w:szCs w:val="22"/>
           <w:lang w:val="en-IN" w:eastAsia="en-US" w:bidi="ar-SA"/>
           <w14:ligatures w14:val="standardContextual"/>
         </w:rPr>
@@ -3565,30 +2324,64 @@
         <w:rPr>
           <w:rFonts w:asciiTheme="minorHAnsi" w:eastAsiaTheme="minorHAnsi" w:hAnsiTheme="minorHAnsi" w:cstheme="minorHAnsi"/>
           <w:kern w:val="2"/>
-          <w:sz w:val="22"/>
-          <w:szCs w:val="22"/>
-          <w:lang w:val="en-IN" w:eastAsia="en-US" w:bidi="ar-SA"/>
-          <w14:ligatures w14:val="standardContextual"/>
-        </w:rPr>
-        <w:t xml:space="preserve"> CDAC Bengaluru | (</w:t>
-      </w:r>
-      <w:r>
-        <w:rPr>
-          <w:rFonts w:asciiTheme="minorHAnsi" w:eastAsiaTheme="minorHAnsi" w:hAnsiTheme="minorHAnsi" w:cstheme="minorHAnsi"/>
-          <w:kern w:val="2"/>
-          <w:sz w:val="22"/>
-          <w:szCs w:val="22"/>
-          <w:lang w:val="en-IN" w:eastAsia="en-US" w:bidi="ar-SA"/>
-          <w14:ligatures w14:val="standardContextual"/>
-        </w:rPr>
-        <w:t xml:space="preserve">September </w:t>
-      </w:r>
-      <w:r>
-        <w:rPr>
-          <w:rFonts w:asciiTheme="minorHAnsi" w:eastAsiaTheme="minorHAnsi" w:hAnsiTheme="minorHAnsi" w:cstheme="minorHAnsi"/>
-          <w:kern w:val="2"/>
-          <w:sz w:val="22"/>
-          <w:szCs w:val="22"/>
+          <w:lang w:val="en-IN" w:eastAsia="en-US" w:bidi="ar-SA"/>
+          <w14:ligatures w14:val="standardContextual"/>
+        </w:rPr>
+        <w:t xml:space="preserve"> CDAC Bengaluru</w:t>
+      </w:r>
+      <w:r>
+        <w:rPr>
+          <w:rFonts w:asciiTheme="minorHAnsi" w:eastAsiaTheme="minorHAnsi" w:hAnsiTheme="minorHAnsi" w:cstheme="minorHAnsi"/>
+          <w:kern w:val="2"/>
+          <w:lang w:val="en-IN" w:eastAsia="en-US" w:bidi="ar-SA"/>
+          <w14:ligatures w14:val="standardContextual"/>
+        </w:rPr>
+        <w:tab/>
+      </w:r>
+      <w:r>
+        <w:rPr>
+          <w:rFonts w:asciiTheme="minorHAnsi" w:eastAsiaTheme="minorHAnsi" w:hAnsiTheme="minorHAnsi" w:cstheme="minorHAnsi"/>
+          <w:kern w:val="2"/>
+          <w:lang w:val="en-IN" w:eastAsia="en-US" w:bidi="ar-SA"/>
+          <w14:ligatures w14:val="standardContextual"/>
+        </w:rPr>
+        <w:tab/>
+      </w:r>
+      <w:r>
+        <w:rPr>
+          <w:rFonts w:asciiTheme="minorHAnsi" w:eastAsiaTheme="minorHAnsi" w:hAnsiTheme="minorHAnsi" w:cstheme="minorHAnsi"/>
+          <w:kern w:val="2"/>
+          <w:lang w:val="en-IN" w:eastAsia="en-US" w:bidi="ar-SA"/>
+          <w14:ligatures w14:val="standardContextual"/>
+        </w:rPr>
+        <w:tab/>
+      </w:r>
+      <w:r>
+        <w:rPr>
+          <w:rFonts w:asciiTheme="minorHAnsi" w:eastAsiaTheme="minorHAnsi" w:hAnsiTheme="minorHAnsi" w:cstheme="minorHAnsi"/>
+          <w:kern w:val="2"/>
+          <w:lang w:val="en-IN" w:eastAsia="en-US" w:bidi="ar-SA"/>
+          <w14:ligatures w14:val="standardContextual"/>
+        </w:rPr>
+        <w:t xml:space="preserve">           </w:t>
+      </w:r>
+      <w:r>
+        <w:rPr>
+          <w:rFonts w:asciiTheme="minorHAnsi" w:eastAsiaTheme="minorHAnsi" w:hAnsiTheme="minorHAnsi" w:cstheme="minorHAnsi"/>
+          <w:b/>
+          <w:bCs/>
+          <w:kern w:val="2"/>
+          <w:lang w:val="en-IN" w:eastAsia="en-US" w:bidi="ar-SA"/>
+          <w14:ligatures w14:val="standardContextual"/>
+        </w:rPr>
+        <w:t xml:space="preserve">Sept </w:t>
+      </w:r>
+      <w:r>
+        <w:rPr>
+          <w:rFonts w:asciiTheme="minorHAnsi" w:eastAsiaTheme="minorHAnsi" w:hAnsiTheme="minorHAnsi" w:cstheme="minorHAnsi"/>
+          <w:b/>
+          <w:bCs/>
+          <w:kern w:val="2"/>
           <w:lang w:val="en-IN" w:eastAsia="en-US" w:bidi="ar-SA"/>
           <w14:ligatures w14:val="standardContextual"/>
         </w:rPr>
@@ -3597,9 +2390,9 @@
       <w:r>
         <w:rPr>
           <w:rFonts w:asciiTheme="minorHAnsi" w:eastAsiaTheme="minorHAnsi" w:hAnsiTheme="minorHAnsi" w:cstheme="minorHAnsi"/>
-          <w:kern w:val="2"/>
-          <w:sz w:val="22"/>
-          <w:szCs w:val="22"/>
+          <w:b/>
+          <w:bCs/>
+          <w:kern w:val="2"/>
           <w:lang w:val="en-IN" w:eastAsia="en-US" w:bidi="ar-SA"/>
           <w14:ligatures w14:val="standardContextual"/>
         </w:rPr>
@@ -3608,9 +2401,9 @@
       <w:r>
         <w:rPr>
           <w:rFonts w:asciiTheme="minorHAnsi" w:eastAsiaTheme="minorHAnsi" w:hAnsiTheme="minorHAnsi" w:cstheme="minorHAnsi"/>
-          <w:kern w:val="2"/>
-          <w:sz w:val="22"/>
-          <w:szCs w:val="22"/>
+          <w:b/>
+          <w:bCs/>
+          <w:kern w:val="2"/>
           <w:lang w:val="en-IN" w:eastAsia="en-US" w:bidi="ar-SA"/>
           <w14:ligatures w14:val="standardContextual"/>
         </w:rPr>
@@ -3619,13 +2412,13 @@
       <w:r>
         <w:rPr>
           <w:rFonts w:asciiTheme="minorHAnsi" w:eastAsiaTheme="minorHAnsi" w:hAnsiTheme="minorHAnsi" w:cstheme="minorHAnsi"/>
-          <w:kern w:val="2"/>
-          <w:sz w:val="22"/>
-          <w:szCs w:val="22"/>
-          <w:lang w:val="en-IN" w:eastAsia="en-US" w:bidi="ar-SA"/>
-          <w14:ligatures w14:val="standardContextual"/>
-        </w:rPr>
-        <w:t>2023)</w:t>
+          <w:b/>
+          <w:bCs/>
+          <w:kern w:val="2"/>
+          <w:lang w:val="en-IN" w:eastAsia="en-US" w:bidi="ar-SA"/>
+          <w14:ligatures w14:val="standardContextual"/>
+        </w:rPr>
+        <w:t>2023</w:t>
       </w:r>
     </w:p>
     <w:p>
@@ -3640,8 +2433,6 @@
         <w:rPr>
           <w:rFonts w:asciiTheme="minorHAnsi" w:eastAsiaTheme="minorHAnsi" w:hAnsiTheme="minorHAnsi" w:cstheme="minorHAnsi"/>
           <w:kern w:val="2"/>
-          <w:sz w:val="22"/>
-          <w:szCs w:val="22"/>
           <w:lang w:val="en-IN" w:eastAsia="en-US" w:bidi="ar-SA"/>
           <w14:ligatures w14:val="standardContextual"/>
         </w:rPr>
@@ -3652,8 +2443,6 @@
           <w:b/>
           <w:bCs/>
           <w:kern w:val="2"/>
-          <w:sz w:val="22"/>
-          <w:szCs w:val="22"/>
           <w:lang w:val="en-IN" w:eastAsia="en-US" w:bidi="ar-SA"/>
           <w14:ligatures w14:val="standardContextual"/>
         </w:rPr>
@@ -3663,8 +2452,6 @@
         <w:rPr>
           <w:rFonts w:asciiTheme="minorHAnsi" w:eastAsiaTheme="minorHAnsi" w:hAnsiTheme="minorHAnsi" w:cstheme="minorHAnsi"/>
           <w:kern w:val="2"/>
-          <w:sz w:val="22"/>
-          <w:szCs w:val="22"/>
           <w:lang w:val="en-IN" w:eastAsia="en-US" w:bidi="ar-SA"/>
           <w14:ligatures w14:val="standardContextual"/>
         </w:rPr>
@@ -3674,8 +2461,6 @@
         <w:rPr>
           <w:rFonts w:asciiTheme="minorHAnsi" w:eastAsiaTheme="minorHAnsi" w:hAnsiTheme="minorHAnsi" w:cstheme="minorHAnsi"/>
           <w:kern w:val="2"/>
-          <w:sz w:val="22"/>
-          <w:szCs w:val="22"/>
           <w:lang w:val="en-IN" w:eastAsia="en-US" w:bidi="ar-SA"/>
           <w14:ligatures w14:val="standardContextual"/>
         </w:rPr>
@@ -3685,19 +2470,71 @@
         <w:rPr>
           <w:rFonts w:asciiTheme="minorHAnsi" w:eastAsiaTheme="minorHAnsi" w:hAnsiTheme="minorHAnsi" w:cstheme="minorHAnsi"/>
           <w:kern w:val="2"/>
-          <w:sz w:val="22"/>
-          <w:szCs w:val="22"/>
-          <w:lang w:val="en-IN" w:eastAsia="en-US" w:bidi="ar-SA"/>
-          <w14:ligatures w14:val="standardContextual"/>
-        </w:rPr>
-        <w:t xml:space="preserve"> UIET-MDU, Haryana | (</w:t>
-      </w:r>
-      <w:r>
-        <w:rPr>
-          <w:rFonts w:asciiTheme="minorHAnsi" w:eastAsiaTheme="minorHAnsi" w:hAnsiTheme="minorHAnsi" w:cstheme="minorHAnsi"/>
-          <w:kern w:val="2"/>
-          <w:sz w:val="22"/>
-          <w:szCs w:val="22"/>
+          <w:lang w:val="en-IN" w:eastAsia="en-US" w:bidi="ar-SA"/>
+          <w14:ligatures w14:val="standardContextual"/>
+        </w:rPr>
+        <w:t xml:space="preserve"> UIET-MDU, Haryana</w:t>
+      </w:r>
+      <w:r>
+        <w:rPr>
+          <w:rFonts w:asciiTheme="minorHAnsi" w:eastAsiaTheme="minorHAnsi" w:hAnsiTheme="minorHAnsi" w:cstheme="minorHAnsi"/>
+          <w:kern w:val="2"/>
+          <w:lang w:val="en-IN" w:eastAsia="en-US" w:bidi="ar-SA"/>
+          <w14:ligatures w14:val="standardContextual"/>
+        </w:rPr>
+        <w:tab/>
+      </w:r>
+      <w:r>
+        <w:rPr>
+          <w:rFonts w:asciiTheme="minorHAnsi" w:eastAsiaTheme="minorHAnsi" w:hAnsiTheme="minorHAnsi" w:cstheme="minorHAnsi"/>
+          <w:kern w:val="2"/>
+          <w:lang w:val="en-IN" w:eastAsia="en-US" w:bidi="ar-SA"/>
+          <w14:ligatures w14:val="standardContextual"/>
+        </w:rPr>
+        <w:tab/>
+      </w:r>
+      <w:r>
+        <w:rPr>
+          <w:rFonts w:asciiTheme="minorHAnsi" w:eastAsiaTheme="minorHAnsi" w:hAnsiTheme="minorHAnsi" w:cstheme="minorHAnsi"/>
+          <w:kern w:val="2"/>
+          <w:lang w:val="en-IN" w:eastAsia="en-US" w:bidi="ar-SA"/>
+          <w14:ligatures w14:val="standardContextual"/>
+        </w:rPr>
+        <w:tab/>
+      </w:r>
+      <w:r>
+        <w:rPr>
+          <w:rFonts w:asciiTheme="minorHAnsi" w:eastAsiaTheme="minorHAnsi" w:hAnsiTheme="minorHAnsi" w:cstheme="minorHAnsi"/>
+          <w:kern w:val="2"/>
+          <w:lang w:val="en-IN" w:eastAsia="en-US" w:bidi="ar-SA"/>
+          <w14:ligatures w14:val="standardContextual"/>
+        </w:rPr>
+        <w:tab/>
+      </w:r>
+      <w:r>
+        <w:rPr>
+          <w:rFonts w:asciiTheme="minorHAnsi" w:eastAsiaTheme="minorHAnsi" w:hAnsiTheme="minorHAnsi" w:cstheme="minorHAnsi"/>
+          <w:kern w:val="2"/>
+          <w:lang w:val="en-IN" w:eastAsia="en-US" w:bidi="ar-SA"/>
+          <w14:ligatures w14:val="standardContextual"/>
+        </w:rPr>
+        <w:tab/>
+      </w:r>
+      <w:r>
+        <w:rPr>
+          <w:rFonts w:asciiTheme="minorHAnsi" w:eastAsiaTheme="minorHAnsi" w:hAnsiTheme="minorHAnsi" w:cstheme="minorHAnsi"/>
+          <w:kern w:val="2"/>
+          <w:lang w:val="en-IN" w:eastAsia="en-US" w:bidi="ar-SA"/>
+          <w14:ligatures w14:val="standardContextual"/>
+        </w:rPr>
+        <w:t xml:space="preserve">           </w:t>
+      </w:r>
+      <w:r>
+        <w:rPr>
+          <w:rFonts w:asciiTheme="minorHAnsi" w:eastAsiaTheme="minorHAnsi" w:hAnsiTheme="minorHAnsi" w:cstheme="minorHAnsi"/>
+          <w:b/>
+          <w:bCs/>
+          <w:kern w:val="2"/>
           <w:lang w:val="en-IN" w:eastAsia="en-US" w:bidi="ar-SA"/>
           <w14:ligatures w14:val="standardContextual"/>
         </w:rPr>
@@ -3706,9 +2543,9 @@
       <w:r>
         <w:rPr>
           <w:rFonts w:asciiTheme="minorHAnsi" w:eastAsiaTheme="minorHAnsi" w:hAnsiTheme="minorHAnsi" w:cstheme="minorHAnsi"/>
-          <w:kern w:val="2"/>
-          <w:sz w:val="22"/>
-          <w:szCs w:val="22"/>
+          <w:b/>
+          <w:bCs/>
+          <w:kern w:val="2"/>
           <w:lang w:val="en-IN" w:eastAsia="en-US" w:bidi="ar-SA"/>
           <w14:ligatures w14:val="standardContextual"/>
         </w:rPr>
@@ -3717,9 +2554,9 @@
       <w:r>
         <w:rPr>
           <w:rFonts w:asciiTheme="minorHAnsi" w:eastAsiaTheme="minorHAnsi" w:hAnsiTheme="minorHAnsi" w:cstheme="minorHAnsi"/>
-          <w:kern w:val="2"/>
-          <w:sz w:val="22"/>
-          <w:szCs w:val="22"/>
+          <w:b/>
+          <w:bCs/>
+          <w:kern w:val="2"/>
           <w:lang w:val="en-IN" w:eastAsia="en-US" w:bidi="ar-SA"/>
           <w14:ligatures w14:val="standardContextual"/>
         </w:rPr>
@@ -3728,13 +2565,13 @@
       <w:r>
         <w:rPr>
           <w:rFonts w:asciiTheme="minorHAnsi" w:eastAsiaTheme="minorHAnsi" w:hAnsiTheme="minorHAnsi" w:cstheme="minorHAnsi"/>
-          <w:kern w:val="2"/>
-          <w:sz w:val="22"/>
-          <w:szCs w:val="22"/>
-          <w:lang w:val="en-IN" w:eastAsia="en-US" w:bidi="ar-SA"/>
-          <w14:ligatures w14:val="standardContextual"/>
-        </w:rPr>
-        <w:t>2022)</w:t>
+          <w:b/>
+          <w:bCs/>
+          <w:kern w:val="2"/>
+          <w:lang w:val="en-IN" w:eastAsia="en-US" w:bidi="ar-SA"/>
+          <w14:ligatures w14:val="standardContextual"/>
+        </w:rPr>
+        <w:t>2022</w:t>
       </w:r>
     </w:p>
     <w:sectPr>

</xml_diff>